<commit_message>
tercer cambio: cambios en el punto 2
</commit_message>
<xml_diff>
--- a/Carlosama_Daniela_Unidad1.docx
+++ b/Carlosama_Daniela_Unidad1.docx
@@ -1,6 +1,6 @@
 
 <file path=word/document.xml><?xml version="1.0" encoding="utf-8"?>
-<w:document xmlns:wpc="http://schemas.microsoft.com/office/word/2010/wordprocessingCanvas" xmlns:cx="http://schemas.microsoft.com/office/drawing/2014/chartex" xmlns:cx1="http://schemas.microsoft.com/office/drawing/2015/9/8/chartex" xmlns:cx2="http://schemas.microsoft.com/office/drawing/2015/10/21/chartex" xmlns:cx3="http://schemas.microsoft.com/office/drawing/2016/5/9/chartex" xmlns:cx4="http://schemas.microsoft.com/office/drawing/2016/5/10/chartex" xmlns:cx5="http://schemas.microsoft.com/office/drawing/2016/5/11/chartex" xmlns:cx6="http://schemas.microsoft.com/office/drawing/2016/5/12/chartex" xmlns:cx7="http://schemas.microsoft.com/office/drawing/2016/5/13/chartex" xmlns:cx8="http://schemas.microsoft.com/office/drawing/2016/5/14/chartex" xmlns:mc="http://schemas.openxmlformats.org/markup-compatibility/2006" xmlns:aink="http://schemas.microsoft.com/office/drawing/2016/ink" xmlns:am3d="http://schemas.microsoft.com/office/drawing/2017/model3d" xmlns:o="urn:schemas-microsoft-com:office:office" xmlns:r="http://schemas.openxmlformats.org/officeDocument/2006/relationships" xmlns:m="http://schemas.openxmlformats.org/officeDocument/2006/math" xmlns:v="urn:schemas-microsoft-com:vml" xmlns:wp14="http://schemas.microsoft.com/office/word/2010/wordprocessingDrawing" xmlns:wp="http://schemas.openxmlformats.org/drawingml/2006/wordprocessingDrawing" xmlns:w10="urn:schemas-microsoft-com:office:word" xmlns:w="http://schemas.openxmlformats.org/wordprocessingml/2006/main" xmlns:w14="http://schemas.microsoft.com/office/word/2010/wordml" xmlns:w15="http://schemas.microsoft.com/office/word/2012/wordml" xmlns:w16cid="http://schemas.microsoft.com/office/word/2016/wordml/cid" xmlns:w16se="http://schemas.microsoft.com/office/word/2015/wordml/symex" xmlns:wpg="http://schemas.microsoft.com/office/word/2010/wordprocessingGroup" xmlns:wpi="http://schemas.microsoft.com/office/word/2010/wordprocessingInk" xmlns:wne="http://schemas.microsoft.com/office/word/2006/wordml" xmlns:wps="http://schemas.microsoft.com/office/word/2010/wordprocessingShape" mc:Ignorable="w14 w15 w16se w16cid wp14">
+<w:document xmlns:wpc="http://schemas.microsoft.com/office/word/2010/wordprocessingCanvas" xmlns:cx="http://schemas.microsoft.com/office/drawing/2014/chartex" xmlns:cx1="http://schemas.microsoft.com/office/drawing/2015/9/8/chartex" xmlns:cx2="http://schemas.microsoft.com/office/drawing/2015/10/21/chartex" xmlns:cx3="http://schemas.microsoft.com/office/drawing/2016/5/9/chartex" xmlns:cx4="http://schemas.microsoft.com/office/drawing/2016/5/10/chartex" xmlns:cx5="http://schemas.microsoft.com/office/drawing/2016/5/11/chartex" xmlns:cx6="http://schemas.microsoft.com/office/drawing/2016/5/12/chartex" xmlns:cx7="http://schemas.microsoft.com/office/drawing/2016/5/13/chartex" xmlns:cx8="http://schemas.microsoft.com/office/drawing/2016/5/14/chartex" xmlns:mc="http://schemas.openxmlformats.org/markup-compatibility/2006" xmlns:aink="http://schemas.microsoft.com/office/drawing/2016/ink" xmlns:am3d="http://schemas.microsoft.com/office/drawing/2017/model3d" xmlns:o="urn:schemas-microsoft-com:office:office" xmlns:r="http://schemas.openxmlformats.org/officeDocument/2006/relationships" xmlns:m="http://schemas.openxmlformats.org/officeDocument/2006/math" xmlns:v="urn:schemas-microsoft-com:vml" xmlns:wp14="http://schemas.microsoft.com/office/word/2010/wordprocessingDrawing" xmlns:wp="http://schemas.openxmlformats.org/drawingml/2006/wordprocessingDrawing" xmlns:w10="urn:schemas-microsoft-com:office:word" xmlns:w="http://schemas.openxmlformats.org/wordprocessingml/2006/main" xmlns:w14="http://schemas.microsoft.com/office/word/2010/wordml" xmlns:w15="http://schemas.microsoft.com/office/word/2012/wordml" xmlns:w16cex="http://schemas.microsoft.com/office/word/2018/wordml/cex" xmlns:w16cid="http://schemas.microsoft.com/office/word/2016/wordml/cid" xmlns:w16="http://schemas.microsoft.com/office/word/2018/wordml" xmlns:w16sdtdh="http://schemas.microsoft.com/office/word/2020/wordml/sdtdatahash" xmlns:w16se="http://schemas.microsoft.com/office/word/2015/wordml/symex" xmlns:wpg="http://schemas.microsoft.com/office/word/2010/wordprocessingGroup" xmlns:wpi="http://schemas.microsoft.com/office/word/2010/wordprocessingInk" xmlns:wne="http://schemas.microsoft.com/office/word/2006/wordml" xmlns:wps="http://schemas.microsoft.com/office/word/2010/wordprocessingShape" mc:Ignorable="w14 w15 w16se w16cid w16 w16cex w16sdtdh wp14">
   <w:body>
     <w:p>
       <w:pPr>
@@ -235,7 +235,7 @@
           <w:szCs w:val="28"/>
           <w:lang w:val="es-ES_tradnl"/>
         </w:rPr>
-        <w:t>Profesor</w:t>
+        <w:t>Profesor:</w:t>
       </w:r>
       <w:r>
         <w:rPr>
@@ -247,7 +247,7 @@
           <w:szCs w:val="28"/>
           <w:lang w:val="es-ES_tradnl"/>
         </w:rPr>
-        <w:t>es</w:t>
+        <w:tab/>
       </w:r>
       <w:r>
         <w:rPr>
@@ -259,73 +259,33 @@
           <w:szCs w:val="28"/>
           <w:lang w:val="es-ES_tradnl"/>
         </w:rPr>
-        <w:t>:</w:t>
-      </w:r>
-      <w:r>
-        <w:rPr>
-          <w:rFonts w:ascii="Arial" w:hAnsi="Arial" w:cs="Arial"/>
-          <w:b/>
-          <w:bCs/>
-          <w:kern w:val="24"/>
+        <w:tab/>
+      </w:r>
+    </w:p>
+    <w:p>
+      <w:pPr>
+        <w:rPr>
           <w:sz w:val="28"/>
           <w:szCs w:val="28"/>
-          <w:lang w:val="es-ES_tradnl"/>
-        </w:rPr>
-        <w:tab/>
-      </w:r>
-      <w:r>
-        <w:rPr>
-          <w:rFonts w:ascii="Arial" w:hAnsi="Arial" w:cs="Arial"/>
-          <w:b/>
-          <w:bCs/>
-          <w:kern w:val="24"/>
+        </w:rPr>
+      </w:pPr>
+      <w:r>
+        <w:rPr>
           <w:sz w:val="28"/>
           <w:szCs w:val="28"/>
-          <w:lang w:val="es-ES_tradnl"/>
-        </w:rPr>
-        <w:tab/>
-      </w:r>
-    </w:p>
-    <w:p>
-      <w:pPr>
+        </w:rPr>
+        <w:t>Ing.</w:t>
+      </w:r>
+      <w:r>
+        <w:t xml:space="preserve"> </w:t>
+      </w:r>
+      <w:r>
         <w:rPr>
           <w:sz w:val="28"/>
           <w:szCs w:val="28"/>
         </w:rPr>
-      </w:pPr>
-      <w:r>
-        <w:rPr>
-          <w:sz w:val="28"/>
-          <w:szCs w:val="28"/>
-        </w:rPr>
-        <w:t>Ing.</w:t>
-      </w:r>
-      <w:r>
-        <w:t xml:space="preserve"> </w:t>
-      </w:r>
-      <w:r>
-        <w:rPr>
-          <w:sz w:val="28"/>
-          <w:szCs w:val="28"/>
-        </w:rPr>
-        <w:t>Roly Steeven Cedeño Menéndez</w:t>
-      </w:r>
-      <w:r>
-        <w:rPr>
-          <w:sz w:val="28"/>
-          <w:szCs w:val="28"/>
-        </w:rPr>
-        <w:t xml:space="preserve">, </w:t>
-      </w:r>
-      <w:proofErr w:type="spellStart"/>
-      <w:r>
-        <w:rPr>
-          <w:sz w:val="28"/>
-          <w:szCs w:val="28"/>
-        </w:rPr>
-        <w:t>Mtr</w:t>
-      </w:r>
-      <w:proofErr w:type="spellEnd"/>
+        <w:t>Jorge Zambrano</w:t>
+      </w:r>
       <w:r>
         <w:rPr>
           <w:sz w:val="28"/>
@@ -533,6 +493,13 @@
         </w:rPr>
         <w:t xml:space="preserve">: </w:t>
       </w:r>
+      <w:r>
+        <w:rPr>
+          <w:b/>
+          <w:bCs/>
+        </w:rPr>
+        <w:t>Kelly Daniela Carlosama Ortiz</w:t>
+      </w:r>
     </w:p>
     <w:p>
       <w:pPr>
@@ -553,6 +520,13 @@
         </w:rPr>
         <w:t>PARALELO:</w:t>
       </w:r>
+      <w:r>
+        <w:rPr>
+          <w:b/>
+          <w:bCs/>
+        </w:rPr>
+        <w:t xml:space="preserve"> “A”</w:t>
+      </w:r>
     </w:p>
     <w:p>
       <w:r>
@@ -576,6 +550,13 @@
         </w:rPr>
         <w:t>SEMESTRE:</w:t>
       </w:r>
+      <w:r>
+        <w:rPr>
+          <w:b/>
+          <w:bCs/>
+        </w:rPr>
+        <w:t xml:space="preserve"> Quinto</w:t>
+      </w:r>
     </w:p>
     <w:p>
       <w:pPr>
@@ -594,7 +575,35 @@
           <w:b/>
           <w:bCs/>
         </w:rPr>
-        <w:t>ACTIVIDAD:</w:t>
+        <w:t>ACTIVIDAD</w:t>
+      </w:r>
+      <w:r>
+        <w:rPr>
+          <w:b/>
+          <w:bCs/>
+        </w:rPr>
+        <w:t xml:space="preserve"> 1</w:t>
+      </w:r>
+      <w:r>
+        <w:rPr>
+          <w:b/>
+          <w:bCs/>
+        </w:rPr>
+        <w:t>:</w:t>
+      </w:r>
+      <w:r>
+        <w:rPr>
+          <w:b/>
+          <w:bCs/>
+        </w:rPr>
+        <w:t xml:space="preserve"> </w:t>
+      </w:r>
+      <w:r>
+        <w:rPr>
+          <w:b/>
+          <w:bCs/>
+        </w:rPr>
+        <w:t>Estudio de Caso - Sistema de Control de Rescate y Adopción Animal</w:t>
       </w:r>
     </w:p>
     <w:p>
@@ -738,7 +747,7 @@
               </wp:anchor>
             </w:drawing>
           </mc:Choice>
-          <mc:Fallback xmlns:w16sdtdh="http://schemas.microsoft.com/office/word/2020/wordml/sdtdatahash" xmlns:w16="http://schemas.microsoft.com/office/word/2018/wordml" xmlns:w16cex="http://schemas.microsoft.com/office/word/2018/wordml/cex">
+          <mc:Fallback>
             <w:pict>
               <v:rect w14:anchorId="7B6493F3" id="Rectángulo 16" o:spid="_x0000_s1026" style="position:absolute;margin-left:374.05pt;margin-top:14.15pt;width:425.25pt;height:3.6pt;z-index:251661312;visibility:visible;mso-wrap-style:square;mso-width-percent:0;mso-height-percent:0;mso-wrap-distance-left:9pt;mso-wrap-distance-top:0;mso-wrap-distance-right:9pt;mso-wrap-distance-bottom:0;mso-position-horizontal:right;mso-position-horizontal-relative:margin;mso-position-vertical:absolute;mso-position-vertical-relative:text;mso-width-percent:0;mso-height-percent:0;mso-width-relative:margin;mso-height-relative:margin;v-text-anchor:middle" o:gfxdata="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" fillcolor="#009640" stroked="f" strokeweight="1pt">
                 <v:fill color2="#93cd9e" rotate="t" angle="270" focus="47%" type="gradient"/>
@@ -807,8 +816,6 @@
         </w:rPr>
         <w:t>SEPTIEMBRE</w:t>
       </w:r>
-      <w:bookmarkStart w:id="0" w:name="_GoBack"/>
-      <w:bookmarkEnd w:id="0"/>
       <w:r>
         <w:rPr>
           <w:rFonts w:ascii="Arial" w:hAnsi="Arial" w:cs="Arial"/>
@@ -1013,7 +1020,7 @@
           <w:b/>
           <w:sz w:val="28"/>
         </w:rPr>
-        <w:t>____</w:t>
+        <w:t>1</w:t>
       </w:r>
     </w:p>
     <w:p>
@@ -1035,7 +1042,7 @@
           <w:bCs/>
           <w:lang w:eastAsia="es-EC"/>
         </w:rPr>
-        <w:t xml:space="preserve">Actividad # </w:t>
+        <w:t>Actividad #</w:t>
       </w:r>
       <w:r>
         <w:rPr>
@@ -1044,7 +1051,2424 @@
           <w:bCs/>
           <w:lang w:eastAsia="es-EC"/>
         </w:rPr>
-        <w:t>________</w:t>
+        <w:t>1</w:t>
+      </w:r>
+    </w:p>
+    <w:p>
+      <w:pPr>
+        <w:pStyle w:val="Sinespaciado"/>
+        <w:spacing w:line="360" w:lineRule="auto"/>
+        <w:jc w:val="both"/>
+        <w:rPr>
+          <w:rFonts w:ascii="Arial" w:hAnsi="Arial" w:cs="Arial"/>
+          <w:b/>
+          <w:bCs/>
+          <w:lang w:eastAsia="es-EC"/>
+        </w:rPr>
+      </w:pPr>
+    </w:p>
+    <w:p>
+      <w:pPr>
+        <w:pStyle w:val="Sinespaciado"/>
+        <w:numPr>
+          <w:ilvl w:val="0"/>
+          <w:numId w:val="23"/>
+        </w:numPr>
+        <w:spacing w:line="360" w:lineRule="auto"/>
+        <w:jc w:val="both"/>
+        <w:rPr>
+          <w:rFonts w:ascii="Arial" w:hAnsi="Arial" w:cs="Arial"/>
+          <w:b/>
+          <w:bCs/>
+          <w:sz w:val="24"/>
+          <w:szCs w:val="24"/>
+          <w:lang w:eastAsia="es-EC"/>
+        </w:rPr>
+      </w:pPr>
+      <w:r>
+        <w:rPr>
+          <w:rFonts w:ascii="Arial" w:hAnsi="Arial" w:cs="Arial"/>
+          <w:b/>
+          <w:bCs/>
+          <w:sz w:val="24"/>
+          <w:szCs w:val="24"/>
+          <w:lang w:eastAsia="es-EC"/>
+        </w:rPr>
+        <w:t>INTRODUCCIÓN</w:t>
+      </w:r>
+    </w:p>
+    <w:p>
+      <w:pPr>
+        <w:pStyle w:val="Sinespaciado"/>
+        <w:spacing w:line="360" w:lineRule="auto"/>
+        <w:jc w:val="both"/>
+        <w:rPr>
+          <w:rFonts w:ascii="Arial" w:hAnsi="Arial" w:cs="Arial"/>
+          <w:sz w:val="24"/>
+          <w:szCs w:val="24"/>
+          <w:lang w:eastAsia="es-EC"/>
+        </w:rPr>
+      </w:pPr>
+      <w:r>
+        <w:rPr>
+          <w:rFonts w:ascii="Arial" w:hAnsi="Arial" w:cs="Arial"/>
+          <w:sz w:val="24"/>
+          <w:szCs w:val="24"/>
+          <w:lang w:eastAsia="es-EC"/>
+        </w:rPr>
+        <w:t xml:space="preserve">Los refugios de animales reciben a diario reportes de perros, gatos y fauna silvestre en situación de riesgo. Sin un sistema organizado, la información se </w:t>
+      </w:r>
+      <w:r>
+        <w:rPr>
+          <w:rFonts w:ascii="Arial" w:hAnsi="Arial" w:cs="Arial"/>
+          <w:sz w:val="24"/>
+          <w:szCs w:val="24"/>
+          <w:lang w:eastAsia="es-EC"/>
+        </w:rPr>
+        <w:t>distorsiona,</w:t>
+      </w:r>
+      <w:r>
+        <w:rPr>
+          <w:rFonts w:ascii="Arial" w:hAnsi="Arial" w:cs="Arial"/>
+          <w:sz w:val="24"/>
+          <w:szCs w:val="24"/>
+          <w:lang w:eastAsia="es-EC"/>
+        </w:rPr>
+        <w:t xml:space="preserve"> no se sabe quién atiende cada caso, en qué estado se encuentra ni cuándo </w:t>
+      </w:r>
+      <w:r>
+        <w:rPr>
+          <w:rFonts w:ascii="Arial" w:hAnsi="Arial" w:cs="Arial"/>
+          <w:sz w:val="24"/>
+          <w:szCs w:val="24"/>
+          <w:lang w:eastAsia="es-EC"/>
+        </w:rPr>
+        <w:t xml:space="preserve">se realiza el </w:t>
+      </w:r>
+      <w:r>
+        <w:rPr>
+          <w:rFonts w:ascii="Arial" w:hAnsi="Arial" w:cs="Arial"/>
+          <w:sz w:val="24"/>
+          <w:szCs w:val="24"/>
+          <w:lang w:eastAsia="es-EC"/>
+        </w:rPr>
+        <w:t>cambi</w:t>
+      </w:r>
+      <w:r>
+        <w:rPr>
+          <w:rFonts w:ascii="Arial" w:hAnsi="Arial" w:cs="Arial"/>
+          <w:sz w:val="24"/>
+          <w:szCs w:val="24"/>
+          <w:lang w:eastAsia="es-EC"/>
+        </w:rPr>
+        <w:t>o</w:t>
+      </w:r>
+      <w:r>
+        <w:rPr>
+          <w:rFonts w:ascii="Arial" w:hAnsi="Arial" w:cs="Arial"/>
+          <w:sz w:val="24"/>
+          <w:szCs w:val="24"/>
+          <w:lang w:eastAsia="es-EC"/>
+        </w:rPr>
+        <w:t>. E</w:t>
+      </w:r>
+      <w:r>
+        <w:rPr>
+          <w:rFonts w:ascii="Arial" w:hAnsi="Arial" w:cs="Arial"/>
+          <w:sz w:val="24"/>
+          <w:szCs w:val="24"/>
+          <w:lang w:eastAsia="es-EC"/>
+        </w:rPr>
+        <w:t xml:space="preserve">n el presente </w:t>
+      </w:r>
+      <w:r>
+        <w:rPr>
+          <w:rFonts w:ascii="Arial" w:hAnsi="Arial" w:cs="Arial"/>
+          <w:sz w:val="24"/>
+          <w:szCs w:val="24"/>
+          <w:lang w:eastAsia="es-EC"/>
+        </w:rPr>
+        <w:t>documento</w:t>
+      </w:r>
+      <w:r>
+        <w:rPr>
+          <w:rFonts w:ascii="Arial" w:hAnsi="Arial" w:cs="Arial"/>
+          <w:sz w:val="24"/>
+          <w:szCs w:val="24"/>
+          <w:lang w:eastAsia="es-EC"/>
+        </w:rPr>
+        <w:t xml:space="preserve"> se</w:t>
+      </w:r>
+      <w:r>
+        <w:rPr>
+          <w:rFonts w:ascii="Arial" w:hAnsi="Arial" w:cs="Arial"/>
+          <w:sz w:val="24"/>
+          <w:szCs w:val="24"/>
+          <w:lang w:eastAsia="es-EC"/>
+        </w:rPr>
+        <w:t xml:space="preserve"> presenta el diseño de </w:t>
+      </w:r>
+      <w:r>
+        <w:rPr>
+          <w:rFonts w:ascii="Arial" w:hAnsi="Arial" w:cs="Arial"/>
+          <w:sz w:val="24"/>
+          <w:szCs w:val="24"/>
+          <w:lang w:eastAsia="es-EC"/>
+        </w:rPr>
+        <w:t>un Sistema de Control de Rescate y Adopción Animal que permite registrar ingresos, asignar voluntarios o veterinarios responsables y gestionar el ciclo de vida de cada caso (</w:t>
+      </w:r>
+      <w:r>
+        <w:rPr>
+          <w:rFonts w:ascii="Arial" w:hAnsi="Arial" w:cs="Arial"/>
+          <w:sz w:val="24"/>
+          <w:szCs w:val="24"/>
+          <w:lang w:eastAsia="es-EC"/>
+        </w:rPr>
+        <w:t>r</w:t>
+      </w:r>
+      <w:r>
+        <w:rPr>
+          <w:rFonts w:ascii="Arial" w:hAnsi="Arial" w:cs="Arial"/>
+          <w:sz w:val="24"/>
+          <w:szCs w:val="24"/>
+          <w:lang w:eastAsia="es-EC"/>
+        </w:rPr>
+        <w:t>escatado,</w:t>
+      </w:r>
+      <w:r>
+        <w:rPr>
+          <w:rFonts w:ascii="Arial" w:hAnsi="Arial" w:cs="Arial"/>
+          <w:sz w:val="24"/>
+          <w:szCs w:val="24"/>
+          <w:lang w:eastAsia="es-EC"/>
+        </w:rPr>
+        <w:t xml:space="preserve"> en t</w:t>
+      </w:r>
+      <w:r>
+        <w:rPr>
+          <w:rFonts w:ascii="Arial" w:hAnsi="Arial" w:cs="Arial"/>
+          <w:sz w:val="24"/>
+          <w:szCs w:val="24"/>
+          <w:lang w:eastAsia="es-EC"/>
+        </w:rPr>
+        <w:t xml:space="preserve">ratamiento, </w:t>
+      </w:r>
+      <w:r>
+        <w:rPr>
+          <w:rFonts w:ascii="Arial" w:hAnsi="Arial" w:cs="Arial"/>
+          <w:sz w:val="24"/>
+          <w:szCs w:val="24"/>
+          <w:lang w:eastAsia="es-EC"/>
+        </w:rPr>
+        <w:t>en a</w:t>
+      </w:r>
+      <w:r>
+        <w:rPr>
+          <w:rFonts w:ascii="Arial" w:hAnsi="Arial" w:cs="Arial"/>
+          <w:sz w:val="24"/>
+          <w:szCs w:val="24"/>
+          <w:lang w:eastAsia="es-EC"/>
+        </w:rPr>
+        <w:t xml:space="preserve">dopción y </w:t>
+      </w:r>
+      <w:r>
+        <w:rPr>
+          <w:rFonts w:ascii="Arial" w:hAnsi="Arial" w:cs="Arial"/>
+          <w:sz w:val="24"/>
+          <w:szCs w:val="24"/>
+          <w:lang w:eastAsia="es-EC"/>
+        </w:rPr>
+        <w:t>a</w:t>
+      </w:r>
+      <w:r>
+        <w:rPr>
+          <w:rFonts w:ascii="Arial" w:hAnsi="Arial" w:cs="Arial"/>
+          <w:sz w:val="24"/>
+          <w:szCs w:val="24"/>
+          <w:lang w:eastAsia="es-EC"/>
+        </w:rPr>
+        <w:t>doptado).</w:t>
+      </w:r>
+    </w:p>
+    <w:p>
+      <w:pPr>
+        <w:pStyle w:val="Sinespaciado"/>
+        <w:spacing w:line="360" w:lineRule="auto"/>
+        <w:jc w:val="both"/>
+        <w:rPr>
+          <w:rFonts w:ascii="Arial" w:hAnsi="Arial" w:cs="Arial"/>
+          <w:sz w:val="24"/>
+          <w:szCs w:val="24"/>
+          <w:lang w:eastAsia="es-EC"/>
+        </w:rPr>
+      </w:pPr>
+      <w:r>
+        <w:rPr>
+          <w:rFonts w:ascii="Arial" w:hAnsi="Arial" w:cs="Arial"/>
+          <w:sz w:val="24"/>
+          <w:szCs w:val="24"/>
+          <w:lang w:eastAsia="es-EC"/>
+        </w:rPr>
+        <w:t xml:space="preserve">El diseño se apoya en tres pilares: </w:t>
+      </w:r>
+    </w:p>
+    <w:p>
+      <w:pPr>
+        <w:pStyle w:val="Sinespaciado"/>
+        <w:numPr>
+          <w:ilvl w:val="0"/>
+          <w:numId w:val="24"/>
+        </w:numPr>
+        <w:spacing w:line="360" w:lineRule="auto"/>
+        <w:jc w:val="both"/>
+        <w:rPr>
+          <w:rFonts w:ascii="Arial" w:hAnsi="Arial" w:cs="Arial"/>
+          <w:sz w:val="24"/>
+          <w:szCs w:val="24"/>
+          <w:lang w:eastAsia="es-EC"/>
+        </w:rPr>
+      </w:pPr>
+      <w:r>
+        <w:rPr>
+          <w:rFonts w:ascii="Arial" w:hAnsi="Arial" w:cs="Arial"/>
+          <w:sz w:val="24"/>
+          <w:szCs w:val="24"/>
+          <w:lang w:eastAsia="es-EC"/>
+        </w:rPr>
+        <w:t>A</w:t>
+      </w:r>
+      <w:r>
+        <w:rPr>
+          <w:rFonts w:ascii="Arial" w:hAnsi="Arial" w:cs="Arial"/>
+          <w:sz w:val="24"/>
+          <w:szCs w:val="24"/>
+          <w:lang w:eastAsia="es-EC"/>
+        </w:rPr>
+        <w:t>nálisis claro de actores y requerimientos</w:t>
+      </w:r>
+      <w:r>
+        <w:rPr>
+          <w:rFonts w:ascii="Arial" w:hAnsi="Arial" w:cs="Arial"/>
+          <w:sz w:val="24"/>
+          <w:szCs w:val="24"/>
+          <w:lang w:eastAsia="es-EC"/>
+        </w:rPr>
+        <w:t>.</w:t>
+      </w:r>
+    </w:p>
+    <w:p>
+      <w:pPr>
+        <w:pStyle w:val="Sinespaciado"/>
+        <w:numPr>
+          <w:ilvl w:val="0"/>
+          <w:numId w:val="24"/>
+        </w:numPr>
+        <w:spacing w:line="360" w:lineRule="auto"/>
+        <w:jc w:val="both"/>
+        <w:rPr>
+          <w:rFonts w:ascii="Arial" w:hAnsi="Arial" w:cs="Arial"/>
+          <w:sz w:val="24"/>
+          <w:szCs w:val="24"/>
+          <w:lang w:eastAsia="es-EC"/>
+        </w:rPr>
+      </w:pPr>
+      <w:r>
+        <w:rPr>
+          <w:rFonts w:ascii="Arial" w:hAnsi="Arial" w:cs="Arial"/>
+          <w:sz w:val="24"/>
+          <w:szCs w:val="24"/>
+          <w:lang w:eastAsia="es-EC"/>
+        </w:rPr>
+        <w:t>C</w:t>
+      </w:r>
+      <w:r>
+        <w:rPr>
+          <w:rFonts w:ascii="Arial" w:hAnsi="Arial" w:cs="Arial"/>
+          <w:sz w:val="24"/>
+          <w:szCs w:val="24"/>
+          <w:lang w:eastAsia="es-EC"/>
+        </w:rPr>
+        <w:t>uatro patrones de diseño de software (</w:t>
+      </w:r>
+      <w:r>
+        <w:rPr>
+          <w:rFonts w:ascii="Arial" w:hAnsi="Arial" w:cs="Arial"/>
+          <w:sz w:val="24"/>
+          <w:szCs w:val="24"/>
+          <w:lang w:eastAsia="es-EC"/>
+        </w:rPr>
+        <w:t xml:space="preserve">semifallo, </w:t>
+      </w:r>
+      <w:r>
+        <w:rPr>
+          <w:rFonts w:ascii="Arial" w:hAnsi="Arial" w:cs="Arial"/>
+          <w:sz w:val="24"/>
+          <w:szCs w:val="24"/>
+          <w:lang w:eastAsia="es-EC"/>
+        </w:rPr>
+        <w:t>observadora, método de fábrica y MVC</w:t>
+      </w:r>
+      <w:r>
+        <w:rPr>
+          <w:rFonts w:ascii="Arial" w:hAnsi="Arial" w:cs="Arial"/>
+          <w:sz w:val="24"/>
+          <w:szCs w:val="24"/>
+          <w:lang w:eastAsia="es-EC"/>
+        </w:rPr>
+        <w:t>) aplicados a problemas concretos del refugio</w:t>
+      </w:r>
+    </w:p>
+    <w:p>
+      <w:pPr>
+        <w:pStyle w:val="Sinespaciado"/>
+        <w:numPr>
+          <w:ilvl w:val="0"/>
+          <w:numId w:val="24"/>
+        </w:numPr>
+        <w:spacing w:line="360" w:lineRule="auto"/>
+        <w:jc w:val="both"/>
+        <w:rPr>
+          <w:rFonts w:ascii="Arial" w:hAnsi="Arial" w:cs="Arial"/>
+          <w:sz w:val="24"/>
+          <w:szCs w:val="24"/>
+          <w:lang w:eastAsia="es-EC"/>
+        </w:rPr>
+      </w:pPr>
+      <w:r>
+        <w:rPr>
+          <w:rFonts w:ascii="Arial" w:hAnsi="Arial" w:cs="Arial"/>
+          <w:sz w:val="24"/>
+          <w:szCs w:val="24"/>
+          <w:lang w:eastAsia="es-EC"/>
+        </w:rPr>
+        <w:t>R</w:t>
+      </w:r>
+      <w:r>
+        <w:rPr>
+          <w:rFonts w:ascii="Arial" w:hAnsi="Arial" w:cs="Arial"/>
+          <w:sz w:val="24"/>
+          <w:szCs w:val="24"/>
+          <w:lang w:eastAsia="es-EC"/>
+        </w:rPr>
+        <w:t xml:space="preserve">epositorio en GitHub organizado bajo el modelo </w:t>
+      </w:r>
+      <w:proofErr w:type="spellStart"/>
+      <w:r>
+        <w:rPr>
+          <w:rFonts w:ascii="Arial" w:hAnsi="Arial" w:cs="Arial"/>
+          <w:sz w:val="24"/>
+          <w:szCs w:val="24"/>
+          <w:lang w:eastAsia="es-EC"/>
+        </w:rPr>
+        <w:t>Gitflow</w:t>
+      </w:r>
+      <w:proofErr w:type="spellEnd"/>
+      <w:r>
+        <w:rPr>
+          <w:rFonts w:ascii="Arial" w:hAnsi="Arial" w:cs="Arial"/>
+          <w:sz w:val="24"/>
+          <w:szCs w:val="24"/>
+          <w:lang w:eastAsia="es-EC"/>
+        </w:rPr>
+        <w:t>, que garantiza la trazabilidad de las versiones del proyecto.</w:t>
+      </w:r>
+    </w:p>
+    <w:p>
+      <w:pPr>
+        <w:pStyle w:val="Sinespaciado"/>
+        <w:spacing w:line="360" w:lineRule="auto"/>
+        <w:ind w:left="720"/>
+        <w:jc w:val="both"/>
+        <w:rPr>
+          <w:rFonts w:ascii="Arial" w:hAnsi="Arial" w:cs="Arial"/>
+          <w:sz w:val="24"/>
+          <w:szCs w:val="24"/>
+          <w:lang w:eastAsia="es-EC"/>
+        </w:rPr>
+      </w:pPr>
+    </w:p>
+    <w:p>
+      <w:pPr>
+        <w:rPr>
+          <w:rFonts w:ascii="Arial" w:hAnsi="Arial" w:cs="Arial"/>
+          <w:b/>
+          <w:bCs/>
+          <w:sz w:val="24"/>
+          <w:szCs w:val="24"/>
+          <w:lang w:eastAsia="es-EC"/>
+        </w:rPr>
+      </w:pPr>
+      <w:r>
+        <w:rPr>
+          <w:rFonts w:ascii="Arial" w:hAnsi="Arial" w:cs="Arial"/>
+          <w:b/>
+          <w:bCs/>
+          <w:sz w:val="24"/>
+          <w:szCs w:val="24"/>
+          <w:lang w:eastAsia="es-EC"/>
+        </w:rPr>
+        <w:t>2. ANÁLISIS DEL PROBLEMA</w:t>
+      </w:r>
+    </w:p>
+    <w:p>
+      <w:pPr>
+        <w:rPr>
+          <w:rFonts w:ascii="Arial" w:hAnsi="Arial" w:cs="Arial"/>
+          <w:b/>
+          <w:bCs/>
+          <w:sz w:val="24"/>
+          <w:szCs w:val="24"/>
+          <w:lang w:eastAsia="es-EC"/>
+        </w:rPr>
+      </w:pPr>
+      <w:r>
+        <w:rPr>
+          <w:rFonts w:ascii="Arial" w:hAnsi="Arial" w:cs="Arial"/>
+          <w:b/>
+          <w:bCs/>
+          <w:sz w:val="24"/>
+          <w:szCs w:val="24"/>
+          <w:lang w:eastAsia="es-EC"/>
+        </w:rPr>
+        <w:t>2.1 Descripción y alcance</w:t>
+      </w:r>
+    </w:p>
+    <w:p>
+      <w:pPr>
+        <w:jc w:val="both"/>
+        <w:rPr>
+          <w:rFonts w:ascii="Arial" w:hAnsi="Arial" w:cs="Arial"/>
+          <w:sz w:val="24"/>
+          <w:szCs w:val="24"/>
+          <w:lang w:eastAsia="es-EC"/>
+        </w:rPr>
+      </w:pPr>
+      <w:r>
+        <w:rPr>
+          <w:rFonts w:ascii="Arial" w:hAnsi="Arial" w:cs="Arial"/>
+          <w:sz w:val="24"/>
+          <w:szCs w:val="24"/>
+          <w:lang w:eastAsia="es-EC"/>
+        </w:rPr>
+        <w:t>El sistema gestiona casos de rescate desde que un ciudadano reporta un animal hasta que este es adoptado. Dentro del alcance se encuentran: el registro del caso, la clasificación por especie, la asignación de un responsable, el seguimiento del estado y las notificaciones automáticas a los voluntarios. Quedan fuera del alcance de esta etapa los pagos, las donaciones y la facturación veterinaria.</w:t>
+      </w:r>
+    </w:p>
+    <w:p>
+      <w:pPr>
+        <w:rPr>
+          <w:rFonts w:ascii="Arial" w:hAnsi="Arial" w:cs="Arial"/>
+          <w:b/>
+          <w:bCs/>
+          <w:sz w:val="24"/>
+          <w:szCs w:val="24"/>
+          <w:lang w:eastAsia="es-EC"/>
+        </w:rPr>
+      </w:pPr>
+      <w:r>
+        <w:rPr>
+          <w:rFonts w:ascii="Arial" w:hAnsi="Arial" w:cs="Arial"/>
+          <w:b/>
+          <w:bCs/>
+          <w:sz w:val="24"/>
+          <w:szCs w:val="24"/>
+          <w:lang w:eastAsia="es-EC"/>
+        </w:rPr>
+        <w:t>2.2 Actores del sistema</w:t>
+      </w:r>
+    </w:p>
+    <w:tbl>
+      <w:tblPr>
+        <w:tblStyle w:val="Tablaconcuadrcula"/>
+        <w:tblW w:w="9067" w:type="dxa"/>
+        <w:tblLook w:val="04A0" w:firstRow="1" w:lastRow="0" w:firstColumn="1" w:lastColumn="0" w:noHBand="0" w:noVBand="1"/>
+      </w:tblPr>
+      <w:tblGrid>
+        <w:gridCol w:w="2831"/>
+        <w:gridCol w:w="2831"/>
+        <w:gridCol w:w="3405"/>
+      </w:tblGrid>
+      <w:tr>
+        <w:tc>
+          <w:tcPr>
+            <w:tcW w:w="2831" w:type="dxa"/>
+          </w:tcPr>
+          <w:p>
+            <w:pPr>
+              <w:jc w:val="center"/>
+              <w:rPr>
+                <w:rFonts w:ascii="Arial" w:hAnsi="Arial" w:cs="Arial"/>
+                <w:b/>
+                <w:bCs/>
+                <w:sz w:val="24"/>
+                <w:szCs w:val="24"/>
+              </w:rPr>
+            </w:pPr>
+            <w:r>
+              <w:rPr>
+                <w:rFonts w:ascii="Arial" w:hAnsi="Arial" w:cs="Arial"/>
+                <w:b/>
+                <w:bCs/>
+                <w:sz w:val="24"/>
+                <w:szCs w:val="24"/>
+              </w:rPr>
+              <w:t>Actor</w:t>
+            </w:r>
+          </w:p>
+        </w:tc>
+        <w:tc>
+          <w:tcPr>
+            <w:tcW w:w="2831" w:type="dxa"/>
+          </w:tcPr>
+          <w:p>
+            <w:pPr>
+              <w:jc w:val="center"/>
+              <w:rPr>
+                <w:rFonts w:ascii="Arial" w:hAnsi="Arial" w:cs="Arial"/>
+                <w:b/>
+                <w:bCs/>
+                <w:sz w:val="24"/>
+                <w:szCs w:val="24"/>
+              </w:rPr>
+            </w:pPr>
+            <w:r>
+              <w:rPr>
+                <w:rFonts w:ascii="Arial" w:hAnsi="Arial" w:cs="Arial"/>
+                <w:b/>
+                <w:bCs/>
+                <w:sz w:val="24"/>
+                <w:szCs w:val="24"/>
+              </w:rPr>
+              <w:t>Descripción</w:t>
+            </w:r>
+          </w:p>
+        </w:tc>
+        <w:tc>
+          <w:tcPr>
+            <w:tcW w:w="3405" w:type="dxa"/>
+          </w:tcPr>
+          <w:p>
+            <w:pPr>
+              <w:jc w:val="center"/>
+              <w:rPr>
+                <w:rFonts w:ascii="Arial" w:hAnsi="Arial" w:cs="Arial"/>
+                <w:b/>
+                <w:bCs/>
+                <w:sz w:val="24"/>
+                <w:szCs w:val="24"/>
+              </w:rPr>
+            </w:pPr>
+            <w:r>
+              <w:rPr>
+                <w:rFonts w:ascii="Arial" w:hAnsi="Arial" w:cs="Arial"/>
+                <w:b/>
+                <w:bCs/>
+                <w:sz w:val="24"/>
+                <w:szCs w:val="24"/>
+              </w:rPr>
+              <w:t>Responsabilidades principales</w:t>
+            </w:r>
+          </w:p>
+        </w:tc>
+      </w:tr>
+      <w:tr>
+        <w:tc>
+          <w:tcPr>
+            <w:tcW w:w="2831" w:type="dxa"/>
+          </w:tcPr>
+          <w:p>
+            <w:pPr>
+              <w:rPr>
+                <w:rFonts w:ascii="Arial" w:hAnsi="Arial" w:cs="Arial"/>
+                <w:sz w:val="24"/>
+                <w:szCs w:val="24"/>
+              </w:rPr>
+            </w:pPr>
+            <w:r>
+              <w:rPr>
+                <w:rFonts w:ascii="Arial" w:hAnsi="Arial" w:cs="Arial"/>
+                <w:sz w:val="24"/>
+                <w:szCs w:val="24"/>
+              </w:rPr>
+              <w:t>Ciudadano / Reportante</w:t>
+            </w:r>
+          </w:p>
+        </w:tc>
+        <w:tc>
+          <w:tcPr>
+            <w:tcW w:w="2831" w:type="dxa"/>
+          </w:tcPr>
+          <w:p>
+            <w:pPr>
+              <w:rPr>
+                <w:rFonts w:ascii="Arial" w:hAnsi="Arial" w:cs="Arial"/>
+                <w:sz w:val="24"/>
+                <w:szCs w:val="24"/>
+              </w:rPr>
+            </w:pPr>
+            <w:r>
+              <w:rPr>
+                <w:rFonts w:ascii="Arial" w:hAnsi="Arial" w:cs="Arial"/>
+                <w:sz w:val="24"/>
+                <w:szCs w:val="24"/>
+              </w:rPr>
+              <w:t>Persona externa que encuentra o conoce a un animal en riesgo</w:t>
+            </w:r>
+            <w:r>
+              <w:rPr>
+                <w:rFonts w:ascii="Arial" w:hAnsi="Arial" w:cs="Arial"/>
+                <w:sz w:val="24"/>
+                <w:szCs w:val="24"/>
+              </w:rPr>
+              <w:t>.</w:t>
+            </w:r>
+          </w:p>
+        </w:tc>
+        <w:tc>
+          <w:tcPr>
+            <w:tcW w:w="3405" w:type="dxa"/>
+          </w:tcPr>
+          <w:p>
+            <w:pPr>
+              <w:rPr>
+                <w:rFonts w:ascii="Arial" w:hAnsi="Arial" w:cs="Arial"/>
+                <w:sz w:val="24"/>
+                <w:szCs w:val="24"/>
+              </w:rPr>
+            </w:pPr>
+            <w:r>
+              <w:rPr>
+                <w:rFonts w:ascii="Arial" w:hAnsi="Arial" w:cs="Arial"/>
+                <w:sz w:val="24"/>
+                <w:szCs w:val="24"/>
+              </w:rPr>
+              <w:t>Reportar el ingreso de un animal y consultar el estado de su reporte.</w:t>
+            </w:r>
+          </w:p>
+        </w:tc>
+      </w:tr>
+      <w:tr>
+        <w:tc>
+          <w:tcPr>
+            <w:tcW w:w="2831" w:type="dxa"/>
+          </w:tcPr>
+          <w:p>
+            <w:pPr>
+              <w:rPr>
+                <w:rFonts w:ascii="Arial" w:hAnsi="Arial" w:cs="Arial"/>
+                <w:sz w:val="24"/>
+                <w:szCs w:val="24"/>
+              </w:rPr>
+            </w:pPr>
+            <w:r>
+              <w:rPr>
+                <w:rFonts w:ascii="Arial" w:hAnsi="Arial" w:cs="Arial"/>
+                <w:sz w:val="24"/>
+                <w:szCs w:val="24"/>
+              </w:rPr>
+              <w:t>Voluntario / Veterinario</w:t>
+            </w:r>
+          </w:p>
+        </w:tc>
+        <w:tc>
+          <w:tcPr>
+            <w:tcW w:w="2831" w:type="dxa"/>
+          </w:tcPr>
+          <w:p>
+            <w:pPr>
+              <w:rPr>
+                <w:rFonts w:ascii="Arial" w:hAnsi="Arial" w:cs="Arial"/>
+                <w:sz w:val="24"/>
+                <w:szCs w:val="24"/>
+              </w:rPr>
+            </w:pPr>
+            <w:r>
+              <w:rPr>
+                <w:rFonts w:ascii="Arial" w:hAnsi="Arial" w:cs="Arial"/>
+                <w:sz w:val="24"/>
+                <w:szCs w:val="24"/>
+              </w:rPr>
+              <w:t>Personal que atiende y cuida a los animales rescatados.</w:t>
+            </w:r>
+            <w:r>
+              <w:rPr>
+                <w:rFonts w:ascii="Arial" w:hAnsi="Arial" w:cs="Arial"/>
+                <w:sz w:val="24"/>
+                <w:szCs w:val="24"/>
+              </w:rPr>
+              <w:tab/>
+            </w:r>
+          </w:p>
+        </w:tc>
+        <w:tc>
+          <w:tcPr>
+            <w:tcW w:w="3405" w:type="dxa"/>
+          </w:tcPr>
+          <w:p>
+            <w:pPr>
+              <w:rPr>
+                <w:rFonts w:ascii="Arial" w:hAnsi="Arial" w:cs="Arial"/>
+                <w:sz w:val="24"/>
+                <w:szCs w:val="24"/>
+              </w:rPr>
+            </w:pPr>
+            <w:r>
+              <w:rPr>
+                <w:rFonts w:ascii="Arial" w:hAnsi="Arial" w:cs="Arial"/>
+                <w:sz w:val="24"/>
+                <w:szCs w:val="24"/>
+              </w:rPr>
+              <w:t>Recibir notificaciones de nuevos rescates, aceptar casos, actualizar el estado y registrar el historial clínico.</w:t>
+            </w:r>
+          </w:p>
+        </w:tc>
+      </w:tr>
+      <w:tr>
+        <w:tc>
+          <w:tcPr>
+            <w:tcW w:w="2831" w:type="dxa"/>
+          </w:tcPr>
+          <w:p>
+            <w:pPr>
+              <w:rPr>
+                <w:rFonts w:ascii="Arial" w:hAnsi="Arial" w:cs="Arial"/>
+                <w:sz w:val="24"/>
+                <w:szCs w:val="24"/>
+              </w:rPr>
+            </w:pPr>
+            <w:r>
+              <w:rPr>
+                <w:rFonts w:ascii="Arial" w:hAnsi="Arial" w:cs="Arial"/>
+                <w:sz w:val="24"/>
+                <w:szCs w:val="24"/>
+              </w:rPr>
+              <w:t>Administrador del refugio</w:t>
+            </w:r>
+          </w:p>
+        </w:tc>
+        <w:tc>
+          <w:tcPr>
+            <w:tcW w:w="2831" w:type="dxa"/>
+          </w:tcPr>
+          <w:p>
+            <w:pPr>
+              <w:rPr>
+                <w:rFonts w:ascii="Arial" w:hAnsi="Arial" w:cs="Arial"/>
+                <w:sz w:val="24"/>
+                <w:szCs w:val="24"/>
+              </w:rPr>
+            </w:pPr>
+            <w:r>
+              <w:rPr>
+                <w:rFonts w:ascii="Arial" w:hAnsi="Arial" w:cs="Arial"/>
+                <w:sz w:val="24"/>
+                <w:szCs w:val="24"/>
+              </w:rPr>
+              <w:t>Responsable de la operación del refugio.</w:t>
+            </w:r>
+          </w:p>
+        </w:tc>
+        <w:tc>
+          <w:tcPr>
+            <w:tcW w:w="3405" w:type="dxa"/>
+          </w:tcPr>
+          <w:p>
+            <w:pPr>
+              <w:rPr>
+                <w:rFonts w:ascii="Arial" w:hAnsi="Arial" w:cs="Arial"/>
+                <w:sz w:val="24"/>
+                <w:szCs w:val="24"/>
+              </w:rPr>
+            </w:pPr>
+            <w:r>
+              <w:rPr>
+                <w:rFonts w:ascii="Arial" w:hAnsi="Arial" w:cs="Arial"/>
+                <w:sz w:val="24"/>
+                <w:szCs w:val="24"/>
+              </w:rPr>
+              <w:t xml:space="preserve">Crear y categorizar casos, asignar responsables, </w:t>
+            </w:r>
+            <w:r>
+              <w:rPr>
+                <w:rFonts w:ascii="Arial" w:hAnsi="Arial" w:cs="Arial"/>
+                <w:sz w:val="24"/>
+                <w:szCs w:val="24"/>
+              </w:rPr>
+              <w:lastRenderedPageBreak/>
+              <w:t>gestionar adopciones y generar reportes.</w:t>
+            </w:r>
+          </w:p>
+        </w:tc>
+      </w:tr>
+    </w:tbl>
+    <w:p>
+      <w:pPr>
+        <w:rPr>
+          <w:rFonts w:ascii="Arial" w:hAnsi="Arial" w:cs="Arial"/>
+          <w:b/>
+          <w:bCs/>
+          <w:sz w:val="24"/>
+          <w:szCs w:val="24"/>
+          <w:lang w:eastAsia="es-EC"/>
+        </w:rPr>
+      </w:pPr>
+    </w:p>
+    <w:p>
+      <w:pPr>
+        <w:rPr>
+          <w:rFonts w:ascii="Arial" w:hAnsi="Arial" w:cs="Arial"/>
+          <w:b/>
+          <w:bCs/>
+          <w:sz w:val="24"/>
+          <w:szCs w:val="24"/>
+          <w:lang w:eastAsia="es-EC"/>
+        </w:rPr>
+      </w:pPr>
+      <w:r>
+        <w:rPr>
+          <w:rFonts w:ascii="Arial" w:hAnsi="Arial" w:cs="Arial"/>
+          <w:b/>
+          <w:bCs/>
+          <w:sz w:val="24"/>
+          <w:szCs w:val="24"/>
+          <w:lang w:eastAsia="es-EC"/>
+        </w:rPr>
+        <w:t>2.3 Requerimientos funcionales</w:t>
+      </w:r>
+    </w:p>
+    <w:tbl>
+      <w:tblPr>
+        <w:tblStyle w:val="Tablaconcuadrcula"/>
+        <w:tblW w:w="9026" w:type="dxa"/>
+        <w:tblLook w:val="0000" w:firstRow="0" w:lastRow="0" w:firstColumn="0" w:lastColumn="0" w:noHBand="0" w:noVBand="0"/>
+      </w:tblPr>
+      <w:tblGrid>
+        <w:gridCol w:w="1129"/>
+        <w:gridCol w:w="3300"/>
+        <w:gridCol w:w="4597"/>
+      </w:tblGrid>
+      <w:tr>
+        <w:tc>
+          <w:tcPr>
+            <w:tcW w:w="1129" w:type="dxa"/>
+          </w:tcPr>
+          <w:p>
+            <w:pPr>
+              <w:jc w:val="center"/>
+              <w:rPr>
+                <w:rFonts w:ascii="Arial" w:hAnsi="Arial" w:cs="Arial"/>
+                <w:b/>
+                <w:bCs/>
+                <w:sz w:val="24"/>
+                <w:szCs w:val="24"/>
+              </w:rPr>
+            </w:pPr>
+            <w:r>
+              <w:rPr>
+                <w:rFonts w:ascii="Arial" w:hAnsi="Arial" w:cs="Arial"/>
+                <w:b/>
+                <w:bCs/>
+                <w:sz w:val="24"/>
+                <w:szCs w:val="24"/>
+              </w:rPr>
+              <w:t>Código</w:t>
+            </w:r>
+          </w:p>
+        </w:tc>
+        <w:tc>
+          <w:tcPr>
+            <w:tcW w:w="3300" w:type="dxa"/>
+          </w:tcPr>
+          <w:p>
+            <w:pPr>
+              <w:jc w:val="center"/>
+              <w:rPr>
+                <w:rFonts w:ascii="Arial" w:hAnsi="Arial" w:cs="Arial"/>
+                <w:b/>
+                <w:bCs/>
+                <w:color w:val="000000" w:themeColor="text1"/>
+                <w:sz w:val="24"/>
+                <w:szCs w:val="24"/>
+              </w:rPr>
+            </w:pPr>
+            <w:r>
+              <w:rPr>
+                <w:rFonts w:ascii="Arial" w:eastAsia="Arial" w:hAnsi="Arial" w:cs="Arial"/>
+                <w:b/>
+                <w:bCs/>
+                <w:color w:val="000000" w:themeColor="text1"/>
+                <w:sz w:val="24"/>
+                <w:szCs w:val="24"/>
+              </w:rPr>
+              <w:t>Requerimiento</w:t>
+            </w:r>
+          </w:p>
+        </w:tc>
+        <w:tc>
+          <w:tcPr>
+            <w:tcW w:w="4597" w:type="dxa"/>
+          </w:tcPr>
+          <w:p>
+            <w:pPr>
+              <w:jc w:val="center"/>
+              <w:rPr>
+                <w:rFonts w:ascii="Arial" w:hAnsi="Arial" w:cs="Arial"/>
+                <w:b/>
+                <w:bCs/>
+                <w:color w:val="000000" w:themeColor="text1"/>
+                <w:sz w:val="24"/>
+                <w:szCs w:val="24"/>
+              </w:rPr>
+            </w:pPr>
+            <w:r>
+              <w:rPr>
+                <w:rFonts w:ascii="Arial" w:eastAsia="Arial" w:hAnsi="Arial" w:cs="Arial"/>
+                <w:b/>
+                <w:bCs/>
+                <w:color w:val="000000" w:themeColor="text1"/>
+                <w:sz w:val="24"/>
+                <w:szCs w:val="24"/>
+              </w:rPr>
+              <w:t>Descripción</w:t>
+            </w:r>
+          </w:p>
+        </w:tc>
+      </w:tr>
+      <w:tr>
+        <w:tc>
+          <w:tcPr>
+            <w:tcW w:w="1129" w:type="dxa"/>
+          </w:tcPr>
+          <w:p>
+            <w:pPr>
+              <w:rPr>
+                <w:rFonts w:ascii="Arial" w:hAnsi="Arial" w:cs="Arial"/>
+                <w:sz w:val="24"/>
+                <w:szCs w:val="24"/>
+              </w:rPr>
+            </w:pPr>
+            <w:r>
+              <w:rPr>
+                <w:rFonts w:ascii="Arial" w:eastAsia="Arial" w:hAnsi="Arial" w:cs="Arial"/>
+                <w:color w:val="000000"/>
+                <w:sz w:val="24"/>
+                <w:szCs w:val="24"/>
+              </w:rPr>
+              <w:t>RF-01</w:t>
+            </w:r>
+          </w:p>
+        </w:tc>
+        <w:tc>
+          <w:tcPr>
+            <w:tcW w:w="3300" w:type="dxa"/>
+          </w:tcPr>
+          <w:p>
+            <w:pPr>
+              <w:rPr>
+                <w:rFonts w:ascii="Arial" w:hAnsi="Arial" w:cs="Arial"/>
+                <w:sz w:val="24"/>
+                <w:szCs w:val="24"/>
+              </w:rPr>
+            </w:pPr>
+            <w:r>
+              <w:rPr>
+                <w:rFonts w:ascii="Arial" w:eastAsia="Arial" w:hAnsi="Arial" w:cs="Arial"/>
+                <w:color w:val="000000"/>
+                <w:sz w:val="24"/>
+                <w:szCs w:val="24"/>
+              </w:rPr>
+              <w:t>Crear caso de rescate</w:t>
+            </w:r>
+          </w:p>
+        </w:tc>
+        <w:tc>
+          <w:tcPr>
+            <w:tcW w:w="4597" w:type="dxa"/>
+          </w:tcPr>
+          <w:p>
+            <w:pPr>
+              <w:rPr>
+                <w:rFonts w:ascii="Arial" w:hAnsi="Arial" w:cs="Arial"/>
+                <w:sz w:val="24"/>
+                <w:szCs w:val="24"/>
+              </w:rPr>
+            </w:pPr>
+            <w:r>
+              <w:rPr>
+                <w:rFonts w:ascii="Arial" w:eastAsia="Arial" w:hAnsi="Arial" w:cs="Arial"/>
+                <w:color w:val="000000"/>
+                <w:sz w:val="24"/>
+                <w:szCs w:val="24"/>
+              </w:rPr>
+              <w:t>El sistema debe permitir registrar el ingreso de un animal con su ubicación, fecha y descripción.</w:t>
+            </w:r>
+          </w:p>
+        </w:tc>
+      </w:tr>
+      <w:tr>
+        <w:tc>
+          <w:tcPr>
+            <w:tcW w:w="1129" w:type="dxa"/>
+          </w:tcPr>
+          <w:p>
+            <w:pPr>
+              <w:rPr>
+                <w:rFonts w:ascii="Arial" w:hAnsi="Arial" w:cs="Arial"/>
+                <w:sz w:val="24"/>
+                <w:szCs w:val="24"/>
+              </w:rPr>
+            </w:pPr>
+            <w:r>
+              <w:rPr>
+                <w:rFonts w:ascii="Arial" w:eastAsia="Arial" w:hAnsi="Arial" w:cs="Arial"/>
+                <w:color w:val="000000"/>
+                <w:sz w:val="24"/>
+                <w:szCs w:val="24"/>
+              </w:rPr>
+              <w:t>RF-02</w:t>
+            </w:r>
+          </w:p>
+        </w:tc>
+        <w:tc>
+          <w:tcPr>
+            <w:tcW w:w="3300" w:type="dxa"/>
+          </w:tcPr>
+          <w:p>
+            <w:pPr>
+              <w:rPr>
+                <w:rFonts w:ascii="Arial" w:hAnsi="Arial" w:cs="Arial"/>
+                <w:sz w:val="24"/>
+                <w:szCs w:val="24"/>
+              </w:rPr>
+            </w:pPr>
+            <w:r>
+              <w:rPr>
+                <w:rFonts w:ascii="Arial" w:eastAsia="Arial" w:hAnsi="Arial" w:cs="Arial"/>
+                <w:color w:val="000000"/>
+                <w:sz w:val="24"/>
+                <w:szCs w:val="24"/>
+              </w:rPr>
+              <w:t>Categorizar especie</w:t>
+            </w:r>
+          </w:p>
+        </w:tc>
+        <w:tc>
+          <w:tcPr>
+            <w:tcW w:w="4597" w:type="dxa"/>
+          </w:tcPr>
+          <w:p>
+            <w:pPr>
+              <w:rPr>
+                <w:rFonts w:ascii="Arial" w:hAnsi="Arial" w:cs="Arial"/>
+                <w:sz w:val="24"/>
+                <w:szCs w:val="24"/>
+              </w:rPr>
+            </w:pPr>
+            <w:r>
+              <w:rPr>
+                <w:rFonts w:ascii="Arial" w:eastAsia="Arial" w:hAnsi="Arial" w:cs="Arial"/>
+                <w:color w:val="000000"/>
+                <w:sz w:val="24"/>
+                <w:szCs w:val="24"/>
+              </w:rPr>
+              <w:t>Cada caso debe clasificarse como Perro, Gato o Fauna Silvestre y generar un expediente acorde a la especie.</w:t>
+            </w:r>
+          </w:p>
+        </w:tc>
+      </w:tr>
+      <w:tr>
+        <w:tc>
+          <w:tcPr>
+            <w:tcW w:w="1129" w:type="dxa"/>
+          </w:tcPr>
+          <w:p>
+            <w:pPr>
+              <w:rPr>
+                <w:rFonts w:ascii="Arial" w:hAnsi="Arial" w:cs="Arial"/>
+                <w:sz w:val="24"/>
+                <w:szCs w:val="24"/>
+              </w:rPr>
+            </w:pPr>
+            <w:r>
+              <w:rPr>
+                <w:rFonts w:ascii="Arial" w:eastAsia="Arial" w:hAnsi="Arial" w:cs="Arial"/>
+                <w:color w:val="000000"/>
+                <w:sz w:val="24"/>
+                <w:szCs w:val="24"/>
+              </w:rPr>
+              <w:t>RF-03</w:t>
+            </w:r>
+          </w:p>
+        </w:tc>
+        <w:tc>
+          <w:tcPr>
+            <w:tcW w:w="3300" w:type="dxa"/>
+          </w:tcPr>
+          <w:p>
+            <w:pPr>
+              <w:rPr>
+                <w:rFonts w:ascii="Arial" w:hAnsi="Arial" w:cs="Arial"/>
+                <w:sz w:val="24"/>
+                <w:szCs w:val="24"/>
+              </w:rPr>
+            </w:pPr>
+            <w:r>
+              <w:rPr>
+                <w:rFonts w:ascii="Arial" w:eastAsia="Arial" w:hAnsi="Arial" w:cs="Arial"/>
+                <w:color w:val="000000"/>
+                <w:sz w:val="24"/>
+                <w:szCs w:val="24"/>
+              </w:rPr>
+              <w:t>Asignar responsable</w:t>
+            </w:r>
+          </w:p>
+        </w:tc>
+        <w:tc>
+          <w:tcPr>
+            <w:tcW w:w="4597" w:type="dxa"/>
+          </w:tcPr>
+          <w:p>
+            <w:pPr>
+              <w:rPr>
+                <w:rFonts w:ascii="Arial" w:hAnsi="Arial" w:cs="Arial"/>
+                <w:sz w:val="24"/>
+                <w:szCs w:val="24"/>
+              </w:rPr>
+            </w:pPr>
+            <w:r>
+              <w:rPr>
+                <w:rFonts w:ascii="Arial" w:eastAsia="Arial" w:hAnsi="Arial" w:cs="Arial"/>
+                <w:color w:val="000000"/>
+                <w:sz w:val="24"/>
+                <w:szCs w:val="24"/>
+              </w:rPr>
+              <w:t>El administrador debe poder asignar un voluntario o veterinario a cada caso.</w:t>
+            </w:r>
+          </w:p>
+        </w:tc>
+      </w:tr>
+      <w:tr>
+        <w:tc>
+          <w:tcPr>
+            <w:tcW w:w="1129" w:type="dxa"/>
+          </w:tcPr>
+          <w:p>
+            <w:pPr>
+              <w:rPr>
+                <w:rFonts w:ascii="Arial" w:hAnsi="Arial" w:cs="Arial"/>
+                <w:sz w:val="24"/>
+                <w:szCs w:val="24"/>
+              </w:rPr>
+            </w:pPr>
+            <w:r>
+              <w:rPr>
+                <w:rFonts w:ascii="Arial" w:eastAsia="Arial" w:hAnsi="Arial" w:cs="Arial"/>
+                <w:color w:val="000000"/>
+                <w:sz w:val="24"/>
+                <w:szCs w:val="24"/>
+              </w:rPr>
+              <w:t>RF-04</w:t>
+            </w:r>
+          </w:p>
+        </w:tc>
+        <w:tc>
+          <w:tcPr>
+            <w:tcW w:w="3300" w:type="dxa"/>
+          </w:tcPr>
+          <w:p>
+            <w:pPr>
+              <w:rPr>
+                <w:rFonts w:ascii="Arial" w:hAnsi="Arial" w:cs="Arial"/>
+                <w:sz w:val="24"/>
+                <w:szCs w:val="24"/>
+              </w:rPr>
+            </w:pPr>
+            <w:r>
+              <w:rPr>
+                <w:rFonts w:ascii="Arial" w:eastAsia="Arial" w:hAnsi="Arial" w:cs="Arial"/>
+                <w:color w:val="000000"/>
+                <w:sz w:val="24"/>
+                <w:szCs w:val="24"/>
+              </w:rPr>
+              <w:t>Gestionar estados</w:t>
+            </w:r>
+          </w:p>
+        </w:tc>
+        <w:tc>
+          <w:tcPr>
+            <w:tcW w:w="4597" w:type="dxa"/>
+          </w:tcPr>
+          <w:p>
+            <w:pPr>
+              <w:rPr>
+                <w:rFonts w:ascii="Arial" w:hAnsi="Arial" w:cs="Arial"/>
+                <w:sz w:val="24"/>
+                <w:szCs w:val="24"/>
+              </w:rPr>
+            </w:pPr>
+            <w:r>
+              <w:rPr>
+                <w:rFonts w:ascii="Arial" w:eastAsia="Arial" w:hAnsi="Arial" w:cs="Arial"/>
+                <w:color w:val="000000"/>
+                <w:sz w:val="24"/>
+                <w:szCs w:val="24"/>
+              </w:rPr>
+              <w:t>El sistema debe manejar los estados Rescatado, En Tratamiento, En Adopción y Adoptado, con transiciones controladas.</w:t>
+            </w:r>
+          </w:p>
+        </w:tc>
+      </w:tr>
+      <w:tr>
+        <w:tc>
+          <w:tcPr>
+            <w:tcW w:w="1129" w:type="dxa"/>
+          </w:tcPr>
+          <w:p>
+            <w:pPr>
+              <w:rPr>
+                <w:rFonts w:ascii="Arial" w:hAnsi="Arial" w:cs="Arial"/>
+                <w:sz w:val="24"/>
+                <w:szCs w:val="24"/>
+              </w:rPr>
+            </w:pPr>
+            <w:r>
+              <w:rPr>
+                <w:rFonts w:ascii="Arial" w:eastAsia="Arial" w:hAnsi="Arial" w:cs="Arial"/>
+                <w:color w:val="000000"/>
+                <w:sz w:val="24"/>
+                <w:szCs w:val="24"/>
+              </w:rPr>
+              <w:t>RF-05</w:t>
+            </w:r>
+          </w:p>
+        </w:tc>
+        <w:tc>
+          <w:tcPr>
+            <w:tcW w:w="3300" w:type="dxa"/>
+          </w:tcPr>
+          <w:p>
+            <w:pPr>
+              <w:rPr>
+                <w:rFonts w:ascii="Arial" w:hAnsi="Arial" w:cs="Arial"/>
+                <w:sz w:val="24"/>
+                <w:szCs w:val="24"/>
+              </w:rPr>
+            </w:pPr>
+            <w:r>
+              <w:rPr>
+                <w:rFonts w:ascii="Arial" w:eastAsia="Arial" w:hAnsi="Arial" w:cs="Arial"/>
+                <w:color w:val="000000"/>
+                <w:sz w:val="24"/>
+                <w:szCs w:val="24"/>
+              </w:rPr>
+              <w:t>Notificar nuevos rescates</w:t>
+            </w:r>
+          </w:p>
+        </w:tc>
+        <w:tc>
+          <w:tcPr>
+            <w:tcW w:w="4597" w:type="dxa"/>
+          </w:tcPr>
+          <w:p>
+            <w:pPr>
+              <w:rPr>
+                <w:rFonts w:ascii="Arial" w:hAnsi="Arial" w:cs="Arial"/>
+                <w:sz w:val="24"/>
+                <w:szCs w:val="24"/>
+              </w:rPr>
+            </w:pPr>
+            <w:r>
+              <w:rPr>
+                <w:rFonts w:ascii="Arial" w:eastAsia="Arial" w:hAnsi="Arial" w:cs="Arial"/>
+                <w:color w:val="000000"/>
+                <w:sz w:val="24"/>
+                <w:szCs w:val="24"/>
+              </w:rPr>
+              <w:t>Al registrarse un caso, los voluntarios y veterinarios suscritos deben recibir una notificación automática.</w:t>
+            </w:r>
+          </w:p>
+        </w:tc>
+      </w:tr>
+      <w:tr>
+        <w:tc>
+          <w:tcPr>
+            <w:tcW w:w="1129" w:type="dxa"/>
+          </w:tcPr>
+          <w:p>
+            <w:pPr>
+              <w:rPr>
+                <w:rFonts w:ascii="Arial" w:hAnsi="Arial" w:cs="Arial"/>
+                <w:sz w:val="24"/>
+                <w:szCs w:val="24"/>
+              </w:rPr>
+            </w:pPr>
+            <w:r>
+              <w:rPr>
+                <w:rFonts w:ascii="Arial" w:eastAsia="Arial" w:hAnsi="Arial" w:cs="Arial"/>
+                <w:color w:val="000000"/>
+                <w:sz w:val="24"/>
+                <w:szCs w:val="24"/>
+              </w:rPr>
+              <w:t>RF-06</w:t>
+            </w:r>
+          </w:p>
+        </w:tc>
+        <w:tc>
+          <w:tcPr>
+            <w:tcW w:w="3300" w:type="dxa"/>
+          </w:tcPr>
+          <w:p>
+            <w:pPr>
+              <w:rPr>
+                <w:rFonts w:ascii="Arial" w:hAnsi="Arial" w:cs="Arial"/>
+                <w:sz w:val="24"/>
+                <w:szCs w:val="24"/>
+              </w:rPr>
+            </w:pPr>
+            <w:r>
+              <w:rPr>
+                <w:rFonts w:ascii="Arial" w:eastAsia="Arial" w:hAnsi="Arial" w:cs="Arial"/>
+                <w:color w:val="000000"/>
+                <w:sz w:val="24"/>
+                <w:szCs w:val="24"/>
+              </w:rPr>
+              <w:t>Registrar historial clínico</w:t>
+            </w:r>
+          </w:p>
+        </w:tc>
+        <w:tc>
+          <w:tcPr>
+            <w:tcW w:w="4597" w:type="dxa"/>
+          </w:tcPr>
+          <w:p>
+            <w:pPr>
+              <w:rPr>
+                <w:rFonts w:ascii="Arial" w:hAnsi="Arial" w:cs="Arial"/>
+                <w:sz w:val="24"/>
+                <w:szCs w:val="24"/>
+              </w:rPr>
+            </w:pPr>
+            <w:r>
+              <w:rPr>
+                <w:rFonts w:ascii="Arial" w:eastAsia="Arial" w:hAnsi="Arial" w:cs="Arial"/>
+                <w:color w:val="000000"/>
+                <w:sz w:val="24"/>
+                <w:szCs w:val="24"/>
+              </w:rPr>
+              <w:t>El personal debe poder agregar notas y tratamientos al expediente.</w:t>
+            </w:r>
+          </w:p>
+        </w:tc>
+      </w:tr>
+      <w:tr>
+        <w:tc>
+          <w:tcPr>
+            <w:tcW w:w="1129" w:type="dxa"/>
+          </w:tcPr>
+          <w:p>
+            <w:pPr>
+              <w:rPr>
+                <w:rFonts w:ascii="Arial" w:hAnsi="Arial" w:cs="Arial"/>
+                <w:sz w:val="24"/>
+                <w:szCs w:val="24"/>
+              </w:rPr>
+            </w:pPr>
+            <w:r>
+              <w:rPr>
+                <w:rFonts w:ascii="Arial" w:eastAsia="Arial" w:hAnsi="Arial" w:cs="Arial"/>
+                <w:color w:val="000000"/>
+                <w:sz w:val="24"/>
+                <w:szCs w:val="24"/>
+              </w:rPr>
+              <w:t>RF-07</w:t>
+            </w:r>
+          </w:p>
+        </w:tc>
+        <w:tc>
+          <w:tcPr>
+            <w:tcW w:w="3300" w:type="dxa"/>
+          </w:tcPr>
+          <w:p>
+            <w:pPr>
+              <w:rPr>
+                <w:rFonts w:ascii="Arial" w:hAnsi="Arial" w:cs="Arial"/>
+                <w:sz w:val="24"/>
+                <w:szCs w:val="24"/>
+              </w:rPr>
+            </w:pPr>
+            <w:r>
+              <w:rPr>
+                <w:rFonts w:ascii="Arial" w:eastAsia="Arial" w:hAnsi="Arial" w:cs="Arial"/>
+                <w:color w:val="000000"/>
+                <w:sz w:val="24"/>
+                <w:szCs w:val="24"/>
+              </w:rPr>
+              <w:t>Consultar casos</w:t>
+            </w:r>
+          </w:p>
+        </w:tc>
+        <w:tc>
+          <w:tcPr>
+            <w:tcW w:w="4597" w:type="dxa"/>
+          </w:tcPr>
+          <w:p>
+            <w:pPr>
+              <w:rPr>
+                <w:rFonts w:ascii="Arial" w:hAnsi="Arial" w:cs="Arial"/>
+                <w:sz w:val="24"/>
+                <w:szCs w:val="24"/>
+              </w:rPr>
+            </w:pPr>
+            <w:r>
+              <w:rPr>
+                <w:rFonts w:ascii="Arial" w:eastAsia="Arial" w:hAnsi="Arial" w:cs="Arial"/>
+                <w:color w:val="000000"/>
+                <w:sz w:val="24"/>
+                <w:szCs w:val="24"/>
+              </w:rPr>
+              <w:t>Los usuarios autorizados deben poder buscar y filtrar casos por especie, estado o responsable.</w:t>
+            </w:r>
+          </w:p>
+        </w:tc>
+      </w:tr>
+      <w:tr>
+        <w:tc>
+          <w:tcPr>
+            <w:tcW w:w="1129" w:type="dxa"/>
+          </w:tcPr>
+          <w:p>
+            <w:pPr>
+              <w:rPr>
+                <w:rFonts w:ascii="Arial" w:hAnsi="Arial" w:cs="Arial"/>
+                <w:sz w:val="24"/>
+                <w:szCs w:val="24"/>
+              </w:rPr>
+            </w:pPr>
+            <w:r>
+              <w:rPr>
+                <w:rFonts w:ascii="Arial" w:eastAsia="Arial" w:hAnsi="Arial" w:cs="Arial"/>
+                <w:color w:val="000000"/>
+                <w:sz w:val="24"/>
+                <w:szCs w:val="24"/>
+              </w:rPr>
+              <w:t>RF-08</w:t>
+            </w:r>
+          </w:p>
+        </w:tc>
+        <w:tc>
+          <w:tcPr>
+            <w:tcW w:w="3300" w:type="dxa"/>
+          </w:tcPr>
+          <w:p>
+            <w:pPr>
+              <w:rPr>
+                <w:rFonts w:ascii="Arial" w:hAnsi="Arial" w:cs="Arial"/>
+                <w:sz w:val="24"/>
+                <w:szCs w:val="24"/>
+              </w:rPr>
+            </w:pPr>
+            <w:r>
+              <w:rPr>
+                <w:rFonts w:ascii="Arial" w:eastAsia="Arial" w:hAnsi="Arial" w:cs="Arial"/>
+                <w:color w:val="000000"/>
+                <w:sz w:val="24"/>
+                <w:szCs w:val="24"/>
+              </w:rPr>
+              <w:t>Gestionar adopciones</w:t>
+            </w:r>
+          </w:p>
+        </w:tc>
+        <w:tc>
+          <w:tcPr>
+            <w:tcW w:w="4597" w:type="dxa"/>
+          </w:tcPr>
+          <w:p>
+            <w:pPr>
+              <w:rPr>
+                <w:rFonts w:ascii="Arial" w:hAnsi="Arial" w:cs="Arial"/>
+                <w:sz w:val="24"/>
+                <w:szCs w:val="24"/>
+              </w:rPr>
+            </w:pPr>
+            <w:r>
+              <w:rPr>
+                <w:rFonts w:ascii="Arial" w:eastAsia="Arial" w:hAnsi="Arial" w:cs="Arial"/>
+                <w:color w:val="000000"/>
+                <w:sz w:val="24"/>
+                <w:szCs w:val="24"/>
+              </w:rPr>
+              <w:t>El administrador debe poder registrar la adopción y cerrar el caso.</w:t>
+            </w:r>
+          </w:p>
+        </w:tc>
+      </w:tr>
+      <w:tr>
+        <w:tc>
+          <w:tcPr>
+            <w:tcW w:w="1129" w:type="dxa"/>
+          </w:tcPr>
+          <w:p>
+            <w:pPr>
+              <w:rPr>
+                <w:rFonts w:ascii="Arial" w:hAnsi="Arial" w:cs="Arial"/>
+                <w:sz w:val="24"/>
+                <w:szCs w:val="24"/>
+              </w:rPr>
+            </w:pPr>
+            <w:r>
+              <w:rPr>
+                <w:rFonts w:ascii="Arial" w:eastAsia="Arial" w:hAnsi="Arial" w:cs="Arial"/>
+                <w:color w:val="000000"/>
+                <w:sz w:val="24"/>
+                <w:szCs w:val="24"/>
+              </w:rPr>
+              <w:t>RF-09</w:t>
+            </w:r>
+          </w:p>
+        </w:tc>
+        <w:tc>
+          <w:tcPr>
+            <w:tcW w:w="3300" w:type="dxa"/>
+          </w:tcPr>
+          <w:p>
+            <w:pPr>
+              <w:rPr>
+                <w:rFonts w:ascii="Arial" w:hAnsi="Arial" w:cs="Arial"/>
+                <w:sz w:val="24"/>
+                <w:szCs w:val="24"/>
+              </w:rPr>
+            </w:pPr>
+            <w:r>
+              <w:rPr>
+                <w:rFonts w:ascii="Arial" w:eastAsia="Arial" w:hAnsi="Arial" w:cs="Arial"/>
+                <w:color w:val="000000"/>
+                <w:sz w:val="24"/>
+                <w:szCs w:val="24"/>
+              </w:rPr>
+              <w:t>Generar reportes</w:t>
+            </w:r>
+          </w:p>
+        </w:tc>
+        <w:tc>
+          <w:tcPr>
+            <w:tcW w:w="4597" w:type="dxa"/>
+          </w:tcPr>
+          <w:p>
+            <w:pPr>
+              <w:rPr>
+                <w:rFonts w:ascii="Arial" w:hAnsi="Arial" w:cs="Arial"/>
+                <w:sz w:val="24"/>
+                <w:szCs w:val="24"/>
+              </w:rPr>
+            </w:pPr>
+            <w:r>
+              <w:rPr>
+                <w:rFonts w:ascii="Arial" w:eastAsia="Arial" w:hAnsi="Arial" w:cs="Arial"/>
+                <w:color w:val="000000"/>
+                <w:sz w:val="24"/>
+                <w:szCs w:val="24"/>
+              </w:rPr>
+              <w:t>El sistema debe emitir reportes de casos por periodo, especie y estado.</w:t>
+            </w:r>
+          </w:p>
+        </w:tc>
+      </w:tr>
+    </w:tbl>
+    <w:p>
+      <w:pPr>
+        <w:rPr>
+          <w:rFonts w:ascii="Arial" w:hAnsi="Arial" w:cs="Arial"/>
+          <w:b/>
+          <w:bCs/>
+          <w:sz w:val="24"/>
+          <w:szCs w:val="24"/>
+          <w:lang w:eastAsia="es-EC"/>
+        </w:rPr>
+      </w:pPr>
+    </w:p>
+    <w:p>
+      <w:pPr>
+        <w:rPr>
+          <w:rFonts w:ascii="Arial" w:hAnsi="Arial" w:cs="Arial"/>
+          <w:b/>
+          <w:bCs/>
+          <w:sz w:val="24"/>
+          <w:szCs w:val="24"/>
+          <w:lang w:eastAsia="es-EC"/>
+        </w:rPr>
+      </w:pPr>
+      <w:r>
+        <w:rPr>
+          <w:rFonts w:ascii="Arial" w:hAnsi="Arial" w:cs="Arial"/>
+          <w:b/>
+          <w:bCs/>
+          <w:sz w:val="24"/>
+          <w:szCs w:val="24"/>
+          <w:lang w:eastAsia="es-EC"/>
+        </w:rPr>
+        <w:t>2.4 Requerimientos no funcionales</w:t>
+      </w:r>
+    </w:p>
+    <w:tbl>
+      <w:tblPr>
+        <w:tblStyle w:val="Tablaconcuadrcula"/>
+        <w:tblW w:w="0" w:type="auto"/>
+        <w:tblLook w:val="04A0" w:firstRow="1" w:lastRow="0" w:firstColumn="1" w:lastColumn="0" w:noHBand="0" w:noVBand="1"/>
+      </w:tblPr>
+      <w:tblGrid>
+        <w:gridCol w:w="1129"/>
+        <w:gridCol w:w="3295"/>
+        <w:gridCol w:w="4592"/>
+      </w:tblGrid>
+      <w:tr>
+        <w:tc>
+          <w:tcPr>
+            <w:tcW w:w="1129" w:type="dxa"/>
+          </w:tcPr>
+          <w:p>
+            <w:pPr>
+              <w:rPr>
+                <w:rFonts w:ascii="Arial" w:hAnsi="Arial" w:cs="Arial"/>
+                <w:b/>
+                <w:bCs/>
+                <w:sz w:val="24"/>
+                <w:szCs w:val="24"/>
+              </w:rPr>
+            </w:pPr>
+            <w:r>
+              <w:rPr>
+                <w:rFonts w:ascii="Arial" w:hAnsi="Arial" w:cs="Arial"/>
+                <w:b/>
+                <w:bCs/>
+                <w:sz w:val="24"/>
+                <w:szCs w:val="24"/>
+              </w:rPr>
+              <w:t>Código</w:t>
+            </w:r>
+          </w:p>
+        </w:tc>
+        <w:tc>
+          <w:tcPr>
+            <w:tcW w:w="3295" w:type="dxa"/>
+          </w:tcPr>
+          <w:p>
+            <w:pPr>
+              <w:rPr>
+                <w:rFonts w:ascii="Arial" w:hAnsi="Arial" w:cs="Arial"/>
+                <w:b/>
+                <w:bCs/>
+                <w:sz w:val="24"/>
+                <w:szCs w:val="24"/>
+              </w:rPr>
+            </w:pPr>
+            <w:r>
+              <w:rPr>
+                <w:rFonts w:ascii="Arial" w:hAnsi="Arial" w:cs="Arial"/>
+                <w:b/>
+                <w:bCs/>
+                <w:sz w:val="24"/>
+                <w:szCs w:val="24"/>
+              </w:rPr>
+              <w:t>Atributo</w:t>
+            </w:r>
+          </w:p>
+        </w:tc>
+        <w:tc>
+          <w:tcPr>
+            <w:tcW w:w="4592" w:type="dxa"/>
+          </w:tcPr>
+          <w:p>
+            <w:pPr>
+              <w:rPr>
+                <w:rFonts w:ascii="Arial" w:hAnsi="Arial" w:cs="Arial"/>
+                <w:b/>
+                <w:bCs/>
+                <w:sz w:val="24"/>
+                <w:szCs w:val="24"/>
+              </w:rPr>
+            </w:pPr>
+            <w:r>
+              <w:rPr>
+                <w:rFonts w:ascii="Arial" w:hAnsi="Arial" w:cs="Arial"/>
+                <w:b/>
+                <w:bCs/>
+                <w:sz w:val="24"/>
+                <w:szCs w:val="24"/>
+              </w:rPr>
+              <w:t>Descripción</w:t>
+            </w:r>
+          </w:p>
+        </w:tc>
+      </w:tr>
+      <w:tr>
+        <w:tc>
+          <w:tcPr>
+            <w:tcW w:w="1129" w:type="dxa"/>
+          </w:tcPr>
+          <w:p>
+            <w:pPr>
+              <w:rPr>
+                <w:rFonts w:ascii="Arial" w:hAnsi="Arial" w:cs="Arial"/>
+                <w:b/>
+                <w:bCs/>
+                <w:sz w:val="24"/>
+                <w:szCs w:val="24"/>
+              </w:rPr>
+            </w:pPr>
+            <w:r>
+              <w:rPr>
+                <w:rFonts w:ascii="Arial" w:hAnsi="Arial" w:cs="Arial"/>
+                <w:sz w:val="24"/>
+                <w:szCs w:val="24"/>
+              </w:rPr>
+              <w:t>RNF-</w:t>
+            </w:r>
+            <w:r>
+              <w:rPr>
+                <w:rFonts w:ascii="Arial" w:hAnsi="Arial" w:cs="Arial"/>
+                <w:sz w:val="24"/>
+                <w:szCs w:val="24"/>
+              </w:rPr>
+              <w:t>01</w:t>
+            </w:r>
+          </w:p>
+        </w:tc>
+        <w:tc>
+          <w:tcPr>
+            <w:tcW w:w="3295" w:type="dxa"/>
+          </w:tcPr>
+          <w:p>
+            <w:pPr>
+              <w:rPr>
+                <w:rFonts w:ascii="Arial" w:hAnsi="Arial" w:cs="Arial"/>
+                <w:b/>
+                <w:bCs/>
+                <w:sz w:val="24"/>
+                <w:szCs w:val="24"/>
+              </w:rPr>
+            </w:pPr>
+            <w:r>
+              <w:rPr>
+                <w:rFonts w:ascii="Arial" w:hAnsi="Arial" w:cs="Arial"/>
+                <w:sz w:val="24"/>
+                <w:szCs w:val="24"/>
+              </w:rPr>
+              <w:t>Escalabilidad</w:t>
+            </w:r>
+          </w:p>
+        </w:tc>
+        <w:tc>
+          <w:tcPr>
+            <w:tcW w:w="4592" w:type="dxa"/>
+          </w:tcPr>
+          <w:p>
+            <w:pPr>
+              <w:rPr>
+                <w:rFonts w:ascii="Arial" w:hAnsi="Arial" w:cs="Arial"/>
+                <w:b/>
+                <w:bCs/>
+                <w:sz w:val="24"/>
+                <w:szCs w:val="24"/>
+              </w:rPr>
+            </w:pPr>
+            <w:r>
+              <w:rPr>
+                <w:rFonts w:ascii="Arial" w:hAnsi="Arial" w:cs="Arial"/>
+                <w:sz w:val="24"/>
+                <w:szCs w:val="24"/>
+              </w:rPr>
+              <w:t xml:space="preserve">Agregar una </w:t>
+            </w:r>
+            <w:r>
+              <w:rPr>
+                <w:rFonts w:ascii="Arial" w:hAnsi="Arial" w:cs="Arial"/>
+                <w:sz w:val="24"/>
+                <w:szCs w:val="24"/>
+              </w:rPr>
+              <w:t>nueva especie o canal</w:t>
+            </w:r>
+            <w:r>
+              <w:rPr>
+                <w:rFonts w:ascii="Arial" w:hAnsi="Arial" w:cs="Arial"/>
+                <w:sz w:val="24"/>
+                <w:szCs w:val="24"/>
+              </w:rPr>
+              <w:t xml:space="preserve"> de notificación no debe obligar a modificar el código existente (principio abierto/cerrado)</w:t>
+            </w:r>
+          </w:p>
+        </w:tc>
+      </w:tr>
+      <w:tr>
+        <w:tc>
+          <w:tcPr>
+            <w:tcW w:w="1129" w:type="dxa"/>
+          </w:tcPr>
+          <w:p>
+            <w:pPr>
+              <w:rPr>
+                <w:rFonts w:ascii="Arial" w:hAnsi="Arial" w:cs="Arial"/>
+                <w:b/>
+                <w:bCs/>
+                <w:sz w:val="24"/>
+                <w:szCs w:val="24"/>
+              </w:rPr>
+            </w:pPr>
+            <w:r>
+              <w:rPr>
+                <w:rFonts w:ascii="Arial" w:hAnsi="Arial" w:cs="Arial"/>
+                <w:sz w:val="24"/>
+                <w:szCs w:val="24"/>
+              </w:rPr>
+              <w:t>RNF-02</w:t>
+            </w:r>
+          </w:p>
+        </w:tc>
+        <w:tc>
+          <w:tcPr>
+            <w:tcW w:w="3295" w:type="dxa"/>
+          </w:tcPr>
+          <w:p>
+            <w:pPr>
+              <w:rPr>
+                <w:rFonts w:ascii="Arial" w:hAnsi="Arial" w:cs="Arial"/>
+                <w:b/>
+                <w:bCs/>
+                <w:sz w:val="24"/>
+                <w:szCs w:val="24"/>
+              </w:rPr>
+            </w:pPr>
+            <w:r>
+              <w:rPr>
+                <w:rFonts w:ascii="Arial" w:hAnsi="Arial" w:cs="Arial"/>
+                <w:sz w:val="24"/>
+                <w:szCs w:val="24"/>
+              </w:rPr>
+              <w:t>Mantenibilidad</w:t>
+            </w:r>
+          </w:p>
+        </w:tc>
+        <w:tc>
+          <w:tcPr>
+            <w:tcW w:w="4592" w:type="dxa"/>
+          </w:tcPr>
+          <w:p>
+            <w:pPr>
+              <w:rPr>
+                <w:rFonts w:ascii="Arial" w:hAnsi="Arial" w:cs="Arial"/>
+                <w:b/>
+                <w:bCs/>
+                <w:sz w:val="24"/>
+                <w:szCs w:val="24"/>
+              </w:rPr>
+            </w:pPr>
+            <w:r>
+              <w:rPr>
+                <w:rFonts w:ascii="Arial" w:hAnsi="Arial" w:cs="Arial"/>
+                <w:sz w:val="24"/>
+                <w:szCs w:val="24"/>
+              </w:rPr>
+              <w:t>Código modular, con bajo acoplamiento y nombres significativos, organizado en capas (MVC).</w:t>
+            </w:r>
+          </w:p>
+        </w:tc>
+      </w:tr>
+      <w:tr>
+        <w:tc>
+          <w:tcPr>
+            <w:tcW w:w="1129" w:type="dxa"/>
+          </w:tcPr>
+          <w:p>
+            <w:pPr>
+              <w:rPr>
+                <w:rFonts w:ascii="Arial" w:hAnsi="Arial" w:cs="Arial"/>
+                <w:b/>
+                <w:bCs/>
+                <w:sz w:val="24"/>
+                <w:szCs w:val="24"/>
+              </w:rPr>
+            </w:pPr>
+            <w:r>
+              <w:rPr>
+                <w:rFonts w:ascii="Arial" w:hAnsi="Arial" w:cs="Arial"/>
+                <w:sz w:val="24"/>
+                <w:szCs w:val="24"/>
+              </w:rPr>
+              <w:t>RNF-03</w:t>
+            </w:r>
+          </w:p>
+        </w:tc>
+        <w:tc>
+          <w:tcPr>
+            <w:tcW w:w="3295" w:type="dxa"/>
+          </w:tcPr>
+          <w:p>
+            <w:pPr>
+              <w:rPr>
+                <w:rFonts w:ascii="Arial" w:hAnsi="Arial" w:cs="Arial"/>
+                <w:b/>
+                <w:bCs/>
+                <w:sz w:val="24"/>
+                <w:szCs w:val="24"/>
+              </w:rPr>
+            </w:pPr>
+            <w:r>
+              <w:rPr>
+                <w:rFonts w:ascii="Arial" w:hAnsi="Arial" w:cs="Arial"/>
+                <w:sz w:val="24"/>
+                <w:szCs w:val="24"/>
+              </w:rPr>
+              <w:t>Trazabilidad de versione</w:t>
+            </w:r>
+            <w:r>
+              <w:rPr>
+                <w:rFonts w:ascii="Arial" w:hAnsi="Arial" w:cs="Arial"/>
+                <w:sz w:val="24"/>
+                <w:szCs w:val="24"/>
+              </w:rPr>
+              <w:t>s</w:t>
+            </w:r>
+          </w:p>
+        </w:tc>
+        <w:tc>
+          <w:tcPr>
+            <w:tcW w:w="4592" w:type="dxa"/>
+          </w:tcPr>
+          <w:p>
+            <w:pPr>
+              <w:rPr>
+                <w:rFonts w:ascii="Arial" w:hAnsi="Arial" w:cs="Arial"/>
+                <w:b/>
+                <w:bCs/>
+                <w:sz w:val="24"/>
+                <w:szCs w:val="24"/>
+              </w:rPr>
+            </w:pPr>
+            <w:r>
+              <w:rPr>
+                <w:rFonts w:ascii="Arial" w:hAnsi="Arial" w:cs="Arial"/>
+                <w:sz w:val="24"/>
+                <w:szCs w:val="24"/>
+              </w:rPr>
+              <w:t xml:space="preserve">Todo cambio debe quedar registrado en GitHub bajo </w:t>
+            </w:r>
+            <w:proofErr w:type="spellStart"/>
+            <w:r>
+              <w:rPr>
+                <w:rFonts w:ascii="Arial" w:hAnsi="Arial" w:cs="Arial"/>
+                <w:sz w:val="24"/>
+                <w:szCs w:val="24"/>
+              </w:rPr>
+              <w:t>Gitflow</w:t>
+            </w:r>
+            <w:proofErr w:type="spellEnd"/>
+            <w:r>
+              <w:rPr>
+                <w:rFonts w:ascii="Arial" w:hAnsi="Arial" w:cs="Arial"/>
+                <w:sz w:val="24"/>
+                <w:szCs w:val="24"/>
+              </w:rPr>
+              <w:t xml:space="preserve">, con </w:t>
+            </w:r>
+            <w:proofErr w:type="spellStart"/>
+            <w:r>
+              <w:rPr>
+                <w:rFonts w:ascii="Arial" w:hAnsi="Arial" w:cs="Arial"/>
+                <w:sz w:val="24"/>
+                <w:szCs w:val="24"/>
+              </w:rPr>
+              <w:t>commits</w:t>
+            </w:r>
+            <w:proofErr w:type="spellEnd"/>
+            <w:r>
+              <w:rPr>
+                <w:rFonts w:ascii="Arial" w:hAnsi="Arial" w:cs="Arial"/>
+                <w:sz w:val="24"/>
+                <w:szCs w:val="24"/>
+              </w:rPr>
+              <w:t xml:space="preserve"> descriptivos y versiones etiquetadas.</w:t>
+            </w:r>
+          </w:p>
+        </w:tc>
+      </w:tr>
+      <w:tr>
+        <w:tc>
+          <w:tcPr>
+            <w:tcW w:w="1129" w:type="dxa"/>
+          </w:tcPr>
+          <w:p>
+            <w:pPr>
+              <w:rPr>
+                <w:rFonts w:ascii="Arial" w:hAnsi="Arial" w:cs="Arial"/>
+                <w:b/>
+                <w:bCs/>
+                <w:sz w:val="24"/>
+                <w:szCs w:val="24"/>
+              </w:rPr>
+            </w:pPr>
+            <w:r>
+              <w:rPr>
+                <w:rFonts w:ascii="Arial" w:hAnsi="Arial" w:cs="Arial"/>
+                <w:sz w:val="24"/>
+                <w:szCs w:val="24"/>
+              </w:rPr>
+              <w:t>RNF-04</w:t>
+            </w:r>
+          </w:p>
+        </w:tc>
+        <w:tc>
+          <w:tcPr>
+            <w:tcW w:w="3295" w:type="dxa"/>
+          </w:tcPr>
+          <w:p>
+            <w:pPr>
+              <w:rPr>
+                <w:rFonts w:ascii="Arial" w:hAnsi="Arial" w:cs="Arial"/>
+                <w:b/>
+                <w:bCs/>
+                <w:sz w:val="24"/>
+                <w:szCs w:val="24"/>
+              </w:rPr>
+            </w:pPr>
+            <w:r>
+              <w:rPr>
+                <w:rFonts w:ascii="Arial" w:hAnsi="Arial" w:cs="Arial"/>
+                <w:sz w:val="24"/>
+                <w:szCs w:val="24"/>
+              </w:rPr>
+              <w:t>Trazabilidad de casos</w:t>
+            </w:r>
+          </w:p>
+        </w:tc>
+        <w:tc>
+          <w:tcPr>
+            <w:tcW w:w="4592" w:type="dxa"/>
+          </w:tcPr>
+          <w:p>
+            <w:pPr>
+              <w:rPr>
+                <w:rFonts w:ascii="Arial" w:hAnsi="Arial" w:cs="Arial"/>
+                <w:b/>
+                <w:bCs/>
+                <w:sz w:val="24"/>
+                <w:szCs w:val="24"/>
+              </w:rPr>
+            </w:pPr>
+            <w:r>
+              <w:rPr>
+                <w:rFonts w:ascii="Arial" w:hAnsi="Arial" w:cs="Arial"/>
+                <w:sz w:val="24"/>
+                <w:szCs w:val="24"/>
+              </w:rPr>
+              <w:t>Cada cambio de estado debe registrar fecha, responsable y motivo.</w:t>
+            </w:r>
+          </w:p>
+        </w:tc>
+      </w:tr>
+      <w:tr>
+        <w:tc>
+          <w:tcPr>
+            <w:tcW w:w="1129" w:type="dxa"/>
+          </w:tcPr>
+          <w:p>
+            <w:pPr>
+              <w:rPr>
+                <w:rFonts w:ascii="Arial" w:hAnsi="Arial" w:cs="Arial"/>
+                <w:b/>
+                <w:bCs/>
+                <w:sz w:val="24"/>
+                <w:szCs w:val="24"/>
+              </w:rPr>
+            </w:pPr>
+            <w:r>
+              <w:rPr>
+                <w:rFonts w:ascii="Arial" w:hAnsi="Arial" w:cs="Arial"/>
+                <w:sz w:val="24"/>
+                <w:szCs w:val="24"/>
+              </w:rPr>
+              <w:t>RNF-05</w:t>
+            </w:r>
+          </w:p>
+        </w:tc>
+        <w:tc>
+          <w:tcPr>
+            <w:tcW w:w="3295" w:type="dxa"/>
+          </w:tcPr>
+          <w:p>
+            <w:pPr>
+              <w:rPr>
+                <w:rFonts w:ascii="Arial" w:hAnsi="Arial" w:cs="Arial"/>
+                <w:sz w:val="24"/>
+                <w:szCs w:val="24"/>
+              </w:rPr>
+            </w:pPr>
+            <w:r>
+              <w:rPr>
+                <w:rFonts w:ascii="Arial" w:hAnsi="Arial" w:cs="Arial"/>
+                <w:sz w:val="24"/>
+                <w:szCs w:val="24"/>
+              </w:rPr>
+              <w:t>Disponibilida</w:t>
+            </w:r>
+            <w:r>
+              <w:rPr>
+                <w:rFonts w:ascii="Arial" w:hAnsi="Arial" w:cs="Arial"/>
+                <w:sz w:val="24"/>
+                <w:szCs w:val="24"/>
+              </w:rPr>
+              <w:t>d</w:t>
+            </w:r>
+          </w:p>
+        </w:tc>
+        <w:tc>
+          <w:tcPr>
+            <w:tcW w:w="4592" w:type="dxa"/>
+          </w:tcPr>
+          <w:p>
+            <w:pPr>
+              <w:rPr>
+                <w:rFonts w:ascii="Arial" w:hAnsi="Arial" w:cs="Arial"/>
+                <w:b/>
+                <w:bCs/>
+                <w:sz w:val="24"/>
+                <w:szCs w:val="24"/>
+              </w:rPr>
+            </w:pPr>
+            <w:r>
+              <w:rPr>
+                <w:rFonts w:ascii="Arial" w:hAnsi="Arial" w:cs="Arial"/>
+                <w:sz w:val="24"/>
+                <w:szCs w:val="24"/>
+              </w:rPr>
+              <w:t>El sistema debe estar disponible para recibir reportes en cualquier momento.</w:t>
+            </w:r>
+          </w:p>
+        </w:tc>
+      </w:tr>
+      <w:tr>
+        <w:tc>
+          <w:tcPr>
+            <w:tcW w:w="1129" w:type="dxa"/>
+          </w:tcPr>
+          <w:p>
+            <w:pPr>
+              <w:rPr>
+                <w:rFonts w:ascii="Arial" w:hAnsi="Arial" w:cs="Arial"/>
+                <w:b/>
+                <w:bCs/>
+                <w:sz w:val="24"/>
+                <w:szCs w:val="24"/>
+              </w:rPr>
+            </w:pPr>
+            <w:r>
+              <w:rPr>
+                <w:rFonts w:ascii="Arial" w:hAnsi="Arial" w:cs="Arial"/>
+                <w:sz w:val="24"/>
+                <w:szCs w:val="24"/>
+              </w:rPr>
+              <w:lastRenderedPageBreak/>
+              <w:t>RNF-06</w:t>
+            </w:r>
+          </w:p>
+        </w:tc>
+        <w:tc>
+          <w:tcPr>
+            <w:tcW w:w="3295" w:type="dxa"/>
+          </w:tcPr>
+          <w:p>
+            <w:pPr>
+              <w:rPr>
+                <w:rFonts w:ascii="Arial" w:hAnsi="Arial" w:cs="Arial"/>
+                <w:b/>
+                <w:bCs/>
+                <w:sz w:val="24"/>
+                <w:szCs w:val="24"/>
+              </w:rPr>
+            </w:pPr>
+            <w:r>
+              <w:rPr>
+                <w:rFonts w:ascii="Arial" w:hAnsi="Arial" w:cs="Arial"/>
+                <w:sz w:val="24"/>
+                <w:szCs w:val="24"/>
+              </w:rPr>
+              <w:t>Usabilidad</w:t>
+            </w:r>
+          </w:p>
+        </w:tc>
+        <w:tc>
+          <w:tcPr>
+            <w:tcW w:w="4592" w:type="dxa"/>
+          </w:tcPr>
+          <w:p>
+            <w:pPr>
+              <w:rPr>
+                <w:rFonts w:ascii="Arial" w:hAnsi="Arial" w:cs="Arial"/>
+                <w:b/>
+                <w:bCs/>
+                <w:sz w:val="24"/>
+                <w:szCs w:val="24"/>
+              </w:rPr>
+            </w:pPr>
+            <w:r>
+              <w:rPr>
+                <w:rFonts w:ascii="Arial" w:hAnsi="Arial" w:cs="Arial"/>
+                <w:sz w:val="24"/>
+                <w:szCs w:val="24"/>
+              </w:rPr>
+              <w:t>La interfaz de reporte para el ciudadano debe poder completarse en pocos pasos.</w:t>
+            </w:r>
+          </w:p>
+        </w:tc>
+      </w:tr>
+    </w:tbl>
+    <w:p>
+      <w:pPr>
+        <w:rPr>
+          <w:rFonts w:ascii="Arial" w:hAnsi="Arial" w:cs="Arial"/>
+          <w:b/>
+          <w:bCs/>
+          <w:lang w:eastAsia="es-EC"/>
+        </w:rPr>
+      </w:pPr>
+    </w:p>
+    <w:p>
+      <w:pPr>
+        <w:rPr>
+          <w:rFonts w:ascii="Arial" w:hAnsi="Arial" w:cs="Arial"/>
+          <w:b/>
+          <w:bCs/>
+          <w:lang w:eastAsia="es-EC"/>
+        </w:rPr>
+      </w:pPr>
+    </w:p>
+    <w:p>
+      <w:pPr>
+        <w:rPr>
+          <w:rFonts w:ascii="Arial" w:hAnsi="Arial" w:cs="Arial"/>
+          <w:b/>
+          <w:bCs/>
+          <w:lang w:eastAsia="es-EC"/>
+        </w:rPr>
+      </w:pPr>
+    </w:p>
+    <w:p>
+      <w:pPr>
+        <w:rPr>
+          <w:rFonts w:ascii="Arial" w:hAnsi="Arial" w:cs="Arial"/>
+          <w:b/>
+          <w:bCs/>
+          <w:lang w:eastAsia="es-EC"/>
+        </w:rPr>
+      </w:pPr>
+    </w:p>
+    <w:p>
+      <w:pPr>
+        <w:rPr>
+          <w:rFonts w:ascii="Arial" w:hAnsi="Arial" w:cs="Arial"/>
+          <w:b/>
+          <w:bCs/>
+          <w:lang w:eastAsia="es-EC"/>
+        </w:rPr>
+      </w:pPr>
+    </w:p>
+    <w:p>
+      <w:pPr>
+        <w:rPr>
+          <w:rFonts w:ascii="Arial" w:hAnsi="Arial" w:cs="Arial"/>
+          <w:b/>
+          <w:bCs/>
+          <w:lang w:eastAsia="es-EC"/>
+        </w:rPr>
+      </w:pPr>
+    </w:p>
+    <w:p>
+      <w:pPr>
+        <w:rPr>
+          <w:rFonts w:ascii="Arial" w:hAnsi="Arial" w:cs="Arial"/>
+          <w:b/>
+          <w:bCs/>
+          <w:lang w:eastAsia="es-EC"/>
+        </w:rPr>
+      </w:pPr>
+    </w:p>
+    <w:p>
+      <w:pPr>
+        <w:rPr>
+          <w:rFonts w:ascii="Arial" w:hAnsi="Arial" w:cs="Arial"/>
+          <w:b/>
+          <w:bCs/>
+          <w:lang w:eastAsia="es-EC"/>
+        </w:rPr>
+      </w:pPr>
+    </w:p>
+    <w:p>
+      <w:pPr>
+        <w:rPr>
+          <w:rFonts w:ascii="Arial" w:hAnsi="Arial" w:cs="Arial"/>
+          <w:b/>
+          <w:bCs/>
+          <w:lang w:eastAsia="es-EC"/>
+        </w:rPr>
+      </w:pPr>
+    </w:p>
+    <w:p>
+      <w:pPr>
+        <w:rPr>
+          <w:rFonts w:ascii="Arial" w:hAnsi="Arial" w:cs="Arial"/>
+          <w:b/>
+          <w:bCs/>
+          <w:lang w:eastAsia="es-EC"/>
+        </w:rPr>
+      </w:pPr>
+    </w:p>
+    <w:p>
+      <w:pPr>
+        <w:rPr>
+          <w:rFonts w:ascii="Arial" w:hAnsi="Arial" w:cs="Arial"/>
+          <w:b/>
+          <w:bCs/>
+          <w:lang w:eastAsia="es-EC"/>
+        </w:rPr>
+      </w:pPr>
+    </w:p>
+    <w:p>
+      <w:pPr>
+        <w:rPr>
+          <w:rFonts w:ascii="Arial" w:hAnsi="Arial" w:cs="Arial"/>
+          <w:b/>
+          <w:bCs/>
+          <w:lang w:eastAsia="es-EC"/>
+        </w:rPr>
+      </w:pPr>
+    </w:p>
+    <w:p>
+      <w:pPr>
+        <w:rPr>
+          <w:rFonts w:ascii="Arial" w:hAnsi="Arial" w:cs="Arial"/>
+          <w:b/>
+          <w:bCs/>
+          <w:lang w:eastAsia="es-EC"/>
+        </w:rPr>
+      </w:pPr>
+    </w:p>
+    <w:p>
+      <w:pPr>
+        <w:pStyle w:val="Sinespaciado"/>
+        <w:spacing w:line="360" w:lineRule="auto"/>
+        <w:jc w:val="both"/>
+        <w:rPr>
+          <w:rFonts w:ascii="Arial" w:hAnsi="Arial" w:cs="Arial"/>
+          <w:b/>
+          <w:bCs/>
+          <w:lang w:eastAsia="es-EC"/>
+        </w:rPr>
+      </w:pPr>
+      <w:r>
+        <w:rPr>
+          <w:rFonts w:ascii="Arial" w:hAnsi="Arial" w:cs="Arial"/>
+          <w:b/>
+          <w:bCs/>
+          <w:lang w:eastAsia="es-EC"/>
+        </w:rPr>
+        <w:t>Evidencias</w:t>
       </w:r>
     </w:p>
     <w:p>
@@ -1060,46 +3484,49 @@
         <w:spacing w:after="0" w:line="240" w:lineRule="auto"/>
         <w:jc w:val="both"/>
         <w:rPr>
-          <w:rFonts w:ascii="Arial" w:hAnsi="Arial" w:cs="Arial"/>
+          <w:rFonts w:ascii="Arial" w:eastAsiaTheme="majorEastAsia" w:hAnsi="Arial" w:cs="Arial"/>
+          <w:b/>
+          <w:bCs/>
+          <w:color w:val="2F5496" w:themeColor="accent1" w:themeShade="BF"/>
+          <w:sz w:val="24"/>
+          <w:szCs w:val="24"/>
+          <w:lang w:eastAsia="es-EC"/>
+        </w:rPr>
+      </w:pPr>
+      <w:r>
+        <w:rPr>
+          <w:rFonts w:ascii="Arial" w:hAnsi="Arial" w:cs="Arial"/>
+          <w:b/>
+          <w:bCs/>
           <w:i/>
           <w:iCs/>
           <w:sz w:val="20"/>
           <w:szCs w:val="20"/>
           <w:lang w:eastAsia="es-EC"/>
         </w:rPr>
-      </w:pPr>
-      <w:r>
-        <w:rPr>
-          <w:rFonts w:ascii="Arial" w:hAnsi="Arial" w:cs="Arial"/>
+        <w:t>(</w:t>
+      </w:r>
+      <w:r>
+        <w:rPr>
+          <w:rFonts w:ascii="Arial" w:eastAsia="Arial" w:hAnsi="Arial" w:cs="Arial"/>
           <w:i/>
           <w:iCs/>
+          <w:color w:val="000000"/>
           <w:sz w:val="20"/>
           <w:szCs w:val="20"/>
+        </w:rPr>
+        <w:t>Código de la ejecución de los ejercicios, enlace drive donde se encuentren los mismos y Capturas de pantalla claras y relevantes, donde evidencie el proceso realizado).</w:t>
+      </w:r>
+      <w:r>
+        <w:rPr>
+          <w:rFonts w:ascii="Arial" w:hAnsi="Arial" w:cs="Arial"/>
+          <w:b/>
+          <w:bCs/>
+          <w:sz w:val="24"/>
+          <w:szCs w:val="24"/>
           <w:lang w:eastAsia="es-EC"/>
         </w:rPr>
-        <w:t>(Desarrollo de la actividad</w:t>
-      </w:r>
-      <w:r>
-        <w:rPr>
-          <w:rFonts w:ascii="Arial" w:hAnsi="Arial" w:cs="Arial"/>
-          <w:i/>
-          <w:iCs/>
-          <w:sz w:val="20"/>
-          <w:szCs w:val="20"/>
-          <w:lang w:eastAsia="es-EC"/>
-        </w:rPr>
-        <w:t xml:space="preserve"> propuesta</w:t>
-      </w:r>
-      <w:r>
-        <w:rPr>
-          <w:rFonts w:ascii="Arial" w:hAnsi="Arial" w:cs="Arial"/>
-          <w:i/>
-          <w:iCs/>
-          <w:sz w:val="20"/>
-          <w:szCs w:val="20"/>
-          <w:lang w:eastAsia="es-EC"/>
-        </w:rPr>
-        <w:t>)</w:t>
+        <w:br w:type="page"/>
       </w:r>
     </w:p>
     <w:p>
@@ -1114,47 +3541,15 @@
           <w:lang w:eastAsia="es-EC"/>
         </w:rPr>
       </w:pPr>
-    </w:p>
-    <w:p>
-      <w:pPr>
+      <w:r>
         <w:rPr>
           <w:rFonts w:ascii="Arial" w:hAnsi="Arial" w:cs="Arial"/>
           <w:b/>
           <w:bCs/>
           <w:lang w:eastAsia="es-EC"/>
         </w:rPr>
-      </w:pPr>
-      <w:r>
-        <w:rPr>
-          <w:rFonts w:ascii="Arial" w:hAnsi="Arial" w:cs="Arial"/>
-          <w:b/>
-          <w:bCs/>
-          <w:lang w:eastAsia="es-EC"/>
-        </w:rPr>
-        <w:br w:type="page"/>
-      </w:r>
-    </w:p>
-    <w:p>
-      <w:pPr>
-        <w:pStyle w:val="Sinespaciado"/>
-        <w:spacing w:line="360" w:lineRule="auto"/>
-        <w:jc w:val="both"/>
-        <w:rPr>
-          <w:rFonts w:ascii="Arial" w:hAnsi="Arial" w:cs="Arial"/>
-          <w:b/>
-          <w:bCs/>
-          <w:lang w:eastAsia="es-EC"/>
-        </w:rPr>
-      </w:pPr>
-      <w:r>
-        <w:rPr>
-          <w:rFonts w:ascii="Arial" w:hAnsi="Arial" w:cs="Arial"/>
-          <w:b/>
-          <w:bCs/>
-          <w:lang w:eastAsia="es-EC"/>
-        </w:rPr>
         <w:lastRenderedPageBreak/>
-        <w:t>Evidencias</w:t>
+        <w:t>Bibliografía</w:t>
       </w:r>
     </w:p>
     <w:p>
@@ -1170,86 +3565,15 @@
         <w:spacing w:after="0" w:line="240" w:lineRule="auto"/>
         <w:jc w:val="both"/>
         <w:rPr>
-          <w:rFonts w:ascii="Arial" w:eastAsiaTheme="majorEastAsia" w:hAnsi="Arial" w:cs="Arial"/>
-          <w:b/>
-          <w:bCs/>
-          <w:color w:val="2F5496" w:themeColor="accent1" w:themeShade="BF"/>
-          <w:sz w:val="24"/>
-          <w:szCs w:val="24"/>
-          <w:lang w:eastAsia="es-EC"/>
-        </w:rPr>
-      </w:pPr>
-      <w:r>
-        <w:rPr>
-          <w:rFonts w:ascii="Arial" w:hAnsi="Arial" w:cs="Arial"/>
-          <w:b/>
-          <w:bCs/>
+          <w:rFonts w:ascii="Arial" w:hAnsi="Arial" w:cs="Arial"/>
           <w:i/>
           <w:iCs/>
           <w:sz w:val="20"/>
           <w:szCs w:val="20"/>
           <w:lang w:eastAsia="es-EC"/>
         </w:rPr>
-        <w:t>(</w:t>
-      </w:r>
-      <w:r>
-        <w:rPr>
-          <w:rFonts w:ascii="Arial" w:eastAsia="Arial" w:hAnsi="Arial" w:cs="Arial"/>
-          <w:i/>
-          <w:iCs/>
-          <w:color w:val="000000"/>
-          <w:sz w:val="20"/>
-          <w:szCs w:val="20"/>
-        </w:rPr>
-        <w:t>Código de la ejecución de los ejercicios, enlace drive donde se encuentren los mismos y Capturas de pantalla claras y relevantes, donde evidencie el proceso realizado).</w:t>
-      </w:r>
-      <w:r>
-        <w:rPr>
-          <w:rFonts w:ascii="Arial" w:hAnsi="Arial" w:cs="Arial"/>
-          <w:b/>
-          <w:bCs/>
-          <w:sz w:val="24"/>
-          <w:szCs w:val="24"/>
-          <w:lang w:eastAsia="es-EC"/>
-        </w:rPr>
-        <w:br w:type="page"/>
-      </w:r>
-    </w:p>
-    <w:p>
-      <w:pPr>
-        <w:pStyle w:val="Sinespaciado"/>
-        <w:spacing w:line="360" w:lineRule="auto"/>
-        <w:jc w:val="both"/>
-        <w:rPr>
-          <w:rFonts w:ascii="Arial" w:hAnsi="Arial" w:cs="Arial"/>
-          <w:b/>
-          <w:bCs/>
-          <w:lang w:eastAsia="es-EC"/>
-        </w:rPr>
-      </w:pPr>
-      <w:r>
-        <w:rPr>
-          <w:rFonts w:ascii="Arial" w:hAnsi="Arial" w:cs="Arial"/>
-          <w:b/>
-          <w:bCs/>
-          <w:lang w:eastAsia="es-EC"/>
-        </w:rPr>
-        <w:lastRenderedPageBreak/>
-        <w:t>Bibliografía</w:t>
-      </w:r>
-    </w:p>
-    <w:p>
-      <w:pPr>
-        <w:widowControl w:val="0"/>
-        <w:pBdr>
-          <w:top w:val="nil"/>
-          <w:left w:val="nil"/>
-          <w:bottom w:val="nil"/>
-          <w:right w:val="nil"/>
-          <w:between w:val="nil"/>
-        </w:pBdr>
-        <w:spacing w:after="0" w:line="240" w:lineRule="auto"/>
-        <w:jc w:val="both"/>
+      </w:pPr>
+      <w:r>
         <w:rPr>
           <w:rFonts w:ascii="Arial" w:hAnsi="Arial" w:cs="Arial"/>
           <w:i/>
@@ -1258,7 +3582,8 @@
           <w:szCs w:val="20"/>
           <w:lang w:eastAsia="es-EC"/>
         </w:rPr>
-      </w:pPr>
+        <w:t>(</w:t>
+      </w:r>
       <w:r>
         <w:rPr>
           <w:rFonts w:ascii="Arial" w:hAnsi="Arial" w:cs="Arial"/>
@@ -1268,7 +3593,7 @@
           <w:szCs w:val="20"/>
           <w:lang w:eastAsia="es-EC"/>
         </w:rPr>
-        <w:t>(</w:t>
+        <w:t>Referencias bibliográficas y/o enlaces en Internet (normas APA) que se utilizaron para realizar la práctica.</w:t>
       </w:r>
       <w:r>
         <w:rPr>
@@ -1279,24 +3604,13 @@
           <w:szCs w:val="20"/>
           <w:lang w:eastAsia="es-EC"/>
         </w:rPr>
-        <w:t>Referencias bibliográficas y/o enlaces en Internet (normas APA) que se utilizaron para realizar la práctica.</w:t>
-      </w:r>
-      <w:r>
-        <w:rPr>
-          <w:rFonts w:ascii="Arial" w:hAnsi="Arial" w:cs="Arial"/>
-          <w:i/>
-          <w:iCs/>
-          <w:sz w:val="20"/>
-          <w:szCs w:val="20"/>
-          <w:lang w:eastAsia="es-EC"/>
-        </w:rPr>
         <w:t>)</w:t>
       </w:r>
     </w:p>
     <w:sectPr>
       <w:headerReference w:type="first" r:id="rId14"/>
       <w:pgSz w:w="11906" w:h="16838"/>
-      <w:pgMar w:top="1417" w:right="1701" w:bottom="1417" w:left="1701" w:header="708" w:footer="708" w:gutter="0"/>
+      <w:pgMar w:top="1417" w:right="1440" w:bottom="1417" w:left="1440" w:header="709" w:footer="709" w:gutter="0"/>
       <w:pgNumType w:start="1"/>
       <w:cols w:space="708"/>
       <w:titlePg/>
@@ -1307,7 +3621,7 @@
 </file>
 
 <file path=word/endnotes.xml><?xml version="1.0" encoding="utf-8"?>
-<w:endnotes xmlns:wpc="http://schemas.microsoft.com/office/word/2010/wordprocessingCanvas" xmlns:cx="http://schemas.microsoft.com/office/drawing/2014/chartex" xmlns:cx1="http://schemas.microsoft.com/office/drawing/2015/9/8/chartex" xmlns:cx2="http://schemas.microsoft.com/office/drawing/2015/10/21/chartex" xmlns:cx3="http://schemas.microsoft.com/office/drawing/2016/5/9/chartex" xmlns:cx4="http://schemas.microsoft.com/office/drawing/2016/5/10/chartex" xmlns:cx5="http://schemas.microsoft.com/office/drawing/2016/5/11/chartex" xmlns:cx6="http://schemas.microsoft.com/office/drawing/2016/5/12/chartex" xmlns:cx7="http://schemas.microsoft.com/office/drawing/2016/5/13/chartex" xmlns:cx8="http://schemas.microsoft.com/office/drawing/2016/5/14/chartex" xmlns:mc="http://schemas.openxmlformats.org/markup-compatibility/2006" xmlns:aink="http://schemas.microsoft.com/office/drawing/2016/ink" xmlns:am3d="http://schemas.microsoft.com/office/drawing/2017/model3d" xmlns:o="urn:schemas-microsoft-com:office:office" xmlns:r="http://schemas.openxmlformats.org/officeDocument/2006/relationships" xmlns:m="http://schemas.openxmlformats.org/officeDocument/2006/math" xmlns:v="urn:schemas-microsoft-com:vml" xmlns:wp14="http://schemas.microsoft.com/office/word/2010/wordprocessingDrawing" xmlns:wp="http://schemas.openxmlformats.org/drawingml/2006/wordprocessingDrawing" xmlns:w10="urn:schemas-microsoft-com:office:word" xmlns:w="http://schemas.openxmlformats.org/wordprocessingml/2006/main" xmlns:w14="http://schemas.microsoft.com/office/word/2010/wordml" xmlns:w15="http://schemas.microsoft.com/office/word/2012/wordml" xmlns:w16cid="http://schemas.microsoft.com/office/word/2016/wordml/cid" xmlns:w16se="http://schemas.microsoft.com/office/word/2015/wordml/symex" xmlns:wpg="http://schemas.microsoft.com/office/word/2010/wordprocessingGroup" xmlns:wpi="http://schemas.microsoft.com/office/word/2010/wordprocessingInk" xmlns:wne="http://schemas.microsoft.com/office/word/2006/wordml" xmlns:wps="http://schemas.microsoft.com/office/word/2010/wordprocessingShape" mc:Ignorable="w14 w15 w16se w16cid wp14">
+<w:endnotes xmlns:wpc="http://schemas.microsoft.com/office/word/2010/wordprocessingCanvas" xmlns:cx="http://schemas.microsoft.com/office/drawing/2014/chartex" xmlns:cx1="http://schemas.microsoft.com/office/drawing/2015/9/8/chartex" xmlns:cx2="http://schemas.microsoft.com/office/drawing/2015/10/21/chartex" xmlns:cx3="http://schemas.microsoft.com/office/drawing/2016/5/9/chartex" xmlns:cx4="http://schemas.microsoft.com/office/drawing/2016/5/10/chartex" xmlns:cx5="http://schemas.microsoft.com/office/drawing/2016/5/11/chartex" xmlns:cx6="http://schemas.microsoft.com/office/drawing/2016/5/12/chartex" xmlns:cx7="http://schemas.microsoft.com/office/drawing/2016/5/13/chartex" xmlns:cx8="http://schemas.microsoft.com/office/drawing/2016/5/14/chartex" xmlns:mc="http://schemas.openxmlformats.org/markup-compatibility/2006" xmlns:aink="http://schemas.microsoft.com/office/drawing/2016/ink" xmlns:am3d="http://schemas.microsoft.com/office/drawing/2017/model3d" xmlns:o="urn:schemas-microsoft-com:office:office" xmlns:r="http://schemas.openxmlformats.org/officeDocument/2006/relationships" xmlns:m="http://schemas.openxmlformats.org/officeDocument/2006/math" xmlns:v="urn:schemas-microsoft-com:vml" xmlns:wp14="http://schemas.microsoft.com/office/word/2010/wordprocessingDrawing" xmlns:wp="http://schemas.openxmlformats.org/drawingml/2006/wordprocessingDrawing" xmlns:w10="urn:schemas-microsoft-com:office:word" xmlns:w="http://schemas.openxmlformats.org/wordprocessingml/2006/main" xmlns:w14="http://schemas.microsoft.com/office/word/2010/wordml" xmlns:w15="http://schemas.microsoft.com/office/word/2012/wordml" xmlns:w16cex="http://schemas.microsoft.com/office/word/2018/wordml/cex" xmlns:w16cid="http://schemas.microsoft.com/office/word/2016/wordml/cid" xmlns:w16="http://schemas.microsoft.com/office/word/2018/wordml" xmlns:w16sdtdh="http://schemas.microsoft.com/office/word/2020/wordml/sdtdatahash" xmlns:w16se="http://schemas.microsoft.com/office/word/2015/wordml/symex" xmlns:wpg="http://schemas.microsoft.com/office/word/2010/wordprocessingGroup" xmlns:wpi="http://schemas.microsoft.com/office/word/2010/wordprocessingInk" xmlns:wne="http://schemas.microsoft.com/office/word/2006/wordml" xmlns:wps="http://schemas.microsoft.com/office/word/2010/wordprocessingShape" mc:Ignorable="w14 w15 w16se w16cid w16 w16cex w16sdtdh wp14">
   <w:endnote w:type="separator" w:id="-1">
     <w:p>
       <w:pPr>
@@ -1332,7 +3646,7 @@
 </file>
 
 <file path=word/footer1.xml><?xml version="1.0" encoding="utf-8"?>
-<w:ftr xmlns:wpc="http://schemas.microsoft.com/office/word/2010/wordprocessingCanvas" xmlns:cx="http://schemas.microsoft.com/office/drawing/2014/chartex" xmlns:cx1="http://schemas.microsoft.com/office/drawing/2015/9/8/chartex" xmlns:cx2="http://schemas.microsoft.com/office/drawing/2015/10/21/chartex" xmlns:cx3="http://schemas.microsoft.com/office/drawing/2016/5/9/chartex" xmlns:cx4="http://schemas.microsoft.com/office/drawing/2016/5/10/chartex" xmlns:cx5="http://schemas.microsoft.com/office/drawing/2016/5/11/chartex" xmlns:cx6="http://schemas.microsoft.com/office/drawing/2016/5/12/chartex" xmlns:cx7="http://schemas.microsoft.com/office/drawing/2016/5/13/chartex" xmlns:cx8="http://schemas.microsoft.com/office/drawing/2016/5/14/chartex" xmlns:mc="http://schemas.openxmlformats.org/markup-compatibility/2006" xmlns:aink="http://schemas.microsoft.com/office/drawing/2016/ink" xmlns:am3d="http://schemas.microsoft.com/office/drawing/2017/model3d" xmlns:o="urn:schemas-microsoft-com:office:office" xmlns:r="http://schemas.openxmlformats.org/officeDocument/2006/relationships" xmlns:m="http://schemas.openxmlformats.org/officeDocument/2006/math" xmlns:v="urn:schemas-microsoft-com:vml" xmlns:wp14="http://schemas.microsoft.com/office/word/2010/wordprocessingDrawing" xmlns:wp="http://schemas.openxmlformats.org/drawingml/2006/wordprocessingDrawing" xmlns:w10="urn:schemas-microsoft-com:office:word" xmlns:w="http://schemas.openxmlformats.org/wordprocessingml/2006/main" xmlns:w14="http://schemas.microsoft.com/office/word/2010/wordml" xmlns:w15="http://schemas.microsoft.com/office/word/2012/wordml" xmlns:w16cid="http://schemas.microsoft.com/office/word/2016/wordml/cid" xmlns:w16se="http://schemas.microsoft.com/office/word/2015/wordml/symex" xmlns:wpg="http://schemas.microsoft.com/office/word/2010/wordprocessingGroup" xmlns:wpi="http://schemas.microsoft.com/office/word/2010/wordprocessingInk" xmlns:wne="http://schemas.microsoft.com/office/word/2006/wordml" xmlns:wps="http://schemas.microsoft.com/office/word/2010/wordprocessingShape" mc:Ignorable="w14 w15 w16se w16cid wp14">
+<w:ftr xmlns:wpc="http://schemas.microsoft.com/office/word/2010/wordprocessingCanvas" xmlns:cx="http://schemas.microsoft.com/office/drawing/2014/chartex" xmlns:cx1="http://schemas.microsoft.com/office/drawing/2015/9/8/chartex" xmlns:cx2="http://schemas.microsoft.com/office/drawing/2015/10/21/chartex" xmlns:cx3="http://schemas.microsoft.com/office/drawing/2016/5/9/chartex" xmlns:cx4="http://schemas.microsoft.com/office/drawing/2016/5/10/chartex" xmlns:cx5="http://schemas.microsoft.com/office/drawing/2016/5/11/chartex" xmlns:cx6="http://schemas.microsoft.com/office/drawing/2016/5/12/chartex" xmlns:cx7="http://schemas.microsoft.com/office/drawing/2016/5/13/chartex" xmlns:cx8="http://schemas.microsoft.com/office/drawing/2016/5/14/chartex" xmlns:mc="http://schemas.openxmlformats.org/markup-compatibility/2006" xmlns:aink="http://schemas.microsoft.com/office/drawing/2016/ink" xmlns:am3d="http://schemas.microsoft.com/office/drawing/2017/model3d" xmlns:o="urn:schemas-microsoft-com:office:office" xmlns:r="http://schemas.openxmlformats.org/officeDocument/2006/relationships" xmlns:m="http://schemas.openxmlformats.org/officeDocument/2006/math" xmlns:v="urn:schemas-microsoft-com:vml" xmlns:wp14="http://schemas.microsoft.com/office/word/2010/wordprocessingDrawing" xmlns:wp="http://schemas.openxmlformats.org/drawingml/2006/wordprocessingDrawing" xmlns:w10="urn:schemas-microsoft-com:office:word" xmlns:w="http://schemas.openxmlformats.org/wordprocessingml/2006/main" xmlns:w14="http://schemas.microsoft.com/office/word/2010/wordml" xmlns:w15="http://schemas.microsoft.com/office/word/2012/wordml" xmlns:w16cex="http://schemas.microsoft.com/office/word/2018/wordml/cex" xmlns:w16cid="http://schemas.microsoft.com/office/word/2016/wordml/cid" xmlns:w16="http://schemas.microsoft.com/office/word/2018/wordml" xmlns:w16sdtdh="http://schemas.microsoft.com/office/word/2020/wordml/sdtdatahash" xmlns:w16se="http://schemas.microsoft.com/office/word/2015/wordml/symex" xmlns:wpg="http://schemas.microsoft.com/office/word/2010/wordprocessingGroup" xmlns:wpi="http://schemas.microsoft.com/office/word/2010/wordprocessingInk" xmlns:wne="http://schemas.microsoft.com/office/word/2006/wordml" xmlns:wps="http://schemas.microsoft.com/office/word/2010/wordprocessingShape" mc:Ignorable="w14 w15 w16se w16cid w16 w16cex w16sdtdh wp14">
   <w:tbl>
     <w:tblPr>
       <w:tblW w:w="5000" w:type="pct"/>
@@ -1493,7 +3807,7 @@
 </file>
 
 <file path=word/footer2.xml><?xml version="1.0" encoding="utf-8"?>
-<w:ftr xmlns:wpc="http://schemas.microsoft.com/office/word/2010/wordprocessingCanvas" xmlns:cx="http://schemas.microsoft.com/office/drawing/2014/chartex" xmlns:cx1="http://schemas.microsoft.com/office/drawing/2015/9/8/chartex" xmlns:cx2="http://schemas.microsoft.com/office/drawing/2015/10/21/chartex" xmlns:cx3="http://schemas.microsoft.com/office/drawing/2016/5/9/chartex" xmlns:cx4="http://schemas.microsoft.com/office/drawing/2016/5/10/chartex" xmlns:cx5="http://schemas.microsoft.com/office/drawing/2016/5/11/chartex" xmlns:cx6="http://schemas.microsoft.com/office/drawing/2016/5/12/chartex" xmlns:cx7="http://schemas.microsoft.com/office/drawing/2016/5/13/chartex" xmlns:cx8="http://schemas.microsoft.com/office/drawing/2016/5/14/chartex" xmlns:mc="http://schemas.openxmlformats.org/markup-compatibility/2006" xmlns:aink="http://schemas.microsoft.com/office/drawing/2016/ink" xmlns:am3d="http://schemas.microsoft.com/office/drawing/2017/model3d" xmlns:o="urn:schemas-microsoft-com:office:office" xmlns:r="http://schemas.openxmlformats.org/officeDocument/2006/relationships" xmlns:m="http://schemas.openxmlformats.org/officeDocument/2006/math" xmlns:v="urn:schemas-microsoft-com:vml" xmlns:wp14="http://schemas.microsoft.com/office/word/2010/wordprocessingDrawing" xmlns:wp="http://schemas.openxmlformats.org/drawingml/2006/wordprocessingDrawing" xmlns:w10="urn:schemas-microsoft-com:office:word" xmlns:w="http://schemas.openxmlformats.org/wordprocessingml/2006/main" xmlns:w14="http://schemas.microsoft.com/office/word/2010/wordml" xmlns:w15="http://schemas.microsoft.com/office/word/2012/wordml" xmlns:w16cid="http://schemas.microsoft.com/office/word/2016/wordml/cid" xmlns:w16se="http://schemas.microsoft.com/office/word/2015/wordml/symex" xmlns:wpg="http://schemas.microsoft.com/office/word/2010/wordprocessingGroup" xmlns:wpi="http://schemas.microsoft.com/office/word/2010/wordprocessingInk" xmlns:wne="http://schemas.microsoft.com/office/word/2006/wordml" xmlns:wps="http://schemas.microsoft.com/office/word/2010/wordprocessingShape" mc:Ignorable="w14 w15 w16se w16cid wp14">
+<w:ftr xmlns:wpc="http://schemas.microsoft.com/office/word/2010/wordprocessingCanvas" xmlns:cx="http://schemas.microsoft.com/office/drawing/2014/chartex" xmlns:cx1="http://schemas.microsoft.com/office/drawing/2015/9/8/chartex" xmlns:cx2="http://schemas.microsoft.com/office/drawing/2015/10/21/chartex" xmlns:cx3="http://schemas.microsoft.com/office/drawing/2016/5/9/chartex" xmlns:cx4="http://schemas.microsoft.com/office/drawing/2016/5/10/chartex" xmlns:cx5="http://schemas.microsoft.com/office/drawing/2016/5/11/chartex" xmlns:cx6="http://schemas.microsoft.com/office/drawing/2016/5/12/chartex" xmlns:cx7="http://schemas.microsoft.com/office/drawing/2016/5/13/chartex" xmlns:cx8="http://schemas.microsoft.com/office/drawing/2016/5/14/chartex" xmlns:mc="http://schemas.openxmlformats.org/markup-compatibility/2006" xmlns:aink="http://schemas.microsoft.com/office/drawing/2016/ink" xmlns:am3d="http://schemas.microsoft.com/office/drawing/2017/model3d" xmlns:o="urn:schemas-microsoft-com:office:office" xmlns:r="http://schemas.openxmlformats.org/officeDocument/2006/relationships" xmlns:m="http://schemas.openxmlformats.org/officeDocument/2006/math" xmlns:v="urn:schemas-microsoft-com:vml" xmlns:wp14="http://schemas.microsoft.com/office/word/2010/wordprocessingDrawing" xmlns:wp="http://schemas.openxmlformats.org/drawingml/2006/wordprocessingDrawing" xmlns:w10="urn:schemas-microsoft-com:office:word" xmlns:w="http://schemas.openxmlformats.org/wordprocessingml/2006/main" xmlns:w14="http://schemas.microsoft.com/office/word/2010/wordml" xmlns:w15="http://schemas.microsoft.com/office/word/2012/wordml" xmlns:w16cex="http://schemas.microsoft.com/office/word/2018/wordml/cex" xmlns:w16cid="http://schemas.microsoft.com/office/word/2016/wordml/cid" xmlns:w16="http://schemas.microsoft.com/office/word/2018/wordml" xmlns:w16sdtdh="http://schemas.microsoft.com/office/word/2020/wordml/sdtdatahash" xmlns:w16se="http://schemas.microsoft.com/office/word/2015/wordml/symex" xmlns:wpg="http://schemas.microsoft.com/office/word/2010/wordprocessingGroup" xmlns:wpi="http://schemas.microsoft.com/office/word/2010/wordprocessingInk" xmlns:wne="http://schemas.microsoft.com/office/word/2006/wordml" xmlns:wps="http://schemas.microsoft.com/office/word/2010/wordprocessingShape" mc:Ignorable="w14 w15 w16se w16cid w16 w16cex w16sdtdh wp14">
   <w:tbl>
     <w:tblPr>
       <w:tblW w:w="5000" w:type="pct"/>
@@ -1654,7 +3968,7 @@
 </file>
 
 <file path=word/footnotes.xml><?xml version="1.0" encoding="utf-8"?>
-<w:footnotes xmlns:wpc="http://schemas.microsoft.com/office/word/2010/wordprocessingCanvas" xmlns:cx="http://schemas.microsoft.com/office/drawing/2014/chartex" xmlns:cx1="http://schemas.microsoft.com/office/drawing/2015/9/8/chartex" xmlns:cx2="http://schemas.microsoft.com/office/drawing/2015/10/21/chartex" xmlns:cx3="http://schemas.microsoft.com/office/drawing/2016/5/9/chartex" xmlns:cx4="http://schemas.microsoft.com/office/drawing/2016/5/10/chartex" xmlns:cx5="http://schemas.microsoft.com/office/drawing/2016/5/11/chartex" xmlns:cx6="http://schemas.microsoft.com/office/drawing/2016/5/12/chartex" xmlns:cx7="http://schemas.microsoft.com/office/drawing/2016/5/13/chartex" xmlns:cx8="http://schemas.microsoft.com/office/drawing/2016/5/14/chartex" xmlns:mc="http://schemas.openxmlformats.org/markup-compatibility/2006" xmlns:aink="http://schemas.microsoft.com/office/drawing/2016/ink" xmlns:am3d="http://schemas.microsoft.com/office/drawing/2017/model3d" xmlns:o="urn:schemas-microsoft-com:office:office" xmlns:r="http://schemas.openxmlformats.org/officeDocument/2006/relationships" xmlns:m="http://schemas.openxmlformats.org/officeDocument/2006/math" xmlns:v="urn:schemas-microsoft-com:vml" xmlns:wp14="http://schemas.microsoft.com/office/word/2010/wordprocessingDrawing" xmlns:wp="http://schemas.openxmlformats.org/drawingml/2006/wordprocessingDrawing" xmlns:w10="urn:schemas-microsoft-com:office:word" xmlns:w="http://schemas.openxmlformats.org/wordprocessingml/2006/main" xmlns:w14="http://schemas.microsoft.com/office/word/2010/wordml" xmlns:w15="http://schemas.microsoft.com/office/word/2012/wordml" xmlns:w16cid="http://schemas.microsoft.com/office/word/2016/wordml/cid" xmlns:w16se="http://schemas.microsoft.com/office/word/2015/wordml/symex" xmlns:wpg="http://schemas.microsoft.com/office/word/2010/wordprocessingGroup" xmlns:wpi="http://schemas.microsoft.com/office/word/2010/wordprocessingInk" xmlns:wne="http://schemas.microsoft.com/office/word/2006/wordml" xmlns:wps="http://schemas.microsoft.com/office/word/2010/wordprocessingShape" mc:Ignorable="w14 w15 w16se w16cid wp14">
+<w:footnotes xmlns:wpc="http://schemas.microsoft.com/office/word/2010/wordprocessingCanvas" xmlns:cx="http://schemas.microsoft.com/office/drawing/2014/chartex" xmlns:cx1="http://schemas.microsoft.com/office/drawing/2015/9/8/chartex" xmlns:cx2="http://schemas.microsoft.com/office/drawing/2015/10/21/chartex" xmlns:cx3="http://schemas.microsoft.com/office/drawing/2016/5/9/chartex" xmlns:cx4="http://schemas.microsoft.com/office/drawing/2016/5/10/chartex" xmlns:cx5="http://schemas.microsoft.com/office/drawing/2016/5/11/chartex" xmlns:cx6="http://schemas.microsoft.com/office/drawing/2016/5/12/chartex" xmlns:cx7="http://schemas.microsoft.com/office/drawing/2016/5/13/chartex" xmlns:cx8="http://schemas.microsoft.com/office/drawing/2016/5/14/chartex" xmlns:mc="http://schemas.openxmlformats.org/markup-compatibility/2006" xmlns:aink="http://schemas.microsoft.com/office/drawing/2016/ink" xmlns:am3d="http://schemas.microsoft.com/office/drawing/2017/model3d" xmlns:o="urn:schemas-microsoft-com:office:office" xmlns:r="http://schemas.openxmlformats.org/officeDocument/2006/relationships" xmlns:m="http://schemas.openxmlformats.org/officeDocument/2006/math" xmlns:v="urn:schemas-microsoft-com:vml" xmlns:wp14="http://schemas.microsoft.com/office/word/2010/wordprocessingDrawing" xmlns:wp="http://schemas.openxmlformats.org/drawingml/2006/wordprocessingDrawing" xmlns:w10="urn:schemas-microsoft-com:office:word" xmlns:w="http://schemas.openxmlformats.org/wordprocessingml/2006/main" xmlns:w14="http://schemas.microsoft.com/office/word/2010/wordml" xmlns:w15="http://schemas.microsoft.com/office/word/2012/wordml" xmlns:w16cex="http://schemas.microsoft.com/office/word/2018/wordml/cex" xmlns:w16cid="http://schemas.microsoft.com/office/word/2016/wordml/cid" xmlns:w16="http://schemas.microsoft.com/office/word/2018/wordml" xmlns:w16sdtdh="http://schemas.microsoft.com/office/word/2020/wordml/sdtdatahash" xmlns:w16se="http://schemas.microsoft.com/office/word/2015/wordml/symex" xmlns:wpg="http://schemas.microsoft.com/office/word/2010/wordprocessingGroup" xmlns:wpi="http://schemas.microsoft.com/office/word/2010/wordprocessingInk" xmlns:wne="http://schemas.microsoft.com/office/word/2006/wordml" xmlns:wps="http://schemas.microsoft.com/office/word/2010/wordprocessingShape" mc:Ignorable="w14 w15 w16se w16cid w16 w16cex w16sdtdh wp14">
   <w:footnote w:type="separator" w:id="-1">
     <w:p>
       <w:pPr>
@@ -1679,7 +3993,7 @@
 </file>
 
 <file path=word/header1.xml><?xml version="1.0" encoding="utf-8"?>
-<w:hdr xmlns:wpc="http://schemas.microsoft.com/office/word/2010/wordprocessingCanvas" xmlns:cx="http://schemas.microsoft.com/office/drawing/2014/chartex" xmlns:cx1="http://schemas.microsoft.com/office/drawing/2015/9/8/chartex" xmlns:cx2="http://schemas.microsoft.com/office/drawing/2015/10/21/chartex" xmlns:cx3="http://schemas.microsoft.com/office/drawing/2016/5/9/chartex" xmlns:cx4="http://schemas.microsoft.com/office/drawing/2016/5/10/chartex" xmlns:cx5="http://schemas.microsoft.com/office/drawing/2016/5/11/chartex" xmlns:cx6="http://schemas.microsoft.com/office/drawing/2016/5/12/chartex" xmlns:cx7="http://schemas.microsoft.com/office/drawing/2016/5/13/chartex" xmlns:cx8="http://schemas.microsoft.com/office/drawing/2016/5/14/chartex" xmlns:mc="http://schemas.openxmlformats.org/markup-compatibility/2006" xmlns:aink="http://schemas.microsoft.com/office/drawing/2016/ink" xmlns:am3d="http://schemas.microsoft.com/office/drawing/2017/model3d" xmlns:o="urn:schemas-microsoft-com:office:office" xmlns:r="http://schemas.openxmlformats.org/officeDocument/2006/relationships" xmlns:m="http://schemas.openxmlformats.org/officeDocument/2006/math" xmlns:v="urn:schemas-microsoft-com:vml" xmlns:wp14="http://schemas.microsoft.com/office/word/2010/wordprocessingDrawing" xmlns:wp="http://schemas.openxmlformats.org/drawingml/2006/wordprocessingDrawing" xmlns:w10="urn:schemas-microsoft-com:office:word" xmlns:w="http://schemas.openxmlformats.org/wordprocessingml/2006/main" xmlns:w14="http://schemas.microsoft.com/office/word/2010/wordml" xmlns:w15="http://schemas.microsoft.com/office/word/2012/wordml" xmlns:w16cid="http://schemas.microsoft.com/office/word/2016/wordml/cid" xmlns:w16se="http://schemas.microsoft.com/office/word/2015/wordml/symex" xmlns:wpg="http://schemas.microsoft.com/office/word/2010/wordprocessingGroup" xmlns:wpi="http://schemas.microsoft.com/office/word/2010/wordprocessingInk" xmlns:wne="http://schemas.microsoft.com/office/word/2006/wordml" xmlns:wps="http://schemas.microsoft.com/office/word/2010/wordprocessingShape" mc:Ignorable="w14 w15 w16se w16cid wp14">
+<w:hdr xmlns:wpc="http://schemas.microsoft.com/office/word/2010/wordprocessingCanvas" xmlns:cx="http://schemas.microsoft.com/office/drawing/2014/chartex" xmlns:cx1="http://schemas.microsoft.com/office/drawing/2015/9/8/chartex" xmlns:cx2="http://schemas.microsoft.com/office/drawing/2015/10/21/chartex" xmlns:cx3="http://schemas.microsoft.com/office/drawing/2016/5/9/chartex" xmlns:cx4="http://schemas.microsoft.com/office/drawing/2016/5/10/chartex" xmlns:cx5="http://schemas.microsoft.com/office/drawing/2016/5/11/chartex" xmlns:cx6="http://schemas.microsoft.com/office/drawing/2016/5/12/chartex" xmlns:cx7="http://schemas.microsoft.com/office/drawing/2016/5/13/chartex" xmlns:cx8="http://schemas.microsoft.com/office/drawing/2016/5/14/chartex" xmlns:mc="http://schemas.openxmlformats.org/markup-compatibility/2006" xmlns:aink="http://schemas.microsoft.com/office/drawing/2016/ink" xmlns:am3d="http://schemas.microsoft.com/office/drawing/2017/model3d" xmlns:o="urn:schemas-microsoft-com:office:office" xmlns:r="http://schemas.openxmlformats.org/officeDocument/2006/relationships" xmlns:m="http://schemas.openxmlformats.org/officeDocument/2006/math" xmlns:v="urn:schemas-microsoft-com:vml" xmlns:wp14="http://schemas.microsoft.com/office/word/2010/wordprocessingDrawing" xmlns:wp="http://schemas.openxmlformats.org/drawingml/2006/wordprocessingDrawing" xmlns:w10="urn:schemas-microsoft-com:office:word" xmlns:w="http://schemas.openxmlformats.org/wordprocessingml/2006/main" xmlns:w14="http://schemas.microsoft.com/office/word/2010/wordml" xmlns:w15="http://schemas.microsoft.com/office/word/2012/wordml" xmlns:w16cex="http://schemas.microsoft.com/office/word/2018/wordml/cex" xmlns:w16cid="http://schemas.microsoft.com/office/word/2016/wordml/cid" xmlns:w16="http://schemas.microsoft.com/office/word/2018/wordml" xmlns:w16sdtdh="http://schemas.microsoft.com/office/word/2020/wordml/sdtdatahash" xmlns:w16se="http://schemas.microsoft.com/office/word/2015/wordml/symex" xmlns:wpg="http://schemas.microsoft.com/office/word/2010/wordprocessingGroup" xmlns:wpi="http://schemas.microsoft.com/office/word/2010/wordprocessingInk" xmlns:wne="http://schemas.microsoft.com/office/word/2006/wordml" xmlns:wps="http://schemas.microsoft.com/office/word/2010/wordprocessingShape" mc:Ignorable="w14 w15 w16se w16cid w16 w16cex w16sdtdh wp14">
   <w:tbl>
     <w:tblPr>
       <w:tblStyle w:val="1"/>
@@ -1876,7 +4190,7 @@
 </file>
 
 <file path=word/header2.xml><?xml version="1.0" encoding="utf-8"?>
-<w:hdr xmlns:wpc="http://schemas.microsoft.com/office/word/2010/wordprocessingCanvas" xmlns:cx="http://schemas.microsoft.com/office/drawing/2014/chartex" xmlns:cx1="http://schemas.microsoft.com/office/drawing/2015/9/8/chartex" xmlns:cx2="http://schemas.microsoft.com/office/drawing/2015/10/21/chartex" xmlns:cx3="http://schemas.microsoft.com/office/drawing/2016/5/9/chartex" xmlns:cx4="http://schemas.microsoft.com/office/drawing/2016/5/10/chartex" xmlns:cx5="http://schemas.microsoft.com/office/drawing/2016/5/11/chartex" xmlns:cx6="http://schemas.microsoft.com/office/drawing/2016/5/12/chartex" xmlns:cx7="http://schemas.microsoft.com/office/drawing/2016/5/13/chartex" xmlns:cx8="http://schemas.microsoft.com/office/drawing/2016/5/14/chartex" xmlns:mc="http://schemas.openxmlformats.org/markup-compatibility/2006" xmlns:aink="http://schemas.microsoft.com/office/drawing/2016/ink" xmlns:am3d="http://schemas.microsoft.com/office/drawing/2017/model3d" xmlns:o="urn:schemas-microsoft-com:office:office" xmlns:r="http://schemas.openxmlformats.org/officeDocument/2006/relationships" xmlns:m="http://schemas.openxmlformats.org/officeDocument/2006/math" xmlns:v="urn:schemas-microsoft-com:vml" xmlns:wp14="http://schemas.microsoft.com/office/word/2010/wordprocessingDrawing" xmlns:wp="http://schemas.openxmlformats.org/drawingml/2006/wordprocessingDrawing" xmlns:w10="urn:schemas-microsoft-com:office:word" xmlns:w="http://schemas.openxmlformats.org/wordprocessingml/2006/main" xmlns:w14="http://schemas.microsoft.com/office/word/2010/wordml" xmlns:w15="http://schemas.microsoft.com/office/word/2012/wordml" xmlns:w16cid="http://schemas.microsoft.com/office/word/2016/wordml/cid" xmlns:w16se="http://schemas.microsoft.com/office/word/2015/wordml/symex" xmlns:wpg="http://schemas.microsoft.com/office/word/2010/wordprocessingGroup" xmlns:wpi="http://schemas.microsoft.com/office/word/2010/wordprocessingInk" xmlns:wne="http://schemas.microsoft.com/office/word/2006/wordml" xmlns:wps="http://schemas.microsoft.com/office/word/2010/wordprocessingShape" mc:Ignorable="w14 w15 w16se w16cid wp14">
+<w:hdr xmlns:wpc="http://schemas.microsoft.com/office/word/2010/wordprocessingCanvas" xmlns:cx="http://schemas.microsoft.com/office/drawing/2014/chartex" xmlns:cx1="http://schemas.microsoft.com/office/drawing/2015/9/8/chartex" xmlns:cx2="http://schemas.microsoft.com/office/drawing/2015/10/21/chartex" xmlns:cx3="http://schemas.microsoft.com/office/drawing/2016/5/9/chartex" xmlns:cx4="http://schemas.microsoft.com/office/drawing/2016/5/10/chartex" xmlns:cx5="http://schemas.microsoft.com/office/drawing/2016/5/11/chartex" xmlns:cx6="http://schemas.microsoft.com/office/drawing/2016/5/12/chartex" xmlns:cx7="http://schemas.microsoft.com/office/drawing/2016/5/13/chartex" xmlns:cx8="http://schemas.microsoft.com/office/drawing/2016/5/14/chartex" xmlns:mc="http://schemas.openxmlformats.org/markup-compatibility/2006" xmlns:aink="http://schemas.microsoft.com/office/drawing/2016/ink" xmlns:am3d="http://schemas.microsoft.com/office/drawing/2017/model3d" xmlns:o="urn:schemas-microsoft-com:office:office" xmlns:r="http://schemas.openxmlformats.org/officeDocument/2006/relationships" xmlns:m="http://schemas.openxmlformats.org/officeDocument/2006/math" xmlns:v="urn:schemas-microsoft-com:vml" xmlns:wp14="http://schemas.microsoft.com/office/word/2010/wordprocessingDrawing" xmlns:wp="http://schemas.openxmlformats.org/drawingml/2006/wordprocessingDrawing" xmlns:w10="urn:schemas-microsoft-com:office:word" xmlns:w="http://schemas.openxmlformats.org/wordprocessingml/2006/main" xmlns:w14="http://schemas.microsoft.com/office/word/2010/wordml" xmlns:w15="http://schemas.microsoft.com/office/word/2012/wordml" xmlns:w16cex="http://schemas.microsoft.com/office/word/2018/wordml/cex" xmlns:w16cid="http://schemas.microsoft.com/office/word/2016/wordml/cid" xmlns:w16="http://schemas.microsoft.com/office/word/2018/wordml" xmlns:w16sdtdh="http://schemas.microsoft.com/office/word/2020/wordml/sdtdatahash" xmlns:w16se="http://schemas.microsoft.com/office/word/2015/wordml/symex" xmlns:wpg="http://schemas.microsoft.com/office/word/2010/wordprocessingGroup" xmlns:wpi="http://schemas.microsoft.com/office/word/2010/wordprocessingInk" xmlns:wne="http://schemas.microsoft.com/office/word/2006/wordml" xmlns:wps="http://schemas.microsoft.com/office/word/2010/wordprocessingShape" mc:Ignorable="w14 w15 w16se w16cid w16 w16cex w16sdtdh wp14">
   <w:p>
     <w:pPr>
       <w:pStyle w:val="Encabezado"/>
@@ -1951,7 +4265,7 @@
 </file>
 
 <file path=word/header3.xml><?xml version="1.0" encoding="utf-8"?>
-<w:hdr xmlns:wpc="http://schemas.microsoft.com/office/word/2010/wordprocessingCanvas" xmlns:cx="http://schemas.microsoft.com/office/drawing/2014/chartex" xmlns:cx1="http://schemas.microsoft.com/office/drawing/2015/9/8/chartex" xmlns:cx2="http://schemas.microsoft.com/office/drawing/2015/10/21/chartex" xmlns:cx3="http://schemas.microsoft.com/office/drawing/2016/5/9/chartex" xmlns:cx4="http://schemas.microsoft.com/office/drawing/2016/5/10/chartex" xmlns:cx5="http://schemas.microsoft.com/office/drawing/2016/5/11/chartex" xmlns:cx6="http://schemas.microsoft.com/office/drawing/2016/5/12/chartex" xmlns:cx7="http://schemas.microsoft.com/office/drawing/2016/5/13/chartex" xmlns:cx8="http://schemas.microsoft.com/office/drawing/2016/5/14/chartex" xmlns:mc="http://schemas.openxmlformats.org/markup-compatibility/2006" xmlns:aink="http://schemas.microsoft.com/office/drawing/2016/ink" xmlns:am3d="http://schemas.microsoft.com/office/drawing/2017/model3d" xmlns:o="urn:schemas-microsoft-com:office:office" xmlns:r="http://schemas.openxmlformats.org/officeDocument/2006/relationships" xmlns:m="http://schemas.openxmlformats.org/officeDocument/2006/math" xmlns:v="urn:schemas-microsoft-com:vml" xmlns:wp14="http://schemas.microsoft.com/office/word/2010/wordprocessingDrawing" xmlns:wp="http://schemas.openxmlformats.org/drawingml/2006/wordprocessingDrawing" xmlns:w10="urn:schemas-microsoft-com:office:word" xmlns:w="http://schemas.openxmlformats.org/wordprocessingml/2006/main" xmlns:w14="http://schemas.microsoft.com/office/word/2010/wordml" xmlns:w15="http://schemas.microsoft.com/office/word/2012/wordml" xmlns:w16cid="http://schemas.microsoft.com/office/word/2016/wordml/cid" xmlns:w16se="http://schemas.microsoft.com/office/word/2015/wordml/symex" xmlns:wpg="http://schemas.microsoft.com/office/word/2010/wordprocessingGroup" xmlns:wpi="http://schemas.microsoft.com/office/word/2010/wordprocessingInk" xmlns:wne="http://schemas.microsoft.com/office/word/2006/wordml" xmlns:wps="http://schemas.microsoft.com/office/word/2010/wordprocessingShape" mc:Ignorable="w14 w15 w16se w16cid wp14">
+<w:hdr xmlns:wpc="http://schemas.microsoft.com/office/word/2010/wordprocessingCanvas" xmlns:cx="http://schemas.microsoft.com/office/drawing/2014/chartex" xmlns:cx1="http://schemas.microsoft.com/office/drawing/2015/9/8/chartex" xmlns:cx2="http://schemas.microsoft.com/office/drawing/2015/10/21/chartex" xmlns:cx3="http://schemas.microsoft.com/office/drawing/2016/5/9/chartex" xmlns:cx4="http://schemas.microsoft.com/office/drawing/2016/5/10/chartex" xmlns:cx5="http://schemas.microsoft.com/office/drawing/2016/5/11/chartex" xmlns:cx6="http://schemas.microsoft.com/office/drawing/2016/5/12/chartex" xmlns:cx7="http://schemas.microsoft.com/office/drawing/2016/5/13/chartex" xmlns:cx8="http://schemas.microsoft.com/office/drawing/2016/5/14/chartex" xmlns:mc="http://schemas.openxmlformats.org/markup-compatibility/2006" xmlns:aink="http://schemas.microsoft.com/office/drawing/2016/ink" xmlns:am3d="http://schemas.microsoft.com/office/drawing/2017/model3d" xmlns:o="urn:schemas-microsoft-com:office:office" xmlns:r="http://schemas.openxmlformats.org/officeDocument/2006/relationships" xmlns:m="http://schemas.openxmlformats.org/officeDocument/2006/math" xmlns:v="urn:schemas-microsoft-com:vml" xmlns:wp14="http://schemas.microsoft.com/office/word/2010/wordprocessingDrawing" xmlns:wp="http://schemas.openxmlformats.org/drawingml/2006/wordprocessingDrawing" xmlns:w10="urn:schemas-microsoft-com:office:word" xmlns:w="http://schemas.openxmlformats.org/wordprocessingml/2006/main" xmlns:w14="http://schemas.microsoft.com/office/word/2010/wordml" xmlns:w15="http://schemas.microsoft.com/office/word/2012/wordml" xmlns:w16cex="http://schemas.microsoft.com/office/word/2018/wordml/cex" xmlns:w16cid="http://schemas.microsoft.com/office/word/2016/wordml/cid" xmlns:w16="http://schemas.microsoft.com/office/word/2018/wordml" xmlns:w16sdtdh="http://schemas.microsoft.com/office/word/2020/wordml/sdtdatahash" xmlns:w16se="http://schemas.microsoft.com/office/word/2015/wordml/symex" xmlns:wpg="http://schemas.microsoft.com/office/word/2010/wordprocessingGroup" xmlns:wpi="http://schemas.microsoft.com/office/word/2010/wordprocessingInk" xmlns:wne="http://schemas.microsoft.com/office/word/2006/wordml" xmlns:wps="http://schemas.microsoft.com/office/word/2010/wordprocessingShape" mc:Ignorable="w14 w15 w16se w16cid w16 w16cex w16sdtdh wp14">
   <w:tbl>
     <w:tblPr>
       <w:tblStyle w:val="1"/>
@@ -2148,7 +4462,7 @@
 </file>
 
 <file path=word/numbering.xml><?xml version="1.0" encoding="utf-8"?>
-<w:numbering xmlns:wpc="http://schemas.microsoft.com/office/word/2010/wordprocessingCanvas" xmlns:cx="http://schemas.microsoft.com/office/drawing/2014/chartex" xmlns:cx1="http://schemas.microsoft.com/office/drawing/2015/9/8/chartex" xmlns:cx2="http://schemas.microsoft.com/office/drawing/2015/10/21/chartex" xmlns:cx3="http://schemas.microsoft.com/office/drawing/2016/5/9/chartex" xmlns:cx4="http://schemas.microsoft.com/office/drawing/2016/5/10/chartex" xmlns:cx5="http://schemas.microsoft.com/office/drawing/2016/5/11/chartex" xmlns:cx6="http://schemas.microsoft.com/office/drawing/2016/5/12/chartex" xmlns:cx7="http://schemas.microsoft.com/office/drawing/2016/5/13/chartex" xmlns:cx8="http://schemas.microsoft.com/office/drawing/2016/5/14/chartex" xmlns:mc="http://schemas.openxmlformats.org/markup-compatibility/2006" xmlns:aink="http://schemas.microsoft.com/office/drawing/2016/ink" xmlns:am3d="http://schemas.microsoft.com/office/drawing/2017/model3d" xmlns:o="urn:schemas-microsoft-com:office:office" xmlns:r="http://schemas.openxmlformats.org/officeDocument/2006/relationships" xmlns:m="http://schemas.openxmlformats.org/officeDocument/2006/math" xmlns:v="urn:schemas-microsoft-com:vml" xmlns:wp14="http://schemas.microsoft.com/office/word/2010/wordprocessingDrawing" xmlns:wp="http://schemas.openxmlformats.org/drawingml/2006/wordprocessingDrawing" xmlns:w10="urn:schemas-microsoft-com:office:word" xmlns:w="http://schemas.openxmlformats.org/wordprocessingml/2006/main" xmlns:w14="http://schemas.microsoft.com/office/word/2010/wordml" xmlns:w15="http://schemas.microsoft.com/office/word/2012/wordml" xmlns:w16cid="http://schemas.microsoft.com/office/word/2016/wordml/cid" xmlns:w16se="http://schemas.microsoft.com/office/word/2015/wordml/symex" xmlns:wpg="http://schemas.microsoft.com/office/word/2010/wordprocessingGroup" xmlns:wpi="http://schemas.microsoft.com/office/word/2010/wordprocessingInk" xmlns:wne="http://schemas.microsoft.com/office/word/2006/wordml" xmlns:wps="http://schemas.microsoft.com/office/word/2010/wordprocessingShape" mc:Ignorable="w14 w15 w16se w16cid wp14">
+<w:numbering xmlns:wpc="http://schemas.microsoft.com/office/word/2010/wordprocessingCanvas" xmlns:cx="http://schemas.microsoft.com/office/drawing/2014/chartex" xmlns:cx1="http://schemas.microsoft.com/office/drawing/2015/9/8/chartex" xmlns:cx2="http://schemas.microsoft.com/office/drawing/2015/10/21/chartex" xmlns:cx3="http://schemas.microsoft.com/office/drawing/2016/5/9/chartex" xmlns:cx4="http://schemas.microsoft.com/office/drawing/2016/5/10/chartex" xmlns:cx5="http://schemas.microsoft.com/office/drawing/2016/5/11/chartex" xmlns:cx6="http://schemas.microsoft.com/office/drawing/2016/5/12/chartex" xmlns:cx7="http://schemas.microsoft.com/office/drawing/2016/5/13/chartex" xmlns:cx8="http://schemas.microsoft.com/office/drawing/2016/5/14/chartex" xmlns:mc="http://schemas.openxmlformats.org/markup-compatibility/2006" xmlns:aink="http://schemas.microsoft.com/office/drawing/2016/ink" xmlns:am3d="http://schemas.microsoft.com/office/drawing/2017/model3d" xmlns:o="urn:schemas-microsoft-com:office:office" xmlns:r="http://schemas.openxmlformats.org/officeDocument/2006/relationships" xmlns:m="http://schemas.openxmlformats.org/officeDocument/2006/math" xmlns:v="urn:schemas-microsoft-com:vml" xmlns:wp14="http://schemas.microsoft.com/office/word/2010/wordprocessingDrawing" xmlns:wp="http://schemas.openxmlformats.org/drawingml/2006/wordprocessingDrawing" xmlns:w10="urn:schemas-microsoft-com:office:word" xmlns:w="http://schemas.openxmlformats.org/wordprocessingml/2006/main" xmlns:w14="http://schemas.microsoft.com/office/word/2010/wordml" xmlns:w15="http://schemas.microsoft.com/office/word/2012/wordml" xmlns:w16cex="http://schemas.microsoft.com/office/word/2018/wordml/cex" xmlns:w16cid="http://schemas.microsoft.com/office/word/2016/wordml/cid" xmlns:w16="http://schemas.microsoft.com/office/word/2018/wordml" xmlns:w16sdtdh="http://schemas.microsoft.com/office/word/2020/wordml/sdtdatahash" xmlns:w16se="http://schemas.microsoft.com/office/word/2015/wordml/symex" xmlns:wpg="http://schemas.microsoft.com/office/word/2010/wordprocessingGroup" xmlns:wpi="http://schemas.microsoft.com/office/word/2010/wordprocessingInk" xmlns:wne="http://schemas.microsoft.com/office/word/2006/wordml" xmlns:wps="http://schemas.microsoft.com/office/word/2010/wordprocessingShape" mc:Ignorable="w14 w15 w16se w16cid w16 w16cex w16sdtdh wp14">
   <w:numPicBullet w:numPicBulletId="0">
     <w:pict>
       <v:shapetype id="_x0000_t75" coordsize="21600,21600" o:spt="75" o:preferrelative="t" path="m@4@5l@4@11@9@11@9@5xe" filled="f" stroked="f">
@@ -2170,7 +4484,7 @@
         <v:path o:extrusionok="f" gradientshapeok="t" o:connecttype="rect"/>
         <o:lock v:ext="edit" aspectratio="t"/>
       </v:shapetype>
-      <v:shape id="_x0000_i1027" type="#_x0000_t75" style="width:11.25pt;height:11.25pt" o:bullet="t">
+      <v:shape id="_x0000_i1138" type="#_x0000_t75" style="width:11.4pt;height:11.4pt" o:bullet="t">
         <v:imagedata r:id="rId1" o:title="mso3E28"/>
       </v:shape>
     </w:pict>
@@ -2630,6 +4944,95 @@
     </w:lvl>
   </w:abstractNum>
   <w:abstractNum w:abstractNumId="4" w15:restartNumberingAfterBreak="0">
+    <w:nsid w:val="25EF7B9A"/>
+    <w:multiLevelType w:val="hybridMultilevel"/>
+    <w:tmpl w:val="59CA3074"/>
+    <w:lvl w:ilvl="0" w:tplc="300A000F">
+      <w:start w:val="1"/>
+      <w:numFmt w:val="decimal"/>
+      <w:lvlText w:val="%1."/>
+      <w:lvlJc w:val="left"/>
+      <w:pPr>
+        <w:ind w:left="720" w:hanging="360"/>
+      </w:pPr>
+      <w:rPr>
+        <w:rFonts w:hint="default"/>
+      </w:rPr>
+    </w:lvl>
+    <w:lvl w:ilvl="1" w:tplc="300A0019" w:tentative="1">
+      <w:start w:val="1"/>
+      <w:numFmt w:val="lowerLetter"/>
+      <w:lvlText w:val="%2."/>
+      <w:lvlJc w:val="left"/>
+      <w:pPr>
+        <w:ind w:left="1440" w:hanging="360"/>
+      </w:pPr>
+    </w:lvl>
+    <w:lvl w:ilvl="2" w:tplc="300A001B" w:tentative="1">
+      <w:start w:val="1"/>
+      <w:numFmt w:val="lowerRoman"/>
+      <w:lvlText w:val="%3."/>
+      <w:lvlJc w:val="right"/>
+      <w:pPr>
+        <w:ind w:left="2160" w:hanging="180"/>
+      </w:pPr>
+    </w:lvl>
+    <w:lvl w:ilvl="3" w:tplc="300A000F" w:tentative="1">
+      <w:start w:val="1"/>
+      <w:numFmt w:val="decimal"/>
+      <w:lvlText w:val="%4."/>
+      <w:lvlJc w:val="left"/>
+      <w:pPr>
+        <w:ind w:left="2880" w:hanging="360"/>
+      </w:pPr>
+    </w:lvl>
+    <w:lvl w:ilvl="4" w:tplc="300A0019" w:tentative="1">
+      <w:start w:val="1"/>
+      <w:numFmt w:val="lowerLetter"/>
+      <w:lvlText w:val="%5."/>
+      <w:lvlJc w:val="left"/>
+      <w:pPr>
+        <w:ind w:left="3600" w:hanging="360"/>
+      </w:pPr>
+    </w:lvl>
+    <w:lvl w:ilvl="5" w:tplc="300A001B" w:tentative="1">
+      <w:start w:val="1"/>
+      <w:numFmt w:val="lowerRoman"/>
+      <w:lvlText w:val="%6."/>
+      <w:lvlJc w:val="right"/>
+      <w:pPr>
+        <w:ind w:left="4320" w:hanging="180"/>
+      </w:pPr>
+    </w:lvl>
+    <w:lvl w:ilvl="6" w:tplc="300A000F" w:tentative="1">
+      <w:start w:val="1"/>
+      <w:numFmt w:val="decimal"/>
+      <w:lvlText w:val="%7."/>
+      <w:lvlJc w:val="left"/>
+      <w:pPr>
+        <w:ind w:left="5040" w:hanging="360"/>
+      </w:pPr>
+    </w:lvl>
+    <w:lvl w:ilvl="7" w:tplc="300A0019" w:tentative="1">
+      <w:start w:val="1"/>
+      <w:numFmt w:val="lowerLetter"/>
+      <w:lvlText w:val="%8."/>
+      <w:lvlJc w:val="left"/>
+      <w:pPr>
+        <w:ind w:left="5760" w:hanging="360"/>
+      </w:pPr>
+    </w:lvl>
+    <w:lvl w:ilvl="8" w:tplc="300A001B" w:tentative="1">
+      <w:start w:val="1"/>
+      <w:numFmt w:val="lowerRoman"/>
+      <w:lvlText w:val="%9."/>
+      <w:lvlJc w:val="right"/>
+      <w:pPr>
+        <w:ind w:left="6480" w:hanging="180"/>
+      </w:pPr>
+    </w:lvl>
+  </w:abstractNum>
+  <w:abstractNum w:abstractNumId="5" w15:restartNumberingAfterBreak="0">
     <w:nsid w:val="26DE4B16"/>
     <w:multiLevelType w:val="multilevel"/>
     <w:tmpl w:val="9470283E"/>
@@ -2778,7 +5181,7 @@
       </w:rPr>
     </w:lvl>
   </w:abstractNum>
-  <w:abstractNum w:abstractNumId="5" w15:restartNumberingAfterBreak="0">
+  <w:abstractNum w:abstractNumId="6" w15:restartNumberingAfterBreak="0">
     <w:nsid w:val="2E8C7B01"/>
     <w:multiLevelType w:val="multilevel"/>
     <w:tmpl w:val="C17EACDC"/>
@@ -2899,7 +5302,7 @@
       </w:rPr>
     </w:lvl>
   </w:abstractNum>
-  <w:abstractNum w:abstractNumId="6" w15:restartNumberingAfterBreak="0">
+  <w:abstractNum w:abstractNumId="7" w15:restartNumberingAfterBreak="0">
     <w:nsid w:val="40DD1A90"/>
     <w:multiLevelType w:val="multilevel"/>
     <w:tmpl w:val="6E5C174A"/>
@@ -3012,7 +5415,7 @@
       </w:rPr>
     </w:lvl>
   </w:abstractNum>
-  <w:abstractNum w:abstractNumId="7" w15:restartNumberingAfterBreak="0">
+  <w:abstractNum w:abstractNumId="8" w15:restartNumberingAfterBreak="0">
     <w:nsid w:val="43722CF5"/>
     <w:multiLevelType w:val="hybridMultilevel"/>
     <w:tmpl w:val="7CCAC0E6"/>
@@ -3098,7 +5501,7 @@
       </w:pPr>
     </w:lvl>
   </w:abstractNum>
-  <w:abstractNum w:abstractNumId="8" w15:restartNumberingAfterBreak="0">
+  <w:abstractNum w:abstractNumId="9" w15:restartNumberingAfterBreak="0">
     <w:nsid w:val="4D4940A8"/>
     <w:multiLevelType w:val="hybridMultilevel"/>
     <w:tmpl w:val="4FEC69F0"/>
@@ -3212,7 +5615,7 @@
       </w:rPr>
     </w:lvl>
   </w:abstractNum>
-  <w:abstractNum w:abstractNumId="9" w15:restartNumberingAfterBreak="0">
+  <w:abstractNum w:abstractNumId="10" w15:restartNumberingAfterBreak="0">
     <w:nsid w:val="4F397A1C"/>
     <w:multiLevelType w:val="multilevel"/>
     <w:tmpl w:val="CCDA827E"/>
@@ -3361,7 +5764,120 @@
       </w:rPr>
     </w:lvl>
   </w:abstractNum>
-  <w:abstractNum w:abstractNumId="10" w15:restartNumberingAfterBreak="0">
+  <w:abstractNum w:abstractNumId="11" w15:restartNumberingAfterBreak="0">
+    <w:nsid w:val="504F2C3C"/>
+    <w:multiLevelType w:val="hybridMultilevel"/>
+    <w:tmpl w:val="5446791E"/>
+    <w:lvl w:ilvl="0" w:tplc="300A0001">
+      <w:start w:val="1"/>
+      <w:numFmt w:val="bullet"/>
+      <w:lvlText w:val=""/>
+      <w:lvlJc w:val="left"/>
+      <w:pPr>
+        <w:ind w:left="720" w:hanging="360"/>
+      </w:pPr>
+      <w:rPr>
+        <w:rFonts w:ascii="Symbol" w:hAnsi="Symbol" w:hint="default"/>
+      </w:rPr>
+    </w:lvl>
+    <w:lvl w:ilvl="1" w:tplc="300A0003" w:tentative="1">
+      <w:start w:val="1"/>
+      <w:numFmt w:val="bullet"/>
+      <w:lvlText w:val="o"/>
+      <w:lvlJc w:val="left"/>
+      <w:pPr>
+        <w:ind w:left="1440" w:hanging="360"/>
+      </w:pPr>
+      <w:rPr>
+        <w:rFonts w:ascii="Courier New" w:hAnsi="Courier New" w:cs="Courier New" w:hint="default"/>
+      </w:rPr>
+    </w:lvl>
+    <w:lvl w:ilvl="2" w:tplc="300A0005" w:tentative="1">
+      <w:start w:val="1"/>
+      <w:numFmt w:val="bullet"/>
+      <w:lvlText w:val=""/>
+      <w:lvlJc w:val="left"/>
+      <w:pPr>
+        <w:ind w:left="2160" w:hanging="360"/>
+      </w:pPr>
+      <w:rPr>
+        <w:rFonts w:ascii="Wingdings" w:hAnsi="Wingdings" w:hint="default"/>
+      </w:rPr>
+    </w:lvl>
+    <w:lvl w:ilvl="3" w:tplc="300A0001" w:tentative="1">
+      <w:start w:val="1"/>
+      <w:numFmt w:val="bullet"/>
+      <w:lvlText w:val=""/>
+      <w:lvlJc w:val="left"/>
+      <w:pPr>
+        <w:ind w:left="2880" w:hanging="360"/>
+      </w:pPr>
+      <w:rPr>
+        <w:rFonts w:ascii="Symbol" w:hAnsi="Symbol" w:hint="default"/>
+      </w:rPr>
+    </w:lvl>
+    <w:lvl w:ilvl="4" w:tplc="300A0003" w:tentative="1">
+      <w:start w:val="1"/>
+      <w:numFmt w:val="bullet"/>
+      <w:lvlText w:val="o"/>
+      <w:lvlJc w:val="left"/>
+      <w:pPr>
+        <w:ind w:left="3600" w:hanging="360"/>
+      </w:pPr>
+      <w:rPr>
+        <w:rFonts w:ascii="Courier New" w:hAnsi="Courier New" w:cs="Courier New" w:hint="default"/>
+      </w:rPr>
+    </w:lvl>
+    <w:lvl w:ilvl="5" w:tplc="300A0005" w:tentative="1">
+      <w:start w:val="1"/>
+      <w:numFmt w:val="bullet"/>
+      <w:lvlText w:val=""/>
+      <w:lvlJc w:val="left"/>
+      <w:pPr>
+        <w:ind w:left="4320" w:hanging="360"/>
+      </w:pPr>
+      <w:rPr>
+        <w:rFonts w:ascii="Wingdings" w:hAnsi="Wingdings" w:hint="default"/>
+      </w:rPr>
+    </w:lvl>
+    <w:lvl w:ilvl="6" w:tplc="300A0001" w:tentative="1">
+      <w:start w:val="1"/>
+      <w:numFmt w:val="bullet"/>
+      <w:lvlText w:val=""/>
+      <w:lvlJc w:val="left"/>
+      <w:pPr>
+        <w:ind w:left="5040" w:hanging="360"/>
+      </w:pPr>
+      <w:rPr>
+        <w:rFonts w:ascii="Symbol" w:hAnsi="Symbol" w:hint="default"/>
+      </w:rPr>
+    </w:lvl>
+    <w:lvl w:ilvl="7" w:tplc="300A0003" w:tentative="1">
+      <w:start w:val="1"/>
+      <w:numFmt w:val="bullet"/>
+      <w:lvlText w:val="o"/>
+      <w:lvlJc w:val="left"/>
+      <w:pPr>
+        <w:ind w:left="5760" w:hanging="360"/>
+      </w:pPr>
+      <w:rPr>
+        <w:rFonts w:ascii="Courier New" w:hAnsi="Courier New" w:cs="Courier New" w:hint="default"/>
+      </w:rPr>
+    </w:lvl>
+    <w:lvl w:ilvl="8" w:tplc="300A0005" w:tentative="1">
+      <w:start w:val="1"/>
+      <w:numFmt w:val="bullet"/>
+      <w:lvlText w:val=""/>
+      <w:lvlJc w:val="left"/>
+      <w:pPr>
+        <w:ind w:left="6480" w:hanging="360"/>
+      </w:pPr>
+      <w:rPr>
+        <w:rFonts w:ascii="Wingdings" w:hAnsi="Wingdings" w:hint="default"/>
+      </w:rPr>
+    </w:lvl>
+  </w:abstractNum>
+  <w:abstractNum w:abstractNumId="12" w15:restartNumberingAfterBreak="0">
     <w:nsid w:val="54174C12"/>
     <w:multiLevelType w:val="multilevel"/>
     <w:tmpl w:val="15B62650"/>
@@ -3492,7 +6008,7 @@
       </w:rPr>
     </w:lvl>
   </w:abstractNum>
-  <w:abstractNum w:abstractNumId="11" w15:restartNumberingAfterBreak="0">
+  <w:abstractNum w:abstractNumId="13" w15:restartNumberingAfterBreak="0">
     <w:nsid w:val="54517D06"/>
     <w:multiLevelType w:val="hybridMultilevel"/>
     <w:tmpl w:val="3DB0EB80"/>
@@ -3604,7 +6120,96 @@
       </w:rPr>
     </w:lvl>
   </w:abstractNum>
-  <w:abstractNum w:abstractNumId="12" w15:restartNumberingAfterBreak="0">
+  <w:abstractNum w:abstractNumId="14" w15:restartNumberingAfterBreak="0">
+    <w:nsid w:val="61A66414"/>
+    <w:multiLevelType w:val="hybridMultilevel"/>
+    <w:tmpl w:val="EF4CF79C"/>
+    <w:lvl w:ilvl="0" w:tplc="300A000F">
+      <w:start w:val="1"/>
+      <w:numFmt w:val="decimal"/>
+      <w:lvlText w:val="%1."/>
+      <w:lvlJc w:val="left"/>
+      <w:pPr>
+        <w:ind w:left="720" w:hanging="360"/>
+      </w:pPr>
+      <w:rPr>
+        <w:rFonts w:hint="default"/>
+      </w:rPr>
+    </w:lvl>
+    <w:lvl w:ilvl="1" w:tplc="300A0019" w:tentative="1">
+      <w:start w:val="1"/>
+      <w:numFmt w:val="lowerLetter"/>
+      <w:lvlText w:val="%2."/>
+      <w:lvlJc w:val="left"/>
+      <w:pPr>
+        <w:ind w:left="1440" w:hanging="360"/>
+      </w:pPr>
+    </w:lvl>
+    <w:lvl w:ilvl="2" w:tplc="300A001B" w:tentative="1">
+      <w:start w:val="1"/>
+      <w:numFmt w:val="lowerRoman"/>
+      <w:lvlText w:val="%3."/>
+      <w:lvlJc w:val="right"/>
+      <w:pPr>
+        <w:ind w:left="2160" w:hanging="180"/>
+      </w:pPr>
+    </w:lvl>
+    <w:lvl w:ilvl="3" w:tplc="300A000F" w:tentative="1">
+      <w:start w:val="1"/>
+      <w:numFmt w:val="decimal"/>
+      <w:lvlText w:val="%4."/>
+      <w:lvlJc w:val="left"/>
+      <w:pPr>
+        <w:ind w:left="2880" w:hanging="360"/>
+      </w:pPr>
+    </w:lvl>
+    <w:lvl w:ilvl="4" w:tplc="300A0019" w:tentative="1">
+      <w:start w:val="1"/>
+      <w:numFmt w:val="lowerLetter"/>
+      <w:lvlText w:val="%5."/>
+      <w:lvlJc w:val="left"/>
+      <w:pPr>
+        <w:ind w:left="3600" w:hanging="360"/>
+      </w:pPr>
+    </w:lvl>
+    <w:lvl w:ilvl="5" w:tplc="300A001B" w:tentative="1">
+      <w:start w:val="1"/>
+      <w:numFmt w:val="lowerRoman"/>
+      <w:lvlText w:val="%6."/>
+      <w:lvlJc w:val="right"/>
+      <w:pPr>
+        <w:ind w:left="4320" w:hanging="180"/>
+      </w:pPr>
+    </w:lvl>
+    <w:lvl w:ilvl="6" w:tplc="300A000F" w:tentative="1">
+      <w:start w:val="1"/>
+      <w:numFmt w:val="decimal"/>
+      <w:lvlText w:val="%7."/>
+      <w:lvlJc w:val="left"/>
+      <w:pPr>
+        <w:ind w:left="5040" w:hanging="360"/>
+      </w:pPr>
+    </w:lvl>
+    <w:lvl w:ilvl="7" w:tplc="300A0019" w:tentative="1">
+      <w:start w:val="1"/>
+      <w:numFmt w:val="lowerLetter"/>
+      <w:lvlText w:val="%8."/>
+      <w:lvlJc w:val="left"/>
+      <w:pPr>
+        <w:ind w:left="5760" w:hanging="360"/>
+      </w:pPr>
+    </w:lvl>
+    <w:lvl w:ilvl="8" w:tplc="300A001B" w:tentative="1">
+      <w:start w:val="1"/>
+      <w:numFmt w:val="lowerRoman"/>
+      <w:lvlText w:val="%9."/>
+      <w:lvlJc w:val="right"/>
+      <w:pPr>
+        <w:ind w:left="6480" w:hanging="180"/>
+      </w:pPr>
+    </w:lvl>
+  </w:abstractNum>
+  <w:abstractNum w:abstractNumId="15" w15:restartNumberingAfterBreak="0">
     <w:nsid w:val="68E15795"/>
     <w:multiLevelType w:val="hybridMultilevel"/>
     <w:tmpl w:val="8FE616A0"/>
@@ -3717,7 +6322,7 @@
       </w:rPr>
     </w:lvl>
   </w:abstractNum>
-  <w:abstractNum w:abstractNumId="13" w15:restartNumberingAfterBreak="0">
+  <w:abstractNum w:abstractNumId="16" w15:restartNumberingAfterBreak="0">
     <w:nsid w:val="6AFC07D3"/>
     <w:multiLevelType w:val="multilevel"/>
     <w:tmpl w:val="B3426C00"/>
@@ -3830,7 +6435,7 @@
       </w:rPr>
     </w:lvl>
   </w:abstractNum>
-  <w:abstractNum w:abstractNumId="14" w15:restartNumberingAfterBreak="0">
+  <w:abstractNum w:abstractNumId="17" w15:restartNumberingAfterBreak="0">
     <w:nsid w:val="6B7B1E92"/>
     <w:multiLevelType w:val="multilevel"/>
     <w:tmpl w:val="21BA233E"/>
@@ -3961,7 +6566,7 @@
       </w:rPr>
     </w:lvl>
   </w:abstractNum>
-  <w:abstractNum w:abstractNumId="15" w15:restartNumberingAfterBreak="0">
+  <w:abstractNum w:abstractNumId="18" w15:restartNumberingAfterBreak="0">
     <w:nsid w:val="6FA144D3"/>
     <w:multiLevelType w:val="multilevel"/>
     <w:tmpl w:val="98CEB7D6"/>
@@ -4082,7 +6687,7 @@
       </w:rPr>
     </w:lvl>
   </w:abstractNum>
-  <w:abstractNum w:abstractNumId="16" w15:restartNumberingAfterBreak="0">
+  <w:abstractNum w:abstractNumId="19" w15:restartNumberingAfterBreak="0">
     <w:nsid w:val="738344F2"/>
     <w:multiLevelType w:val="hybridMultilevel"/>
     <w:tmpl w:val="C4E037F2"/>
@@ -4197,7 +6802,7 @@
       </w:rPr>
     </w:lvl>
   </w:abstractNum>
-  <w:abstractNum w:abstractNumId="17" w15:restartNumberingAfterBreak="0">
+  <w:abstractNum w:abstractNumId="20" w15:restartNumberingAfterBreak="0">
     <w:nsid w:val="74B1685F"/>
     <w:multiLevelType w:val="hybridMultilevel"/>
     <w:tmpl w:val="943E89B2"/>
@@ -4310,7 +6915,7 @@
       </w:rPr>
     </w:lvl>
   </w:abstractNum>
-  <w:abstractNum w:abstractNumId="18" w15:restartNumberingAfterBreak="0">
+  <w:abstractNum w:abstractNumId="21" w15:restartNumberingAfterBreak="0">
     <w:nsid w:val="75DB1EAD"/>
     <w:multiLevelType w:val="multilevel"/>
     <w:tmpl w:val="F2B0D608"/>
@@ -4423,7 +7028,7 @@
       </w:rPr>
     </w:lvl>
   </w:abstractNum>
-  <w:abstractNum w:abstractNumId="19" w15:restartNumberingAfterBreak="0">
+  <w:abstractNum w:abstractNumId="22" w15:restartNumberingAfterBreak="0">
     <w:nsid w:val="77694BC3"/>
     <w:multiLevelType w:val="hybridMultilevel"/>
     <w:tmpl w:val="8D0A3582"/>
@@ -4536,7 +7141,7 @@
       </w:rPr>
     </w:lvl>
   </w:abstractNum>
-  <w:abstractNum w:abstractNumId="20" w15:restartNumberingAfterBreak="0">
+  <w:abstractNum w:abstractNumId="23" w15:restartNumberingAfterBreak="0">
     <w:nsid w:val="7CE94054"/>
     <w:multiLevelType w:val="multilevel"/>
     <w:tmpl w:val="A4D4C1F2"/>
@@ -4651,31 +7256,31 @@
     </w:lvl>
   </w:abstractNum>
   <w:num w:numId="1">
-    <w:abstractNumId w:val="6"/>
+    <w:abstractNumId w:val="7"/>
   </w:num>
   <w:num w:numId="2">
+    <w:abstractNumId w:val="19"/>
+  </w:num>
+  <w:num w:numId="3">
+    <w:abstractNumId w:val="18"/>
+  </w:num>
+  <w:num w:numId="4">
     <w:abstractNumId w:val="16"/>
   </w:num>
-  <w:num w:numId="3">
-    <w:abstractNumId w:val="15"/>
-  </w:num>
-  <w:num w:numId="4">
-    <w:abstractNumId w:val="13"/>
-  </w:num>
   <w:num w:numId="5">
-    <w:abstractNumId w:val="20"/>
+    <w:abstractNumId w:val="23"/>
   </w:num>
   <w:num w:numId="6">
-    <w:abstractNumId w:val="10"/>
+    <w:abstractNumId w:val="12"/>
   </w:num>
   <w:num w:numId="7">
-    <w:abstractNumId w:val="14"/>
+    <w:abstractNumId w:val="17"/>
   </w:num>
   <w:num w:numId="8">
-    <w:abstractNumId w:val="18"/>
+    <w:abstractNumId w:val="21"/>
   </w:num>
   <w:num w:numId="9">
-    <w:abstractNumId w:val="19"/>
+    <w:abstractNumId w:val="22"/>
   </w:num>
   <w:num w:numId="10">
     <w:abstractNumId w:val="1"/>
@@ -4684,40 +7289,49 @@
     <w:abstractNumId w:val="3"/>
   </w:num>
   <w:num w:numId="12">
-    <w:abstractNumId w:val="11"/>
+    <w:abstractNumId w:val="13"/>
   </w:num>
   <w:num w:numId="13">
-    <w:abstractNumId w:val="5"/>
+    <w:abstractNumId w:val="6"/>
   </w:num>
   <w:num w:numId="14">
-    <w:abstractNumId w:val="8"/>
+    <w:abstractNumId w:val="9"/>
   </w:num>
   <w:num w:numId="15">
     <w:abstractNumId w:val="0"/>
   </w:num>
   <w:num w:numId="16">
-    <w:abstractNumId w:val="17"/>
+    <w:abstractNumId w:val="20"/>
   </w:num>
   <w:num w:numId="17">
-    <w:abstractNumId w:val="12"/>
+    <w:abstractNumId w:val="15"/>
   </w:num>
   <w:num w:numId="18">
     <w:abstractNumId w:val="2"/>
   </w:num>
   <w:num w:numId="19">
-    <w:abstractNumId w:val="9"/>
+    <w:abstractNumId w:val="10"/>
   </w:num>
   <w:num w:numId="20">
+    <w:abstractNumId w:val="5"/>
+  </w:num>
+  <w:num w:numId="21">
+    <w:abstractNumId w:val="8"/>
+  </w:num>
+  <w:num w:numId="22">
     <w:abstractNumId w:val="4"/>
   </w:num>
-  <w:num w:numId="21">
-    <w:abstractNumId w:val="7"/>
+  <w:num w:numId="23">
+    <w:abstractNumId w:val="14"/>
+  </w:num>
+  <w:num w:numId="24">
+    <w:abstractNumId w:val="11"/>
   </w:num>
 </w:numbering>
 </file>
 
 <file path=word/styles.xml><?xml version="1.0" encoding="utf-8"?>
-<w:styles xmlns:mc="http://schemas.openxmlformats.org/markup-compatibility/2006" xmlns:r="http://schemas.openxmlformats.org/officeDocument/2006/relationships" xmlns:w="http://schemas.openxmlformats.org/wordprocessingml/2006/main" xmlns:w14="http://schemas.microsoft.com/office/word/2010/wordml" xmlns:w15="http://schemas.microsoft.com/office/word/2012/wordml" xmlns:w16cid="http://schemas.microsoft.com/office/word/2016/wordml/cid" xmlns:w16se="http://schemas.microsoft.com/office/word/2015/wordml/symex" mc:Ignorable="w14 w15 w16se w16cid">
+<w:styles xmlns:mc="http://schemas.openxmlformats.org/markup-compatibility/2006" xmlns:r="http://schemas.openxmlformats.org/officeDocument/2006/relationships" xmlns:w="http://schemas.openxmlformats.org/wordprocessingml/2006/main" xmlns:w14="http://schemas.microsoft.com/office/word/2010/wordml" xmlns:w15="http://schemas.microsoft.com/office/word/2012/wordml" xmlns:w16cex="http://schemas.microsoft.com/office/word/2018/wordml/cex" xmlns:w16cid="http://schemas.microsoft.com/office/word/2016/wordml/cid" xmlns:w16="http://schemas.microsoft.com/office/word/2018/wordml" xmlns:w16sdtdh="http://schemas.microsoft.com/office/word/2020/wordml/sdtdatahash" xmlns:w16se="http://schemas.microsoft.com/office/word/2015/wordml/symex" mc:Ignorable="w14 w15 w16se w16cid w16 w16cex w16sdtdh">
   <w:docDefaults>
     <w:rPrDefault>
       <w:rPr>
@@ -4733,7 +7347,7 @@
       </w:pPr>
     </w:pPrDefault>
   </w:docDefaults>
-  <w:latentStyles w:defLockedState="0" w:defUIPriority="99" w:defSemiHidden="0" w:defUnhideWhenUsed="0" w:defQFormat="0" w:count="375">
+  <w:latentStyles w:defLockedState="0" w:defUIPriority="99" w:defSemiHidden="0" w:defUnhideWhenUsed="0" w:defQFormat="0" w:count="376">
     <w:lsdException w:name="Normal" w:uiPriority="0" w:qFormat="1"/>
     <w:lsdException w:name="heading 1" w:uiPriority="9" w:qFormat="1"/>
     <w:lsdException w:name="heading 2" w:semiHidden="1" w:uiPriority="9" w:unhideWhenUsed="1" w:qFormat="1"/>
@@ -4839,7 +7453,6 @@
     <w:lsdException w:name="HTML Sample" w:semiHidden="1" w:unhideWhenUsed="1"/>
     <w:lsdException w:name="HTML Typewriter" w:semiHidden="1" w:unhideWhenUsed="1"/>
     <w:lsdException w:name="HTML Variable" w:semiHidden="1" w:unhideWhenUsed="1"/>
-    <w:lsdException w:name="Normal Table" w:semiHidden="1" w:unhideWhenUsed="1"/>
     <w:lsdException w:name="annotation subject" w:semiHidden="1" w:unhideWhenUsed="1"/>
     <w:lsdException w:name="No List" w:semiHidden="1" w:unhideWhenUsed="1"/>
     <w:lsdException w:name="Outline List 1" w:semiHidden="1" w:unhideWhenUsed="1"/>
@@ -4886,10 +7499,8 @@
     <w:lsdException w:name="Table Subtle 2" w:semiHidden="1" w:unhideWhenUsed="1"/>
     <w:lsdException w:name="Table Web 1" w:semiHidden="1" w:unhideWhenUsed="1"/>
     <w:lsdException w:name="Table Web 2" w:semiHidden="1" w:unhideWhenUsed="1"/>
-    <w:lsdException w:name="Table Web 3" w:semiHidden="1" w:unhideWhenUsed="1"/>
     <w:lsdException w:name="Balloon Text" w:semiHidden="1" w:unhideWhenUsed="1"/>
     <w:lsdException w:name="Table Grid" w:uiPriority="39"/>
-    <w:lsdException w:name="Table Theme" w:semiHidden="1" w:unhideWhenUsed="1"/>
     <w:lsdException w:name="Placeholder Text" w:semiHidden="1"/>
     <w:lsdException w:name="No Spacing" w:uiPriority="1" w:qFormat="1"/>
     <w:lsdException w:name="Light Shading" w:uiPriority="60"/>
@@ -5109,6 +7720,7 @@
     <w:lsdException w:name="Smart Hyperlink" w:semiHidden="1" w:unhideWhenUsed="1"/>
     <w:lsdException w:name="Hashtag" w:semiHidden="1" w:unhideWhenUsed="1"/>
     <w:lsdException w:name="Unresolved Mention" w:semiHidden="1" w:unhideWhenUsed="1"/>
+    <w:lsdException w:name="Smart Link" w:semiHidden="1" w:unhideWhenUsed="1"/>
   </w:latentStyles>
   <w:style w:type="paragraph" w:default="1" w:styleId="Normal">
     <w:name w:val="Normal"/>
@@ -5683,6 +8295,86 @@
       </w:tcPr>
     </w:tblStylePr>
   </w:style>
+  <w:style w:type="table" w:styleId="Tablanormal2">
+    <w:name w:val="Plain Table 2"/>
+    <w:basedOn w:val="Tablanormal"/>
+    <w:uiPriority w:val="42"/>
+    <w:rsid w:val="00D1391E"/>
+    <w:pPr>
+      <w:spacing w:after="0" w:line="240" w:lineRule="auto"/>
+    </w:pPr>
+    <w:tblPr>
+      <w:tblStyleRowBandSize w:val="1"/>
+      <w:tblStyleColBandSize w:val="1"/>
+      <w:tblBorders>
+        <w:top w:val="single" w:sz="4" w:space="0" w:color="7F7F7F" w:themeColor="text1" w:themeTint="80"/>
+        <w:bottom w:val="single" w:sz="4" w:space="0" w:color="7F7F7F" w:themeColor="text1" w:themeTint="80"/>
+      </w:tblBorders>
+    </w:tblPr>
+    <w:tblStylePr w:type="firstRow">
+      <w:rPr>
+        <w:b/>
+        <w:bCs/>
+      </w:rPr>
+      <w:tblPr/>
+      <w:tcPr>
+        <w:tcBorders>
+          <w:bottom w:val="single" w:sz="4" w:space="0" w:color="7F7F7F" w:themeColor="text1" w:themeTint="80"/>
+        </w:tcBorders>
+      </w:tcPr>
+    </w:tblStylePr>
+    <w:tblStylePr w:type="lastRow">
+      <w:rPr>
+        <w:b/>
+        <w:bCs/>
+      </w:rPr>
+      <w:tblPr/>
+      <w:tcPr>
+        <w:tcBorders>
+          <w:top w:val="single" w:sz="4" w:space="0" w:color="7F7F7F" w:themeColor="text1" w:themeTint="80"/>
+        </w:tcBorders>
+      </w:tcPr>
+    </w:tblStylePr>
+    <w:tblStylePr w:type="firstCol">
+      <w:rPr>
+        <w:b/>
+        <w:bCs/>
+      </w:rPr>
+    </w:tblStylePr>
+    <w:tblStylePr w:type="lastCol">
+      <w:rPr>
+        <w:b/>
+        <w:bCs/>
+      </w:rPr>
+    </w:tblStylePr>
+    <w:tblStylePr w:type="band1Vert">
+      <w:tblPr/>
+      <w:tcPr>
+        <w:tcBorders>
+          <w:left w:val="single" w:sz="4" w:space="0" w:color="7F7F7F" w:themeColor="text1" w:themeTint="80"/>
+          <w:right w:val="single" w:sz="4" w:space="0" w:color="7F7F7F" w:themeColor="text1" w:themeTint="80"/>
+        </w:tcBorders>
+      </w:tcPr>
+    </w:tblStylePr>
+    <w:tblStylePr w:type="band2Vert">
+      <w:tblPr/>
+      <w:tcPr>
+        <w:tcBorders>
+          <w:left w:val="single" w:sz="4" w:space="0" w:color="7F7F7F" w:themeColor="text1" w:themeTint="80"/>
+          <w:right w:val="single" w:sz="4" w:space="0" w:color="7F7F7F" w:themeColor="text1" w:themeTint="80"/>
+        </w:tcBorders>
+      </w:tcPr>
+    </w:tblStylePr>
+    <w:tblStylePr w:type="band1Horz">
+      <w:tblPr/>
+      <w:tcPr>
+        <w:tcBorders>
+          <w:top w:val="single" w:sz="4" w:space="0" w:color="7F7F7F" w:themeColor="text1" w:themeTint="80"/>
+          <w:bottom w:val="single" w:sz="4" w:space="0" w:color="7F7F7F" w:themeColor="text1" w:themeTint="80"/>
+        </w:tcBorders>
+      </w:tcPr>
+    </w:tblStylePr>
+  </w:style>
 </w:styles>
 </file>
 

</xml_diff>

<commit_message>
cuarto cambio: Diseño del sistema
</commit_message>
<xml_diff>
--- a/Carlosama_Daniela_Unidad1.docx
+++ b/Carlosama_Daniela_Unidad1.docx
@@ -1489,6 +1489,11 @@
     </w:p>
     <w:p>
       <w:pPr>
+        <w:pStyle w:val="Prrafodelista"/>
+        <w:numPr>
+          <w:ilvl w:val="0"/>
+          <w:numId w:val="23"/>
+        </w:numPr>
         <w:rPr>
           <w:rFonts w:ascii="Arial" w:hAnsi="Arial" w:cs="Arial"/>
           <w:b/>
@@ -1507,11 +1512,16 @@
           <w:szCs w:val="24"/>
           <w:lang w:eastAsia="es-EC"/>
         </w:rPr>
-        <w:t>2. ANÁLISIS DEL PROBLEMA</w:t>
+        <w:t>ANÁLISIS DEL PROBLEMA</w:t>
       </w:r>
     </w:p>
     <w:p>
       <w:pPr>
+        <w:pStyle w:val="Prrafodelista"/>
+        <w:numPr>
+          <w:ilvl w:val="1"/>
+          <w:numId w:val="23"/>
+        </w:numPr>
         <w:rPr>
           <w:rFonts w:ascii="Arial" w:hAnsi="Arial" w:cs="Arial"/>
           <w:b/>
@@ -1530,7 +1540,7 @@
           <w:szCs w:val="24"/>
           <w:lang w:eastAsia="es-EC"/>
         </w:rPr>
-        <w:t>2.1 Descripción y alcance</w:t>
+        <w:t>Descripción y alcance</w:t>
       </w:r>
     </w:p>
     <w:p>
@@ -1555,6 +1565,11 @@
     </w:p>
     <w:p>
       <w:pPr>
+        <w:pStyle w:val="Prrafodelista"/>
+        <w:numPr>
+          <w:ilvl w:val="1"/>
+          <w:numId w:val="23"/>
+        </w:numPr>
         <w:rPr>
           <w:rFonts w:ascii="Arial" w:hAnsi="Arial" w:cs="Arial"/>
           <w:b/>
@@ -1573,7 +1588,7 @@
           <w:szCs w:val="24"/>
           <w:lang w:eastAsia="es-EC"/>
         </w:rPr>
-        <w:t>2.2 Actores del sistema</w:t>
+        <w:t>Actores del sistema</w:t>
       </w:r>
     </w:p>
     <w:tbl>
@@ -1914,6 +1929,11 @@
     </w:p>
     <w:p>
       <w:pPr>
+        <w:pStyle w:val="Prrafodelista"/>
+        <w:numPr>
+          <w:ilvl w:val="1"/>
+          <w:numId w:val="23"/>
+        </w:numPr>
         <w:rPr>
           <w:rFonts w:ascii="Arial" w:hAnsi="Arial" w:cs="Arial"/>
           <w:b/>
@@ -1932,7 +1952,7 @@
           <w:szCs w:val="24"/>
           <w:lang w:eastAsia="es-EC"/>
         </w:rPr>
-        <w:t>2.3 Requerimientos funcionales</w:t>
+        <w:t>Requerimientos funcionales</w:t>
       </w:r>
     </w:p>
     <w:tbl>
@@ -2687,6 +2707,11 @@
     </w:p>
     <w:p>
       <w:pPr>
+        <w:pStyle w:val="Prrafodelista"/>
+        <w:numPr>
+          <w:ilvl w:val="1"/>
+          <w:numId w:val="23"/>
+        </w:numPr>
         <w:rPr>
           <w:rFonts w:ascii="Arial" w:hAnsi="Arial" w:cs="Arial"/>
           <w:b/>
@@ -2705,7 +2730,7 @@
           <w:szCs w:val="24"/>
           <w:lang w:eastAsia="es-EC"/>
         </w:rPr>
-        <w:t>2.4 Requerimientos no funcionales</w:t>
+        <w:t>Requerimientos no funcionales</w:t>
       </w:r>
     </w:p>
     <w:tbl>
@@ -3004,8 +3029,6 @@
             <w:pPr>
               <w:rPr>
                 <w:rFonts w:ascii="Arial" w:hAnsi="Arial" w:cs="Arial"/>
-                <w:b/>
-                <w:bCs/>
                 <w:sz w:val="24"/>
                 <w:szCs w:val="24"/>
               </w:rPr>
@@ -3016,15 +3039,7 @@
                 <w:sz w:val="24"/>
                 <w:szCs w:val="24"/>
               </w:rPr>
-              <w:t>Trazabilidad de versione</w:t>
-            </w:r>
-            <w:r>
-              <w:rPr>
-                <w:rFonts w:ascii="Arial" w:hAnsi="Arial" w:cs="Arial"/>
-                <w:sz w:val="24"/>
-                <w:szCs w:val="24"/>
-              </w:rPr>
-              <w:t>s</w:t>
+              <w:t>Seguridad y control de acceso</w:t>
             </w:r>
           </w:p>
         </w:tc>
@@ -3036,8 +3051,6 @@
             <w:pPr>
               <w:rPr>
                 <w:rFonts w:ascii="Arial" w:hAnsi="Arial" w:cs="Arial"/>
-                <w:b/>
-                <w:bCs/>
                 <w:sz w:val="24"/>
                 <w:szCs w:val="24"/>
               </w:rPr>
@@ -3048,43 +3061,7 @@
                 <w:sz w:val="24"/>
                 <w:szCs w:val="24"/>
               </w:rPr>
-              <w:t xml:space="preserve">Todo cambio debe quedar registrado en GitHub bajo </w:t>
-            </w:r>
-            <w:proofErr w:type="spellStart"/>
-            <w:r>
-              <w:rPr>
-                <w:rFonts w:ascii="Arial" w:hAnsi="Arial" w:cs="Arial"/>
-                <w:sz w:val="24"/>
-                <w:szCs w:val="24"/>
-              </w:rPr>
-              <w:t>Gitflow</w:t>
-            </w:r>
-            <w:proofErr w:type="spellEnd"/>
-            <w:r>
-              <w:rPr>
-                <w:rFonts w:ascii="Arial" w:hAnsi="Arial" w:cs="Arial"/>
-                <w:sz w:val="24"/>
-                <w:szCs w:val="24"/>
-              </w:rPr>
-              <w:t xml:space="preserve">, con </w:t>
-            </w:r>
-            <w:proofErr w:type="spellStart"/>
-            <w:r>
-              <w:rPr>
-                <w:rFonts w:ascii="Arial" w:hAnsi="Arial" w:cs="Arial"/>
-                <w:sz w:val="24"/>
-                <w:szCs w:val="24"/>
-              </w:rPr>
-              <w:t>commits</w:t>
-            </w:r>
-            <w:proofErr w:type="spellEnd"/>
-            <w:r>
-              <w:rPr>
-                <w:rFonts w:ascii="Arial" w:hAnsi="Arial" w:cs="Arial"/>
-                <w:sz w:val="24"/>
-                <w:szCs w:val="24"/>
-              </w:rPr>
-              <w:t xml:space="preserve"> descriptivos y versiones etiquetadas.</w:t>
+              <w:t>El sistema debe restringir las funciones según el rol del usuario (ciudadano, voluntario/veterinario o administrador), de modo que solo el personal autorizado pueda modificar casos, asignar responsables o gestionar adopciones.</w:t>
             </w:r>
           </w:p>
         </w:tc>
@@ -3110,6 +3087,7 @@
                 <w:sz w:val="24"/>
                 <w:szCs w:val="24"/>
               </w:rPr>
+              <w:lastRenderedPageBreak/>
               <w:t>RNF-04</w:t>
             </w:r>
           </w:p>
@@ -3146,8 +3124,6 @@
             <w:pPr>
               <w:rPr>
                 <w:rFonts w:ascii="Arial" w:hAnsi="Arial" w:cs="Arial"/>
-                <w:b/>
-                <w:bCs/>
                 <w:sz w:val="24"/>
                 <w:szCs w:val="24"/>
               </w:rPr>
@@ -3264,7 +3240,6 @@
                 <w:sz w:val="24"/>
                 <w:szCs w:val="24"/>
               </w:rPr>
-              <w:lastRenderedPageBreak/>
               <w:t>RNF-06</w:t>
             </w:r>
           </w:p>
@@ -3325,29 +3300,339 @@
           <w:rFonts w:ascii="Arial" w:hAnsi="Arial" w:cs="Arial"/>
           <w:b/>
           <w:bCs/>
+          <w:sz w:val="24"/>
+          <w:szCs w:val="24"/>
           <w:lang w:eastAsia="es-EC"/>
         </w:rPr>
       </w:pPr>
     </w:p>
     <w:p>
       <w:pPr>
+        <w:pStyle w:val="Prrafodelista"/>
+        <w:numPr>
+          <w:ilvl w:val="0"/>
+          <w:numId w:val="23"/>
+        </w:numPr>
+        <w:tabs>
+          <w:tab w:val="left" w:pos="3909"/>
+        </w:tabs>
         <w:rPr>
           <w:rFonts w:ascii="Arial" w:hAnsi="Arial" w:cs="Arial"/>
           <w:b/>
           <w:bCs/>
-          <w:lang w:eastAsia="es-EC"/>
-        </w:rPr>
-      </w:pPr>
+          <w:sz w:val="24"/>
+          <w:szCs w:val="24"/>
+          <w:lang w:eastAsia="es-EC"/>
+        </w:rPr>
+      </w:pPr>
+      <w:r>
+        <w:rPr>
+          <w:rFonts w:ascii="Arial" w:hAnsi="Arial" w:cs="Arial"/>
+          <w:b/>
+          <w:bCs/>
+          <w:sz w:val="24"/>
+          <w:szCs w:val="24"/>
+          <w:lang w:eastAsia="es-EC"/>
+        </w:rPr>
+        <w:t>DISEÑO DEL SISTEMA</w:t>
+      </w:r>
     </w:p>
     <w:p>
       <w:pPr>
+        <w:pStyle w:val="Prrafodelista"/>
+        <w:numPr>
+          <w:ilvl w:val="1"/>
+          <w:numId w:val="23"/>
+        </w:numPr>
+        <w:tabs>
+          <w:tab w:val="left" w:pos="3909"/>
+        </w:tabs>
         <w:rPr>
           <w:rFonts w:ascii="Arial" w:hAnsi="Arial" w:cs="Arial"/>
           <w:b/>
           <w:bCs/>
-          <w:lang w:eastAsia="es-EC"/>
-        </w:rPr>
-      </w:pPr>
+          <w:sz w:val="24"/>
+          <w:szCs w:val="24"/>
+          <w:lang w:eastAsia="es-EC"/>
+        </w:rPr>
+      </w:pPr>
+      <w:r>
+        <w:rPr>
+          <w:rFonts w:ascii="Arial" w:hAnsi="Arial" w:cs="Arial"/>
+          <w:b/>
+          <w:bCs/>
+          <w:sz w:val="24"/>
+          <w:szCs w:val="24"/>
+          <w:lang w:eastAsia="es-EC"/>
+        </w:rPr>
+        <w:t>Diagrama de casos de uso</w:t>
+      </w:r>
+    </w:p>
+    <w:p>
+      <w:pPr>
+        <w:tabs>
+          <w:tab w:val="left" w:pos="3909"/>
+        </w:tabs>
+        <w:jc w:val="both"/>
+        <w:rPr>
+          <w:rFonts w:ascii="Arial" w:hAnsi="Arial" w:cs="Arial"/>
+          <w:sz w:val="24"/>
+          <w:szCs w:val="24"/>
+          <w:lang w:eastAsia="es-EC"/>
+        </w:rPr>
+      </w:pPr>
+      <w:r>
+        <w:rPr>
+          <w:rFonts w:ascii="Arial" w:hAnsi="Arial" w:cs="Arial"/>
+          <w:sz w:val="24"/>
+          <w:szCs w:val="24"/>
+          <w:lang w:eastAsia="es-EC"/>
+        </w:rPr>
+        <w:t xml:space="preserve">El diagrama representa cómo los tres actores interactúan con el sistema. Las relaciones </w:t>
+      </w:r>
+      <w:r>
+        <w:rPr>
+          <w:rFonts w:ascii="Arial" w:hAnsi="Arial" w:cs="Arial"/>
+          <w:sz w:val="24"/>
+          <w:szCs w:val="24"/>
+          <w:lang w:eastAsia="es-EC"/>
+        </w:rPr>
+        <w:t>“</w:t>
+      </w:r>
+      <w:proofErr w:type="spellStart"/>
+      <w:r>
+        <w:rPr>
+          <w:rFonts w:ascii="Arial" w:hAnsi="Arial" w:cs="Arial"/>
+          <w:sz w:val="24"/>
+          <w:szCs w:val="24"/>
+          <w:lang w:eastAsia="es-EC"/>
+        </w:rPr>
+        <w:t>include</w:t>
+      </w:r>
+      <w:proofErr w:type="spellEnd"/>
+      <w:r>
+        <w:rPr>
+          <w:rFonts w:ascii="Arial" w:hAnsi="Arial" w:cs="Arial"/>
+          <w:sz w:val="24"/>
+          <w:szCs w:val="24"/>
+          <w:lang w:eastAsia="es-EC"/>
+        </w:rPr>
+        <w:t>”</w:t>
+      </w:r>
+      <w:r>
+        <w:rPr>
+          <w:rFonts w:ascii="Arial" w:hAnsi="Arial" w:cs="Arial"/>
+          <w:sz w:val="24"/>
+          <w:szCs w:val="24"/>
+          <w:lang w:eastAsia="es-EC"/>
+        </w:rPr>
+        <w:t xml:space="preserve"> señalan acciones que se ejecutan como parte de otras funciones: </w:t>
+      </w:r>
+    </w:p>
+    <w:p>
+      <w:pPr>
+        <w:pStyle w:val="Prrafodelista"/>
+        <w:numPr>
+          <w:ilvl w:val="0"/>
+          <w:numId w:val="26"/>
+        </w:numPr>
+        <w:tabs>
+          <w:tab w:val="left" w:pos="3909"/>
+        </w:tabs>
+        <w:jc w:val="both"/>
+        <w:rPr>
+          <w:rFonts w:ascii="Arial" w:hAnsi="Arial" w:cs="Arial"/>
+          <w:sz w:val="24"/>
+          <w:szCs w:val="24"/>
+          <w:lang w:eastAsia="es-EC"/>
+        </w:rPr>
+      </w:pPr>
+      <w:r>
+        <w:rPr>
+          <w:rFonts w:ascii="Arial" w:hAnsi="Arial" w:cs="Arial"/>
+          <w:sz w:val="24"/>
+          <w:szCs w:val="24"/>
+          <w:lang w:eastAsia="es-EC"/>
+        </w:rPr>
+        <w:t>A</w:t>
+      </w:r>
+      <w:r>
+        <w:rPr>
+          <w:rFonts w:ascii="Arial" w:hAnsi="Arial" w:cs="Arial"/>
+          <w:sz w:val="24"/>
+          <w:szCs w:val="24"/>
+          <w:lang w:eastAsia="es-EC"/>
+        </w:rPr>
+        <w:t>l registrar un rescate se debe clasificar la especi</w:t>
+      </w:r>
+      <w:r>
+        <w:rPr>
+          <w:rFonts w:ascii="Arial" w:hAnsi="Arial" w:cs="Arial"/>
+          <w:sz w:val="24"/>
+          <w:szCs w:val="24"/>
+          <w:lang w:eastAsia="es-EC"/>
+        </w:rPr>
+        <w:t xml:space="preserve">e. </w:t>
+      </w:r>
+    </w:p>
+    <w:p>
+      <w:pPr>
+        <w:pStyle w:val="Prrafodelista"/>
+        <w:numPr>
+          <w:ilvl w:val="0"/>
+          <w:numId w:val="26"/>
+        </w:numPr>
+        <w:tabs>
+          <w:tab w:val="left" w:pos="3909"/>
+        </w:tabs>
+        <w:jc w:val="both"/>
+        <w:rPr>
+          <w:rFonts w:ascii="Arial" w:hAnsi="Arial" w:cs="Arial"/>
+          <w:sz w:val="24"/>
+          <w:szCs w:val="24"/>
+          <w:lang w:eastAsia="es-EC"/>
+        </w:rPr>
+      </w:pPr>
+      <w:r>
+        <w:rPr>
+          <w:rFonts w:ascii="Arial" w:hAnsi="Arial" w:cs="Arial"/>
+          <w:sz w:val="24"/>
+          <w:szCs w:val="24"/>
+          <w:lang w:eastAsia="es-EC"/>
+        </w:rPr>
+        <w:t>A</w:t>
+      </w:r>
+      <w:r>
+        <w:rPr>
+          <w:rFonts w:ascii="Arial" w:hAnsi="Arial" w:cs="Arial"/>
+          <w:sz w:val="24"/>
+          <w:szCs w:val="24"/>
+          <w:lang w:eastAsia="es-EC"/>
+        </w:rPr>
+        <w:t>l designar a un responsable se genera una notificación</w:t>
+      </w:r>
+    </w:p>
+    <w:p>
+      <w:pPr>
+        <w:pStyle w:val="Prrafodelista"/>
+        <w:numPr>
+          <w:ilvl w:val="0"/>
+          <w:numId w:val="26"/>
+        </w:numPr>
+        <w:tabs>
+          <w:tab w:val="left" w:pos="3909"/>
+        </w:tabs>
+        <w:jc w:val="both"/>
+        <w:rPr>
+          <w:rFonts w:ascii="Arial" w:hAnsi="Arial" w:cs="Arial"/>
+          <w:sz w:val="24"/>
+          <w:szCs w:val="24"/>
+          <w:lang w:eastAsia="es-EC"/>
+        </w:rPr>
+      </w:pPr>
+      <w:r>
+        <w:rPr>
+          <w:rFonts w:ascii="Arial" w:hAnsi="Arial" w:cs="Arial"/>
+          <w:sz w:val="24"/>
+          <w:szCs w:val="24"/>
+          <w:lang w:eastAsia="es-EC"/>
+        </w:rPr>
+        <w:t>A</w:t>
+      </w:r>
+      <w:r>
+        <w:rPr>
+          <w:rFonts w:ascii="Arial" w:hAnsi="Arial" w:cs="Arial"/>
+          <w:sz w:val="24"/>
+          <w:szCs w:val="24"/>
+          <w:lang w:eastAsia="es-EC"/>
+        </w:rPr>
+        <w:t>l gestionar una adopción, se actualiza el estado del procedimiento.</w:t>
+      </w:r>
+    </w:p>
+    <w:p>
+      <w:pPr>
+        <w:rPr>
+          <w:rFonts w:ascii="Arial" w:hAnsi="Arial" w:cs="Arial"/>
+          <w:b/>
+          <w:bCs/>
+          <w:lang w:eastAsia="es-EC"/>
+        </w:rPr>
+      </w:pPr>
+      <w:r>
+        <w:rPr>
+          <w:rFonts w:ascii="Arial" w:hAnsi="Arial" w:cs="Arial"/>
+          <w:b/>
+          <w:bCs/>
+          <w:noProof/>
+          <w:lang w:eastAsia="es-EC"/>
+        </w:rPr>
+        <w:lastRenderedPageBreak/>
+        <w:drawing>
+          <wp:inline distT="0" distB="0" distL="0" distR="0" wp14:anchorId="69E2122C" wp14:editId="638FBF31">
+            <wp:extent cx="5731510" cy="5857875"/>
+            <wp:effectExtent l="0" t="0" r="2540" b="9525"/>
+            <wp:docPr id="3" name="Imagen 3" descr="Diagrama&#10;&#10;Descripción generada automáticamente"/>
+            <wp:cNvGraphicFramePr>
+              <a:graphicFrameLocks xmlns:a="http://schemas.openxmlformats.org/drawingml/2006/main" noChangeAspect="1"/>
+            </wp:cNvGraphicFramePr>
+            <a:graphic xmlns:a="http://schemas.openxmlformats.org/drawingml/2006/main">
+              <a:graphicData uri="http://schemas.openxmlformats.org/drawingml/2006/picture">
+                <pic:pic xmlns:pic="http://schemas.openxmlformats.org/drawingml/2006/picture">
+                  <pic:nvPicPr>
+                    <pic:cNvPr id="3" name="Imagen 3" descr="Diagrama&#10;&#10;Descripción generada automáticamente"/>
+                    <pic:cNvPicPr/>
+                  </pic:nvPicPr>
+                  <pic:blipFill>
+                    <a:blip r:embed="rId14" cstate="print">
+                      <a:extLst>
+                        <a:ext uri="{28A0092B-C50C-407E-A947-70E740481C1C}">
+                          <a14:useLocalDpi xmlns:a14="http://schemas.microsoft.com/office/drawing/2010/main" val="0"/>
+                        </a:ext>
+                      </a:extLst>
+                    </a:blip>
+                    <a:stretch>
+                      <a:fillRect/>
+                    </a:stretch>
+                  </pic:blipFill>
+                  <pic:spPr>
+                    <a:xfrm>
+                      <a:off x="0" y="0"/>
+                      <a:ext cx="5731510" cy="5857875"/>
+                    </a:xfrm>
+                    <a:prstGeom prst="rect">
+                      <a:avLst/>
+                    </a:prstGeom>
+                  </pic:spPr>
+                </pic:pic>
+              </a:graphicData>
+            </a:graphic>
+          </wp:inline>
+        </w:drawing>
+      </w:r>
+    </w:p>
+    <w:p>
+      <w:pPr>
+        <w:pStyle w:val="Prrafodelista"/>
+        <w:numPr>
+          <w:ilvl w:val="1"/>
+          <w:numId w:val="23"/>
+        </w:numPr>
+        <w:rPr>
+          <w:rFonts w:ascii="Arial" w:hAnsi="Arial" w:cs="Arial"/>
+          <w:b/>
+          <w:bCs/>
+          <w:lang w:eastAsia="es-EC"/>
+        </w:rPr>
+      </w:pPr>
+      <w:r>
+        <w:rPr>
+          <w:rFonts w:ascii="Arial" w:hAnsi="Arial" w:cs="Arial"/>
+          <w:b/>
+          <w:bCs/>
+          <w:lang w:eastAsia="es-EC"/>
+        </w:rPr>
+        <w:t>Diagrama de clases UML y principios SOLID</w:t>
+      </w:r>
     </w:p>
     <w:p>
       <w:pPr>
@@ -3608,7 +3893,7 @@
       </w:r>
     </w:p>
     <w:sectPr>
-      <w:headerReference w:type="first" r:id="rId14"/>
+      <w:headerReference w:type="first" r:id="rId15"/>
       <w:pgSz w:w="11906" w:h="16838"/>
       <w:pgMar w:top="1417" w:right="1440" w:bottom="1417" w:left="1440" w:header="709" w:footer="709" w:gutter="0"/>
       <w:pgNumType w:start="1"/>
@@ -4484,7 +4769,7 @@
         <v:path o:extrusionok="f" gradientshapeok="t" o:connecttype="rect"/>
         <o:lock v:ext="edit" aspectratio="t"/>
       </v:shapetype>
-      <v:shape id="_x0000_i1138" type="#_x0000_t75" style="width:11.4pt;height:11.4pt" o:bullet="t">
+      <v:shape id="_x0000_i1167" type="#_x0000_t75" style="width:11.35pt;height:11.35pt" o:bullet="t">
         <v:imagedata r:id="rId1" o:title="mso3E28"/>
       </v:shape>
     </w:pict>
@@ -4717,6 +5002,127 @@
     </w:lvl>
   </w:abstractNum>
   <w:abstractNum w:abstractNumId="2" w15:restartNumberingAfterBreak="0">
+    <w:nsid w:val="12991AEA"/>
+    <w:multiLevelType w:val="multilevel"/>
+    <w:tmpl w:val="2B0CD108"/>
+    <w:lvl w:ilvl="0">
+      <w:start w:val="1"/>
+      <w:numFmt w:val="decimal"/>
+      <w:lvlText w:val="%1."/>
+      <w:lvlJc w:val="left"/>
+      <w:pPr>
+        <w:ind w:left="720" w:hanging="360"/>
+      </w:pPr>
+      <w:rPr>
+        <w:rFonts w:hint="default"/>
+      </w:rPr>
+    </w:lvl>
+    <w:lvl w:ilvl="1">
+      <w:start w:val="1"/>
+      <w:numFmt w:val="decimal"/>
+      <w:isLgl/>
+      <w:lvlText w:val="%1.%2"/>
+      <w:lvlJc w:val="left"/>
+      <w:pPr>
+        <w:ind w:left="732" w:hanging="372"/>
+      </w:pPr>
+      <w:rPr>
+        <w:rFonts w:hint="default"/>
+      </w:rPr>
+    </w:lvl>
+    <w:lvl w:ilvl="2">
+      <w:start w:val="1"/>
+      <w:numFmt w:val="decimal"/>
+      <w:isLgl/>
+      <w:lvlText w:val="%1.%2.%3"/>
+      <w:lvlJc w:val="left"/>
+      <w:pPr>
+        <w:ind w:left="1080" w:hanging="720"/>
+      </w:pPr>
+      <w:rPr>
+        <w:rFonts w:hint="default"/>
+      </w:rPr>
+    </w:lvl>
+    <w:lvl w:ilvl="3">
+      <w:start w:val="1"/>
+      <w:numFmt w:val="decimal"/>
+      <w:isLgl/>
+      <w:lvlText w:val="%1.%2.%3.%4"/>
+      <w:lvlJc w:val="left"/>
+      <w:pPr>
+        <w:ind w:left="1080" w:hanging="720"/>
+      </w:pPr>
+      <w:rPr>
+        <w:rFonts w:hint="default"/>
+      </w:rPr>
+    </w:lvl>
+    <w:lvl w:ilvl="4">
+      <w:start w:val="1"/>
+      <w:numFmt w:val="decimal"/>
+      <w:isLgl/>
+      <w:lvlText w:val="%1.%2.%3.%4.%5"/>
+      <w:lvlJc w:val="left"/>
+      <w:pPr>
+        <w:ind w:left="1440" w:hanging="1080"/>
+      </w:pPr>
+      <w:rPr>
+        <w:rFonts w:hint="default"/>
+      </w:rPr>
+    </w:lvl>
+    <w:lvl w:ilvl="5">
+      <w:start w:val="1"/>
+      <w:numFmt w:val="decimal"/>
+      <w:isLgl/>
+      <w:lvlText w:val="%1.%2.%3.%4.%5.%6"/>
+      <w:lvlJc w:val="left"/>
+      <w:pPr>
+        <w:ind w:left="1440" w:hanging="1080"/>
+      </w:pPr>
+      <w:rPr>
+        <w:rFonts w:hint="default"/>
+      </w:rPr>
+    </w:lvl>
+    <w:lvl w:ilvl="6">
+      <w:start w:val="1"/>
+      <w:numFmt w:val="decimal"/>
+      <w:isLgl/>
+      <w:lvlText w:val="%1.%2.%3.%4.%5.%6.%7"/>
+      <w:lvlJc w:val="left"/>
+      <w:pPr>
+        <w:ind w:left="1800" w:hanging="1440"/>
+      </w:pPr>
+      <w:rPr>
+        <w:rFonts w:hint="default"/>
+      </w:rPr>
+    </w:lvl>
+    <w:lvl w:ilvl="7">
+      <w:start w:val="1"/>
+      <w:numFmt w:val="decimal"/>
+      <w:isLgl/>
+      <w:lvlText w:val="%1.%2.%3.%4.%5.%6.%7.%8"/>
+      <w:lvlJc w:val="left"/>
+      <w:pPr>
+        <w:ind w:left="1800" w:hanging="1440"/>
+      </w:pPr>
+      <w:rPr>
+        <w:rFonts w:hint="default"/>
+      </w:rPr>
+    </w:lvl>
+    <w:lvl w:ilvl="8">
+      <w:start w:val="1"/>
+      <w:numFmt w:val="decimal"/>
+      <w:isLgl/>
+      <w:lvlText w:val="%1.%2.%3.%4.%5.%6.%7.%8.%9"/>
+      <w:lvlJc w:val="left"/>
+      <w:pPr>
+        <w:ind w:left="2160" w:hanging="1800"/>
+      </w:pPr>
+      <w:rPr>
+        <w:rFonts w:hint="default"/>
+      </w:rPr>
+    </w:lvl>
+  </w:abstractNum>
+  <w:abstractNum w:abstractNumId="3" w15:restartNumberingAfterBreak="0">
     <w:nsid w:val="19254471"/>
     <w:multiLevelType w:val="hybridMultilevel"/>
     <w:tmpl w:val="EE48CFBA"/>
@@ -4830,7 +5236,7 @@
       </w:rPr>
     </w:lvl>
   </w:abstractNum>
-  <w:abstractNum w:abstractNumId="3" w15:restartNumberingAfterBreak="0">
+  <w:abstractNum w:abstractNumId="4" w15:restartNumberingAfterBreak="0">
     <w:nsid w:val="25D101E3"/>
     <w:multiLevelType w:val="hybridMultilevel"/>
     <w:tmpl w:val="1E9CC514"/>
@@ -4943,7 +5349,7 @@
       </w:rPr>
     </w:lvl>
   </w:abstractNum>
-  <w:abstractNum w:abstractNumId="4" w15:restartNumberingAfterBreak="0">
+  <w:abstractNum w:abstractNumId="5" w15:restartNumberingAfterBreak="0">
     <w:nsid w:val="25EF7B9A"/>
     <w:multiLevelType w:val="hybridMultilevel"/>
     <w:tmpl w:val="59CA3074"/>
@@ -5032,7 +5438,7 @@
       </w:pPr>
     </w:lvl>
   </w:abstractNum>
-  <w:abstractNum w:abstractNumId="5" w15:restartNumberingAfterBreak="0">
+  <w:abstractNum w:abstractNumId="6" w15:restartNumberingAfterBreak="0">
     <w:nsid w:val="26DE4B16"/>
     <w:multiLevelType w:val="multilevel"/>
     <w:tmpl w:val="9470283E"/>
@@ -5181,7 +5587,7 @@
       </w:rPr>
     </w:lvl>
   </w:abstractNum>
-  <w:abstractNum w:abstractNumId="6" w15:restartNumberingAfterBreak="0">
+  <w:abstractNum w:abstractNumId="7" w15:restartNumberingAfterBreak="0">
     <w:nsid w:val="2E8C7B01"/>
     <w:multiLevelType w:val="multilevel"/>
     <w:tmpl w:val="C17EACDC"/>
@@ -5302,7 +5708,7 @@
       </w:rPr>
     </w:lvl>
   </w:abstractNum>
-  <w:abstractNum w:abstractNumId="7" w15:restartNumberingAfterBreak="0">
+  <w:abstractNum w:abstractNumId="8" w15:restartNumberingAfterBreak="0">
     <w:nsid w:val="40DD1A90"/>
     <w:multiLevelType w:val="multilevel"/>
     <w:tmpl w:val="6E5C174A"/>
@@ -5415,7 +5821,7 @@
       </w:rPr>
     </w:lvl>
   </w:abstractNum>
-  <w:abstractNum w:abstractNumId="8" w15:restartNumberingAfterBreak="0">
+  <w:abstractNum w:abstractNumId="9" w15:restartNumberingAfterBreak="0">
     <w:nsid w:val="43722CF5"/>
     <w:multiLevelType w:val="hybridMultilevel"/>
     <w:tmpl w:val="7CCAC0E6"/>
@@ -5501,7 +5907,7 @@
       </w:pPr>
     </w:lvl>
   </w:abstractNum>
-  <w:abstractNum w:abstractNumId="9" w15:restartNumberingAfterBreak="0">
+  <w:abstractNum w:abstractNumId="10" w15:restartNumberingAfterBreak="0">
     <w:nsid w:val="4D4940A8"/>
     <w:multiLevelType w:val="hybridMultilevel"/>
     <w:tmpl w:val="4FEC69F0"/>
@@ -5615,7 +6021,7 @@
       </w:rPr>
     </w:lvl>
   </w:abstractNum>
-  <w:abstractNum w:abstractNumId="10" w15:restartNumberingAfterBreak="0">
+  <w:abstractNum w:abstractNumId="11" w15:restartNumberingAfterBreak="0">
     <w:nsid w:val="4F397A1C"/>
     <w:multiLevelType w:val="multilevel"/>
     <w:tmpl w:val="CCDA827E"/>
@@ -5764,7 +6170,120 @@
       </w:rPr>
     </w:lvl>
   </w:abstractNum>
-  <w:abstractNum w:abstractNumId="11" w15:restartNumberingAfterBreak="0">
+  <w:abstractNum w:abstractNumId="12" w15:restartNumberingAfterBreak="0">
+    <w:nsid w:val="4F8D11D9"/>
+    <w:multiLevelType w:val="hybridMultilevel"/>
+    <w:tmpl w:val="E416CB92"/>
+    <w:lvl w:ilvl="0" w:tplc="300A0001">
+      <w:start w:val="1"/>
+      <w:numFmt w:val="bullet"/>
+      <w:lvlText w:val=""/>
+      <w:lvlJc w:val="left"/>
+      <w:pPr>
+        <w:ind w:left="720" w:hanging="360"/>
+      </w:pPr>
+      <w:rPr>
+        <w:rFonts w:ascii="Symbol" w:hAnsi="Symbol" w:hint="default"/>
+      </w:rPr>
+    </w:lvl>
+    <w:lvl w:ilvl="1" w:tplc="300A0003" w:tentative="1">
+      <w:start w:val="1"/>
+      <w:numFmt w:val="bullet"/>
+      <w:lvlText w:val="o"/>
+      <w:lvlJc w:val="left"/>
+      <w:pPr>
+        <w:ind w:left="1440" w:hanging="360"/>
+      </w:pPr>
+      <w:rPr>
+        <w:rFonts w:ascii="Courier New" w:hAnsi="Courier New" w:cs="Courier New" w:hint="default"/>
+      </w:rPr>
+    </w:lvl>
+    <w:lvl w:ilvl="2" w:tplc="300A0005" w:tentative="1">
+      <w:start w:val="1"/>
+      <w:numFmt w:val="bullet"/>
+      <w:lvlText w:val=""/>
+      <w:lvlJc w:val="left"/>
+      <w:pPr>
+        <w:ind w:left="2160" w:hanging="360"/>
+      </w:pPr>
+      <w:rPr>
+        <w:rFonts w:ascii="Wingdings" w:hAnsi="Wingdings" w:hint="default"/>
+      </w:rPr>
+    </w:lvl>
+    <w:lvl w:ilvl="3" w:tplc="300A0001" w:tentative="1">
+      <w:start w:val="1"/>
+      <w:numFmt w:val="bullet"/>
+      <w:lvlText w:val=""/>
+      <w:lvlJc w:val="left"/>
+      <w:pPr>
+        <w:ind w:left="2880" w:hanging="360"/>
+      </w:pPr>
+      <w:rPr>
+        <w:rFonts w:ascii="Symbol" w:hAnsi="Symbol" w:hint="default"/>
+      </w:rPr>
+    </w:lvl>
+    <w:lvl w:ilvl="4" w:tplc="300A0003" w:tentative="1">
+      <w:start w:val="1"/>
+      <w:numFmt w:val="bullet"/>
+      <w:lvlText w:val="o"/>
+      <w:lvlJc w:val="left"/>
+      <w:pPr>
+        <w:ind w:left="3600" w:hanging="360"/>
+      </w:pPr>
+      <w:rPr>
+        <w:rFonts w:ascii="Courier New" w:hAnsi="Courier New" w:cs="Courier New" w:hint="default"/>
+      </w:rPr>
+    </w:lvl>
+    <w:lvl w:ilvl="5" w:tplc="300A0005" w:tentative="1">
+      <w:start w:val="1"/>
+      <w:numFmt w:val="bullet"/>
+      <w:lvlText w:val=""/>
+      <w:lvlJc w:val="left"/>
+      <w:pPr>
+        <w:ind w:left="4320" w:hanging="360"/>
+      </w:pPr>
+      <w:rPr>
+        <w:rFonts w:ascii="Wingdings" w:hAnsi="Wingdings" w:hint="default"/>
+      </w:rPr>
+    </w:lvl>
+    <w:lvl w:ilvl="6" w:tplc="300A0001" w:tentative="1">
+      <w:start w:val="1"/>
+      <w:numFmt w:val="bullet"/>
+      <w:lvlText w:val=""/>
+      <w:lvlJc w:val="left"/>
+      <w:pPr>
+        <w:ind w:left="5040" w:hanging="360"/>
+      </w:pPr>
+      <w:rPr>
+        <w:rFonts w:ascii="Symbol" w:hAnsi="Symbol" w:hint="default"/>
+      </w:rPr>
+    </w:lvl>
+    <w:lvl w:ilvl="7" w:tplc="300A0003" w:tentative="1">
+      <w:start w:val="1"/>
+      <w:numFmt w:val="bullet"/>
+      <w:lvlText w:val="o"/>
+      <w:lvlJc w:val="left"/>
+      <w:pPr>
+        <w:ind w:left="5760" w:hanging="360"/>
+      </w:pPr>
+      <w:rPr>
+        <w:rFonts w:ascii="Courier New" w:hAnsi="Courier New" w:cs="Courier New" w:hint="default"/>
+      </w:rPr>
+    </w:lvl>
+    <w:lvl w:ilvl="8" w:tplc="300A0005" w:tentative="1">
+      <w:start w:val="1"/>
+      <w:numFmt w:val="bullet"/>
+      <w:lvlText w:val=""/>
+      <w:lvlJc w:val="left"/>
+      <w:pPr>
+        <w:ind w:left="6480" w:hanging="360"/>
+      </w:pPr>
+      <w:rPr>
+        <w:rFonts w:ascii="Wingdings" w:hAnsi="Wingdings" w:hint="default"/>
+      </w:rPr>
+    </w:lvl>
+  </w:abstractNum>
+  <w:abstractNum w:abstractNumId="13" w15:restartNumberingAfterBreak="0">
     <w:nsid w:val="504F2C3C"/>
     <w:multiLevelType w:val="hybridMultilevel"/>
     <w:tmpl w:val="5446791E"/>
@@ -5877,7 +6396,7 @@
       </w:rPr>
     </w:lvl>
   </w:abstractNum>
-  <w:abstractNum w:abstractNumId="12" w15:restartNumberingAfterBreak="0">
+  <w:abstractNum w:abstractNumId="14" w15:restartNumberingAfterBreak="0">
     <w:nsid w:val="54174C12"/>
     <w:multiLevelType w:val="multilevel"/>
     <w:tmpl w:val="15B62650"/>
@@ -6008,7 +6527,7 @@
       </w:rPr>
     </w:lvl>
   </w:abstractNum>
-  <w:abstractNum w:abstractNumId="13" w15:restartNumberingAfterBreak="0">
+  <w:abstractNum w:abstractNumId="15" w15:restartNumberingAfterBreak="0">
     <w:nsid w:val="54517D06"/>
     <w:multiLevelType w:val="hybridMultilevel"/>
     <w:tmpl w:val="3DB0EB80"/>
@@ -6120,11 +6639,11 @@
       </w:rPr>
     </w:lvl>
   </w:abstractNum>
-  <w:abstractNum w:abstractNumId="14" w15:restartNumberingAfterBreak="0">
+  <w:abstractNum w:abstractNumId="16" w15:restartNumberingAfterBreak="0">
     <w:nsid w:val="61A66414"/>
-    <w:multiLevelType w:val="hybridMultilevel"/>
-    <w:tmpl w:val="EF4CF79C"/>
-    <w:lvl w:ilvl="0" w:tplc="300A000F">
+    <w:multiLevelType w:val="multilevel"/>
+    <w:tmpl w:val="2B0CD108"/>
+    <w:lvl w:ilvl="0">
       <w:start w:val="1"/>
       <w:numFmt w:val="decimal"/>
       <w:lvlText w:val="%1."/>
@@ -6136,80 +6655,112 @@
         <w:rFonts w:hint="default"/>
       </w:rPr>
     </w:lvl>
-    <w:lvl w:ilvl="1" w:tplc="300A0019" w:tentative="1">
-      <w:start w:val="1"/>
-      <w:numFmt w:val="lowerLetter"/>
-      <w:lvlText w:val="%2."/>
-      <w:lvlJc w:val="left"/>
-      <w:pPr>
-        <w:ind w:left="1440" w:hanging="360"/>
-      </w:pPr>
-    </w:lvl>
-    <w:lvl w:ilvl="2" w:tplc="300A001B" w:tentative="1">
-      <w:start w:val="1"/>
-      <w:numFmt w:val="lowerRoman"/>
-      <w:lvlText w:val="%3."/>
-      <w:lvlJc w:val="right"/>
-      <w:pPr>
-        <w:ind w:left="2160" w:hanging="180"/>
-      </w:pPr>
-    </w:lvl>
-    <w:lvl w:ilvl="3" w:tplc="300A000F" w:tentative="1">
-      <w:start w:val="1"/>
-      <w:numFmt w:val="decimal"/>
-      <w:lvlText w:val="%4."/>
-      <w:lvlJc w:val="left"/>
-      <w:pPr>
-        <w:ind w:left="2880" w:hanging="360"/>
-      </w:pPr>
-    </w:lvl>
-    <w:lvl w:ilvl="4" w:tplc="300A0019" w:tentative="1">
-      <w:start w:val="1"/>
-      <w:numFmt w:val="lowerLetter"/>
-      <w:lvlText w:val="%5."/>
-      <w:lvlJc w:val="left"/>
-      <w:pPr>
-        <w:ind w:left="3600" w:hanging="360"/>
-      </w:pPr>
-    </w:lvl>
-    <w:lvl w:ilvl="5" w:tplc="300A001B" w:tentative="1">
-      <w:start w:val="1"/>
-      <w:numFmt w:val="lowerRoman"/>
-      <w:lvlText w:val="%6."/>
-      <w:lvlJc w:val="right"/>
-      <w:pPr>
-        <w:ind w:left="4320" w:hanging="180"/>
-      </w:pPr>
-    </w:lvl>
-    <w:lvl w:ilvl="6" w:tplc="300A000F" w:tentative="1">
-      <w:start w:val="1"/>
-      <w:numFmt w:val="decimal"/>
-      <w:lvlText w:val="%7."/>
-      <w:lvlJc w:val="left"/>
-      <w:pPr>
-        <w:ind w:left="5040" w:hanging="360"/>
-      </w:pPr>
-    </w:lvl>
-    <w:lvl w:ilvl="7" w:tplc="300A0019" w:tentative="1">
-      <w:start w:val="1"/>
-      <w:numFmt w:val="lowerLetter"/>
-      <w:lvlText w:val="%8."/>
-      <w:lvlJc w:val="left"/>
-      <w:pPr>
-        <w:ind w:left="5760" w:hanging="360"/>
-      </w:pPr>
-    </w:lvl>
-    <w:lvl w:ilvl="8" w:tplc="300A001B" w:tentative="1">
-      <w:start w:val="1"/>
-      <w:numFmt w:val="lowerRoman"/>
-      <w:lvlText w:val="%9."/>
-      <w:lvlJc w:val="right"/>
-      <w:pPr>
-        <w:ind w:left="6480" w:hanging="180"/>
-      </w:pPr>
+    <w:lvl w:ilvl="1">
+      <w:start w:val="1"/>
+      <w:numFmt w:val="decimal"/>
+      <w:isLgl/>
+      <w:lvlText w:val="%1.%2"/>
+      <w:lvlJc w:val="left"/>
+      <w:pPr>
+        <w:ind w:left="732" w:hanging="372"/>
+      </w:pPr>
+      <w:rPr>
+        <w:rFonts w:hint="default"/>
+      </w:rPr>
+    </w:lvl>
+    <w:lvl w:ilvl="2">
+      <w:start w:val="1"/>
+      <w:numFmt w:val="decimal"/>
+      <w:isLgl/>
+      <w:lvlText w:val="%1.%2.%3"/>
+      <w:lvlJc w:val="left"/>
+      <w:pPr>
+        <w:ind w:left="1080" w:hanging="720"/>
+      </w:pPr>
+      <w:rPr>
+        <w:rFonts w:hint="default"/>
+      </w:rPr>
+    </w:lvl>
+    <w:lvl w:ilvl="3">
+      <w:start w:val="1"/>
+      <w:numFmt w:val="decimal"/>
+      <w:isLgl/>
+      <w:lvlText w:val="%1.%2.%3.%4"/>
+      <w:lvlJc w:val="left"/>
+      <w:pPr>
+        <w:ind w:left="1080" w:hanging="720"/>
+      </w:pPr>
+      <w:rPr>
+        <w:rFonts w:hint="default"/>
+      </w:rPr>
+    </w:lvl>
+    <w:lvl w:ilvl="4">
+      <w:start w:val="1"/>
+      <w:numFmt w:val="decimal"/>
+      <w:isLgl/>
+      <w:lvlText w:val="%1.%2.%3.%4.%5"/>
+      <w:lvlJc w:val="left"/>
+      <w:pPr>
+        <w:ind w:left="1440" w:hanging="1080"/>
+      </w:pPr>
+      <w:rPr>
+        <w:rFonts w:hint="default"/>
+      </w:rPr>
+    </w:lvl>
+    <w:lvl w:ilvl="5">
+      <w:start w:val="1"/>
+      <w:numFmt w:val="decimal"/>
+      <w:isLgl/>
+      <w:lvlText w:val="%1.%2.%3.%4.%5.%6"/>
+      <w:lvlJc w:val="left"/>
+      <w:pPr>
+        <w:ind w:left="1440" w:hanging="1080"/>
+      </w:pPr>
+      <w:rPr>
+        <w:rFonts w:hint="default"/>
+      </w:rPr>
+    </w:lvl>
+    <w:lvl w:ilvl="6">
+      <w:start w:val="1"/>
+      <w:numFmt w:val="decimal"/>
+      <w:isLgl/>
+      <w:lvlText w:val="%1.%2.%3.%4.%5.%6.%7"/>
+      <w:lvlJc w:val="left"/>
+      <w:pPr>
+        <w:ind w:left="1800" w:hanging="1440"/>
+      </w:pPr>
+      <w:rPr>
+        <w:rFonts w:hint="default"/>
+      </w:rPr>
+    </w:lvl>
+    <w:lvl w:ilvl="7">
+      <w:start w:val="1"/>
+      <w:numFmt w:val="decimal"/>
+      <w:isLgl/>
+      <w:lvlText w:val="%1.%2.%3.%4.%5.%6.%7.%8"/>
+      <w:lvlJc w:val="left"/>
+      <w:pPr>
+        <w:ind w:left="1800" w:hanging="1440"/>
+      </w:pPr>
+      <w:rPr>
+        <w:rFonts w:hint="default"/>
+      </w:rPr>
+    </w:lvl>
+    <w:lvl w:ilvl="8">
+      <w:start w:val="1"/>
+      <w:numFmt w:val="decimal"/>
+      <w:isLgl/>
+      <w:lvlText w:val="%1.%2.%3.%4.%5.%6.%7.%8.%9"/>
+      <w:lvlJc w:val="left"/>
+      <w:pPr>
+        <w:ind w:left="2160" w:hanging="1800"/>
+      </w:pPr>
+      <w:rPr>
+        <w:rFonts w:hint="default"/>
+      </w:rPr>
     </w:lvl>
   </w:abstractNum>
-  <w:abstractNum w:abstractNumId="15" w15:restartNumberingAfterBreak="0">
+  <w:abstractNum w:abstractNumId="17" w15:restartNumberingAfterBreak="0">
     <w:nsid w:val="68E15795"/>
     <w:multiLevelType w:val="hybridMultilevel"/>
     <w:tmpl w:val="8FE616A0"/>
@@ -6322,7 +6873,7 @@
       </w:rPr>
     </w:lvl>
   </w:abstractNum>
-  <w:abstractNum w:abstractNumId="16" w15:restartNumberingAfterBreak="0">
+  <w:abstractNum w:abstractNumId="18" w15:restartNumberingAfterBreak="0">
     <w:nsid w:val="6AFC07D3"/>
     <w:multiLevelType w:val="multilevel"/>
     <w:tmpl w:val="B3426C00"/>
@@ -6435,7 +6986,7 @@
       </w:rPr>
     </w:lvl>
   </w:abstractNum>
-  <w:abstractNum w:abstractNumId="17" w15:restartNumberingAfterBreak="0">
+  <w:abstractNum w:abstractNumId="19" w15:restartNumberingAfterBreak="0">
     <w:nsid w:val="6B7B1E92"/>
     <w:multiLevelType w:val="multilevel"/>
     <w:tmpl w:val="21BA233E"/>
@@ -6566,7 +7117,7 @@
       </w:rPr>
     </w:lvl>
   </w:abstractNum>
-  <w:abstractNum w:abstractNumId="18" w15:restartNumberingAfterBreak="0">
+  <w:abstractNum w:abstractNumId="20" w15:restartNumberingAfterBreak="0">
     <w:nsid w:val="6FA144D3"/>
     <w:multiLevelType w:val="multilevel"/>
     <w:tmpl w:val="98CEB7D6"/>
@@ -6687,7 +7238,7 @@
       </w:rPr>
     </w:lvl>
   </w:abstractNum>
-  <w:abstractNum w:abstractNumId="19" w15:restartNumberingAfterBreak="0">
+  <w:abstractNum w:abstractNumId="21" w15:restartNumberingAfterBreak="0">
     <w:nsid w:val="738344F2"/>
     <w:multiLevelType w:val="hybridMultilevel"/>
     <w:tmpl w:val="C4E037F2"/>
@@ -6802,7 +7353,7 @@
       </w:rPr>
     </w:lvl>
   </w:abstractNum>
-  <w:abstractNum w:abstractNumId="20" w15:restartNumberingAfterBreak="0">
+  <w:abstractNum w:abstractNumId="22" w15:restartNumberingAfterBreak="0">
     <w:nsid w:val="74B1685F"/>
     <w:multiLevelType w:val="hybridMultilevel"/>
     <w:tmpl w:val="943E89B2"/>
@@ -6915,7 +7466,7 @@
       </w:rPr>
     </w:lvl>
   </w:abstractNum>
-  <w:abstractNum w:abstractNumId="21" w15:restartNumberingAfterBreak="0">
+  <w:abstractNum w:abstractNumId="23" w15:restartNumberingAfterBreak="0">
     <w:nsid w:val="75DB1EAD"/>
     <w:multiLevelType w:val="multilevel"/>
     <w:tmpl w:val="F2B0D608"/>
@@ -7028,7 +7579,7 @@
       </w:rPr>
     </w:lvl>
   </w:abstractNum>
-  <w:abstractNum w:abstractNumId="22" w15:restartNumberingAfterBreak="0">
+  <w:abstractNum w:abstractNumId="24" w15:restartNumberingAfterBreak="0">
     <w:nsid w:val="77694BC3"/>
     <w:multiLevelType w:val="hybridMultilevel"/>
     <w:tmpl w:val="8D0A3582"/>
@@ -7141,7 +7692,7 @@
       </w:rPr>
     </w:lvl>
   </w:abstractNum>
-  <w:abstractNum w:abstractNumId="23" w15:restartNumberingAfterBreak="0">
+  <w:abstractNum w:abstractNumId="25" w15:restartNumberingAfterBreak="0">
     <w:nsid w:val="7CE94054"/>
     <w:multiLevelType w:val="multilevel"/>
     <w:tmpl w:val="A4D4C1F2"/>
@@ -7256,76 +7807,82 @@
     </w:lvl>
   </w:abstractNum>
   <w:num w:numId="1">
-    <w:abstractNumId w:val="7"/>
+    <w:abstractNumId w:val="8"/>
   </w:num>
   <w:num w:numId="2">
+    <w:abstractNumId w:val="21"/>
+  </w:num>
+  <w:num w:numId="3">
+    <w:abstractNumId w:val="20"/>
+  </w:num>
+  <w:num w:numId="4">
+    <w:abstractNumId w:val="18"/>
+  </w:num>
+  <w:num w:numId="5">
+    <w:abstractNumId w:val="25"/>
+  </w:num>
+  <w:num w:numId="6">
+    <w:abstractNumId w:val="14"/>
+  </w:num>
+  <w:num w:numId="7">
     <w:abstractNumId w:val="19"/>
   </w:num>
-  <w:num w:numId="3">
-    <w:abstractNumId w:val="18"/>
-  </w:num>
-  <w:num w:numId="4">
-    <w:abstractNumId w:val="16"/>
-  </w:num>
-  <w:num w:numId="5">
+  <w:num w:numId="8">
     <w:abstractNumId w:val="23"/>
   </w:num>
-  <w:num w:numId="6">
-    <w:abstractNumId w:val="12"/>
-  </w:num>
-  <w:num w:numId="7">
-    <w:abstractNumId w:val="17"/>
-  </w:num>
-  <w:num w:numId="8">
-    <w:abstractNumId w:val="21"/>
-  </w:num>
   <w:num w:numId="9">
-    <w:abstractNumId w:val="22"/>
+    <w:abstractNumId w:val="24"/>
   </w:num>
   <w:num w:numId="10">
     <w:abstractNumId w:val="1"/>
   </w:num>
   <w:num w:numId="11">
-    <w:abstractNumId w:val="3"/>
+    <w:abstractNumId w:val="4"/>
   </w:num>
   <w:num w:numId="12">
-    <w:abstractNumId w:val="13"/>
+    <w:abstractNumId w:val="15"/>
   </w:num>
   <w:num w:numId="13">
-    <w:abstractNumId w:val="6"/>
+    <w:abstractNumId w:val="7"/>
   </w:num>
   <w:num w:numId="14">
-    <w:abstractNumId w:val="9"/>
+    <w:abstractNumId w:val="10"/>
   </w:num>
   <w:num w:numId="15">
     <w:abstractNumId w:val="0"/>
   </w:num>
   <w:num w:numId="16">
-    <w:abstractNumId w:val="20"/>
+    <w:abstractNumId w:val="22"/>
   </w:num>
   <w:num w:numId="17">
-    <w:abstractNumId w:val="15"/>
+    <w:abstractNumId w:val="17"/>
   </w:num>
   <w:num w:numId="18">
+    <w:abstractNumId w:val="3"/>
+  </w:num>
+  <w:num w:numId="19">
+    <w:abstractNumId w:val="11"/>
+  </w:num>
+  <w:num w:numId="20">
+    <w:abstractNumId w:val="6"/>
+  </w:num>
+  <w:num w:numId="21">
+    <w:abstractNumId w:val="9"/>
+  </w:num>
+  <w:num w:numId="22">
+    <w:abstractNumId w:val="5"/>
+  </w:num>
+  <w:num w:numId="23">
+    <w:abstractNumId w:val="16"/>
+  </w:num>
+  <w:num w:numId="24">
+    <w:abstractNumId w:val="13"/>
+  </w:num>
+  <w:num w:numId="25">
     <w:abstractNumId w:val="2"/>
   </w:num>
-  <w:num w:numId="19">
-    <w:abstractNumId w:val="10"/>
-  </w:num>
-  <w:num w:numId="20">
-    <w:abstractNumId w:val="5"/>
-  </w:num>
-  <w:num w:numId="21">
-    <w:abstractNumId w:val="8"/>
-  </w:num>
-  <w:num w:numId="22">
-    <w:abstractNumId w:val="4"/>
-  </w:num>
-  <w:num w:numId="23">
-    <w:abstractNumId w:val="14"/>
-  </w:num>
-  <w:num w:numId="24">
-    <w:abstractNumId w:val="11"/>
+  <w:num w:numId="26">
+    <w:abstractNumId w:val="12"/>
   </w:num>
 </w:numbering>
 </file>

</xml_diff>

<commit_message>
quinto cambio: Diseño del diagrama UML
</commit_message>
<xml_diff>
--- a/Carlosama_Daniela_Unidad1.docx
+++ b/Carlosama_Daniela_Unidad1.docx
@@ -982,13 +982,23 @@
           </wp:anchor>
         </w:drawing>
       </w:r>
+      <w:proofErr w:type="gramStart"/>
       <w:r>
         <w:rPr>
           <w:rFonts w:ascii="Arial" w:hAnsi="Arial" w:cs="Arial"/>
           <w:b/>
           <w:sz w:val="28"/>
         </w:rPr>
-        <w:t xml:space="preserve">Actividades a desarrollar en la </w:t>
+        <w:t>Actividades a desarrollar</w:t>
+      </w:r>
+      <w:proofErr w:type="gramEnd"/>
+      <w:r>
+        <w:rPr>
+          <w:rFonts w:ascii="Arial" w:hAnsi="Arial" w:cs="Arial"/>
+          <w:b/>
+          <w:sz w:val="28"/>
+        </w:rPr>
+        <w:t xml:space="preserve"> en la </w:t>
       </w:r>
       <w:r>
         <w:rPr>
@@ -3636,6 +3646,293 @@
     </w:p>
     <w:p>
       <w:pPr>
+        <w:jc w:val="both"/>
+        <w:rPr>
+          <w:rFonts w:ascii="Arial" w:hAnsi="Arial" w:cs="Arial"/>
+          <w:lang w:eastAsia="es-EC"/>
+        </w:rPr>
+      </w:pPr>
+      <w:r>
+        <w:rPr>
+          <w:rFonts w:ascii="Arial" w:hAnsi="Arial" w:cs="Arial"/>
+          <w:lang w:eastAsia="es-EC"/>
+        </w:rPr>
+        <w:t xml:space="preserve">El diagrama de clases representa la estructura estática del sistema: las clases, sus atributos, métodos y relaciones. Traduce a clases los actores y casos de uso de la Figura 1 y sirve de base para los patrones de diseño de la sección 4. </w:t>
+      </w:r>
+      <w:proofErr w:type="spellStart"/>
+      <w:r>
+        <w:rPr>
+          <w:rFonts w:ascii="Arial" w:hAnsi="Arial" w:cs="Arial"/>
+          <w:lang w:eastAsia="es-EC"/>
+        </w:rPr>
+        <w:t>GestorCasos</w:t>
+      </w:r>
+      <w:proofErr w:type="spellEnd"/>
+      <w:r>
+        <w:rPr>
+          <w:rFonts w:ascii="Arial" w:hAnsi="Arial" w:cs="Arial"/>
+          <w:lang w:eastAsia="es-EC"/>
+        </w:rPr>
+        <w:t xml:space="preserve"> coordina el registro, la asignación y la adopción de los casos; la jerarquía de Expediente (perro, gato y fauna silvestre) guarda los datos de cada animal, junto con su </w:t>
+      </w:r>
+      <w:proofErr w:type="spellStart"/>
+      <w:r>
+        <w:rPr>
+          <w:rFonts w:ascii="Arial" w:hAnsi="Arial" w:cs="Arial"/>
+          <w:lang w:eastAsia="es-EC"/>
+        </w:rPr>
+        <w:t>HistorialClinico</w:t>
+      </w:r>
+      <w:proofErr w:type="spellEnd"/>
+      <w:r>
+        <w:rPr>
+          <w:rFonts w:ascii="Arial" w:hAnsi="Arial" w:cs="Arial"/>
+          <w:lang w:eastAsia="es-EC"/>
+        </w:rPr>
+        <w:t xml:space="preserve"> y los </w:t>
+      </w:r>
+      <w:proofErr w:type="spellStart"/>
+      <w:r>
+        <w:rPr>
+          <w:rFonts w:ascii="Arial" w:hAnsi="Arial" w:cs="Arial"/>
+          <w:lang w:eastAsia="es-EC"/>
+        </w:rPr>
+        <w:t>CambioEstado</w:t>
+      </w:r>
+      <w:proofErr w:type="spellEnd"/>
+      <w:r>
+        <w:rPr>
+          <w:rFonts w:ascii="Arial" w:hAnsi="Arial" w:cs="Arial"/>
+          <w:lang w:eastAsia="es-EC"/>
+        </w:rPr>
+        <w:t xml:space="preserve"> que dan trazabilidad; </w:t>
+      </w:r>
+      <w:proofErr w:type="spellStart"/>
+      <w:r>
+        <w:rPr>
+          <w:rFonts w:ascii="Arial" w:hAnsi="Arial" w:cs="Arial"/>
+          <w:lang w:eastAsia="es-EC"/>
+        </w:rPr>
+        <w:t>Adopcion</w:t>
+      </w:r>
+      <w:proofErr w:type="spellEnd"/>
+      <w:r>
+        <w:rPr>
+          <w:rFonts w:ascii="Arial" w:hAnsi="Arial" w:cs="Arial"/>
+          <w:lang w:eastAsia="es-EC"/>
+        </w:rPr>
+        <w:t xml:space="preserve"> cierra el expediente; las fábricas crean cada expediente a partir de </w:t>
+      </w:r>
+      <w:proofErr w:type="spellStart"/>
+      <w:r>
+        <w:rPr>
+          <w:rFonts w:ascii="Arial" w:hAnsi="Arial" w:cs="Arial"/>
+          <w:lang w:eastAsia="es-EC"/>
+        </w:rPr>
+        <w:t>DatosRescate</w:t>
+      </w:r>
+      <w:proofErr w:type="spellEnd"/>
+      <w:r>
+        <w:rPr>
+          <w:rFonts w:ascii="Arial" w:hAnsi="Arial" w:cs="Arial"/>
+          <w:lang w:eastAsia="es-EC"/>
+        </w:rPr>
+        <w:t xml:space="preserve">; los observadores (Voluntario y Veterinario) reciben el </w:t>
+      </w:r>
+      <w:proofErr w:type="spellStart"/>
+      <w:r>
+        <w:rPr>
+          <w:rFonts w:ascii="Arial" w:hAnsi="Arial" w:cs="Arial"/>
+          <w:lang w:eastAsia="es-EC"/>
+        </w:rPr>
+        <w:t>EventoRescate</w:t>
+      </w:r>
+      <w:proofErr w:type="spellEnd"/>
+      <w:r>
+        <w:rPr>
+          <w:rFonts w:ascii="Arial" w:hAnsi="Arial" w:cs="Arial"/>
+          <w:lang w:eastAsia="es-EC"/>
+        </w:rPr>
+        <w:t xml:space="preserve">; </w:t>
+      </w:r>
+      <w:proofErr w:type="spellStart"/>
+      <w:r>
+        <w:rPr>
+          <w:rFonts w:ascii="Arial" w:hAnsi="Arial" w:cs="Arial"/>
+          <w:lang w:eastAsia="es-EC"/>
+        </w:rPr>
+        <w:t>ServicioReportes</w:t>
+      </w:r>
+      <w:proofErr w:type="spellEnd"/>
+      <w:r>
+        <w:rPr>
+          <w:rFonts w:ascii="Arial" w:hAnsi="Arial" w:cs="Arial"/>
+          <w:lang w:eastAsia="es-EC"/>
+        </w:rPr>
+        <w:t xml:space="preserve"> genera los reportes y consulta la trazabilidad; y </w:t>
+      </w:r>
+      <w:proofErr w:type="spellStart"/>
+      <w:r>
+        <w:rPr>
+          <w:rFonts w:ascii="Arial" w:hAnsi="Arial" w:cs="Arial"/>
+          <w:lang w:eastAsia="es-EC"/>
+        </w:rPr>
+        <w:t>CasoController</w:t>
+      </w:r>
+      <w:proofErr w:type="spellEnd"/>
+      <w:r>
+        <w:rPr>
+          <w:rFonts w:ascii="Arial" w:hAnsi="Arial" w:cs="Arial"/>
+          <w:lang w:eastAsia="es-EC"/>
+        </w:rPr>
+        <w:t xml:space="preserve"> y </w:t>
+      </w:r>
+      <w:proofErr w:type="spellStart"/>
+      <w:r>
+        <w:rPr>
+          <w:rFonts w:ascii="Arial" w:hAnsi="Arial" w:cs="Arial"/>
+          <w:lang w:eastAsia="es-EC"/>
+        </w:rPr>
+        <w:t>VistaCaso</w:t>
+      </w:r>
+      <w:proofErr w:type="spellEnd"/>
+      <w:r>
+        <w:rPr>
+          <w:rFonts w:ascii="Arial" w:hAnsi="Arial" w:cs="Arial"/>
+          <w:lang w:eastAsia="es-EC"/>
+        </w:rPr>
+        <w:t xml:space="preserve"> separan la interfaz de la lógica de negocio.</w:t>
+      </w:r>
+    </w:p>
+    <w:p>
+      <w:pPr>
+        <w:jc w:val="both"/>
+        <w:rPr>
+          <w:rFonts w:ascii="Arial" w:hAnsi="Arial" w:cs="Arial"/>
+          <w:lang w:eastAsia="es-EC"/>
+        </w:rPr>
+      </w:pPr>
+    </w:p>
+    <w:p>
+      <w:pPr>
+        <w:jc w:val="both"/>
+        <w:rPr>
+          <w:rFonts w:ascii="Arial" w:hAnsi="Arial" w:cs="Arial"/>
+          <w:lang w:eastAsia="es-EC"/>
+        </w:rPr>
+      </w:pPr>
+    </w:p>
+    <w:p>
+      <w:pPr>
+        <w:jc w:val="both"/>
+        <w:rPr>
+          <w:rFonts w:ascii="Arial" w:hAnsi="Arial" w:cs="Arial"/>
+          <w:lang w:eastAsia="es-EC"/>
+        </w:rPr>
+      </w:pPr>
+    </w:p>
+    <w:p>
+      <w:pPr>
+        <w:jc w:val="both"/>
+        <w:rPr>
+          <w:rFonts w:ascii="Arial" w:hAnsi="Arial" w:cs="Arial"/>
+          <w:lang w:eastAsia="es-EC"/>
+        </w:rPr>
+        <w:sectPr>
+          <w:headerReference w:type="first" r:id="rId15"/>
+          <w:pgSz w:w="11906" w:h="16838"/>
+          <w:pgMar w:top="1417" w:right="1440" w:bottom="1417" w:left="1440" w:header="709" w:footer="709" w:gutter="0"/>
+          <w:pgNumType w:start="1"/>
+          <w:cols w:space="708"/>
+          <w:titlePg/>
+          <w:docGrid w:linePitch="360"/>
+        </w:sectPr>
+      </w:pPr>
+    </w:p>
+    <w:p>
+      <w:pPr>
+        <w:jc w:val="both"/>
+        <w:rPr>
+          <w:rFonts w:ascii="Arial" w:hAnsi="Arial" w:cs="Arial"/>
+          <w:lang w:eastAsia="es-EC"/>
+        </w:rPr>
+        <w:sectPr>
+          <w:pgSz w:w="16838" w:h="11906" w:orient="landscape"/>
+          <w:pgMar w:top="1440" w:right="1418" w:bottom="1440" w:left="1418" w:header="709" w:footer="709" w:gutter="0"/>
+          <w:pgNumType w:start="1"/>
+          <w:cols w:space="708"/>
+          <w:titlePg/>
+          <w:docGrid w:linePitch="360"/>
+        </w:sectPr>
+      </w:pPr>
+      <w:r>
+        <w:rPr>
+          <w:rFonts w:ascii="Arial" w:hAnsi="Arial" w:cs="Arial"/>
+          <w:noProof/>
+          <w:lang w:eastAsia="es-EC"/>
+        </w:rPr>
+        <w:lastRenderedPageBreak/>
+        <w:drawing>
+          <wp:inline distT="0" distB="0" distL="0" distR="0" wp14:anchorId="3CE980D6" wp14:editId="1BE6FEAB">
+            <wp:extent cx="9224964" cy="4381500"/>
+            <wp:effectExtent l="0" t="0" r="0" b="0"/>
+            <wp:docPr id="7" name="Imagen 7"/>
+            <wp:cNvGraphicFramePr>
+              <a:graphicFrameLocks xmlns:a="http://schemas.openxmlformats.org/drawingml/2006/main" noChangeAspect="1"/>
+            </wp:cNvGraphicFramePr>
+            <a:graphic xmlns:a="http://schemas.openxmlformats.org/drawingml/2006/main">
+              <a:graphicData uri="http://schemas.openxmlformats.org/drawingml/2006/picture">
+                <pic:pic xmlns:pic="http://schemas.openxmlformats.org/drawingml/2006/picture">
+                  <pic:nvPicPr>
+                    <pic:cNvPr id="7" name="Imagen 7"/>
+                    <pic:cNvPicPr/>
+                  </pic:nvPicPr>
+                  <pic:blipFill>
+                    <a:blip r:embed="rId16" cstate="print">
+                      <a:extLst>
+                        <a:ext uri="{28A0092B-C50C-407E-A947-70E740481C1C}">
+                          <a14:useLocalDpi xmlns:a14="http://schemas.microsoft.com/office/drawing/2010/main" val="0"/>
+                        </a:ext>
+                      </a:extLst>
+                    </a:blip>
+                    <a:stretch>
+                      <a:fillRect/>
+                    </a:stretch>
+                  </pic:blipFill>
+                  <pic:spPr>
+                    <a:xfrm>
+                      <a:off x="0" y="0"/>
+                      <a:ext cx="9227010" cy="4382472"/>
+                    </a:xfrm>
+                    <a:prstGeom prst="rect">
+                      <a:avLst/>
+                    </a:prstGeom>
+                  </pic:spPr>
+                </pic:pic>
+              </a:graphicData>
+            </a:graphic>
+          </wp:inline>
+        </w:drawing>
+      </w:r>
+    </w:p>
+    <w:p>
+      <w:pPr>
+        <w:rPr>
+          <w:rFonts w:ascii="Arial" w:hAnsi="Arial" w:cs="Arial"/>
+          <w:lang w:eastAsia="es-EC"/>
+        </w:rPr>
+      </w:pPr>
+      <w:r>
+        <w:rPr>
+          <w:rFonts w:ascii="Arial" w:hAnsi="Arial" w:cs="Arial"/>
+          <w:lang w:eastAsia="es-EC"/>
+        </w:rPr>
+        <w:lastRenderedPageBreak/>
+        <w:t>La siguiente tabla explica como el diseño cumple los principios SOLID:</w:t>
+      </w:r>
+    </w:p>
+    <w:p>
+      <w:pPr>
         <w:rPr>
           <w:rFonts w:ascii="Arial" w:hAnsi="Arial" w:cs="Arial"/>
           <w:b/>
@@ -3644,6 +3941,447 @@
         </w:rPr>
       </w:pPr>
     </w:p>
+    <w:tbl>
+      <w:tblPr>
+        <w:tblStyle w:val="Tablaconcuadrcula"/>
+        <w:tblW w:w="0" w:type="auto"/>
+        <w:tblLook w:val="04A0" w:firstRow="1" w:lastRow="0" w:firstColumn="1" w:lastColumn="0" w:noHBand="0" w:noVBand="1"/>
+      </w:tblPr>
+      <w:tblGrid>
+        <w:gridCol w:w="3114"/>
+        <w:gridCol w:w="5902"/>
+      </w:tblGrid>
+      <w:tr>
+        <w:tc>
+          <w:tcPr>
+            <w:tcW w:w="3114" w:type="dxa"/>
+          </w:tcPr>
+          <w:p>
+            <w:pPr>
+              <w:jc w:val="center"/>
+              <w:rPr>
+                <w:rFonts w:ascii="Arial" w:hAnsi="Arial" w:cs="Arial"/>
+                <w:b/>
+                <w:bCs/>
+              </w:rPr>
+            </w:pPr>
+            <w:r>
+              <w:rPr>
+                <w:rFonts w:ascii="Arial" w:hAnsi="Arial" w:cs="Arial"/>
+                <w:b/>
+                <w:bCs/>
+              </w:rPr>
+              <w:t>Principio</w:t>
+            </w:r>
+          </w:p>
+        </w:tc>
+        <w:tc>
+          <w:tcPr>
+            <w:tcW w:w="5902" w:type="dxa"/>
+          </w:tcPr>
+          <w:p>
+            <w:pPr>
+              <w:jc w:val="center"/>
+              <w:rPr>
+                <w:rFonts w:ascii="Arial" w:hAnsi="Arial" w:cs="Arial"/>
+                <w:b/>
+                <w:bCs/>
+              </w:rPr>
+            </w:pPr>
+            <w:r>
+              <w:rPr>
+                <w:rFonts w:ascii="Arial" w:hAnsi="Arial" w:cs="Arial"/>
+                <w:b/>
+                <w:bCs/>
+              </w:rPr>
+              <w:t>Aplicación en el diseño</w:t>
+            </w:r>
+          </w:p>
+        </w:tc>
+      </w:tr>
+      <w:tr>
+        <w:tc>
+          <w:tcPr>
+            <w:tcW w:w="3114" w:type="dxa"/>
+          </w:tcPr>
+          <w:p>
+            <w:pPr>
+              <w:rPr>
+                <w:rFonts w:ascii="Arial" w:hAnsi="Arial" w:cs="Arial"/>
+              </w:rPr>
+            </w:pPr>
+            <w:r>
+              <w:rPr>
+                <w:rFonts w:ascii="Arial" w:hAnsi="Arial" w:cs="Arial"/>
+              </w:rPr>
+              <w:t>S – Responsabilidad única</w:t>
+            </w:r>
+          </w:p>
+        </w:tc>
+        <w:tc>
+          <w:tcPr>
+            <w:tcW w:w="5902" w:type="dxa"/>
+          </w:tcPr>
+          <w:p>
+            <w:pPr>
+              <w:rPr>
+                <w:rFonts w:ascii="Arial" w:hAnsi="Arial" w:cs="Arial"/>
+              </w:rPr>
+            </w:pPr>
+            <w:r>
+              <w:rPr>
+                <w:rFonts w:ascii="Arial" w:hAnsi="Arial" w:cs="Arial"/>
+              </w:rPr>
+              <w:t xml:space="preserve">Expediente solo representa los datos y el estado de un caso. El historial clínico y los cambios de estado se delegan en </w:t>
+            </w:r>
+            <w:proofErr w:type="spellStart"/>
+            <w:r>
+              <w:rPr>
+                <w:rFonts w:ascii="Arial" w:hAnsi="Arial" w:cs="Arial"/>
+              </w:rPr>
+              <w:t>HistorialClinico</w:t>
+            </w:r>
+            <w:proofErr w:type="spellEnd"/>
+            <w:r>
+              <w:rPr>
+                <w:rFonts w:ascii="Arial" w:hAnsi="Arial" w:cs="Arial"/>
+              </w:rPr>
+              <w:t xml:space="preserve"> y </w:t>
+            </w:r>
+            <w:proofErr w:type="spellStart"/>
+            <w:r>
+              <w:rPr>
+                <w:rFonts w:ascii="Arial" w:hAnsi="Arial" w:cs="Arial"/>
+              </w:rPr>
+              <w:t>CambioEstado</w:t>
+            </w:r>
+            <w:proofErr w:type="spellEnd"/>
+            <w:r>
+              <w:rPr>
+                <w:rFonts w:ascii="Arial" w:hAnsi="Arial" w:cs="Arial"/>
+              </w:rPr>
+              <w:t xml:space="preserve">, el almacenamiento lo gestiona </w:t>
+            </w:r>
+            <w:proofErr w:type="spellStart"/>
+            <w:r>
+              <w:rPr>
+                <w:rFonts w:ascii="Arial" w:hAnsi="Arial" w:cs="Arial"/>
+              </w:rPr>
+              <w:t>RepositorioExpediente</w:t>
+            </w:r>
+            <w:proofErr w:type="spellEnd"/>
+            <w:r>
+              <w:rPr>
+                <w:rFonts w:ascii="Arial" w:hAnsi="Arial" w:cs="Arial"/>
+              </w:rPr>
+              <w:t xml:space="preserve">, los reportes </w:t>
+            </w:r>
+            <w:proofErr w:type="spellStart"/>
+            <w:r>
+              <w:rPr>
+                <w:rFonts w:ascii="Arial" w:hAnsi="Arial" w:cs="Arial"/>
+              </w:rPr>
+              <w:t>ServicioReportes</w:t>
+            </w:r>
+            <w:proofErr w:type="spellEnd"/>
+            <w:r>
+              <w:rPr>
+                <w:rFonts w:ascii="Arial" w:hAnsi="Arial" w:cs="Arial"/>
+              </w:rPr>
+              <w:t xml:space="preserve"> y la presentación, </w:t>
+            </w:r>
+            <w:proofErr w:type="spellStart"/>
+            <w:r>
+              <w:rPr>
+                <w:rFonts w:ascii="Arial" w:hAnsi="Arial" w:cs="Arial"/>
+              </w:rPr>
+              <w:t>VistaCaso</w:t>
+            </w:r>
+            <w:proofErr w:type="spellEnd"/>
+            <w:r>
+              <w:rPr>
+                <w:rFonts w:ascii="Arial" w:hAnsi="Arial" w:cs="Arial"/>
+              </w:rPr>
+              <w:t>.</w:t>
+            </w:r>
+          </w:p>
+        </w:tc>
+      </w:tr>
+      <w:tr>
+        <w:tc>
+          <w:tcPr>
+            <w:tcW w:w="3114" w:type="dxa"/>
+          </w:tcPr>
+          <w:p>
+            <w:pPr>
+              <w:rPr>
+                <w:rFonts w:ascii="Arial" w:hAnsi="Arial" w:cs="Arial"/>
+              </w:rPr>
+            </w:pPr>
+            <w:r>
+              <w:rPr>
+                <w:rFonts w:ascii="Arial" w:hAnsi="Arial" w:cs="Arial"/>
+              </w:rPr>
+              <w:t>O – Abierto/Cerrado</w:t>
+            </w:r>
+          </w:p>
+        </w:tc>
+        <w:tc>
+          <w:tcPr>
+            <w:tcW w:w="5902" w:type="dxa"/>
+          </w:tcPr>
+          <w:p>
+            <w:pPr>
+              <w:rPr>
+                <w:rFonts w:ascii="Arial" w:hAnsi="Arial" w:cs="Arial"/>
+              </w:rPr>
+            </w:pPr>
+            <w:r>
+              <w:rPr>
+                <w:rFonts w:ascii="Arial" w:hAnsi="Arial" w:cs="Arial"/>
+              </w:rPr>
+              <w:t xml:space="preserve">Para soportar una nueva especie (por ejemplo, aves exóticas) se agregan </w:t>
+            </w:r>
+            <w:proofErr w:type="spellStart"/>
+            <w:r>
+              <w:rPr>
+                <w:rFonts w:ascii="Arial" w:hAnsi="Arial" w:cs="Arial"/>
+              </w:rPr>
+              <w:t>ExpedienteAve</w:t>
+            </w:r>
+            <w:proofErr w:type="spellEnd"/>
+            <w:r>
+              <w:rPr>
+                <w:rFonts w:ascii="Arial" w:hAnsi="Arial" w:cs="Arial"/>
+              </w:rPr>
+              <w:t xml:space="preserve"> y </w:t>
+            </w:r>
+            <w:proofErr w:type="spellStart"/>
+            <w:r>
+              <w:rPr>
+                <w:rFonts w:ascii="Arial" w:hAnsi="Arial" w:cs="Arial"/>
+              </w:rPr>
+              <w:t>FabricaAve</w:t>
+            </w:r>
+            <w:proofErr w:type="spellEnd"/>
+            <w:r>
+              <w:rPr>
+                <w:rFonts w:ascii="Arial" w:hAnsi="Arial" w:cs="Arial"/>
+              </w:rPr>
+              <w:t xml:space="preserve"> sin modificar las clases existentes.</w:t>
+            </w:r>
+          </w:p>
+        </w:tc>
+      </w:tr>
+      <w:tr>
+        <w:tc>
+          <w:tcPr>
+            <w:tcW w:w="3114" w:type="dxa"/>
+          </w:tcPr>
+          <w:p>
+            <w:pPr>
+              <w:rPr>
+                <w:rFonts w:ascii="Arial" w:hAnsi="Arial" w:cs="Arial"/>
+              </w:rPr>
+            </w:pPr>
+            <w:r>
+              <w:rPr>
+                <w:rFonts w:ascii="Arial" w:hAnsi="Arial" w:cs="Arial"/>
+              </w:rPr>
+              <w:t xml:space="preserve">L – Sustitución de </w:t>
+            </w:r>
+            <w:proofErr w:type="spellStart"/>
+            <w:r>
+              <w:rPr>
+                <w:rFonts w:ascii="Arial" w:hAnsi="Arial" w:cs="Arial"/>
+              </w:rPr>
+              <w:t>Liskov</w:t>
+            </w:r>
+            <w:proofErr w:type="spellEnd"/>
+          </w:p>
+        </w:tc>
+        <w:tc>
+          <w:tcPr>
+            <w:tcW w:w="5902" w:type="dxa"/>
+          </w:tcPr>
+          <w:p>
+            <w:pPr>
+              <w:rPr>
+                <w:rFonts w:ascii="Arial" w:hAnsi="Arial" w:cs="Arial"/>
+              </w:rPr>
+            </w:pPr>
+            <w:proofErr w:type="spellStart"/>
+            <w:r>
+              <w:rPr>
+                <w:rFonts w:ascii="Arial" w:hAnsi="Arial" w:cs="Arial"/>
+              </w:rPr>
+              <w:t>ExpedientePerro</w:t>
+            </w:r>
+            <w:proofErr w:type="spellEnd"/>
+            <w:r>
+              <w:rPr>
+                <w:rFonts w:ascii="Arial" w:hAnsi="Arial" w:cs="Arial"/>
+              </w:rPr>
+              <w:t xml:space="preserve">, </w:t>
+            </w:r>
+            <w:proofErr w:type="spellStart"/>
+            <w:r>
+              <w:rPr>
+                <w:rFonts w:ascii="Arial" w:hAnsi="Arial" w:cs="Arial"/>
+              </w:rPr>
+              <w:t>ExpedienteGato</w:t>
+            </w:r>
+            <w:proofErr w:type="spellEnd"/>
+            <w:r>
+              <w:rPr>
+                <w:rFonts w:ascii="Arial" w:hAnsi="Arial" w:cs="Arial"/>
+              </w:rPr>
+              <w:t xml:space="preserve"> y </w:t>
+            </w:r>
+            <w:proofErr w:type="spellStart"/>
+            <w:r>
+              <w:rPr>
+                <w:rFonts w:ascii="Arial" w:hAnsi="Arial" w:cs="Arial"/>
+              </w:rPr>
+              <w:t>ExpedienteFauna</w:t>
+            </w:r>
+            <w:proofErr w:type="spellEnd"/>
+            <w:r>
+              <w:rPr>
+                <w:rFonts w:ascii="Arial" w:hAnsi="Arial" w:cs="Arial"/>
+              </w:rPr>
+              <w:t xml:space="preserve"> pueden usarse donde se espera un Expediente sin alterar el comportamiento del sistema.</w:t>
+            </w:r>
+          </w:p>
+        </w:tc>
+      </w:tr>
+      <w:tr>
+        <w:tc>
+          <w:tcPr>
+            <w:tcW w:w="3114" w:type="dxa"/>
+          </w:tcPr>
+          <w:p>
+            <w:pPr>
+              <w:rPr>
+                <w:rFonts w:ascii="Arial" w:hAnsi="Arial" w:cs="Arial"/>
+              </w:rPr>
+            </w:pPr>
+            <w:r>
+              <w:rPr>
+                <w:rFonts w:ascii="Arial" w:hAnsi="Arial" w:cs="Arial"/>
+              </w:rPr>
+              <w:t>I – Segregación de interfaces</w:t>
+            </w:r>
+          </w:p>
+        </w:tc>
+        <w:tc>
+          <w:tcPr>
+            <w:tcW w:w="5902" w:type="dxa"/>
+          </w:tcPr>
+          <w:p>
+            <w:pPr>
+              <w:rPr>
+                <w:rFonts w:ascii="Arial" w:hAnsi="Arial" w:cs="Arial"/>
+              </w:rPr>
+            </w:pPr>
+            <w:r>
+              <w:rPr>
+                <w:rFonts w:ascii="Arial" w:hAnsi="Arial" w:cs="Arial"/>
+              </w:rPr>
+              <w:t>Observador define un único método (actualizar), por lo que Voluntario y Veterinario no dependen de métodos que no usan.</w:t>
+            </w:r>
+          </w:p>
+        </w:tc>
+      </w:tr>
+      <w:tr>
+        <w:tc>
+          <w:tcPr>
+            <w:tcW w:w="3114" w:type="dxa"/>
+          </w:tcPr>
+          <w:p>
+            <w:pPr>
+              <w:rPr>
+                <w:rFonts w:ascii="Arial" w:hAnsi="Arial" w:cs="Arial"/>
+              </w:rPr>
+            </w:pPr>
+            <w:r>
+              <w:rPr>
+                <w:rFonts w:ascii="Arial" w:hAnsi="Arial" w:cs="Arial"/>
+              </w:rPr>
+              <w:t>D – Inversión de dependencias</w:t>
+            </w:r>
+          </w:p>
+        </w:tc>
+        <w:tc>
+          <w:tcPr>
+            <w:tcW w:w="5902" w:type="dxa"/>
+          </w:tcPr>
+          <w:p>
+            <w:pPr>
+              <w:rPr>
+                <w:rFonts w:ascii="Arial" w:hAnsi="Arial" w:cs="Arial"/>
+              </w:rPr>
+            </w:pPr>
+            <w:proofErr w:type="spellStart"/>
+            <w:r>
+              <w:rPr>
+                <w:rFonts w:ascii="Arial" w:hAnsi="Arial" w:cs="Arial"/>
+              </w:rPr>
+              <w:t>GestorCasos</w:t>
+            </w:r>
+            <w:proofErr w:type="spellEnd"/>
+            <w:r>
+              <w:rPr>
+                <w:rFonts w:ascii="Arial" w:hAnsi="Arial" w:cs="Arial"/>
+              </w:rPr>
+              <w:t xml:space="preserve"> y </w:t>
+            </w:r>
+            <w:proofErr w:type="spellStart"/>
+            <w:r>
+              <w:rPr>
+                <w:rFonts w:ascii="Arial" w:hAnsi="Arial" w:cs="Arial"/>
+              </w:rPr>
+              <w:t>ServicioReportes</w:t>
+            </w:r>
+            <w:proofErr w:type="spellEnd"/>
+            <w:r>
+              <w:rPr>
+                <w:rFonts w:ascii="Arial" w:hAnsi="Arial" w:cs="Arial"/>
+              </w:rPr>
+              <w:t xml:space="preserve"> dependen de la interfaz </w:t>
+            </w:r>
+            <w:proofErr w:type="spellStart"/>
+            <w:r>
+              <w:rPr>
+                <w:rFonts w:ascii="Arial" w:hAnsi="Arial" w:cs="Arial"/>
+              </w:rPr>
+              <w:t>RepositorioExpediente</w:t>
+            </w:r>
+            <w:proofErr w:type="spellEnd"/>
+            <w:r>
+              <w:rPr>
+                <w:rFonts w:ascii="Arial" w:hAnsi="Arial" w:cs="Arial"/>
+              </w:rPr>
+              <w:t xml:space="preserve"> y no de </w:t>
+            </w:r>
+            <w:proofErr w:type="spellStart"/>
+            <w:r>
+              <w:rPr>
+                <w:rFonts w:ascii="Arial" w:hAnsi="Arial" w:cs="Arial"/>
+              </w:rPr>
+              <w:t>RepositorioSQL</w:t>
+            </w:r>
+            <w:proofErr w:type="spellEnd"/>
+            <w:r>
+              <w:rPr>
+                <w:rFonts w:ascii="Arial" w:hAnsi="Arial" w:cs="Arial"/>
+              </w:rPr>
+              <w:t>; la base de datos puede cambiarse sin tocar la lógica de negocio.</w:t>
+            </w:r>
+          </w:p>
+        </w:tc>
+      </w:tr>
+    </w:tbl>
     <w:p>
       <w:pPr>
         <w:rPr>
@@ -3656,6 +4394,11 @@
     </w:p>
     <w:p>
       <w:pPr>
+        <w:pStyle w:val="Prrafodelista"/>
+        <w:numPr>
+          <w:ilvl w:val="1"/>
+          <w:numId w:val="23"/>
+        </w:numPr>
         <w:rPr>
           <w:rFonts w:ascii="Arial" w:hAnsi="Arial" w:cs="Arial"/>
           <w:b/>
@@ -3663,9 +4406,34 @@
           <w:lang w:eastAsia="es-EC"/>
         </w:rPr>
       </w:pPr>
+      <w:r>
+        <w:rPr>
+          <w:rFonts w:ascii="Arial" w:hAnsi="Arial" w:cs="Arial"/>
+          <w:b/>
+          <w:bCs/>
+          <w:lang w:eastAsia="es-EC"/>
+        </w:rPr>
+        <w:t>Arquitectura general del sistema</w:t>
+      </w:r>
     </w:p>
     <w:p>
       <w:pPr>
+        <w:jc w:val="both"/>
+        <w:rPr>
+          <w:rFonts w:ascii="Arial" w:hAnsi="Arial" w:cs="Arial"/>
+          <w:lang w:eastAsia="es-EC"/>
+        </w:rPr>
+      </w:pPr>
+      <w:r>
+        <w:rPr>
+          <w:rFonts w:ascii="Arial" w:hAnsi="Arial" w:cs="Arial"/>
+          <w:lang w:eastAsia="es-EC"/>
+        </w:rPr>
+        <w:t>El sistema se organiza en capas siguiendo MVC. La capa de presentación recibe las acciones del usuario, el controlador las traduce en llamadas al modelo, la capa de negocio concentra las reglas del refugio (gestor de casos, fábricas, expedientes y observadores) y la capa de persistencia aísla el acceso a la base de datos mediante un repositorio.</w:t>
+      </w:r>
+    </w:p>
+    <w:p>
+      <w:pPr>
         <w:rPr>
           <w:rFonts w:ascii="Arial" w:hAnsi="Arial" w:cs="Arial"/>
           <w:b/>
@@ -3693,68 +4461,6 @@
           <w:lang w:eastAsia="es-EC"/>
         </w:rPr>
       </w:pPr>
-    </w:p>
-    <w:p>
-      <w:pPr>
-        <w:rPr>
-          <w:rFonts w:ascii="Arial" w:hAnsi="Arial" w:cs="Arial"/>
-          <w:b/>
-          <w:bCs/>
-          <w:lang w:eastAsia="es-EC"/>
-        </w:rPr>
-      </w:pPr>
-    </w:p>
-    <w:p>
-      <w:pPr>
-        <w:rPr>
-          <w:rFonts w:ascii="Arial" w:hAnsi="Arial" w:cs="Arial"/>
-          <w:b/>
-          <w:bCs/>
-          <w:lang w:eastAsia="es-EC"/>
-        </w:rPr>
-      </w:pPr>
-    </w:p>
-    <w:p>
-      <w:pPr>
-        <w:rPr>
-          <w:rFonts w:ascii="Arial" w:hAnsi="Arial" w:cs="Arial"/>
-          <w:b/>
-          <w:bCs/>
-          <w:lang w:eastAsia="es-EC"/>
-        </w:rPr>
-      </w:pPr>
-    </w:p>
-    <w:p>
-      <w:pPr>
-        <w:rPr>
-          <w:rFonts w:ascii="Arial" w:hAnsi="Arial" w:cs="Arial"/>
-          <w:b/>
-          <w:bCs/>
-          <w:lang w:eastAsia="es-EC"/>
-        </w:rPr>
-      </w:pPr>
-    </w:p>
-    <w:p>
-      <w:pPr>
-        <w:pStyle w:val="Sinespaciado"/>
-        <w:spacing w:line="360" w:lineRule="auto"/>
-        <w:jc w:val="both"/>
-        <w:rPr>
-          <w:rFonts w:ascii="Arial" w:hAnsi="Arial" w:cs="Arial"/>
-          <w:b/>
-          <w:bCs/>
-          <w:lang w:eastAsia="es-EC"/>
-        </w:rPr>
-      </w:pPr>
-      <w:r>
-        <w:rPr>
-          <w:rFonts w:ascii="Arial" w:hAnsi="Arial" w:cs="Arial"/>
-          <w:b/>
-          <w:bCs/>
-          <w:lang w:eastAsia="es-EC"/>
-        </w:rPr>
-        <w:t>Evidencias</w:t>
-      </w:r>
     </w:p>
     <w:p>
       <w:pPr>
@@ -3783,30 +4489,6 @@
           <w:rFonts w:ascii="Arial" w:hAnsi="Arial" w:cs="Arial"/>
           <w:b/>
           <w:bCs/>
-          <w:i/>
-          <w:iCs/>
-          <w:sz w:val="20"/>
-          <w:szCs w:val="20"/>
-          <w:lang w:eastAsia="es-EC"/>
-        </w:rPr>
-        <w:t>(</w:t>
-      </w:r>
-      <w:r>
-        <w:rPr>
-          <w:rFonts w:ascii="Arial" w:eastAsia="Arial" w:hAnsi="Arial" w:cs="Arial"/>
-          <w:i/>
-          <w:iCs/>
-          <w:color w:val="000000"/>
-          <w:sz w:val="20"/>
-          <w:szCs w:val="20"/>
-        </w:rPr>
-        <w:t>Código de la ejecución de los ejercicios, enlace drive donde se encuentren los mismos y Capturas de pantalla claras y relevantes, donde evidencie el proceso realizado).</w:t>
-      </w:r>
-      <w:r>
-        <w:rPr>
-          <w:rFonts w:ascii="Arial" w:hAnsi="Arial" w:cs="Arial"/>
-          <w:b/>
-          <w:bCs/>
           <w:sz w:val="24"/>
           <w:szCs w:val="24"/>
           <w:lang w:eastAsia="es-EC"/>
@@ -3826,14 +4508,109 @@
           <w:lang w:eastAsia="es-EC"/>
         </w:rPr>
       </w:pPr>
-      <w:r>
+    </w:p>
+    <w:p>
+      <w:pPr>
+        <w:pStyle w:val="Sinespaciado"/>
+        <w:spacing w:line="360" w:lineRule="auto"/>
+        <w:jc w:val="both"/>
         <w:rPr>
           <w:rFonts w:ascii="Arial" w:hAnsi="Arial" w:cs="Arial"/>
           <w:b/>
           <w:bCs/>
           <w:lang w:eastAsia="es-EC"/>
         </w:rPr>
-        <w:lastRenderedPageBreak/>
+      </w:pPr>
+      <w:r>
+        <w:rPr>
+          <w:rFonts w:ascii="Arial" w:hAnsi="Arial" w:cs="Arial"/>
+          <w:b/>
+          <w:bCs/>
+          <w:lang w:eastAsia="es-EC"/>
+        </w:rPr>
+        <w:t>Evidencias</w:t>
+      </w:r>
+    </w:p>
+    <w:p>
+      <w:pPr>
+        <w:pStyle w:val="Sinespaciado"/>
+        <w:spacing w:line="360" w:lineRule="auto"/>
+        <w:jc w:val="both"/>
+        <w:rPr>
+          <w:rFonts w:ascii="Arial" w:hAnsi="Arial" w:cs="Arial"/>
+          <w:b/>
+          <w:bCs/>
+          <w:lang w:eastAsia="es-EC"/>
+        </w:rPr>
+      </w:pPr>
+      <w:r>
+        <w:rPr>
+          <w:rFonts w:ascii="Arial" w:hAnsi="Arial" w:cs="Arial"/>
+          <w:b/>
+          <w:bCs/>
+          <w:lang w:eastAsia="es-EC"/>
+        </w:rPr>
+        <w:t>(Código de la ejecución de los ejercicios, enlace drive donde se encuentren los mismos y Capturas de pantalla claras y relevantes, donde evidencie el proceso realizado).</w:t>
+      </w:r>
+    </w:p>
+    <w:p>
+      <w:pPr>
+        <w:pStyle w:val="Sinespaciado"/>
+        <w:spacing w:line="360" w:lineRule="auto"/>
+        <w:jc w:val="both"/>
+        <w:rPr>
+          <w:rFonts w:ascii="Arial" w:hAnsi="Arial" w:cs="Arial"/>
+          <w:b/>
+          <w:bCs/>
+          <w:lang w:eastAsia="es-EC"/>
+        </w:rPr>
+      </w:pPr>
+    </w:p>
+    <w:p>
+      <w:pPr>
+        <w:pStyle w:val="Sinespaciado"/>
+        <w:spacing w:line="360" w:lineRule="auto"/>
+        <w:jc w:val="both"/>
+        <w:rPr>
+          <w:rFonts w:ascii="Arial" w:hAnsi="Arial" w:cs="Arial"/>
+          <w:b/>
+          <w:bCs/>
+          <w:lang w:eastAsia="es-EC"/>
+        </w:rPr>
+      </w:pPr>
+    </w:p>
+    <w:p>
+      <w:pPr>
+        <w:pStyle w:val="Sinespaciado"/>
+        <w:spacing w:line="360" w:lineRule="auto"/>
+        <w:jc w:val="both"/>
+        <w:rPr>
+          <w:rFonts w:ascii="Arial" w:hAnsi="Arial" w:cs="Arial"/>
+          <w:b/>
+          <w:bCs/>
+          <w:lang w:eastAsia="es-EC"/>
+        </w:rPr>
+      </w:pPr>
+    </w:p>
+    <w:p>
+      <w:pPr>
+        <w:pStyle w:val="Sinespaciado"/>
+        <w:spacing w:line="360" w:lineRule="auto"/>
+        <w:jc w:val="both"/>
+        <w:rPr>
+          <w:rFonts w:ascii="Arial" w:hAnsi="Arial" w:cs="Arial"/>
+          <w:b/>
+          <w:bCs/>
+          <w:lang w:eastAsia="es-EC"/>
+        </w:rPr>
+      </w:pPr>
+      <w:r>
+        <w:rPr>
+          <w:rFonts w:ascii="Arial" w:hAnsi="Arial" w:cs="Arial"/>
+          <w:b/>
+          <w:bCs/>
+          <w:lang w:eastAsia="es-EC"/>
+        </w:rPr>
         <w:t>Bibliografía</w:t>
       </w:r>
     </w:p>
@@ -3892,8 +4669,186 @@
         <w:t>)</w:t>
       </w:r>
     </w:p>
+    <w:p>
+      <w:pPr>
+        <w:widowControl w:val="0"/>
+        <w:pBdr>
+          <w:top w:val="nil"/>
+          <w:left w:val="nil"/>
+          <w:bottom w:val="nil"/>
+          <w:right w:val="nil"/>
+          <w:between w:val="nil"/>
+        </w:pBdr>
+        <w:spacing w:after="0" w:line="240" w:lineRule="auto"/>
+        <w:jc w:val="both"/>
+        <w:rPr>
+          <w:rFonts w:ascii="Arial" w:hAnsi="Arial" w:cs="Arial"/>
+          <w:i/>
+          <w:iCs/>
+          <w:sz w:val="20"/>
+          <w:szCs w:val="20"/>
+          <w:lang w:eastAsia="es-EC"/>
+        </w:rPr>
+      </w:pPr>
+    </w:p>
+    <w:p>
+      <w:pPr>
+        <w:widowControl w:val="0"/>
+        <w:pBdr>
+          <w:top w:val="nil"/>
+          <w:left w:val="nil"/>
+          <w:bottom w:val="nil"/>
+          <w:right w:val="nil"/>
+          <w:between w:val="nil"/>
+        </w:pBdr>
+        <w:spacing w:after="0" w:line="240" w:lineRule="auto"/>
+        <w:jc w:val="both"/>
+        <w:rPr>
+          <w:rFonts w:ascii="Arial" w:hAnsi="Arial" w:cs="Arial"/>
+          <w:i/>
+          <w:iCs/>
+          <w:sz w:val="20"/>
+          <w:szCs w:val="20"/>
+          <w:lang w:eastAsia="es-EC"/>
+        </w:rPr>
+      </w:pPr>
+    </w:p>
+    <w:p>
+      <w:pPr>
+        <w:widowControl w:val="0"/>
+        <w:pBdr>
+          <w:top w:val="nil"/>
+          <w:left w:val="nil"/>
+          <w:bottom w:val="nil"/>
+          <w:right w:val="nil"/>
+          <w:between w:val="nil"/>
+        </w:pBdr>
+        <w:spacing w:after="0" w:line="240" w:lineRule="auto"/>
+        <w:jc w:val="both"/>
+        <w:rPr>
+          <w:rFonts w:ascii="Arial" w:hAnsi="Arial" w:cs="Arial"/>
+          <w:i/>
+          <w:iCs/>
+          <w:sz w:val="20"/>
+          <w:szCs w:val="20"/>
+          <w:lang w:eastAsia="es-EC"/>
+        </w:rPr>
+      </w:pPr>
+      <w:r>
+        <w:rPr>
+          <w:rFonts w:ascii="Arial" w:hAnsi="Arial" w:cs="Arial"/>
+          <w:i/>
+          <w:iCs/>
+          <w:sz w:val="20"/>
+          <w:szCs w:val="20"/>
+          <w:lang w:eastAsia="es-EC"/>
+        </w:rPr>
+        <w:t>Anexos</w:t>
+      </w:r>
+    </w:p>
+    <w:p>
+      <w:pPr>
+        <w:widowControl w:val="0"/>
+        <w:pBdr>
+          <w:top w:val="nil"/>
+          <w:left w:val="nil"/>
+          <w:bottom w:val="nil"/>
+          <w:right w:val="nil"/>
+          <w:between w:val="nil"/>
+        </w:pBdr>
+        <w:spacing w:after="0" w:line="240" w:lineRule="auto"/>
+        <w:jc w:val="both"/>
+        <w:rPr>
+          <w:rFonts w:ascii="Arial" w:hAnsi="Arial" w:cs="Arial"/>
+          <w:i/>
+          <w:iCs/>
+          <w:sz w:val="20"/>
+          <w:szCs w:val="20"/>
+          <w:lang w:eastAsia="es-EC"/>
+        </w:rPr>
+      </w:pPr>
+      <w:hyperlink r:id="rId17" w:history="1">
+        <w:r>
+          <w:rPr>
+            <w:rStyle w:val="Hipervnculo"/>
+            <w:rFonts w:ascii="Arial" w:hAnsi="Arial" w:cs="Arial"/>
+            <w:i/>
+            <w:iCs/>
+            <w:sz w:val="20"/>
+            <w:szCs w:val="20"/>
+            <w:lang w:eastAsia="es-EC"/>
+          </w:rPr>
+          <w:t>https://lucid.app/lucidchart/5c9b9490-fbbe-450c-be14-33b1d79ccf24/edit?viewport_loc=-602%2C-55%2C2596%2C1361%2C0_0&amp;invitationId=inv_1f96320a-de77-4dd7-9b3b-48aaf619344f</w:t>
+        </w:r>
+      </w:hyperlink>
+    </w:p>
+    <w:p>
+      <w:pPr>
+        <w:widowControl w:val="0"/>
+        <w:pBdr>
+          <w:top w:val="nil"/>
+          <w:left w:val="nil"/>
+          <w:bottom w:val="nil"/>
+          <w:right w:val="nil"/>
+          <w:between w:val="nil"/>
+        </w:pBdr>
+        <w:spacing w:after="0" w:line="240" w:lineRule="auto"/>
+        <w:jc w:val="both"/>
+        <w:rPr>
+          <w:rFonts w:ascii="Arial" w:hAnsi="Arial" w:cs="Arial"/>
+          <w:i/>
+          <w:iCs/>
+          <w:sz w:val="20"/>
+          <w:szCs w:val="20"/>
+          <w:lang w:eastAsia="es-EC"/>
+        </w:rPr>
+      </w:pPr>
+    </w:p>
+    <w:p>
+      <w:pPr>
+        <w:widowControl w:val="0"/>
+        <w:pBdr>
+          <w:top w:val="nil"/>
+          <w:left w:val="nil"/>
+          <w:bottom w:val="nil"/>
+          <w:right w:val="nil"/>
+          <w:between w:val="nil"/>
+        </w:pBdr>
+        <w:spacing w:after="0" w:line="240" w:lineRule="auto"/>
+        <w:jc w:val="both"/>
+        <w:rPr>
+          <w:rFonts w:ascii="Arial" w:hAnsi="Arial" w:cs="Arial"/>
+          <w:i/>
+          <w:iCs/>
+          <w:sz w:val="20"/>
+          <w:szCs w:val="20"/>
+          <w:lang w:eastAsia="es-EC"/>
+        </w:rPr>
+      </w:pPr>
+    </w:p>
+    <w:p>
+      <w:pPr>
+        <w:widowControl w:val="0"/>
+        <w:pBdr>
+          <w:top w:val="nil"/>
+          <w:left w:val="nil"/>
+          <w:bottom w:val="nil"/>
+          <w:right w:val="nil"/>
+          <w:between w:val="nil"/>
+        </w:pBdr>
+        <w:spacing w:after="0" w:line="240" w:lineRule="auto"/>
+        <w:jc w:val="both"/>
+        <w:rPr>
+          <w:rFonts w:ascii="Arial" w:hAnsi="Arial" w:cs="Arial"/>
+          <w:i/>
+          <w:iCs/>
+          <w:sz w:val="20"/>
+          <w:szCs w:val="20"/>
+          <w:lang w:eastAsia="es-EC"/>
+        </w:rPr>
+      </w:pPr>
+    </w:p>
     <w:sectPr>
-      <w:headerReference w:type="first" r:id="rId15"/>
       <w:pgSz w:w="11906" w:h="16838"/>
       <w:pgMar w:top="1417" w:right="1440" w:bottom="1417" w:left="1440" w:header="709" w:footer="709" w:gutter="0"/>
       <w:pgNumType w:start="1"/>
@@ -4605,7 +5560,7 @@
               <wp:inline distT="0" distB="0" distL="0" distR="0" wp14:anchorId="558DFBB3" wp14:editId="42FDF3FE">
                 <wp:extent cx="400153" cy="386664"/>
                 <wp:effectExtent l="0" t="0" r="0" b="0"/>
-                <wp:docPr id="977392058" name="Imagen 977392058"/>
+                <wp:docPr id="8" name="Imagen 8"/>
                 <wp:cNvGraphicFramePr/>
                 <a:graphic xmlns:a="http://schemas.openxmlformats.org/drawingml/2006/main">
                   <a:graphicData uri="http://schemas.openxmlformats.org/drawingml/2006/picture">
@@ -4769,7 +5724,7 @@
         <v:path o:extrusionok="f" gradientshapeok="t" o:connecttype="rect"/>
         <o:lock v:ext="edit" aspectratio="t"/>
       </v:shapetype>
-      <v:shape id="_x0000_i1167" type="#_x0000_t75" style="width:11.35pt;height:11.35pt" o:bullet="t">
+      <v:shape id="_x0000_i1200" type="#_x0000_t75" style="width:11.35pt;height:11.35pt" o:bullet="t">
         <v:imagedata r:id="rId1" o:title="mso3E28"/>
       </v:shape>
     </w:pict>
@@ -8932,6 +9887,18 @@
       </w:tcPr>
     </w:tblStylePr>
   </w:style>
+  <w:style w:type="character" w:styleId="Mencinsinresolver">
+    <w:name w:val="Unresolved Mention"/>
+    <w:basedOn w:val="Fuentedeprrafopredeter"/>
+    <w:uiPriority w:val="99"/>
+    <w:semiHidden/>
+    <w:unhideWhenUsed/>
+    <w:rsid w:val="00CD35D0"/>
+    <w:rPr>
+      <w:color w:val="605E5C"/>
+      <w:shd w:val="clear" w:color="auto" w:fill="E1DFDD"/>
+    </w:rPr>
+  </w:style>
 </w:styles>
 </file>
 

</xml_diff>

<commit_message>
septimo cambio: Listo para la entrega
</commit_message>
<xml_diff>
--- a/Carlosama_Daniela_Unidad1.docx
+++ b/Carlosama_Daniela_Unidad1.docx
@@ -982,13 +982,23 @@
           </wp:anchor>
         </w:drawing>
       </w:r>
+      <w:proofErr w:type="gramStart"/>
       <w:r>
         <w:rPr>
           <w:rFonts w:ascii="Arial" w:hAnsi="Arial" w:cs="Arial"/>
           <w:b/>
           <w:sz w:val="28"/>
         </w:rPr>
-        <w:t xml:space="preserve">Actividades a desarrollar en la </w:t>
+        <w:t>Actividades a desarrollar</w:t>
+      </w:r>
+      <w:proofErr w:type="gramEnd"/>
+      <w:r>
+        <w:rPr>
+          <w:rFonts w:ascii="Arial" w:hAnsi="Arial" w:cs="Arial"/>
+          <w:b/>
+          <w:sz w:val="28"/>
+        </w:rPr>
+        <w:t xml:space="preserve"> en la </w:t>
       </w:r>
       <w:r>
         <w:rPr>
@@ -1116,169 +1126,7 @@
           <w:szCs w:val="24"/>
           <w:lang w:eastAsia="es-EC"/>
         </w:rPr>
-        <w:t xml:space="preserve">Los refugios de animales reciben a diario reportes de perros, gatos y fauna silvestre en situación de riesgo. Sin un sistema organizado, la información se </w:t>
-      </w:r>
-      <w:r>
-        <w:rPr>
-          <w:rFonts w:ascii="Arial" w:hAnsi="Arial" w:cs="Arial"/>
-          <w:sz w:val="24"/>
-          <w:szCs w:val="24"/>
-          <w:lang w:eastAsia="es-EC"/>
-        </w:rPr>
-        <w:t>distorsiona,</w:t>
-      </w:r>
-      <w:r>
-        <w:rPr>
-          <w:rFonts w:ascii="Arial" w:hAnsi="Arial" w:cs="Arial"/>
-          <w:sz w:val="24"/>
-          <w:szCs w:val="24"/>
-          <w:lang w:eastAsia="es-EC"/>
-        </w:rPr>
-        <w:t xml:space="preserve"> no se sabe quién atiende cada caso, en qué estado se encuentra ni cuándo </w:t>
-      </w:r>
-      <w:r>
-        <w:rPr>
-          <w:rFonts w:ascii="Arial" w:hAnsi="Arial" w:cs="Arial"/>
-          <w:sz w:val="24"/>
-          <w:szCs w:val="24"/>
-          <w:lang w:eastAsia="es-EC"/>
-        </w:rPr>
-        <w:t xml:space="preserve">se realiza el </w:t>
-      </w:r>
-      <w:r>
-        <w:rPr>
-          <w:rFonts w:ascii="Arial" w:hAnsi="Arial" w:cs="Arial"/>
-          <w:sz w:val="24"/>
-          <w:szCs w:val="24"/>
-          <w:lang w:eastAsia="es-EC"/>
-        </w:rPr>
-        <w:t>cambi</w:t>
-      </w:r>
-      <w:r>
-        <w:rPr>
-          <w:rFonts w:ascii="Arial" w:hAnsi="Arial" w:cs="Arial"/>
-          <w:sz w:val="24"/>
-          <w:szCs w:val="24"/>
-          <w:lang w:eastAsia="es-EC"/>
-        </w:rPr>
-        <w:t>o</w:t>
-      </w:r>
-      <w:r>
-        <w:rPr>
-          <w:rFonts w:ascii="Arial" w:hAnsi="Arial" w:cs="Arial"/>
-          <w:sz w:val="24"/>
-          <w:szCs w:val="24"/>
-          <w:lang w:eastAsia="es-EC"/>
-        </w:rPr>
-        <w:t>. E</w:t>
-      </w:r>
-      <w:r>
-        <w:rPr>
-          <w:rFonts w:ascii="Arial" w:hAnsi="Arial" w:cs="Arial"/>
-          <w:sz w:val="24"/>
-          <w:szCs w:val="24"/>
-          <w:lang w:eastAsia="es-EC"/>
-        </w:rPr>
-        <w:t xml:space="preserve">n el presente </w:t>
-      </w:r>
-      <w:r>
-        <w:rPr>
-          <w:rFonts w:ascii="Arial" w:hAnsi="Arial" w:cs="Arial"/>
-          <w:sz w:val="24"/>
-          <w:szCs w:val="24"/>
-          <w:lang w:eastAsia="es-EC"/>
-        </w:rPr>
-        <w:t>documento</w:t>
-      </w:r>
-      <w:r>
-        <w:rPr>
-          <w:rFonts w:ascii="Arial" w:hAnsi="Arial" w:cs="Arial"/>
-          <w:sz w:val="24"/>
-          <w:szCs w:val="24"/>
-          <w:lang w:eastAsia="es-EC"/>
-        </w:rPr>
-        <w:t xml:space="preserve"> se</w:t>
-      </w:r>
-      <w:r>
-        <w:rPr>
-          <w:rFonts w:ascii="Arial" w:hAnsi="Arial" w:cs="Arial"/>
-          <w:sz w:val="24"/>
-          <w:szCs w:val="24"/>
-          <w:lang w:eastAsia="es-EC"/>
-        </w:rPr>
-        <w:t xml:space="preserve"> presenta el diseño de un Sistema de Control de Rescate y Adopción Animal que permite registrar ingresos, asignar voluntarios o veterinarios responsables y gestionar el ciclo de vida de cada caso (</w:t>
-      </w:r>
-      <w:r>
-        <w:rPr>
-          <w:rFonts w:ascii="Arial" w:hAnsi="Arial" w:cs="Arial"/>
-          <w:sz w:val="24"/>
-          <w:szCs w:val="24"/>
-          <w:lang w:eastAsia="es-EC"/>
-        </w:rPr>
-        <w:t>r</w:t>
-      </w:r>
-      <w:r>
-        <w:rPr>
-          <w:rFonts w:ascii="Arial" w:hAnsi="Arial" w:cs="Arial"/>
-          <w:sz w:val="24"/>
-          <w:szCs w:val="24"/>
-          <w:lang w:eastAsia="es-EC"/>
-        </w:rPr>
-        <w:t>escatado,</w:t>
-      </w:r>
-      <w:r>
-        <w:rPr>
-          <w:rFonts w:ascii="Arial" w:hAnsi="Arial" w:cs="Arial"/>
-          <w:sz w:val="24"/>
-          <w:szCs w:val="24"/>
-          <w:lang w:eastAsia="es-EC"/>
-        </w:rPr>
-        <w:t xml:space="preserve"> en t</w:t>
-      </w:r>
-      <w:r>
-        <w:rPr>
-          <w:rFonts w:ascii="Arial" w:hAnsi="Arial" w:cs="Arial"/>
-          <w:sz w:val="24"/>
-          <w:szCs w:val="24"/>
-          <w:lang w:eastAsia="es-EC"/>
-        </w:rPr>
-        <w:t xml:space="preserve">ratamiento, </w:t>
-      </w:r>
-      <w:r>
-        <w:rPr>
-          <w:rFonts w:ascii="Arial" w:hAnsi="Arial" w:cs="Arial"/>
-          <w:sz w:val="24"/>
-          <w:szCs w:val="24"/>
-          <w:lang w:eastAsia="es-EC"/>
-        </w:rPr>
-        <w:t>en a</w:t>
-      </w:r>
-      <w:r>
-        <w:rPr>
-          <w:rFonts w:ascii="Arial" w:hAnsi="Arial" w:cs="Arial"/>
-          <w:sz w:val="24"/>
-          <w:szCs w:val="24"/>
-          <w:lang w:eastAsia="es-EC"/>
-        </w:rPr>
-        <w:t xml:space="preserve">dopción y </w:t>
-      </w:r>
-      <w:r>
-        <w:rPr>
-          <w:rFonts w:ascii="Arial" w:hAnsi="Arial" w:cs="Arial"/>
-          <w:sz w:val="24"/>
-          <w:szCs w:val="24"/>
-          <w:lang w:eastAsia="es-EC"/>
-        </w:rPr>
-        <w:t>a</w:t>
-      </w:r>
-      <w:r>
-        <w:rPr>
-          <w:rFonts w:ascii="Arial" w:hAnsi="Arial" w:cs="Arial"/>
-          <w:sz w:val="24"/>
-          <w:szCs w:val="24"/>
-          <w:lang w:eastAsia="es-EC"/>
-        </w:rPr>
-        <w:t>doptado).</w:t>
+        <w:t>Los refugios de animales reciben a diario reportes de perros, gatos y fauna silvestre en situación de riesgo. Sin un sistema organizado, la información se distorsiona, no se sabe quién atiende cada caso, en qué estado se encuentra ni cuándo se realiza el cambio. En el presente documento se presenta el diseño de un Sistema de Control de Rescate y Adopción Animal que permite registrar ingresos, asignar voluntarios o veterinarios responsables y gestionar el ciclo de vida de cada caso (rescatado, en tratamiento, en adopción y adoptado).</w:t>
       </w:r>
     </w:p>
     <w:p>
@@ -1326,25 +1174,7 @@
           <w:szCs w:val="24"/>
           <w:lang w:eastAsia="es-EC"/>
         </w:rPr>
-        <w:t>A</w:t>
-      </w:r>
-      <w:r>
-        <w:rPr>
-          <w:rFonts w:ascii="Arial" w:hAnsi="Arial" w:cs="Arial"/>
-          <w:sz w:val="24"/>
-          <w:szCs w:val="24"/>
-          <w:lang w:eastAsia="es-EC"/>
-        </w:rPr>
-        <w:t>nálisis claro de actores y requerimientos</w:t>
-      </w:r>
-      <w:r>
-        <w:rPr>
-          <w:rFonts w:ascii="Arial" w:hAnsi="Arial" w:cs="Arial"/>
-          <w:sz w:val="24"/>
-          <w:szCs w:val="24"/>
-          <w:lang w:eastAsia="es-EC"/>
-        </w:rPr>
-        <w:t>.</w:t>
+        <w:t>Análisis claro de actores y requerimientos.</w:t>
       </w:r>
     </w:p>
     <w:p>
@@ -1370,34 +1200,47 @@
           <w:szCs w:val="24"/>
           <w:lang w:eastAsia="es-EC"/>
         </w:rPr>
-        <w:t>C</w:t>
-      </w:r>
-      <w:r>
-        <w:rPr>
-          <w:rFonts w:ascii="Arial" w:hAnsi="Arial" w:cs="Arial"/>
-          <w:sz w:val="24"/>
-          <w:szCs w:val="24"/>
-          <w:lang w:eastAsia="es-EC"/>
-        </w:rPr>
-        <w:t>uatro patrones de diseño de software (</w:t>
-      </w:r>
-      <w:r>
-        <w:rPr>
-          <w:rFonts w:ascii="Arial" w:hAnsi="Arial" w:cs="Arial"/>
-          <w:sz w:val="24"/>
-          <w:szCs w:val="24"/>
-          <w:lang w:eastAsia="es-EC"/>
-        </w:rPr>
-        <w:t xml:space="preserve">semifallo, </w:t>
-      </w:r>
-      <w:r>
-        <w:rPr>
-          <w:rFonts w:ascii="Arial" w:hAnsi="Arial" w:cs="Arial"/>
-          <w:sz w:val="24"/>
-          <w:szCs w:val="24"/>
-          <w:lang w:eastAsia="es-EC"/>
-        </w:rPr>
-        <w:t>observadora, método de fábrica y MVC</w:t>
+        <w:t>Cuatro patrones de diseño de software (</w:t>
+      </w:r>
+      <w:proofErr w:type="spellStart"/>
+      <w:r>
+        <w:rPr>
+          <w:rFonts w:ascii="Arial" w:hAnsi="Arial" w:cs="Arial"/>
+          <w:sz w:val="24"/>
+          <w:szCs w:val="24"/>
+          <w:lang w:eastAsia="es-EC"/>
+        </w:rPr>
+        <w:t>Singleton</w:t>
+      </w:r>
+      <w:proofErr w:type="spellEnd"/>
+      <w:r>
+        <w:rPr>
+          <w:rFonts w:ascii="Arial" w:hAnsi="Arial" w:cs="Arial"/>
+          <w:sz w:val="24"/>
+          <w:szCs w:val="24"/>
+          <w:lang w:eastAsia="es-EC"/>
+        </w:rPr>
+        <w:t xml:space="preserve">, </w:t>
+      </w:r>
+      <w:proofErr w:type="spellStart"/>
+      <w:r>
+        <w:rPr>
+          <w:rFonts w:ascii="Arial" w:hAnsi="Arial" w:cs="Arial"/>
+          <w:sz w:val="24"/>
+          <w:szCs w:val="24"/>
+          <w:lang w:eastAsia="es-EC"/>
+        </w:rPr>
+        <w:t>Observer</w:t>
+      </w:r>
+      <w:proofErr w:type="spellEnd"/>
+      <w:r>
+        <w:rPr>
+          <w:rFonts w:ascii="Arial" w:hAnsi="Arial" w:cs="Arial"/>
+          <w:sz w:val="24"/>
+          <w:szCs w:val="24"/>
+          <w:lang w:eastAsia="es-EC"/>
+        </w:rPr>
+        <w:t>, Factory Method y MVC</w:t>
       </w:r>
       <w:r>
         <w:rPr>
@@ -1441,7 +1284,27 @@
           <w:szCs w:val="24"/>
           <w:lang w:eastAsia="es-EC"/>
         </w:rPr>
-        <w:t>epositorio en GitHub organizado bajo el modelo Gitflow, que garantiza la trazabilidad de las versiones del proyecto.</w:t>
+        <w:t xml:space="preserve">epositorio en GitHub organizado bajo el modelo </w:t>
+      </w:r>
+      <w:proofErr w:type="spellStart"/>
+      <w:r>
+        <w:rPr>
+          <w:rFonts w:ascii="Arial" w:hAnsi="Arial" w:cs="Arial"/>
+          <w:sz w:val="24"/>
+          <w:szCs w:val="24"/>
+          <w:lang w:eastAsia="es-EC"/>
+        </w:rPr>
+        <w:t>Gitflow</w:t>
+      </w:r>
+      <w:proofErr w:type="spellEnd"/>
+      <w:r>
+        <w:rPr>
+          <w:rFonts w:ascii="Arial" w:hAnsi="Arial" w:cs="Arial"/>
+          <w:sz w:val="24"/>
+          <w:szCs w:val="24"/>
+          <w:lang w:eastAsia="es-EC"/>
+        </w:rPr>
+        <w:t>, que garantiza la trazabilidad de las versiones del proyecto.</w:t>
       </w:r>
     </w:p>
     <w:p>
@@ -1568,7 +1431,7 @@
     </w:p>
     <w:tbl>
       <w:tblPr>
-        <w:tblStyle w:val="Tablaconcuadrcula"/>
+        <w:tblStyle w:val="Tablanormal2"/>
         <w:tblW w:w="9067" w:type="dxa"/>
         <w:tblLook w:val="04A0" w:firstRow="1" w:lastRow="0" w:firstColumn="1" w:lastColumn="0" w:noHBand="0" w:noVBand="1"/>
       </w:tblPr>
@@ -1578,9 +1441,17 @@
         <w:gridCol w:w="3405"/>
       </w:tblGrid>
       <w:tr>
+        <w:trPr>
+          <w:cnfStyle w:val="100000000000" w:firstRow="1" w:lastRow="0" w:firstColumn="0" w:lastColumn="0" w:oddVBand="0" w:evenVBand="0" w:oddHBand="0" w:evenHBand="0" w:firstRowFirstColumn="0" w:firstRowLastColumn="0" w:lastRowFirstColumn="0" w:lastRowLastColumn="0"/>
+        </w:trPr>
         <w:tc>
           <w:tcPr>
+            <w:cnfStyle w:val="001000000000" w:firstRow="0" w:lastRow="0" w:firstColumn="1" w:lastColumn="0" w:oddVBand="0" w:evenVBand="0" w:oddHBand="0" w:evenHBand="0" w:firstRowFirstColumn="0" w:firstRowLastColumn="0" w:lastRowFirstColumn="0" w:lastRowLastColumn="0"/>
             <w:tcW w:w="2831" w:type="dxa"/>
+            <w:tcBorders>
+              <w:left w:val="single" w:sz="4" w:space="0" w:color="FFFFFF" w:themeColor="background1"/>
+              <w:right w:val="single" w:sz="4" w:space="0" w:color="FFFFFF" w:themeColor="background1"/>
+            </w:tcBorders>
           </w:tcPr>
           <w:p>
             <w:pPr>
@@ -1588,8 +1459,8 @@
               <w:jc w:val="center"/>
               <w:rPr>
                 <w:rFonts w:ascii="Arial" w:hAnsi="Arial" w:cs="Arial"/>
-                <w:b/>
-                <w:bCs/>
+                <w:b w:val="0"/>
+                <w:bCs w:val="0"/>
                 <w:sz w:val="24"/>
                 <w:szCs w:val="24"/>
               </w:rPr>
@@ -1597,8 +1468,6 @@
             <w:r>
               <w:rPr>
                 <w:rFonts w:ascii="Arial" w:hAnsi="Arial" w:cs="Arial"/>
-                <w:b/>
-                <w:bCs/>
                 <w:sz w:val="24"/>
                 <w:szCs w:val="24"/>
               </w:rPr>
@@ -1609,15 +1478,20 @@
         <w:tc>
           <w:tcPr>
             <w:tcW w:w="2831" w:type="dxa"/>
+            <w:tcBorders>
+              <w:left w:val="single" w:sz="4" w:space="0" w:color="FFFFFF" w:themeColor="background1"/>
+              <w:right w:val="single" w:sz="4" w:space="0" w:color="FFFFFF" w:themeColor="background1"/>
+            </w:tcBorders>
           </w:tcPr>
           <w:p>
             <w:pPr>
               <w:spacing w:line="360" w:lineRule="auto"/>
               <w:jc w:val="center"/>
-              <w:rPr>
-                <w:rFonts w:ascii="Arial" w:hAnsi="Arial" w:cs="Arial"/>
-                <w:b/>
-                <w:bCs/>
+              <w:cnfStyle w:val="100000000000" w:firstRow="1" w:lastRow="0" w:firstColumn="0" w:lastColumn="0" w:oddVBand="0" w:evenVBand="0" w:oddHBand="0" w:evenHBand="0" w:firstRowFirstColumn="0" w:firstRowLastColumn="0" w:lastRowFirstColumn="0" w:lastRowLastColumn="0"/>
+              <w:rPr>
+                <w:rFonts w:ascii="Arial" w:hAnsi="Arial" w:cs="Arial"/>
+                <w:b w:val="0"/>
+                <w:bCs w:val="0"/>
                 <w:sz w:val="24"/>
                 <w:szCs w:val="24"/>
               </w:rPr>
@@ -1625,8 +1499,6 @@
             <w:r>
               <w:rPr>
                 <w:rFonts w:ascii="Arial" w:hAnsi="Arial" w:cs="Arial"/>
-                <w:b/>
-                <w:bCs/>
                 <w:sz w:val="24"/>
                 <w:szCs w:val="24"/>
               </w:rPr>
@@ -1637,15 +1509,20 @@
         <w:tc>
           <w:tcPr>
             <w:tcW w:w="3405" w:type="dxa"/>
+            <w:tcBorders>
+              <w:left w:val="single" w:sz="4" w:space="0" w:color="FFFFFF" w:themeColor="background1"/>
+              <w:right w:val="single" w:sz="4" w:space="0" w:color="FFFFFF" w:themeColor="background1"/>
+            </w:tcBorders>
           </w:tcPr>
           <w:p>
             <w:pPr>
               <w:spacing w:line="360" w:lineRule="auto"/>
               <w:jc w:val="center"/>
-              <w:rPr>
-                <w:rFonts w:ascii="Arial" w:hAnsi="Arial" w:cs="Arial"/>
-                <w:b/>
-                <w:bCs/>
+              <w:cnfStyle w:val="100000000000" w:firstRow="1" w:lastRow="0" w:firstColumn="0" w:lastColumn="0" w:oddVBand="0" w:evenVBand="0" w:oddHBand="0" w:evenHBand="0" w:firstRowFirstColumn="0" w:firstRowLastColumn="0" w:lastRowFirstColumn="0" w:lastRowLastColumn="0"/>
+              <w:rPr>
+                <w:rFonts w:ascii="Arial" w:hAnsi="Arial" w:cs="Arial"/>
+                <w:b w:val="0"/>
+                <w:bCs w:val="0"/>
                 <w:sz w:val="24"/>
                 <w:szCs w:val="24"/>
               </w:rPr>
@@ -1653,12 +1530,99 @@
             <w:r>
               <w:rPr>
                 <w:rFonts w:ascii="Arial" w:hAnsi="Arial" w:cs="Arial"/>
-                <w:b/>
-                <w:bCs/>
                 <w:sz w:val="24"/>
                 <w:szCs w:val="24"/>
               </w:rPr>
               <w:t>Responsabilidades principales</w:t>
+            </w:r>
+          </w:p>
+        </w:tc>
+      </w:tr>
+      <w:tr>
+        <w:trPr>
+          <w:cnfStyle w:val="000000100000" w:firstRow="0" w:lastRow="0" w:firstColumn="0" w:lastColumn="0" w:oddVBand="0" w:evenVBand="0" w:oddHBand="1" w:evenHBand="0" w:firstRowFirstColumn="0" w:firstRowLastColumn="0" w:lastRowFirstColumn="0" w:lastRowLastColumn="0"/>
+        </w:trPr>
+        <w:tc>
+          <w:tcPr>
+            <w:cnfStyle w:val="001000000000" w:firstRow="0" w:lastRow="0" w:firstColumn="1" w:lastColumn="0" w:oddVBand="0" w:evenVBand="0" w:oddHBand="0" w:evenHBand="0" w:firstRowFirstColumn="0" w:firstRowLastColumn="0" w:lastRowFirstColumn="0" w:lastRowLastColumn="0"/>
+            <w:tcW w:w="2831" w:type="dxa"/>
+            <w:tcBorders>
+              <w:left w:val="single" w:sz="4" w:space="0" w:color="FFFFFF" w:themeColor="background1"/>
+              <w:right w:val="single" w:sz="4" w:space="0" w:color="FFFFFF" w:themeColor="background1"/>
+            </w:tcBorders>
+          </w:tcPr>
+          <w:p>
+            <w:pPr>
+              <w:spacing w:line="360" w:lineRule="auto"/>
+              <w:rPr>
+                <w:rFonts w:ascii="Arial" w:hAnsi="Arial" w:cs="Arial"/>
+                <w:sz w:val="24"/>
+                <w:szCs w:val="24"/>
+              </w:rPr>
+            </w:pPr>
+            <w:r>
+              <w:rPr>
+                <w:rFonts w:ascii="Arial" w:hAnsi="Arial" w:cs="Arial"/>
+                <w:sz w:val="24"/>
+                <w:szCs w:val="24"/>
+              </w:rPr>
+              <w:t>Ciudadano / Reportante</w:t>
+            </w:r>
+          </w:p>
+        </w:tc>
+        <w:tc>
+          <w:tcPr>
+            <w:tcW w:w="2831" w:type="dxa"/>
+            <w:tcBorders>
+              <w:left w:val="single" w:sz="4" w:space="0" w:color="FFFFFF" w:themeColor="background1"/>
+              <w:right w:val="single" w:sz="4" w:space="0" w:color="FFFFFF" w:themeColor="background1"/>
+            </w:tcBorders>
+          </w:tcPr>
+          <w:p>
+            <w:pPr>
+              <w:spacing w:line="360" w:lineRule="auto"/>
+              <w:cnfStyle w:val="000000100000" w:firstRow="0" w:lastRow="0" w:firstColumn="0" w:lastColumn="0" w:oddVBand="0" w:evenVBand="0" w:oddHBand="1" w:evenHBand="0" w:firstRowFirstColumn="0" w:firstRowLastColumn="0" w:lastRowFirstColumn="0" w:lastRowLastColumn="0"/>
+              <w:rPr>
+                <w:rFonts w:ascii="Arial" w:hAnsi="Arial" w:cs="Arial"/>
+                <w:sz w:val="24"/>
+                <w:szCs w:val="24"/>
+              </w:rPr>
+            </w:pPr>
+            <w:r>
+              <w:rPr>
+                <w:rFonts w:ascii="Arial" w:hAnsi="Arial" w:cs="Arial"/>
+                <w:sz w:val="24"/>
+                <w:szCs w:val="24"/>
+              </w:rPr>
+              <w:t>Persona externa que encuentra o conoce a un animal en riesgo.</w:t>
+            </w:r>
+          </w:p>
+        </w:tc>
+        <w:tc>
+          <w:tcPr>
+            <w:tcW w:w="3405" w:type="dxa"/>
+            <w:tcBorders>
+              <w:left w:val="single" w:sz="4" w:space="0" w:color="FFFFFF" w:themeColor="background1"/>
+              <w:right w:val="single" w:sz="4" w:space="0" w:color="FFFFFF" w:themeColor="background1"/>
+            </w:tcBorders>
+          </w:tcPr>
+          <w:p>
+            <w:pPr>
+              <w:spacing w:line="360" w:lineRule="auto"/>
+              <w:cnfStyle w:val="000000100000" w:firstRow="0" w:lastRow="0" w:firstColumn="0" w:lastColumn="0" w:oddVBand="0" w:evenVBand="0" w:oddHBand="1" w:evenHBand="0" w:firstRowFirstColumn="0" w:firstRowLastColumn="0" w:lastRowFirstColumn="0" w:lastRowLastColumn="0"/>
+              <w:rPr>
+                <w:rFonts w:ascii="Arial" w:hAnsi="Arial" w:cs="Arial"/>
+                <w:sz w:val="24"/>
+                <w:szCs w:val="24"/>
+              </w:rPr>
+            </w:pPr>
+            <w:r>
+              <w:rPr>
+                <w:rFonts w:ascii="Arial" w:hAnsi="Arial" w:cs="Arial"/>
+                <w:sz w:val="24"/>
+                <w:szCs w:val="24"/>
+              </w:rPr>
+              <w:t>Reportar el ingreso de un animal y consultar el estado de su reporte.</w:t>
             </w:r>
           </w:p>
         </w:tc>
@@ -1666,7 +1630,14 @@
       <w:tr>
         <w:tc>
           <w:tcPr>
+            <w:cnfStyle w:val="001000000000" w:firstRow="0" w:lastRow="0" w:firstColumn="1" w:lastColumn="0" w:oddVBand="0" w:evenVBand="0" w:oddHBand="0" w:evenHBand="0" w:firstRowFirstColumn="0" w:firstRowLastColumn="0" w:lastRowFirstColumn="0" w:lastRowLastColumn="0"/>
             <w:tcW w:w="2831" w:type="dxa"/>
+            <w:tcBorders>
+              <w:top w:val="single" w:sz="4" w:space="0" w:color="FFFFFF" w:themeColor="background1"/>
+              <w:left w:val="single" w:sz="4" w:space="0" w:color="FFFFFF" w:themeColor="background1"/>
+              <w:bottom w:val="single" w:sz="4" w:space="0" w:color="FFFFFF" w:themeColor="background1"/>
+              <w:right w:val="single" w:sz="4" w:space="0" w:color="FFFFFF" w:themeColor="background1"/>
+            </w:tcBorders>
           </w:tcPr>
           <w:p>
             <w:pPr>
@@ -1683,17 +1654,25 @@
                 <w:sz w:val="24"/>
                 <w:szCs w:val="24"/>
               </w:rPr>
-              <w:t>Ciudadano / Reportante</w:t>
+              <w:lastRenderedPageBreak/>
+              <w:t>Voluntario / Veterinario</w:t>
             </w:r>
           </w:p>
         </w:tc>
         <w:tc>
           <w:tcPr>
             <w:tcW w:w="2831" w:type="dxa"/>
+            <w:tcBorders>
+              <w:top w:val="single" w:sz="4" w:space="0" w:color="FFFFFF" w:themeColor="background1"/>
+              <w:left w:val="single" w:sz="4" w:space="0" w:color="FFFFFF" w:themeColor="background1"/>
+              <w:bottom w:val="single" w:sz="4" w:space="0" w:color="FFFFFF" w:themeColor="background1"/>
+              <w:right w:val="single" w:sz="4" w:space="0" w:color="FFFFFF" w:themeColor="background1"/>
+            </w:tcBorders>
           </w:tcPr>
           <w:p>
             <w:pPr>
               <w:spacing w:line="360" w:lineRule="auto"/>
+              <w:cnfStyle w:val="000000000000" w:firstRow="0" w:lastRow="0" w:firstColumn="0" w:lastColumn="0" w:oddVBand="0" w:evenVBand="0" w:oddHBand="0" w:evenHBand="0" w:firstRowFirstColumn="0" w:firstRowLastColumn="0" w:lastRowFirstColumn="0" w:lastRowLastColumn="0"/>
               <w:rPr>
                 <w:rFonts w:ascii="Arial" w:hAnsi="Arial" w:cs="Arial"/>
                 <w:sz w:val="24"/>
@@ -1706,25 +1685,32 @@
                 <w:sz w:val="24"/>
                 <w:szCs w:val="24"/>
               </w:rPr>
-              <w:t>Persona externa que encuentra o conoce a un animal en riesgo</w:t>
-            </w:r>
-            <w:r>
-              <w:rPr>
-                <w:rFonts w:ascii="Arial" w:hAnsi="Arial" w:cs="Arial"/>
-                <w:sz w:val="24"/>
-                <w:szCs w:val="24"/>
-              </w:rPr>
-              <w:t>.</w:t>
+              <w:t>Personal que atiende y cuida a los animales rescatados.</w:t>
+            </w:r>
+            <w:r>
+              <w:rPr>
+                <w:rFonts w:ascii="Arial" w:hAnsi="Arial" w:cs="Arial"/>
+                <w:sz w:val="24"/>
+                <w:szCs w:val="24"/>
+              </w:rPr>
+              <w:tab/>
             </w:r>
           </w:p>
         </w:tc>
         <w:tc>
           <w:tcPr>
             <w:tcW w:w="3405" w:type="dxa"/>
+            <w:tcBorders>
+              <w:top w:val="single" w:sz="4" w:space="0" w:color="FFFFFF" w:themeColor="background1"/>
+              <w:left w:val="single" w:sz="4" w:space="0" w:color="FFFFFF" w:themeColor="background1"/>
+              <w:bottom w:val="single" w:sz="4" w:space="0" w:color="FFFFFF" w:themeColor="background1"/>
+              <w:right w:val="single" w:sz="4" w:space="0" w:color="FFFFFF" w:themeColor="background1"/>
+            </w:tcBorders>
           </w:tcPr>
           <w:p>
             <w:pPr>
               <w:spacing w:line="360" w:lineRule="auto"/>
+              <w:cnfStyle w:val="000000000000" w:firstRow="0" w:lastRow="0" w:firstColumn="0" w:lastColumn="0" w:oddVBand="0" w:evenVBand="0" w:oddHBand="0" w:evenHBand="0" w:firstRowFirstColumn="0" w:firstRowLastColumn="0" w:lastRowFirstColumn="0" w:lastRowLastColumn="0"/>
               <w:rPr>
                 <w:rFonts w:ascii="Arial" w:hAnsi="Arial" w:cs="Arial"/>
                 <w:sz w:val="24"/>
@@ -1737,15 +1723,24 @@
                 <w:sz w:val="24"/>
                 <w:szCs w:val="24"/>
               </w:rPr>
-              <w:t>Reportar el ingreso de un animal y consultar el estado de su reporte.</w:t>
+              <w:t>Recibir notificaciones de nuevos rescates, aceptar casos, actualizar el estado y registrar el historial clínico.</w:t>
             </w:r>
           </w:p>
         </w:tc>
       </w:tr>
       <w:tr>
+        <w:trPr>
+          <w:cnfStyle w:val="000000100000" w:firstRow="0" w:lastRow="0" w:firstColumn="0" w:lastColumn="0" w:oddVBand="0" w:evenVBand="0" w:oddHBand="1" w:evenHBand="0" w:firstRowFirstColumn="0" w:firstRowLastColumn="0" w:lastRowFirstColumn="0" w:lastRowLastColumn="0"/>
+        </w:trPr>
         <w:tc>
           <w:tcPr>
+            <w:cnfStyle w:val="001000000000" w:firstRow="0" w:lastRow="0" w:firstColumn="1" w:lastColumn="0" w:oddVBand="0" w:evenVBand="0" w:oddHBand="0" w:evenHBand="0" w:firstRowFirstColumn="0" w:firstRowLastColumn="0" w:lastRowFirstColumn="0" w:lastRowLastColumn="0"/>
             <w:tcW w:w="2831" w:type="dxa"/>
+            <w:tcBorders>
+              <w:top w:val="single" w:sz="4" w:space="0" w:color="FFFFFF" w:themeColor="background1"/>
+              <w:left w:val="single" w:sz="4" w:space="0" w:color="FFFFFF" w:themeColor="background1"/>
+              <w:right w:val="single" w:sz="4" w:space="0" w:color="FFFFFF" w:themeColor="background1"/>
+            </w:tcBorders>
           </w:tcPr>
           <w:p>
             <w:pPr>
@@ -1762,18 +1757,23 @@
                 <w:sz w:val="24"/>
                 <w:szCs w:val="24"/>
               </w:rPr>
-              <w:lastRenderedPageBreak/>
-              <w:t>Voluntario / Veterinario</w:t>
+              <w:t>Administrador del refugio</w:t>
             </w:r>
           </w:p>
         </w:tc>
         <w:tc>
           <w:tcPr>
             <w:tcW w:w="2831" w:type="dxa"/>
+            <w:tcBorders>
+              <w:top w:val="single" w:sz="4" w:space="0" w:color="FFFFFF" w:themeColor="background1"/>
+              <w:left w:val="single" w:sz="4" w:space="0" w:color="FFFFFF" w:themeColor="background1"/>
+              <w:right w:val="single" w:sz="4" w:space="0" w:color="FFFFFF" w:themeColor="background1"/>
+            </w:tcBorders>
           </w:tcPr>
           <w:p>
             <w:pPr>
               <w:spacing w:line="360" w:lineRule="auto"/>
+              <w:cnfStyle w:val="000000100000" w:firstRow="0" w:lastRow="0" w:firstColumn="0" w:lastColumn="0" w:oddVBand="0" w:evenVBand="0" w:oddHBand="1" w:evenHBand="0" w:firstRowFirstColumn="0" w:firstRowLastColumn="0" w:lastRowFirstColumn="0" w:lastRowLastColumn="0"/>
               <w:rPr>
                 <w:rFonts w:ascii="Arial" w:hAnsi="Arial" w:cs="Arial"/>
                 <w:sz w:val="24"/>
@@ -1786,96 +1786,22 @@
                 <w:sz w:val="24"/>
                 <w:szCs w:val="24"/>
               </w:rPr>
-              <w:t>Personal que atiende y cuida a los animales rescatados.</w:t>
-            </w:r>
-            <w:r>
-              <w:rPr>
-                <w:rFonts w:ascii="Arial" w:hAnsi="Arial" w:cs="Arial"/>
-                <w:sz w:val="24"/>
-                <w:szCs w:val="24"/>
-              </w:rPr>
-              <w:tab/>
+              <w:t>Responsable de la operación del refugio.</w:t>
             </w:r>
           </w:p>
         </w:tc>
         <w:tc>
           <w:tcPr>
             <w:tcW w:w="3405" w:type="dxa"/>
+            <w:tcBorders>
+              <w:top w:val="single" w:sz="4" w:space="0" w:color="FFFFFF" w:themeColor="background1"/>
+              <w:left w:val="single" w:sz="4" w:space="0" w:color="FFFFFF" w:themeColor="background1"/>
+            </w:tcBorders>
           </w:tcPr>
           <w:p>
             <w:pPr>
               <w:spacing w:line="360" w:lineRule="auto"/>
-              <w:rPr>
-                <w:rFonts w:ascii="Arial" w:hAnsi="Arial" w:cs="Arial"/>
-                <w:sz w:val="24"/>
-                <w:szCs w:val="24"/>
-              </w:rPr>
-            </w:pPr>
-            <w:r>
-              <w:rPr>
-                <w:rFonts w:ascii="Arial" w:hAnsi="Arial" w:cs="Arial"/>
-                <w:sz w:val="24"/>
-                <w:szCs w:val="24"/>
-              </w:rPr>
-              <w:t>Recibir notificaciones de nuevos rescates, aceptar casos, actualizar el estado y registrar el historial clínico.</w:t>
-            </w:r>
-          </w:p>
-        </w:tc>
-      </w:tr>
-      <w:tr>
-        <w:tc>
-          <w:tcPr>
-            <w:tcW w:w="2831" w:type="dxa"/>
-          </w:tcPr>
-          <w:p>
-            <w:pPr>
-              <w:spacing w:line="360" w:lineRule="auto"/>
-              <w:rPr>
-                <w:rFonts w:ascii="Arial" w:hAnsi="Arial" w:cs="Arial"/>
-                <w:sz w:val="24"/>
-                <w:szCs w:val="24"/>
-              </w:rPr>
-            </w:pPr>
-            <w:r>
-              <w:rPr>
-                <w:rFonts w:ascii="Arial" w:hAnsi="Arial" w:cs="Arial"/>
-                <w:sz w:val="24"/>
-                <w:szCs w:val="24"/>
-              </w:rPr>
-              <w:t>Administrador del refugio</w:t>
-            </w:r>
-          </w:p>
-        </w:tc>
-        <w:tc>
-          <w:tcPr>
-            <w:tcW w:w="2831" w:type="dxa"/>
-          </w:tcPr>
-          <w:p>
-            <w:pPr>
-              <w:spacing w:line="360" w:lineRule="auto"/>
-              <w:rPr>
-                <w:rFonts w:ascii="Arial" w:hAnsi="Arial" w:cs="Arial"/>
-                <w:sz w:val="24"/>
-                <w:szCs w:val="24"/>
-              </w:rPr>
-            </w:pPr>
-            <w:r>
-              <w:rPr>
-                <w:rFonts w:ascii="Arial" w:hAnsi="Arial" w:cs="Arial"/>
-                <w:sz w:val="24"/>
-                <w:szCs w:val="24"/>
-              </w:rPr>
-              <w:t>Responsable de la operación del refugio.</w:t>
-            </w:r>
-          </w:p>
-        </w:tc>
-        <w:tc>
-          <w:tcPr>
-            <w:tcW w:w="3405" w:type="dxa"/>
-          </w:tcPr>
-          <w:p>
-            <w:pPr>
-              <w:spacing w:line="360" w:lineRule="auto"/>
+              <w:cnfStyle w:val="000000100000" w:firstRow="0" w:lastRow="0" w:firstColumn="0" w:lastColumn="0" w:oddVBand="0" w:evenVBand="0" w:oddHBand="1" w:evenHBand="0" w:firstRowFirstColumn="0" w:firstRowLastColumn="0" w:lastRowFirstColumn="0" w:lastRowLastColumn="0"/>
               <w:rPr>
                 <w:rFonts w:ascii="Arial" w:hAnsi="Arial" w:cs="Arial"/>
                 <w:sz w:val="24"/>
@@ -1951,6 +1877,10 @@
         <w:tc>
           <w:tcPr>
             <w:tcW w:w="1129" w:type="dxa"/>
+            <w:tcBorders>
+              <w:left w:val="single" w:sz="4" w:space="0" w:color="FFFFFF" w:themeColor="background1"/>
+              <w:right w:val="single" w:sz="4" w:space="0" w:color="FFFFFF" w:themeColor="background1"/>
+            </w:tcBorders>
           </w:tcPr>
           <w:p>
             <w:pPr>
@@ -1979,6 +1909,10 @@
         <w:tc>
           <w:tcPr>
             <w:tcW w:w="3300" w:type="dxa"/>
+            <w:tcBorders>
+              <w:left w:val="single" w:sz="4" w:space="0" w:color="FFFFFF" w:themeColor="background1"/>
+              <w:right w:val="single" w:sz="4" w:space="0" w:color="FFFFFF" w:themeColor="background1"/>
+            </w:tcBorders>
           </w:tcPr>
           <w:p>
             <w:pPr>
@@ -2009,6 +1943,10 @@
         <w:tc>
           <w:tcPr>
             <w:tcW w:w="4597" w:type="dxa"/>
+            <w:tcBorders>
+              <w:left w:val="single" w:sz="4" w:space="0" w:color="FFFFFF" w:themeColor="background1"/>
+              <w:right w:val="single" w:sz="4" w:space="0" w:color="FFFFFF" w:themeColor="background1"/>
+            </w:tcBorders>
           </w:tcPr>
           <w:p>
             <w:pPr>
@@ -2041,6 +1979,11 @@
         <w:tc>
           <w:tcPr>
             <w:tcW w:w="1129" w:type="dxa"/>
+            <w:tcBorders>
+              <w:left w:val="single" w:sz="4" w:space="0" w:color="FFFFFF" w:themeColor="background1"/>
+              <w:bottom w:val="single" w:sz="4" w:space="0" w:color="FFFFFF" w:themeColor="background1"/>
+              <w:right w:val="single" w:sz="4" w:space="0" w:color="FFFFFF" w:themeColor="background1"/>
+            </w:tcBorders>
           </w:tcPr>
           <w:p>
             <w:pPr>
@@ -2065,6 +2008,11 @@
         <w:tc>
           <w:tcPr>
             <w:tcW w:w="3300" w:type="dxa"/>
+            <w:tcBorders>
+              <w:left w:val="single" w:sz="4" w:space="0" w:color="FFFFFF" w:themeColor="background1"/>
+              <w:bottom w:val="single" w:sz="4" w:space="0" w:color="FFFFFF" w:themeColor="background1"/>
+              <w:right w:val="single" w:sz="4" w:space="0" w:color="FFFFFF" w:themeColor="background1"/>
+            </w:tcBorders>
           </w:tcPr>
           <w:p>
             <w:pPr>
@@ -2089,6 +2037,11 @@
         <w:tc>
           <w:tcPr>
             <w:tcW w:w="4597" w:type="dxa"/>
+            <w:tcBorders>
+              <w:left w:val="single" w:sz="4" w:space="0" w:color="FFFFFF" w:themeColor="background1"/>
+              <w:bottom w:val="single" w:sz="4" w:space="0" w:color="FFFFFF" w:themeColor="background1"/>
+              <w:right w:val="single" w:sz="4" w:space="0" w:color="FFFFFF" w:themeColor="background1"/>
+            </w:tcBorders>
           </w:tcPr>
           <w:p>
             <w:pPr>
@@ -2115,6 +2068,12 @@
         <w:tc>
           <w:tcPr>
             <w:tcW w:w="1129" w:type="dxa"/>
+            <w:tcBorders>
+              <w:top w:val="single" w:sz="4" w:space="0" w:color="FFFFFF" w:themeColor="background1"/>
+              <w:left w:val="single" w:sz="4" w:space="0" w:color="FFFFFF" w:themeColor="background1"/>
+              <w:bottom w:val="single" w:sz="4" w:space="0" w:color="FFFFFF" w:themeColor="background1"/>
+              <w:right w:val="single" w:sz="4" w:space="0" w:color="FFFFFF" w:themeColor="background1"/>
+            </w:tcBorders>
           </w:tcPr>
           <w:p>
             <w:pPr>
@@ -2139,6 +2098,12 @@
         <w:tc>
           <w:tcPr>
             <w:tcW w:w="3300" w:type="dxa"/>
+            <w:tcBorders>
+              <w:top w:val="single" w:sz="4" w:space="0" w:color="FFFFFF" w:themeColor="background1"/>
+              <w:left w:val="single" w:sz="4" w:space="0" w:color="FFFFFF" w:themeColor="background1"/>
+              <w:bottom w:val="single" w:sz="4" w:space="0" w:color="FFFFFF" w:themeColor="background1"/>
+              <w:right w:val="single" w:sz="4" w:space="0" w:color="FFFFFF" w:themeColor="background1"/>
+            </w:tcBorders>
           </w:tcPr>
           <w:p>
             <w:pPr>
@@ -2163,6 +2128,12 @@
         <w:tc>
           <w:tcPr>
             <w:tcW w:w="4597" w:type="dxa"/>
+            <w:tcBorders>
+              <w:top w:val="single" w:sz="4" w:space="0" w:color="FFFFFF" w:themeColor="background1"/>
+              <w:left w:val="single" w:sz="4" w:space="0" w:color="FFFFFF" w:themeColor="background1"/>
+              <w:bottom w:val="single" w:sz="4" w:space="0" w:color="FFFFFF" w:themeColor="background1"/>
+              <w:right w:val="single" w:sz="4" w:space="0" w:color="FFFFFF" w:themeColor="background1"/>
+            </w:tcBorders>
           </w:tcPr>
           <w:p>
             <w:pPr>
@@ -2189,6 +2160,12 @@
         <w:tc>
           <w:tcPr>
             <w:tcW w:w="1129" w:type="dxa"/>
+            <w:tcBorders>
+              <w:top w:val="single" w:sz="4" w:space="0" w:color="FFFFFF" w:themeColor="background1"/>
+              <w:left w:val="single" w:sz="4" w:space="0" w:color="FFFFFF" w:themeColor="background1"/>
+              <w:bottom w:val="single" w:sz="4" w:space="0" w:color="FFFFFF" w:themeColor="background1"/>
+              <w:right w:val="single" w:sz="4" w:space="0" w:color="FFFFFF" w:themeColor="background1"/>
+            </w:tcBorders>
           </w:tcPr>
           <w:p>
             <w:pPr>
@@ -2213,6 +2190,12 @@
         <w:tc>
           <w:tcPr>
             <w:tcW w:w="3300" w:type="dxa"/>
+            <w:tcBorders>
+              <w:top w:val="single" w:sz="4" w:space="0" w:color="FFFFFF" w:themeColor="background1"/>
+              <w:left w:val="single" w:sz="4" w:space="0" w:color="FFFFFF" w:themeColor="background1"/>
+              <w:bottom w:val="single" w:sz="4" w:space="0" w:color="FFFFFF" w:themeColor="background1"/>
+              <w:right w:val="single" w:sz="4" w:space="0" w:color="FFFFFF" w:themeColor="background1"/>
+            </w:tcBorders>
           </w:tcPr>
           <w:p>
             <w:pPr>
@@ -2237,6 +2220,12 @@
         <w:tc>
           <w:tcPr>
             <w:tcW w:w="4597" w:type="dxa"/>
+            <w:tcBorders>
+              <w:top w:val="single" w:sz="4" w:space="0" w:color="FFFFFF" w:themeColor="background1"/>
+              <w:left w:val="single" w:sz="4" w:space="0" w:color="FFFFFF" w:themeColor="background1"/>
+              <w:bottom w:val="single" w:sz="4" w:space="0" w:color="FFFFFF" w:themeColor="background1"/>
+              <w:right w:val="single" w:sz="4" w:space="0" w:color="FFFFFF" w:themeColor="background1"/>
+            </w:tcBorders>
           </w:tcPr>
           <w:p>
             <w:pPr>
@@ -2263,6 +2252,12 @@
         <w:tc>
           <w:tcPr>
             <w:tcW w:w="1129" w:type="dxa"/>
+            <w:tcBorders>
+              <w:top w:val="single" w:sz="4" w:space="0" w:color="FFFFFF" w:themeColor="background1"/>
+              <w:left w:val="single" w:sz="4" w:space="0" w:color="FFFFFF" w:themeColor="background1"/>
+              <w:bottom w:val="single" w:sz="4" w:space="0" w:color="FFFFFF" w:themeColor="background1"/>
+              <w:right w:val="single" w:sz="4" w:space="0" w:color="FFFFFF" w:themeColor="background1"/>
+            </w:tcBorders>
           </w:tcPr>
           <w:p>
             <w:pPr>
@@ -2287,6 +2282,12 @@
         <w:tc>
           <w:tcPr>
             <w:tcW w:w="3300" w:type="dxa"/>
+            <w:tcBorders>
+              <w:top w:val="single" w:sz="4" w:space="0" w:color="FFFFFF" w:themeColor="background1"/>
+              <w:left w:val="single" w:sz="4" w:space="0" w:color="FFFFFF" w:themeColor="background1"/>
+              <w:bottom w:val="single" w:sz="4" w:space="0" w:color="FFFFFF" w:themeColor="background1"/>
+              <w:right w:val="single" w:sz="4" w:space="0" w:color="FFFFFF" w:themeColor="background1"/>
+            </w:tcBorders>
           </w:tcPr>
           <w:p>
             <w:pPr>
@@ -2311,6 +2312,12 @@
         <w:tc>
           <w:tcPr>
             <w:tcW w:w="4597" w:type="dxa"/>
+            <w:tcBorders>
+              <w:top w:val="single" w:sz="4" w:space="0" w:color="FFFFFF" w:themeColor="background1"/>
+              <w:left w:val="single" w:sz="4" w:space="0" w:color="FFFFFF" w:themeColor="background1"/>
+              <w:bottom w:val="single" w:sz="4" w:space="0" w:color="FFFFFF" w:themeColor="background1"/>
+              <w:right w:val="single" w:sz="4" w:space="0" w:color="FFFFFF" w:themeColor="background1"/>
+            </w:tcBorders>
           </w:tcPr>
           <w:p>
             <w:pPr>
@@ -2337,6 +2344,12 @@
         <w:tc>
           <w:tcPr>
             <w:tcW w:w="1129" w:type="dxa"/>
+            <w:tcBorders>
+              <w:top w:val="single" w:sz="4" w:space="0" w:color="FFFFFF" w:themeColor="background1"/>
+              <w:left w:val="single" w:sz="4" w:space="0" w:color="FFFFFF" w:themeColor="background1"/>
+              <w:bottom w:val="single" w:sz="4" w:space="0" w:color="FFFFFF" w:themeColor="background1"/>
+              <w:right w:val="single" w:sz="4" w:space="0" w:color="FFFFFF" w:themeColor="background1"/>
+            </w:tcBorders>
           </w:tcPr>
           <w:p>
             <w:pPr>
@@ -2361,6 +2374,12 @@
         <w:tc>
           <w:tcPr>
             <w:tcW w:w="3300" w:type="dxa"/>
+            <w:tcBorders>
+              <w:top w:val="single" w:sz="4" w:space="0" w:color="FFFFFF" w:themeColor="background1"/>
+              <w:left w:val="single" w:sz="4" w:space="0" w:color="FFFFFF" w:themeColor="background1"/>
+              <w:bottom w:val="single" w:sz="4" w:space="0" w:color="FFFFFF" w:themeColor="background1"/>
+              <w:right w:val="single" w:sz="4" w:space="0" w:color="FFFFFF" w:themeColor="background1"/>
+            </w:tcBorders>
           </w:tcPr>
           <w:p>
             <w:pPr>
@@ -2385,6 +2404,12 @@
         <w:tc>
           <w:tcPr>
             <w:tcW w:w="4597" w:type="dxa"/>
+            <w:tcBorders>
+              <w:top w:val="single" w:sz="4" w:space="0" w:color="FFFFFF" w:themeColor="background1"/>
+              <w:left w:val="single" w:sz="4" w:space="0" w:color="FFFFFF" w:themeColor="background1"/>
+              <w:bottom w:val="single" w:sz="4" w:space="0" w:color="FFFFFF" w:themeColor="background1"/>
+              <w:right w:val="single" w:sz="4" w:space="0" w:color="FFFFFF" w:themeColor="background1"/>
+            </w:tcBorders>
           </w:tcPr>
           <w:p>
             <w:pPr>
@@ -2402,7 +2427,7 @@
                 <w:sz w:val="24"/>
                 <w:szCs w:val="24"/>
               </w:rPr>
-              <w:t>Al registrarse un caso, los voluntarios y veterinarios suscritos deben recibir una notificación automática.</w:t>
+              <w:t>Al registrarse un caso y al asignarse un responsable, los voluntarios y veterinarios suscritos deben recibir una notificación automática.</w:t>
             </w:r>
           </w:p>
         </w:tc>
@@ -2411,6 +2436,11 @@
         <w:tc>
           <w:tcPr>
             <w:tcW w:w="1129" w:type="dxa"/>
+            <w:tcBorders>
+              <w:top w:val="single" w:sz="4" w:space="0" w:color="FFFFFF" w:themeColor="background1"/>
+              <w:left w:val="single" w:sz="4" w:space="0" w:color="FFFFFF" w:themeColor="background1"/>
+              <w:right w:val="single" w:sz="4" w:space="0" w:color="FFFFFF" w:themeColor="background1"/>
+            </w:tcBorders>
           </w:tcPr>
           <w:p>
             <w:pPr>
@@ -2435,6 +2465,11 @@
         <w:tc>
           <w:tcPr>
             <w:tcW w:w="3300" w:type="dxa"/>
+            <w:tcBorders>
+              <w:top w:val="single" w:sz="4" w:space="0" w:color="FFFFFF" w:themeColor="background1"/>
+              <w:left w:val="single" w:sz="4" w:space="0" w:color="FFFFFF" w:themeColor="background1"/>
+              <w:right w:val="single" w:sz="4" w:space="0" w:color="FFFFFF" w:themeColor="background1"/>
+            </w:tcBorders>
           </w:tcPr>
           <w:p>
             <w:pPr>
@@ -2459,6 +2494,11 @@
         <w:tc>
           <w:tcPr>
             <w:tcW w:w="4597" w:type="dxa"/>
+            <w:tcBorders>
+              <w:top w:val="single" w:sz="4" w:space="0" w:color="FFFFFF" w:themeColor="background1"/>
+              <w:left w:val="single" w:sz="4" w:space="0" w:color="FFFFFF" w:themeColor="background1"/>
+              <w:right w:val="single" w:sz="4" w:space="0" w:color="FFFFFF" w:themeColor="background1"/>
+            </w:tcBorders>
           </w:tcPr>
           <w:p>
             <w:pPr>
@@ -2485,6 +2525,12 @@
         <w:tc>
           <w:tcPr>
             <w:tcW w:w="1129" w:type="dxa"/>
+            <w:tcBorders>
+              <w:top w:val="single" w:sz="4" w:space="0" w:color="FFFFFF" w:themeColor="background1"/>
+              <w:left w:val="single" w:sz="4" w:space="0" w:color="FFFFFF" w:themeColor="background1"/>
+              <w:bottom w:val="single" w:sz="4" w:space="0" w:color="FFFFFF" w:themeColor="background1"/>
+              <w:right w:val="single" w:sz="4" w:space="0" w:color="FFFFFF" w:themeColor="background1"/>
+            </w:tcBorders>
           </w:tcPr>
           <w:p>
             <w:pPr>
@@ -2502,6 +2548,7 @@
                 <w:sz w:val="24"/>
                 <w:szCs w:val="24"/>
               </w:rPr>
+              <w:lastRenderedPageBreak/>
               <w:t>RF-07</w:t>
             </w:r>
           </w:p>
@@ -2509,6 +2556,12 @@
         <w:tc>
           <w:tcPr>
             <w:tcW w:w="3300" w:type="dxa"/>
+            <w:tcBorders>
+              <w:top w:val="single" w:sz="4" w:space="0" w:color="FFFFFF" w:themeColor="background1"/>
+              <w:left w:val="single" w:sz="4" w:space="0" w:color="FFFFFF" w:themeColor="background1"/>
+              <w:bottom w:val="single" w:sz="4" w:space="0" w:color="FFFFFF" w:themeColor="background1"/>
+              <w:right w:val="single" w:sz="4" w:space="0" w:color="FFFFFF" w:themeColor="background1"/>
+            </w:tcBorders>
           </w:tcPr>
           <w:p>
             <w:pPr>
@@ -2533,6 +2586,12 @@
         <w:tc>
           <w:tcPr>
             <w:tcW w:w="4597" w:type="dxa"/>
+            <w:tcBorders>
+              <w:top w:val="single" w:sz="4" w:space="0" w:color="FFFFFF" w:themeColor="background1"/>
+              <w:left w:val="single" w:sz="4" w:space="0" w:color="FFFFFF" w:themeColor="background1"/>
+              <w:bottom w:val="single" w:sz="4" w:space="0" w:color="FFFFFF" w:themeColor="background1"/>
+              <w:right w:val="single" w:sz="4" w:space="0" w:color="FFFFFF" w:themeColor="background1"/>
+            </w:tcBorders>
           </w:tcPr>
           <w:p>
             <w:pPr>
@@ -2559,6 +2618,12 @@
         <w:tc>
           <w:tcPr>
             <w:tcW w:w="1129" w:type="dxa"/>
+            <w:tcBorders>
+              <w:top w:val="single" w:sz="4" w:space="0" w:color="FFFFFF" w:themeColor="background1"/>
+              <w:left w:val="single" w:sz="4" w:space="0" w:color="FFFFFF" w:themeColor="background1"/>
+              <w:bottom w:val="single" w:sz="4" w:space="0" w:color="FFFFFF" w:themeColor="background1"/>
+              <w:right w:val="single" w:sz="4" w:space="0" w:color="FFFFFF" w:themeColor="background1"/>
+            </w:tcBorders>
           </w:tcPr>
           <w:p>
             <w:pPr>
@@ -2576,7 +2641,6 @@
                 <w:sz w:val="24"/>
                 <w:szCs w:val="24"/>
               </w:rPr>
-              <w:lastRenderedPageBreak/>
               <w:t>RF-08</w:t>
             </w:r>
           </w:p>
@@ -2584,6 +2648,12 @@
         <w:tc>
           <w:tcPr>
             <w:tcW w:w="3300" w:type="dxa"/>
+            <w:tcBorders>
+              <w:top w:val="single" w:sz="4" w:space="0" w:color="FFFFFF" w:themeColor="background1"/>
+              <w:left w:val="single" w:sz="4" w:space="0" w:color="FFFFFF" w:themeColor="background1"/>
+              <w:bottom w:val="single" w:sz="4" w:space="0" w:color="FFFFFF" w:themeColor="background1"/>
+              <w:right w:val="single" w:sz="4" w:space="0" w:color="FFFFFF" w:themeColor="background1"/>
+            </w:tcBorders>
           </w:tcPr>
           <w:p>
             <w:pPr>
@@ -2608,6 +2678,12 @@
         <w:tc>
           <w:tcPr>
             <w:tcW w:w="4597" w:type="dxa"/>
+            <w:tcBorders>
+              <w:top w:val="single" w:sz="4" w:space="0" w:color="FFFFFF" w:themeColor="background1"/>
+              <w:left w:val="single" w:sz="4" w:space="0" w:color="FFFFFF" w:themeColor="background1"/>
+              <w:bottom w:val="single" w:sz="4" w:space="0" w:color="FFFFFF" w:themeColor="background1"/>
+              <w:right w:val="single" w:sz="4" w:space="0" w:color="FFFFFF" w:themeColor="background1"/>
+            </w:tcBorders>
           </w:tcPr>
           <w:p>
             <w:pPr>
@@ -2634,6 +2710,11 @@
         <w:tc>
           <w:tcPr>
             <w:tcW w:w="1129" w:type="dxa"/>
+            <w:tcBorders>
+              <w:top w:val="single" w:sz="4" w:space="0" w:color="FFFFFF" w:themeColor="background1"/>
+              <w:left w:val="single" w:sz="4" w:space="0" w:color="FFFFFF" w:themeColor="background1"/>
+              <w:right w:val="single" w:sz="4" w:space="0" w:color="FFFFFF" w:themeColor="background1"/>
+            </w:tcBorders>
           </w:tcPr>
           <w:p>
             <w:pPr>
@@ -2658,6 +2739,11 @@
         <w:tc>
           <w:tcPr>
             <w:tcW w:w="3300" w:type="dxa"/>
+            <w:tcBorders>
+              <w:top w:val="single" w:sz="4" w:space="0" w:color="FFFFFF" w:themeColor="background1"/>
+              <w:left w:val="single" w:sz="4" w:space="0" w:color="FFFFFF" w:themeColor="background1"/>
+              <w:right w:val="single" w:sz="4" w:space="0" w:color="FFFFFF" w:themeColor="background1"/>
+            </w:tcBorders>
           </w:tcPr>
           <w:p>
             <w:pPr>
@@ -2682,6 +2768,11 @@
         <w:tc>
           <w:tcPr>
             <w:tcW w:w="4597" w:type="dxa"/>
+            <w:tcBorders>
+              <w:top w:val="single" w:sz="4" w:space="0" w:color="FFFFFF" w:themeColor="background1"/>
+              <w:left w:val="single" w:sz="4" w:space="0" w:color="FFFFFF" w:themeColor="background1"/>
+              <w:right w:val="single" w:sz="4" w:space="0" w:color="FFFFFF" w:themeColor="background1"/>
+            </w:tcBorders>
           </w:tcPr>
           <w:p>
             <w:pPr>
@@ -2762,6 +2853,10 @@
         <w:tc>
           <w:tcPr>
             <w:tcW w:w="1129" w:type="dxa"/>
+            <w:tcBorders>
+              <w:left w:val="single" w:sz="4" w:space="0" w:color="FFFFFF" w:themeColor="background1"/>
+              <w:right w:val="single" w:sz="4" w:space="0" w:color="FFFFFF" w:themeColor="background1"/>
+            </w:tcBorders>
           </w:tcPr>
           <w:p>
             <w:pPr>
@@ -2789,6 +2884,10 @@
         <w:tc>
           <w:tcPr>
             <w:tcW w:w="3295" w:type="dxa"/>
+            <w:tcBorders>
+              <w:left w:val="single" w:sz="4" w:space="0" w:color="FFFFFF" w:themeColor="background1"/>
+              <w:right w:val="single" w:sz="4" w:space="0" w:color="FFFFFF" w:themeColor="background1"/>
+            </w:tcBorders>
           </w:tcPr>
           <w:p>
             <w:pPr>
@@ -2816,6 +2915,10 @@
         <w:tc>
           <w:tcPr>
             <w:tcW w:w="4592" w:type="dxa"/>
+            <w:tcBorders>
+              <w:left w:val="single" w:sz="4" w:space="0" w:color="FFFFFF" w:themeColor="background1"/>
+              <w:right w:val="single" w:sz="4" w:space="0" w:color="FFFFFF" w:themeColor="background1"/>
+            </w:tcBorders>
           </w:tcPr>
           <w:p>
             <w:pPr>
@@ -2845,6 +2948,11 @@
         <w:tc>
           <w:tcPr>
             <w:tcW w:w="1129" w:type="dxa"/>
+            <w:tcBorders>
+              <w:left w:val="single" w:sz="4" w:space="0" w:color="FFFFFF" w:themeColor="background1"/>
+              <w:bottom w:val="single" w:sz="4" w:space="0" w:color="FFFFFF" w:themeColor="background1"/>
+              <w:right w:val="single" w:sz="4" w:space="0" w:color="FFFFFF" w:themeColor="background1"/>
+            </w:tcBorders>
           </w:tcPr>
           <w:p>
             <w:pPr>
@@ -2878,6 +2986,11 @@
         <w:tc>
           <w:tcPr>
             <w:tcW w:w="3295" w:type="dxa"/>
+            <w:tcBorders>
+              <w:left w:val="single" w:sz="4" w:space="0" w:color="FFFFFF" w:themeColor="background1"/>
+              <w:bottom w:val="single" w:sz="4" w:space="0" w:color="FFFFFF" w:themeColor="background1"/>
+              <w:right w:val="single" w:sz="4" w:space="0" w:color="FFFFFF" w:themeColor="background1"/>
+            </w:tcBorders>
           </w:tcPr>
           <w:p>
             <w:pPr>
@@ -2903,6 +3016,11 @@
         <w:tc>
           <w:tcPr>
             <w:tcW w:w="4592" w:type="dxa"/>
+            <w:tcBorders>
+              <w:left w:val="single" w:sz="4" w:space="0" w:color="FFFFFF" w:themeColor="background1"/>
+              <w:bottom w:val="single" w:sz="4" w:space="0" w:color="FFFFFF" w:themeColor="background1"/>
+              <w:right w:val="single" w:sz="4" w:space="0" w:color="FFFFFF" w:themeColor="background1"/>
+            </w:tcBorders>
           </w:tcPr>
           <w:p>
             <w:pPr>
@@ -2921,23 +3039,7 @@
                 <w:sz w:val="24"/>
                 <w:szCs w:val="24"/>
               </w:rPr>
-              <w:t xml:space="preserve">Agregar una </w:t>
-            </w:r>
-            <w:r>
-              <w:rPr>
-                <w:rFonts w:ascii="Arial" w:hAnsi="Arial" w:cs="Arial"/>
-                <w:sz w:val="24"/>
-                <w:szCs w:val="24"/>
-              </w:rPr>
-              <w:t>nueva especie o canal</w:t>
-            </w:r>
-            <w:r>
-              <w:rPr>
-                <w:rFonts w:ascii="Arial" w:hAnsi="Arial" w:cs="Arial"/>
-                <w:sz w:val="24"/>
-                <w:szCs w:val="24"/>
-              </w:rPr>
-              <w:t xml:space="preserve"> de notificación no debe obligar a modificar el código existente (principio abierto/cerrado)</w:t>
+              <w:t>Agregar una nueva especie o canal de notificación no debe obligar a modificar el código existente (principio abierto/cerrado)</w:t>
             </w:r>
           </w:p>
         </w:tc>
@@ -2946,6 +3048,12 @@
         <w:tc>
           <w:tcPr>
             <w:tcW w:w="1129" w:type="dxa"/>
+            <w:tcBorders>
+              <w:top w:val="single" w:sz="4" w:space="0" w:color="FFFFFF" w:themeColor="background1"/>
+              <w:left w:val="single" w:sz="4" w:space="0" w:color="FFFFFF" w:themeColor="background1"/>
+              <w:bottom w:val="single" w:sz="4" w:space="0" w:color="FFFFFF" w:themeColor="background1"/>
+              <w:right w:val="single" w:sz="4" w:space="0" w:color="FFFFFF" w:themeColor="background1"/>
+            </w:tcBorders>
           </w:tcPr>
           <w:p>
             <w:pPr>
@@ -2971,6 +3079,12 @@
         <w:tc>
           <w:tcPr>
             <w:tcW w:w="3295" w:type="dxa"/>
+            <w:tcBorders>
+              <w:top w:val="single" w:sz="4" w:space="0" w:color="FFFFFF" w:themeColor="background1"/>
+              <w:left w:val="single" w:sz="4" w:space="0" w:color="FFFFFF" w:themeColor="background1"/>
+              <w:bottom w:val="single" w:sz="4" w:space="0" w:color="FFFFFF" w:themeColor="background1"/>
+              <w:right w:val="single" w:sz="4" w:space="0" w:color="FFFFFF" w:themeColor="background1"/>
+            </w:tcBorders>
           </w:tcPr>
           <w:p>
             <w:pPr>
@@ -2996,6 +3110,12 @@
         <w:tc>
           <w:tcPr>
             <w:tcW w:w="4592" w:type="dxa"/>
+            <w:tcBorders>
+              <w:top w:val="single" w:sz="4" w:space="0" w:color="FFFFFF" w:themeColor="background1"/>
+              <w:left w:val="single" w:sz="4" w:space="0" w:color="FFFFFF" w:themeColor="background1"/>
+              <w:bottom w:val="single" w:sz="4" w:space="0" w:color="FFFFFF" w:themeColor="background1"/>
+              <w:right w:val="single" w:sz="4" w:space="0" w:color="FFFFFF" w:themeColor="background1"/>
+            </w:tcBorders>
           </w:tcPr>
           <w:p>
             <w:pPr>
@@ -3023,6 +3143,12 @@
         <w:tc>
           <w:tcPr>
             <w:tcW w:w="1129" w:type="dxa"/>
+            <w:tcBorders>
+              <w:top w:val="single" w:sz="4" w:space="0" w:color="FFFFFF" w:themeColor="background1"/>
+              <w:left w:val="single" w:sz="4" w:space="0" w:color="FFFFFF" w:themeColor="background1"/>
+              <w:bottom w:val="single" w:sz="4" w:space="0" w:color="FFFFFF" w:themeColor="background1"/>
+              <w:right w:val="single" w:sz="4" w:space="0" w:color="FFFFFF" w:themeColor="background1"/>
+            </w:tcBorders>
           </w:tcPr>
           <w:p>
             <w:pPr>
@@ -3048,6 +3174,12 @@
         <w:tc>
           <w:tcPr>
             <w:tcW w:w="3295" w:type="dxa"/>
+            <w:tcBorders>
+              <w:top w:val="single" w:sz="4" w:space="0" w:color="FFFFFF" w:themeColor="background1"/>
+              <w:left w:val="single" w:sz="4" w:space="0" w:color="FFFFFF" w:themeColor="background1"/>
+              <w:bottom w:val="single" w:sz="4" w:space="0" w:color="FFFFFF" w:themeColor="background1"/>
+              <w:right w:val="single" w:sz="4" w:space="0" w:color="FFFFFF" w:themeColor="background1"/>
+            </w:tcBorders>
           </w:tcPr>
           <w:p>
             <w:pPr>
@@ -3071,6 +3203,12 @@
         <w:tc>
           <w:tcPr>
             <w:tcW w:w="4592" w:type="dxa"/>
+            <w:tcBorders>
+              <w:top w:val="single" w:sz="4" w:space="0" w:color="FFFFFF" w:themeColor="background1"/>
+              <w:left w:val="single" w:sz="4" w:space="0" w:color="FFFFFF" w:themeColor="background1"/>
+              <w:bottom w:val="single" w:sz="4" w:space="0" w:color="FFFFFF" w:themeColor="background1"/>
+              <w:right w:val="single" w:sz="4" w:space="0" w:color="FFFFFF" w:themeColor="background1"/>
+            </w:tcBorders>
           </w:tcPr>
           <w:p>
             <w:pPr>
@@ -3096,6 +3234,12 @@
         <w:tc>
           <w:tcPr>
             <w:tcW w:w="1129" w:type="dxa"/>
+            <w:tcBorders>
+              <w:top w:val="single" w:sz="4" w:space="0" w:color="FFFFFF" w:themeColor="background1"/>
+              <w:left w:val="single" w:sz="4" w:space="0" w:color="FFFFFF" w:themeColor="background1"/>
+              <w:bottom w:val="single" w:sz="4" w:space="0" w:color="FFFFFF" w:themeColor="background1"/>
+              <w:right w:val="single" w:sz="4" w:space="0" w:color="FFFFFF" w:themeColor="background1"/>
+            </w:tcBorders>
           </w:tcPr>
           <w:p>
             <w:pPr>
@@ -3121,6 +3265,12 @@
         <w:tc>
           <w:tcPr>
             <w:tcW w:w="3295" w:type="dxa"/>
+            <w:tcBorders>
+              <w:top w:val="single" w:sz="4" w:space="0" w:color="FFFFFF" w:themeColor="background1"/>
+              <w:left w:val="single" w:sz="4" w:space="0" w:color="FFFFFF" w:themeColor="background1"/>
+              <w:bottom w:val="single" w:sz="4" w:space="0" w:color="FFFFFF" w:themeColor="background1"/>
+              <w:right w:val="single" w:sz="4" w:space="0" w:color="FFFFFF" w:themeColor="background1"/>
+            </w:tcBorders>
           </w:tcPr>
           <w:p>
             <w:pPr>
@@ -3146,6 +3296,12 @@
         <w:tc>
           <w:tcPr>
             <w:tcW w:w="4592" w:type="dxa"/>
+            <w:tcBorders>
+              <w:top w:val="single" w:sz="4" w:space="0" w:color="FFFFFF" w:themeColor="background1"/>
+              <w:left w:val="single" w:sz="4" w:space="0" w:color="FFFFFF" w:themeColor="background1"/>
+              <w:bottom w:val="single" w:sz="4" w:space="0" w:color="FFFFFF" w:themeColor="background1"/>
+              <w:right w:val="single" w:sz="4" w:space="0" w:color="FFFFFF" w:themeColor="background1"/>
+            </w:tcBorders>
           </w:tcPr>
           <w:p>
             <w:pPr>
@@ -3171,6 +3327,12 @@
         <w:tc>
           <w:tcPr>
             <w:tcW w:w="1129" w:type="dxa"/>
+            <w:tcBorders>
+              <w:top w:val="single" w:sz="4" w:space="0" w:color="FFFFFF" w:themeColor="background1"/>
+              <w:left w:val="single" w:sz="4" w:space="0" w:color="FFFFFF" w:themeColor="background1"/>
+              <w:bottom w:val="single" w:sz="4" w:space="0" w:color="FFFFFF" w:themeColor="background1"/>
+              <w:right w:val="single" w:sz="4" w:space="0" w:color="FFFFFF" w:themeColor="background1"/>
+            </w:tcBorders>
           </w:tcPr>
           <w:p>
             <w:pPr>
@@ -3196,6 +3358,12 @@
         <w:tc>
           <w:tcPr>
             <w:tcW w:w="3295" w:type="dxa"/>
+            <w:tcBorders>
+              <w:top w:val="single" w:sz="4" w:space="0" w:color="FFFFFF" w:themeColor="background1"/>
+              <w:left w:val="single" w:sz="4" w:space="0" w:color="FFFFFF" w:themeColor="background1"/>
+              <w:bottom w:val="single" w:sz="4" w:space="0" w:color="FFFFFF" w:themeColor="background1"/>
+              <w:right w:val="single" w:sz="4" w:space="0" w:color="FFFFFF" w:themeColor="background1"/>
+            </w:tcBorders>
           </w:tcPr>
           <w:p>
             <w:pPr>
@@ -3212,21 +3380,19 @@
                 <w:sz w:val="24"/>
                 <w:szCs w:val="24"/>
               </w:rPr>
-              <w:t>Disponibilida</w:t>
-            </w:r>
-            <w:r>
-              <w:rPr>
-                <w:rFonts w:ascii="Arial" w:hAnsi="Arial" w:cs="Arial"/>
-                <w:sz w:val="24"/>
-                <w:szCs w:val="24"/>
-              </w:rPr>
-              <w:t>d</w:t>
+              <w:t>Disponibilidad</w:t>
             </w:r>
           </w:p>
         </w:tc>
         <w:tc>
           <w:tcPr>
             <w:tcW w:w="4592" w:type="dxa"/>
+            <w:tcBorders>
+              <w:top w:val="single" w:sz="4" w:space="0" w:color="FFFFFF" w:themeColor="background1"/>
+              <w:left w:val="single" w:sz="4" w:space="0" w:color="FFFFFF" w:themeColor="background1"/>
+              <w:bottom w:val="single" w:sz="4" w:space="0" w:color="FFFFFF" w:themeColor="background1"/>
+              <w:right w:val="single" w:sz="4" w:space="0" w:color="FFFFFF" w:themeColor="background1"/>
+            </w:tcBorders>
           </w:tcPr>
           <w:p>
             <w:pPr>
@@ -3254,6 +3420,11 @@
         <w:tc>
           <w:tcPr>
             <w:tcW w:w="1129" w:type="dxa"/>
+            <w:tcBorders>
+              <w:top w:val="single" w:sz="4" w:space="0" w:color="FFFFFF" w:themeColor="background1"/>
+              <w:left w:val="single" w:sz="4" w:space="0" w:color="FFFFFF" w:themeColor="background1"/>
+              <w:right w:val="single" w:sz="4" w:space="0" w:color="FFFFFF" w:themeColor="background1"/>
+            </w:tcBorders>
           </w:tcPr>
           <w:p>
             <w:pPr>
@@ -3279,6 +3450,11 @@
         <w:tc>
           <w:tcPr>
             <w:tcW w:w="3295" w:type="dxa"/>
+            <w:tcBorders>
+              <w:top w:val="single" w:sz="4" w:space="0" w:color="FFFFFF" w:themeColor="background1"/>
+              <w:left w:val="single" w:sz="4" w:space="0" w:color="FFFFFF" w:themeColor="background1"/>
+              <w:right w:val="single" w:sz="4" w:space="0" w:color="FFFFFF" w:themeColor="background1"/>
+            </w:tcBorders>
           </w:tcPr>
           <w:p>
             <w:pPr>
@@ -3304,6 +3480,11 @@
         <w:tc>
           <w:tcPr>
             <w:tcW w:w="4592" w:type="dxa"/>
+            <w:tcBorders>
+              <w:top w:val="single" w:sz="4" w:space="0" w:color="FFFFFF" w:themeColor="background1"/>
+              <w:left w:val="single" w:sz="4" w:space="0" w:color="FFFFFF" w:themeColor="background1"/>
+              <w:right w:val="single" w:sz="4" w:space="0" w:color="FFFFFF" w:themeColor="background1"/>
+            </w:tcBorders>
           </w:tcPr>
           <w:p>
             <w:pPr>
@@ -3370,6 +3551,7 @@
           <w:szCs w:val="24"/>
           <w:lang w:eastAsia="es-EC"/>
         </w:rPr>
+        <w:lastRenderedPageBreak/>
         <w:t>DISEÑO DEL SISTEMA</w:t>
       </w:r>
     </w:p>
@@ -3426,18 +3608,9 @@
           <w:szCs w:val="24"/>
           <w:lang w:eastAsia="es-EC"/>
         </w:rPr>
-        <w:lastRenderedPageBreak/>
-        <w:t xml:space="preserve">El diagrama representa cómo los tres actores interactúan con el sistema. Las relaciones </w:t>
-      </w:r>
-      <w:r>
-        <w:rPr>
-          <w:rFonts w:ascii="Arial" w:hAnsi="Arial" w:cs="Arial"/>
-          <w:sz w:val="24"/>
-          <w:szCs w:val="24"/>
-          <w:lang w:eastAsia="es-EC"/>
-        </w:rPr>
-        <w:t>“</w:t>
-      </w:r>
+        <w:t>El diagrama representa cómo los tres actores interactúan con el sistema. Las relaciones “</w:t>
+      </w:r>
+      <w:proofErr w:type="spellStart"/>
       <w:r>
         <w:rPr>
           <w:rFonts w:ascii="Arial" w:hAnsi="Arial" w:cs="Arial"/>
@@ -3447,23 +3620,15 @@
         </w:rPr>
         <w:t>include</w:t>
       </w:r>
-      <w:r>
-        <w:rPr>
-          <w:rFonts w:ascii="Arial" w:hAnsi="Arial" w:cs="Arial"/>
-          <w:sz w:val="24"/>
-          <w:szCs w:val="24"/>
-          <w:lang w:eastAsia="es-EC"/>
-        </w:rPr>
-        <w:t>”</w:t>
-      </w:r>
-      <w:r>
-        <w:rPr>
-          <w:rFonts w:ascii="Arial" w:hAnsi="Arial" w:cs="Arial"/>
-          <w:sz w:val="24"/>
-          <w:szCs w:val="24"/>
-          <w:lang w:eastAsia="es-EC"/>
-        </w:rPr>
-        <w:t xml:space="preserve"> señalan acciones que se ejecutan como parte de otras funciones: </w:t>
+      <w:proofErr w:type="spellEnd"/>
+      <w:r>
+        <w:rPr>
+          <w:rFonts w:ascii="Arial" w:hAnsi="Arial" w:cs="Arial"/>
+          <w:sz w:val="24"/>
+          <w:szCs w:val="24"/>
+          <w:lang w:eastAsia="es-EC"/>
+        </w:rPr>
+        <w:t xml:space="preserve">” señalan acciones que se ejecutan como parte de otras funciones: </w:t>
       </w:r>
     </w:p>
     <w:p>
@@ -3492,25 +3657,7 @@
           <w:szCs w:val="24"/>
           <w:lang w:eastAsia="es-EC"/>
         </w:rPr>
-        <w:t>A</w:t>
-      </w:r>
-      <w:r>
-        <w:rPr>
-          <w:rFonts w:ascii="Arial" w:hAnsi="Arial" w:cs="Arial"/>
-          <w:sz w:val="24"/>
-          <w:szCs w:val="24"/>
-          <w:lang w:eastAsia="es-EC"/>
-        </w:rPr>
-        <w:t>l registrar un rescate se debe clasificar la especi</w:t>
-      </w:r>
-      <w:r>
-        <w:rPr>
-          <w:rFonts w:ascii="Arial" w:hAnsi="Arial" w:cs="Arial"/>
-          <w:sz w:val="24"/>
-          <w:szCs w:val="24"/>
-          <w:lang w:eastAsia="es-EC"/>
-        </w:rPr>
-        <w:t xml:space="preserve">e. </w:t>
+        <w:t xml:space="preserve">Al registrar un rescate se debe clasificar la especie. </w:t>
       </w:r>
     </w:p>
     <w:p>
@@ -3539,16 +3686,7 @@
           <w:szCs w:val="24"/>
           <w:lang w:eastAsia="es-EC"/>
         </w:rPr>
-        <w:t>A</w:t>
-      </w:r>
-      <w:r>
-        <w:rPr>
-          <w:rFonts w:ascii="Arial" w:hAnsi="Arial" w:cs="Arial"/>
-          <w:sz w:val="24"/>
-          <w:szCs w:val="24"/>
-          <w:lang w:eastAsia="es-EC"/>
-        </w:rPr>
-        <w:t>l designar a un responsable se genera una notificación</w:t>
+        <w:t>Al designar a un responsable se genera una notificación</w:t>
       </w:r>
     </w:p>
     <w:p>
@@ -3577,16 +3715,7 @@
           <w:szCs w:val="24"/>
           <w:lang w:eastAsia="es-EC"/>
         </w:rPr>
-        <w:t>A</w:t>
-      </w:r>
-      <w:r>
-        <w:rPr>
-          <w:rFonts w:ascii="Arial" w:hAnsi="Arial" w:cs="Arial"/>
-          <w:sz w:val="24"/>
-          <w:szCs w:val="24"/>
-          <w:lang w:eastAsia="es-EC"/>
-        </w:rPr>
-        <w:t>l gestionar una adopción, se actualiza el estado del procedimiento.</w:t>
+        <w:t>Al gestionar una adopción, se actualiza el estado del procedimiento.</w:t>
       </w:r>
     </w:p>
     <w:p>
@@ -3656,6 +3785,52 @@
     </w:p>
     <w:p>
       <w:pPr>
+        <w:pStyle w:val="Descripcin"/>
+        <w:rPr>
+          <w:rFonts w:ascii="Arial" w:hAnsi="Arial" w:cs="Arial"/>
+          <w:b/>
+          <w:bCs/>
+          <w:sz w:val="24"/>
+          <w:szCs w:val="24"/>
+          <w:lang w:eastAsia="es-EC"/>
+        </w:rPr>
+      </w:pPr>
+      <w:r>
+        <w:t xml:space="preserve">Figura </w:t>
+      </w:r>
+      <w:r>
+        <w:fldChar w:fldCharType="begin"/>
+      </w:r>
+      <w:r>
+        <w:instrText xml:space="preserve"> SEQ Figura \* ARABIC </w:instrText>
+      </w:r>
+      <w:r>
+        <w:fldChar w:fldCharType="separate"/>
+      </w:r>
+      <w:r>
+        <w:rPr>
+          <w:noProof/>
+        </w:rPr>
+        <w:t>1</w:t>
+      </w:r>
+      <w:r>
+        <w:rPr>
+          <w:noProof/>
+        </w:rPr>
+        <w:fldChar w:fldCharType="end"/>
+      </w:r>
+      <w:r>
+        <w:t xml:space="preserve">: </w:t>
+      </w:r>
+      <w:r>
+        <w:t>Diagrama de casos de uso del sistema</w:t>
+      </w:r>
+      <w:r>
+        <w:t xml:space="preserve"> </w:t>
+      </w:r>
+    </w:p>
+    <w:p>
+      <w:pPr>
         <w:pStyle w:val="Prrafodelista"/>
         <w:numPr>
           <w:ilvl w:val="1"/>
@@ -3701,7 +3876,27 @@
           <w:szCs w:val="24"/>
           <w:lang w:eastAsia="es-EC"/>
         </w:rPr>
-        <w:t xml:space="preserve">El diagrama de clases representa la estructura estática del sistema: las clases, sus atributos, métodos y relaciones. Traduce a clases los actores y casos de uso de la Figura 1 y sirve de base para los patrones de diseño de la sección 4. GestorCasos coordina el registro, la asignación y la adopción de los casos; la jerarquía de Expediente (perro, gato y fauna silvestre) guarda los datos de cada animal, junto con su HistorialClinico y los CambioEstado que dan trazabilidad; Adopcion cierra el </w:t>
+        <w:t xml:space="preserve">El diagrama de clases representa la estructura estática del sistema: las clases, sus atributos, métodos y relaciones. Traduce a clases los actores y casos de uso de la Figura 1 y sirve de base para los patrones de diseño de la sección 4. </w:t>
+      </w:r>
+      <w:proofErr w:type="spellStart"/>
+      <w:r>
+        <w:rPr>
+          <w:rFonts w:ascii="Arial" w:hAnsi="Arial" w:cs="Arial"/>
+          <w:sz w:val="24"/>
+          <w:szCs w:val="24"/>
+          <w:lang w:eastAsia="es-EC"/>
+        </w:rPr>
+        <w:t>GestorCasos</w:t>
+      </w:r>
+      <w:proofErr w:type="spellEnd"/>
+      <w:r>
+        <w:rPr>
+          <w:rFonts w:ascii="Arial" w:hAnsi="Arial" w:cs="Arial"/>
+          <w:sz w:val="24"/>
+          <w:szCs w:val="24"/>
+          <w:lang w:eastAsia="es-EC"/>
+        </w:rPr>
+        <w:t xml:space="preserve"> </w:t>
       </w:r>
       <w:r>
         <w:rPr>
@@ -3711,7 +3906,167 @@
           <w:lang w:eastAsia="es-EC"/>
         </w:rPr>
         <w:lastRenderedPageBreak/>
-        <w:t>expediente; las fábricas crean cada expediente a partir de DatosRescate; los observadores (Voluntario y Veterinario) reciben el EventoRescate; ServicioReportes genera los reportes y consulta la trazabilidad; y CasoController y VistaCaso separan la interfaz de la lógica de negocio.</w:t>
+        <w:t xml:space="preserve">coordina el registro, la asignación y la adopción de los casos; la jerarquía de Expediente (perro, gato y fauna silvestre) guarda los datos de cada animal, junto con su </w:t>
+      </w:r>
+      <w:proofErr w:type="spellStart"/>
+      <w:r>
+        <w:rPr>
+          <w:rFonts w:ascii="Arial" w:hAnsi="Arial" w:cs="Arial"/>
+          <w:sz w:val="24"/>
+          <w:szCs w:val="24"/>
+          <w:lang w:eastAsia="es-EC"/>
+        </w:rPr>
+        <w:t>HistorialClinico</w:t>
+      </w:r>
+      <w:proofErr w:type="spellEnd"/>
+      <w:r>
+        <w:rPr>
+          <w:rFonts w:ascii="Arial" w:hAnsi="Arial" w:cs="Arial"/>
+          <w:sz w:val="24"/>
+          <w:szCs w:val="24"/>
+          <w:lang w:eastAsia="es-EC"/>
+        </w:rPr>
+        <w:t xml:space="preserve"> y los </w:t>
+      </w:r>
+      <w:proofErr w:type="spellStart"/>
+      <w:r>
+        <w:rPr>
+          <w:rFonts w:ascii="Arial" w:hAnsi="Arial" w:cs="Arial"/>
+          <w:sz w:val="24"/>
+          <w:szCs w:val="24"/>
+          <w:lang w:eastAsia="es-EC"/>
+        </w:rPr>
+        <w:t>CambioEstado</w:t>
+      </w:r>
+      <w:proofErr w:type="spellEnd"/>
+      <w:r>
+        <w:rPr>
+          <w:rFonts w:ascii="Arial" w:hAnsi="Arial" w:cs="Arial"/>
+          <w:sz w:val="24"/>
+          <w:szCs w:val="24"/>
+          <w:lang w:eastAsia="es-EC"/>
+        </w:rPr>
+        <w:t xml:space="preserve"> que dan trazabilidad; </w:t>
+      </w:r>
+      <w:proofErr w:type="spellStart"/>
+      <w:r>
+        <w:rPr>
+          <w:rFonts w:ascii="Arial" w:hAnsi="Arial" w:cs="Arial"/>
+          <w:sz w:val="24"/>
+          <w:szCs w:val="24"/>
+          <w:lang w:eastAsia="es-EC"/>
+        </w:rPr>
+        <w:t>Adopcion</w:t>
+      </w:r>
+      <w:proofErr w:type="spellEnd"/>
+      <w:r>
+        <w:rPr>
+          <w:rFonts w:ascii="Arial" w:hAnsi="Arial" w:cs="Arial"/>
+          <w:sz w:val="24"/>
+          <w:szCs w:val="24"/>
+          <w:lang w:eastAsia="es-EC"/>
+        </w:rPr>
+        <w:t xml:space="preserve"> cierra el expediente; las fábricas crean cada expediente a partir de </w:t>
+      </w:r>
+      <w:proofErr w:type="spellStart"/>
+      <w:r>
+        <w:rPr>
+          <w:rFonts w:ascii="Arial" w:hAnsi="Arial" w:cs="Arial"/>
+          <w:sz w:val="24"/>
+          <w:szCs w:val="24"/>
+          <w:lang w:eastAsia="es-EC"/>
+        </w:rPr>
+        <w:t>DatosRescate</w:t>
+      </w:r>
+      <w:proofErr w:type="spellEnd"/>
+      <w:r>
+        <w:rPr>
+          <w:rFonts w:ascii="Arial" w:hAnsi="Arial" w:cs="Arial"/>
+          <w:sz w:val="24"/>
+          <w:szCs w:val="24"/>
+          <w:lang w:eastAsia="es-EC"/>
+        </w:rPr>
+        <w:t xml:space="preserve">; los observadores (Voluntario y Veterinario) reciben el </w:t>
+      </w:r>
+      <w:proofErr w:type="spellStart"/>
+      <w:r>
+        <w:rPr>
+          <w:rFonts w:ascii="Arial" w:hAnsi="Arial" w:cs="Arial"/>
+          <w:sz w:val="24"/>
+          <w:szCs w:val="24"/>
+          <w:lang w:eastAsia="es-EC"/>
+        </w:rPr>
+        <w:t>EventoRescate</w:t>
+      </w:r>
+      <w:proofErr w:type="spellEnd"/>
+      <w:r>
+        <w:rPr>
+          <w:rFonts w:ascii="Arial" w:hAnsi="Arial" w:cs="Arial"/>
+          <w:sz w:val="24"/>
+          <w:szCs w:val="24"/>
+          <w:lang w:eastAsia="es-EC"/>
+        </w:rPr>
+        <w:t xml:space="preserve">; </w:t>
+      </w:r>
+      <w:proofErr w:type="spellStart"/>
+      <w:r>
+        <w:rPr>
+          <w:rFonts w:ascii="Arial" w:hAnsi="Arial" w:cs="Arial"/>
+          <w:sz w:val="24"/>
+          <w:szCs w:val="24"/>
+          <w:lang w:eastAsia="es-EC"/>
+        </w:rPr>
+        <w:t>ServicioReportes</w:t>
+      </w:r>
+      <w:proofErr w:type="spellEnd"/>
+      <w:r>
+        <w:rPr>
+          <w:rFonts w:ascii="Arial" w:hAnsi="Arial" w:cs="Arial"/>
+          <w:sz w:val="24"/>
+          <w:szCs w:val="24"/>
+          <w:lang w:eastAsia="es-EC"/>
+        </w:rPr>
+        <w:t xml:space="preserve"> genera los reportes y consulta la trazabilidad; y </w:t>
+      </w:r>
+      <w:proofErr w:type="spellStart"/>
+      <w:r>
+        <w:rPr>
+          <w:rFonts w:ascii="Arial" w:hAnsi="Arial" w:cs="Arial"/>
+          <w:sz w:val="24"/>
+          <w:szCs w:val="24"/>
+          <w:lang w:eastAsia="es-EC"/>
+        </w:rPr>
+        <w:t>CasoController</w:t>
+      </w:r>
+      <w:proofErr w:type="spellEnd"/>
+      <w:r>
+        <w:rPr>
+          <w:rFonts w:ascii="Arial" w:hAnsi="Arial" w:cs="Arial"/>
+          <w:sz w:val="24"/>
+          <w:szCs w:val="24"/>
+          <w:lang w:eastAsia="es-EC"/>
+        </w:rPr>
+        <w:t xml:space="preserve"> y </w:t>
+      </w:r>
+      <w:proofErr w:type="spellStart"/>
+      <w:r>
+        <w:rPr>
+          <w:rFonts w:ascii="Arial" w:hAnsi="Arial" w:cs="Arial"/>
+          <w:sz w:val="24"/>
+          <w:szCs w:val="24"/>
+          <w:lang w:eastAsia="es-EC"/>
+        </w:rPr>
+        <w:t>VistaCaso</w:t>
+      </w:r>
+      <w:proofErr w:type="spellEnd"/>
+      <w:r>
+        <w:rPr>
+          <w:rFonts w:ascii="Arial" w:hAnsi="Arial" w:cs="Arial"/>
+          <w:sz w:val="24"/>
+          <w:szCs w:val="24"/>
+          <w:lang w:eastAsia="es-EC"/>
+        </w:rPr>
+        <w:t xml:space="preserve"> separan la interfaz de la lógica de negocio.</w:t>
       </w:r>
     </w:p>
     <w:p>
@@ -3781,14 +4136,6 @@
           <w:szCs w:val="24"/>
           <w:lang w:eastAsia="es-EC"/>
         </w:rPr>
-        <w:sectPr>
-          <w:pgSz w:w="16838" w:h="11906" w:orient="landscape"/>
-          <w:pgMar w:top="1440" w:right="1418" w:bottom="1440" w:left="1418" w:header="709" w:footer="709" w:gutter="0"/>
-          <w:pgNumType w:start="1"/>
-          <w:cols w:space="708"/>
-          <w:titlePg/>
-          <w:docGrid w:linePitch="360"/>
-        </w:sectPr>
       </w:pPr>
       <w:r>
         <w:rPr>
@@ -3844,6 +4191,55 @@
     </w:p>
     <w:p>
       <w:pPr>
+        <w:pStyle w:val="Descripcin"/>
+        <w:rPr>
+          <w:rFonts w:ascii="Arial" w:hAnsi="Arial" w:cs="Arial"/>
+          <w:sz w:val="24"/>
+          <w:szCs w:val="24"/>
+          <w:lang w:eastAsia="es-EC"/>
+        </w:rPr>
+        <w:sectPr>
+          <w:pgSz w:w="16838" w:h="11906" w:orient="landscape"/>
+          <w:pgMar w:top="1440" w:right="1418" w:bottom="1440" w:left="1418" w:header="709" w:footer="709" w:gutter="0"/>
+          <w:pgNumType w:start="1"/>
+          <w:cols w:space="708"/>
+          <w:titlePg/>
+          <w:docGrid w:linePitch="360"/>
+        </w:sectPr>
+      </w:pPr>
+      <w:r>
+        <w:t xml:space="preserve">Figura </w:t>
+      </w:r>
+      <w:r>
+        <w:fldChar w:fldCharType="begin"/>
+      </w:r>
+      <w:r>
+        <w:instrText xml:space="preserve"> SEQ Figura \* ARABIC </w:instrText>
+      </w:r>
+      <w:r>
+        <w:fldChar w:fldCharType="separate"/>
+      </w:r>
+      <w:r>
+        <w:rPr>
+          <w:noProof/>
+        </w:rPr>
+        <w:t>2</w:t>
+      </w:r>
+      <w:r>
+        <w:rPr>
+          <w:noProof/>
+        </w:rPr>
+        <w:fldChar w:fldCharType="end"/>
+      </w:r>
+      <w:r>
+        <w:t xml:space="preserve">: </w:t>
+      </w:r>
+      <w:r>
+        <w:t>Diagrama de clases UML</w:t>
+      </w:r>
+    </w:p>
+    <w:p>
+      <w:pPr>
         <w:spacing w:line="360" w:lineRule="auto"/>
         <w:rPr>
           <w:rFonts w:ascii="Arial" w:hAnsi="Arial" w:cs="Arial"/>
@@ -3890,6 +4286,10 @@
         <w:tc>
           <w:tcPr>
             <w:tcW w:w="3114" w:type="dxa"/>
+            <w:tcBorders>
+              <w:left w:val="single" w:sz="4" w:space="0" w:color="FFFFFF" w:themeColor="background1"/>
+              <w:right w:val="single" w:sz="4" w:space="0" w:color="FFFFFF" w:themeColor="background1"/>
+            </w:tcBorders>
           </w:tcPr>
           <w:p>
             <w:pPr>
@@ -3918,6 +4318,10 @@
         <w:tc>
           <w:tcPr>
             <w:tcW w:w="5902" w:type="dxa"/>
+            <w:tcBorders>
+              <w:left w:val="single" w:sz="4" w:space="0" w:color="FFFFFF" w:themeColor="background1"/>
+              <w:right w:val="single" w:sz="4" w:space="0" w:color="FFFFFF" w:themeColor="background1"/>
+            </w:tcBorders>
           </w:tcPr>
           <w:p>
             <w:pPr>
@@ -3948,6 +4352,11 @@
         <w:tc>
           <w:tcPr>
             <w:tcW w:w="3114" w:type="dxa"/>
+            <w:tcBorders>
+              <w:left w:val="single" w:sz="4" w:space="0" w:color="FFFFFF" w:themeColor="background1"/>
+              <w:bottom w:val="single" w:sz="4" w:space="0" w:color="FFFFFF" w:themeColor="background1"/>
+              <w:right w:val="single" w:sz="4" w:space="0" w:color="FFFFFF" w:themeColor="background1"/>
+            </w:tcBorders>
           </w:tcPr>
           <w:p>
             <w:pPr>
@@ -3971,6 +4380,11 @@
         <w:tc>
           <w:tcPr>
             <w:tcW w:w="5902" w:type="dxa"/>
+            <w:tcBorders>
+              <w:left w:val="single" w:sz="4" w:space="0" w:color="FFFFFF" w:themeColor="background1"/>
+              <w:bottom w:val="single" w:sz="4" w:space="0" w:color="FFFFFF" w:themeColor="background1"/>
+              <w:right w:val="single" w:sz="4" w:space="0" w:color="FFFFFF" w:themeColor="background1"/>
+            </w:tcBorders>
           </w:tcPr>
           <w:p>
             <w:pPr>
@@ -3987,7 +4401,97 @@
                 <w:sz w:val="24"/>
                 <w:szCs w:val="24"/>
               </w:rPr>
-              <w:t>Expediente solo representa los datos y el estado de un caso. El historial clínico y los cambios de estado se delegan en HistorialClinico y CambioEstado, el almacenamiento lo gestiona RepositorioExpediente, los reportes ServicioReportes y la presentación, VistaCaso.</w:t>
+              <w:t xml:space="preserve">Expediente solo representa los datos y el estado de un caso. El historial clínico y los cambios de estado se delegan en </w:t>
+            </w:r>
+            <w:proofErr w:type="spellStart"/>
+            <w:r>
+              <w:rPr>
+                <w:rFonts w:ascii="Arial" w:hAnsi="Arial" w:cs="Arial"/>
+                <w:sz w:val="24"/>
+                <w:szCs w:val="24"/>
+              </w:rPr>
+              <w:t>HistorialClinico</w:t>
+            </w:r>
+            <w:proofErr w:type="spellEnd"/>
+            <w:r>
+              <w:rPr>
+                <w:rFonts w:ascii="Arial" w:hAnsi="Arial" w:cs="Arial"/>
+                <w:sz w:val="24"/>
+                <w:szCs w:val="24"/>
+              </w:rPr>
+              <w:t xml:space="preserve"> y </w:t>
+            </w:r>
+            <w:proofErr w:type="spellStart"/>
+            <w:r>
+              <w:rPr>
+                <w:rFonts w:ascii="Arial" w:hAnsi="Arial" w:cs="Arial"/>
+                <w:sz w:val="24"/>
+                <w:szCs w:val="24"/>
+              </w:rPr>
+              <w:t>CambioEstado</w:t>
+            </w:r>
+            <w:proofErr w:type="spellEnd"/>
+            <w:r>
+              <w:rPr>
+                <w:rFonts w:ascii="Arial" w:hAnsi="Arial" w:cs="Arial"/>
+                <w:sz w:val="24"/>
+                <w:szCs w:val="24"/>
+              </w:rPr>
+              <w:t xml:space="preserve">, el almacenamiento lo gestiona </w:t>
+            </w:r>
+            <w:proofErr w:type="spellStart"/>
+            <w:r>
+              <w:rPr>
+                <w:rFonts w:ascii="Arial" w:hAnsi="Arial" w:cs="Arial"/>
+                <w:sz w:val="24"/>
+                <w:szCs w:val="24"/>
+              </w:rPr>
+              <w:t>RepositorioExpediente</w:t>
+            </w:r>
+            <w:proofErr w:type="spellEnd"/>
+            <w:r>
+              <w:rPr>
+                <w:rFonts w:ascii="Arial" w:hAnsi="Arial" w:cs="Arial"/>
+                <w:sz w:val="24"/>
+                <w:szCs w:val="24"/>
+              </w:rPr>
+              <w:t xml:space="preserve">, los reportes </w:t>
+            </w:r>
+            <w:proofErr w:type="spellStart"/>
+            <w:r>
+              <w:rPr>
+                <w:rFonts w:ascii="Arial" w:hAnsi="Arial" w:cs="Arial"/>
+                <w:sz w:val="24"/>
+                <w:szCs w:val="24"/>
+              </w:rPr>
+              <w:t>ServicioReportes</w:t>
+            </w:r>
+            <w:proofErr w:type="spellEnd"/>
+            <w:r>
+              <w:rPr>
+                <w:rFonts w:ascii="Arial" w:hAnsi="Arial" w:cs="Arial"/>
+                <w:sz w:val="24"/>
+                <w:szCs w:val="24"/>
+              </w:rPr>
+              <w:t xml:space="preserve"> y la presentación, </w:t>
+            </w:r>
+            <w:proofErr w:type="spellStart"/>
+            <w:r>
+              <w:rPr>
+                <w:rFonts w:ascii="Arial" w:hAnsi="Arial" w:cs="Arial"/>
+                <w:sz w:val="24"/>
+                <w:szCs w:val="24"/>
+              </w:rPr>
+              <w:t>VistaCaso</w:t>
+            </w:r>
+            <w:proofErr w:type="spellEnd"/>
+            <w:r>
+              <w:rPr>
+                <w:rFonts w:ascii="Arial" w:hAnsi="Arial" w:cs="Arial"/>
+                <w:sz w:val="24"/>
+                <w:szCs w:val="24"/>
+              </w:rPr>
+              <w:t>.</w:t>
             </w:r>
           </w:p>
         </w:tc>
@@ -3996,6 +4500,12 @@
         <w:tc>
           <w:tcPr>
             <w:tcW w:w="3114" w:type="dxa"/>
+            <w:tcBorders>
+              <w:top w:val="single" w:sz="4" w:space="0" w:color="FFFFFF" w:themeColor="background1"/>
+              <w:left w:val="single" w:sz="4" w:space="0" w:color="FFFFFF" w:themeColor="background1"/>
+              <w:bottom w:val="single" w:sz="4" w:space="0" w:color="FFFFFF" w:themeColor="background1"/>
+              <w:right w:val="single" w:sz="4" w:space="0" w:color="FFFFFF" w:themeColor="background1"/>
+            </w:tcBorders>
           </w:tcPr>
           <w:p>
             <w:pPr>
@@ -4019,6 +4529,12 @@
         <w:tc>
           <w:tcPr>
             <w:tcW w:w="5902" w:type="dxa"/>
+            <w:tcBorders>
+              <w:top w:val="single" w:sz="4" w:space="0" w:color="FFFFFF" w:themeColor="background1"/>
+              <w:left w:val="single" w:sz="4" w:space="0" w:color="FFFFFF" w:themeColor="background1"/>
+              <w:bottom w:val="single" w:sz="4" w:space="0" w:color="FFFFFF" w:themeColor="background1"/>
+              <w:right w:val="single" w:sz="4" w:space="0" w:color="FFFFFF" w:themeColor="background1"/>
+            </w:tcBorders>
           </w:tcPr>
           <w:p>
             <w:pPr>
@@ -4035,7 +4551,43 @@
                 <w:sz w:val="24"/>
                 <w:szCs w:val="24"/>
               </w:rPr>
-              <w:t>Para soportar una nueva especie (por ejemplo, aves exóticas) se agregan ExpedienteAve y FabricaAve sin modificar las clases existentes.</w:t>
+              <w:t xml:space="preserve">Para soportar una nueva especie (por ejemplo, aves exóticas) se agregan </w:t>
+            </w:r>
+            <w:proofErr w:type="spellStart"/>
+            <w:r>
+              <w:rPr>
+                <w:rFonts w:ascii="Arial" w:hAnsi="Arial" w:cs="Arial"/>
+                <w:sz w:val="24"/>
+                <w:szCs w:val="24"/>
+              </w:rPr>
+              <w:t>ExpedienteAve</w:t>
+            </w:r>
+            <w:proofErr w:type="spellEnd"/>
+            <w:r>
+              <w:rPr>
+                <w:rFonts w:ascii="Arial" w:hAnsi="Arial" w:cs="Arial"/>
+                <w:sz w:val="24"/>
+                <w:szCs w:val="24"/>
+              </w:rPr>
+              <w:t xml:space="preserve"> y </w:t>
+            </w:r>
+            <w:proofErr w:type="spellStart"/>
+            <w:r>
+              <w:rPr>
+                <w:rFonts w:ascii="Arial" w:hAnsi="Arial" w:cs="Arial"/>
+                <w:sz w:val="24"/>
+                <w:szCs w:val="24"/>
+              </w:rPr>
+              <w:t>FabricaAve</w:t>
+            </w:r>
+            <w:proofErr w:type="spellEnd"/>
+            <w:r>
+              <w:rPr>
+                <w:rFonts w:ascii="Arial" w:hAnsi="Arial" w:cs="Arial"/>
+                <w:sz w:val="24"/>
+                <w:szCs w:val="24"/>
+              </w:rPr>
+              <w:t xml:space="preserve"> sin modificar las clases existentes.</w:t>
             </w:r>
           </w:p>
         </w:tc>
@@ -4044,6 +4596,12 @@
         <w:tc>
           <w:tcPr>
             <w:tcW w:w="3114" w:type="dxa"/>
+            <w:tcBorders>
+              <w:top w:val="single" w:sz="4" w:space="0" w:color="FFFFFF" w:themeColor="background1"/>
+              <w:left w:val="single" w:sz="4" w:space="0" w:color="FFFFFF" w:themeColor="background1"/>
+              <w:bottom w:val="single" w:sz="4" w:space="0" w:color="FFFFFF" w:themeColor="background1"/>
+              <w:right w:val="single" w:sz="4" w:space="0" w:color="FFFFFF" w:themeColor="background1"/>
+            </w:tcBorders>
           </w:tcPr>
           <w:p>
             <w:pPr>
@@ -4060,13 +4618,29 @@
                 <w:sz w:val="24"/>
                 <w:szCs w:val="24"/>
               </w:rPr>
-              <w:t>L – Sustitución de Liskov</w:t>
-            </w:r>
+              <w:t xml:space="preserve">L – Sustitución de </w:t>
+            </w:r>
+            <w:proofErr w:type="spellStart"/>
+            <w:r>
+              <w:rPr>
+                <w:rFonts w:ascii="Arial" w:hAnsi="Arial" w:cs="Arial"/>
+                <w:sz w:val="24"/>
+                <w:szCs w:val="24"/>
+              </w:rPr>
+              <w:t>Liskov</w:t>
+            </w:r>
+            <w:proofErr w:type="spellEnd"/>
           </w:p>
         </w:tc>
         <w:tc>
           <w:tcPr>
             <w:tcW w:w="5902" w:type="dxa"/>
+            <w:tcBorders>
+              <w:top w:val="single" w:sz="4" w:space="0" w:color="FFFFFF" w:themeColor="background1"/>
+              <w:left w:val="single" w:sz="4" w:space="0" w:color="FFFFFF" w:themeColor="background1"/>
+              <w:bottom w:val="single" w:sz="4" w:space="0" w:color="FFFFFF" w:themeColor="background1"/>
+              <w:right w:val="single" w:sz="4" w:space="0" w:color="FFFFFF" w:themeColor="background1"/>
+            </w:tcBorders>
           </w:tcPr>
           <w:p>
             <w:pPr>
@@ -4077,13 +4651,59 @@
                 <w:szCs w:val="24"/>
               </w:rPr>
             </w:pPr>
-            <w:r>
-              <w:rPr>
-                <w:rFonts w:ascii="Arial" w:hAnsi="Arial" w:cs="Arial"/>
-                <w:sz w:val="24"/>
-                <w:szCs w:val="24"/>
-              </w:rPr>
-              <w:t>ExpedientePerro, ExpedienteGato y ExpedienteFauna pueden usarse donde se espera un Expediente sin alterar el comportamiento del sistema.</w:t>
+            <w:proofErr w:type="spellStart"/>
+            <w:r>
+              <w:rPr>
+                <w:rFonts w:ascii="Arial" w:hAnsi="Arial" w:cs="Arial"/>
+                <w:sz w:val="24"/>
+                <w:szCs w:val="24"/>
+              </w:rPr>
+              <w:t>ExpedientePerro</w:t>
+            </w:r>
+            <w:proofErr w:type="spellEnd"/>
+            <w:r>
+              <w:rPr>
+                <w:rFonts w:ascii="Arial" w:hAnsi="Arial" w:cs="Arial"/>
+                <w:sz w:val="24"/>
+                <w:szCs w:val="24"/>
+              </w:rPr>
+              <w:t xml:space="preserve">, </w:t>
+            </w:r>
+            <w:proofErr w:type="spellStart"/>
+            <w:r>
+              <w:rPr>
+                <w:rFonts w:ascii="Arial" w:hAnsi="Arial" w:cs="Arial"/>
+                <w:sz w:val="24"/>
+                <w:szCs w:val="24"/>
+              </w:rPr>
+              <w:t>ExpedienteGato</w:t>
+            </w:r>
+            <w:proofErr w:type="spellEnd"/>
+            <w:r>
+              <w:rPr>
+                <w:rFonts w:ascii="Arial" w:hAnsi="Arial" w:cs="Arial"/>
+                <w:sz w:val="24"/>
+                <w:szCs w:val="24"/>
+              </w:rPr>
+              <w:t xml:space="preserve"> y </w:t>
+            </w:r>
+            <w:proofErr w:type="spellStart"/>
+            <w:r>
+              <w:rPr>
+                <w:rFonts w:ascii="Arial" w:hAnsi="Arial" w:cs="Arial"/>
+                <w:sz w:val="24"/>
+                <w:szCs w:val="24"/>
+              </w:rPr>
+              <w:t>ExpedienteFauna</w:t>
+            </w:r>
+            <w:proofErr w:type="spellEnd"/>
+            <w:r>
+              <w:rPr>
+                <w:rFonts w:ascii="Arial" w:hAnsi="Arial" w:cs="Arial"/>
+                <w:sz w:val="24"/>
+                <w:szCs w:val="24"/>
+              </w:rPr>
+              <w:t xml:space="preserve"> pueden usarse donde se espera un Expediente sin alterar el comportamiento del sistema.</w:t>
             </w:r>
           </w:p>
         </w:tc>
@@ -4092,6 +4712,12 @@
         <w:tc>
           <w:tcPr>
             <w:tcW w:w="3114" w:type="dxa"/>
+            <w:tcBorders>
+              <w:top w:val="single" w:sz="4" w:space="0" w:color="FFFFFF" w:themeColor="background1"/>
+              <w:left w:val="single" w:sz="4" w:space="0" w:color="FFFFFF" w:themeColor="background1"/>
+              <w:bottom w:val="single" w:sz="4" w:space="0" w:color="FFFFFF" w:themeColor="background1"/>
+              <w:right w:val="single" w:sz="4" w:space="0" w:color="FFFFFF" w:themeColor="background1"/>
+            </w:tcBorders>
           </w:tcPr>
           <w:p>
             <w:pPr>
@@ -4115,6 +4741,12 @@
         <w:tc>
           <w:tcPr>
             <w:tcW w:w="5902" w:type="dxa"/>
+            <w:tcBorders>
+              <w:top w:val="single" w:sz="4" w:space="0" w:color="FFFFFF" w:themeColor="background1"/>
+              <w:left w:val="single" w:sz="4" w:space="0" w:color="FFFFFF" w:themeColor="background1"/>
+              <w:bottom w:val="single" w:sz="4" w:space="0" w:color="FFFFFF" w:themeColor="background1"/>
+              <w:right w:val="single" w:sz="4" w:space="0" w:color="FFFFFF" w:themeColor="background1"/>
+            </w:tcBorders>
           </w:tcPr>
           <w:p>
             <w:pPr>
@@ -4140,6 +4772,11 @@
         <w:tc>
           <w:tcPr>
             <w:tcW w:w="3114" w:type="dxa"/>
+            <w:tcBorders>
+              <w:top w:val="single" w:sz="4" w:space="0" w:color="FFFFFF" w:themeColor="background1"/>
+              <w:left w:val="single" w:sz="4" w:space="0" w:color="FFFFFF" w:themeColor="background1"/>
+              <w:right w:val="single" w:sz="4" w:space="0" w:color="FFFFFF" w:themeColor="background1"/>
+            </w:tcBorders>
           </w:tcPr>
           <w:p>
             <w:pPr>
@@ -4163,6 +4800,11 @@
         <w:tc>
           <w:tcPr>
             <w:tcW w:w="5902" w:type="dxa"/>
+            <w:tcBorders>
+              <w:top w:val="single" w:sz="4" w:space="0" w:color="FFFFFF" w:themeColor="background1"/>
+              <w:left w:val="single" w:sz="4" w:space="0" w:color="FFFFFF" w:themeColor="background1"/>
+              <w:right w:val="single" w:sz="4" w:space="0" w:color="FFFFFF" w:themeColor="background1"/>
+            </w:tcBorders>
           </w:tcPr>
           <w:p>
             <w:pPr>
@@ -4173,13 +4815,77 @@
                 <w:szCs w:val="24"/>
               </w:rPr>
             </w:pPr>
-            <w:r>
-              <w:rPr>
-                <w:rFonts w:ascii="Arial" w:hAnsi="Arial" w:cs="Arial"/>
-                <w:sz w:val="24"/>
-                <w:szCs w:val="24"/>
-              </w:rPr>
-              <w:t>GestorCasos y ServicioReportes dependen de la interfaz RepositorioExpediente y no de RepositorioSQL; la base de datos puede cambiarse sin tocar la lógica de negocio.</w:t>
+            <w:proofErr w:type="spellStart"/>
+            <w:r>
+              <w:rPr>
+                <w:rFonts w:ascii="Arial" w:hAnsi="Arial" w:cs="Arial"/>
+                <w:sz w:val="24"/>
+                <w:szCs w:val="24"/>
+              </w:rPr>
+              <w:t>GestorCasos</w:t>
+            </w:r>
+            <w:proofErr w:type="spellEnd"/>
+            <w:r>
+              <w:rPr>
+                <w:rFonts w:ascii="Arial" w:hAnsi="Arial" w:cs="Arial"/>
+                <w:sz w:val="24"/>
+                <w:szCs w:val="24"/>
+              </w:rPr>
+              <w:t xml:space="preserve"> y </w:t>
+            </w:r>
+            <w:proofErr w:type="spellStart"/>
+            <w:r>
+              <w:rPr>
+                <w:rFonts w:ascii="Arial" w:hAnsi="Arial" w:cs="Arial"/>
+                <w:sz w:val="24"/>
+                <w:szCs w:val="24"/>
+              </w:rPr>
+              <w:t>ServicioReportes</w:t>
+            </w:r>
+            <w:proofErr w:type="spellEnd"/>
+            <w:r>
+              <w:rPr>
+                <w:rFonts w:ascii="Arial" w:hAnsi="Arial" w:cs="Arial"/>
+                <w:sz w:val="24"/>
+                <w:szCs w:val="24"/>
+              </w:rPr>
+              <w:t xml:space="preserve"> dependen de la interfaz </w:t>
+            </w:r>
+            <w:proofErr w:type="spellStart"/>
+            <w:r>
+              <w:rPr>
+                <w:rFonts w:ascii="Arial" w:hAnsi="Arial" w:cs="Arial"/>
+                <w:sz w:val="24"/>
+                <w:szCs w:val="24"/>
+              </w:rPr>
+              <w:t>RepositorioExpediente</w:t>
+            </w:r>
+            <w:proofErr w:type="spellEnd"/>
+            <w:r>
+              <w:rPr>
+                <w:rFonts w:ascii="Arial" w:hAnsi="Arial" w:cs="Arial"/>
+                <w:sz w:val="24"/>
+                <w:szCs w:val="24"/>
+              </w:rPr>
+              <w:t xml:space="preserve"> y no de </w:t>
+            </w:r>
+            <w:proofErr w:type="spellStart"/>
+            <w:r>
+              <w:rPr>
+                <w:rFonts w:ascii="Arial" w:hAnsi="Arial" w:cs="Arial"/>
+                <w:sz w:val="24"/>
+                <w:szCs w:val="24"/>
+              </w:rPr>
+              <w:t>RepositorioSQL</w:t>
+            </w:r>
+            <w:proofErr w:type="spellEnd"/>
+            <w:r>
+              <w:rPr>
+                <w:rFonts w:ascii="Arial" w:hAnsi="Arial" w:cs="Arial"/>
+                <w:sz w:val="24"/>
+                <w:szCs w:val="24"/>
+              </w:rPr>
+              <w:t>; la base de datos puede cambiarse sin tocar la lógica de negocio.</w:t>
             </w:r>
           </w:p>
         </w:tc>
@@ -4313,8 +5019,48 @@
     </w:p>
     <w:p>
       <w:pPr>
+        <w:pStyle w:val="Descripcin"/>
+        <w:rPr>
+          <w:rFonts w:ascii="Arial" w:hAnsi="Arial" w:cs="Arial"/>
+          <w:sz w:val="24"/>
+          <w:szCs w:val="24"/>
+          <w:lang w:eastAsia="es-EC"/>
+        </w:rPr>
+      </w:pPr>
+      <w:r>
+        <w:t xml:space="preserve">Figura </w:t>
+      </w:r>
+      <w:r>
+        <w:fldChar w:fldCharType="begin"/>
+      </w:r>
+      <w:r>
+        <w:instrText xml:space="preserve"> SEQ Figura \* ARABIC </w:instrText>
+      </w:r>
+      <w:r>
+        <w:fldChar w:fldCharType="separate"/>
+      </w:r>
+      <w:r>
+        <w:rPr>
+          <w:noProof/>
+        </w:rPr>
+        <w:t>3</w:t>
+      </w:r>
+      <w:r>
+        <w:rPr>
+          <w:noProof/>
+        </w:rPr>
+        <w:fldChar w:fldCharType="end"/>
+      </w:r>
+      <w:r>
+        <w:t xml:space="preserve">: </w:t>
+      </w:r>
+      <w:r>
+        <w:t>Arquitectura lógica en capas (MVC)</w:t>
+      </w:r>
+    </w:p>
+    <w:p>
+      <w:pPr>
         <w:spacing w:line="360" w:lineRule="auto"/>
-        <w:jc w:val="center"/>
         <w:rPr>
           <w:rFonts w:ascii="Arial" w:hAnsi="Arial" w:cs="Arial"/>
           <w:sz w:val="24"/>
@@ -4405,6 +5151,7 @@
           <w:lang w:eastAsia="es-EC"/>
         </w:rPr>
       </w:pPr>
+      <w:proofErr w:type="spellStart"/>
       <w:r>
         <w:rPr>
           <w:rFonts w:ascii="Arial" w:hAnsi="Arial" w:cs="Arial"/>
@@ -4416,6 +5163,7 @@
         </w:rPr>
         <w:t>Singleton</w:t>
       </w:r>
+      <w:proofErr w:type="spellEnd"/>
     </w:p>
     <w:p>
       <w:pPr>
@@ -4480,7 +5228,47 @@
           <w:szCs w:val="24"/>
           <w:lang w:eastAsia="es-EC"/>
         </w:rPr>
-        <w:t xml:space="preserve"> si cada controlador creara su propio GestorCasos, existirían varias listas de observadores y varias conexiones a datos, lo que generaría estados inconsistentes (por ejemplo, un voluntario que no recibe la notificación). Con Singleton, todo el sistema trabaja con el mismo gestor de casos y la misma conexión.</w:t>
+        <w:t xml:space="preserve"> si cada controlador creara su propio </w:t>
+      </w:r>
+      <w:proofErr w:type="spellStart"/>
+      <w:r>
+        <w:rPr>
+          <w:rFonts w:ascii="Arial" w:hAnsi="Arial" w:cs="Arial"/>
+          <w:sz w:val="24"/>
+          <w:szCs w:val="24"/>
+          <w:lang w:eastAsia="es-EC"/>
+        </w:rPr>
+        <w:t>GestorCasos</w:t>
+      </w:r>
+      <w:proofErr w:type="spellEnd"/>
+      <w:r>
+        <w:rPr>
+          <w:rFonts w:ascii="Arial" w:hAnsi="Arial" w:cs="Arial"/>
+          <w:sz w:val="24"/>
+          <w:szCs w:val="24"/>
+          <w:lang w:eastAsia="es-EC"/>
+        </w:rPr>
+        <w:t xml:space="preserve">, existirían varias listas de observadores y varias conexiones a datos, lo que generaría estados inconsistentes (por ejemplo, un voluntario que no recibe la notificación). Con </w:t>
+      </w:r>
+      <w:proofErr w:type="spellStart"/>
+      <w:r>
+        <w:rPr>
+          <w:rFonts w:ascii="Arial" w:hAnsi="Arial" w:cs="Arial"/>
+          <w:sz w:val="24"/>
+          <w:szCs w:val="24"/>
+          <w:lang w:eastAsia="es-EC"/>
+        </w:rPr>
+        <w:t>Singleton</w:t>
+      </w:r>
+      <w:proofErr w:type="spellEnd"/>
+      <w:r>
+        <w:rPr>
+          <w:rFonts w:ascii="Arial" w:hAnsi="Arial" w:cs="Arial"/>
+          <w:sz w:val="24"/>
+          <w:szCs w:val="24"/>
+          <w:lang w:eastAsia="es-EC"/>
+        </w:rPr>
+        <w:t>, todo el sistema trabaja con el mismo gestor de casos y la misma conexión.</w:t>
       </w:r>
     </w:p>
     <w:p>
@@ -4514,7 +5302,58 @@
           <w:szCs w:val="24"/>
           <w:lang w:eastAsia="es-EC"/>
         </w:rPr>
-        <w:t xml:space="preserve"> la clase GestorCasos tiene un constructor privado y se obtiene mediante getInstancia().</w:t>
+        <w:t xml:space="preserve"> la clase </w:t>
+      </w:r>
+      <w:proofErr w:type="spellStart"/>
+      <w:r>
+        <w:rPr>
+          <w:rFonts w:ascii="Arial" w:hAnsi="Arial" w:cs="Arial"/>
+          <w:sz w:val="24"/>
+          <w:szCs w:val="24"/>
+          <w:lang w:eastAsia="es-EC"/>
+        </w:rPr>
+        <w:t>GestorCasos</w:t>
+      </w:r>
+      <w:proofErr w:type="spellEnd"/>
+      <w:r>
+        <w:rPr>
+          <w:rFonts w:ascii="Arial" w:hAnsi="Arial" w:cs="Arial"/>
+          <w:sz w:val="24"/>
+          <w:szCs w:val="24"/>
+          <w:lang w:eastAsia="es-EC"/>
+        </w:rPr>
+        <w:t xml:space="preserve"> tiene un constructor privado y se obtiene mediante </w:t>
+      </w:r>
+      <w:proofErr w:type="spellStart"/>
+      <w:proofErr w:type="gramStart"/>
+      <w:r>
+        <w:rPr>
+          <w:rFonts w:ascii="Arial" w:hAnsi="Arial" w:cs="Arial"/>
+          <w:sz w:val="24"/>
+          <w:szCs w:val="24"/>
+          <w:lang w:eastAsia="es-EC"/>
+        </w:rPr>
+        <w:t>getInstancia</w:t>
+      </w:r>
+      <w:proofErr w:type="spellEnd"/>
+      <w:r>
+        <w:rPr>
+          <w:rFonts w:ascii="Arial" w:hAnsi="Arial" w:cs="Arial"/>
+          <w:sz w:val="24"/>
+          <w:szCs w:val="24"/>
+          <w:lang w:eastAsia="es-EC"/>
+        </w:rPr>
+        <w:t>(</w:t>
+      </w:r>
+      <w:proofErr w:type="gramEnd"/>
+      <w:r>
+        <w:rPr>
+          <w:rFonts w:ascii="Arial" w:hAnsi="Arial" w:cs="Arial"/>
+          <w:sz w:val="24"/>
+          <w:szCs w:val="24"/>
+          <w:lang w:eastAsia="es-EC"/>
+        </w:rPr>
+        <w:t>).</w:t>
       </w:r>
     </w:p>
     <w:p>
@@ -4561,6 +5400,7 @@
           <w:lang w:eastAsia="es-EC"/>
         </w:rPr>
       </w:pPr>
+      <w:proofErr w:type="spellStart"/>
       <w:r>
         <w:rPr>
           <w:rFonts w:ascii="Arial" w:hAnsi="Arial" w:cs="Arial"/>
@@ -4572,6 +5412,7 @@
         </w:rPr>
         <w:t>Observer</w:t>
       </w:r>
+      <w:proofErr w:type="spellEnd"/>
     </w:p>
     <w:p>
       <w:pPr>
@@ -4634,7 +5475,27 @@
           <w:szCs w:val="24"/>
           <w:lang w:eastAsia="es-EC"/>
         </w:rPr>
-        <w:t xml:space="preserve"> cuando ingresa un nuevo rescate, los voluntarios deben enterarse de inmediato, sin que el gestor conozca cada tipo de voluntario ni consulte periódicamente la base de datos. GestorCasos actúa como Sujeto y Voluntario y Veterinario como Observadores; es la base de un comportamiento reactivo.</w:t>
+        <w:t xml:space="preserve"> cuando ingresa un nuevo rescate, los voluntarios deben enterarse de inmediato, sin que el gestor conozca cada tipo de voluntario ni consulte periódicamente la base de datos. </w:t>
+      </w:r>
+      <w:proofErr w:type="spellStart"/>
+      <w:r>
+        <w:rPr>
+          <w:rFonts w:ascii="Arial" w:hAnsi="Arial" w:cs="Arial"/>
+          <w:sz w:val="24"/>
+          <w:szCs w:val="24"/>
+          <w:lang w:eastAsia="es-EC"/>
+        </w:rPr>
+        <w:t>GestorCasos</w:t>
+      </w:r>
+      <w:proofErr w:type="spellEnd"/>
+      <w:r>
+        <w:rPr>
+          <w:rFonts w:ascii="Arial" w:hAnsi="Arial" w:cs="Arial"/>
+          <w:sz w:val="24"/>
+          <w:szCs w:val="24"/>
+          <w:lang w:eastAsia="es-EC"/>
+        </w:rPr>
+        <w:t xml:space="preserve"> actúa como Sujeto y Voluntario y Veterinario como Observadores; es la base de un comportamiento reactivo.</w:t>
       </w:r>
     </w:p>
     <w:p>
@@ -4743,7 +5604,47 @@
           <w:szCs w:val="24"/>
           <w:lang w:eastAsia="es-EC"/>
         </w:rPr>
-        <w:t xml:space="preserve"> cada especie requiere un expediente con datos distintos (raza y tamaño para perros, esterilización para gatos, permiso ambiental para fauna silvestre). Sin una fábrica, GestorCasos llenaría su código de condicionales if/else por especie y habría que modificarlo cada vez que se agregue una nueva. Con Factory Method, cada fábrica concreta crea su expediente y el gestor solo conoce la clase abstracta.</w:t>
+        <w:t xml:space="preserve"> cada especie requiere un expediente con datos distintos (raza y tamaño para perros, esterilización para gatos, permiso ambiental para fauna silvestre). Sin una fábrica, </w:t>
+      </w:r>
+      <w:proofErr w:type="spellStart"/>
+      <w:r>
+        <w:rPr>
+          <w:rFonts w:ascii="Arial" w:hAnsi="Arial" w:cs="Arial"/>
+          <w:sz w:val="24"/>
+          <w:szCs w:val="24"/>
+          <w:lang w:eastAsia="es-EC"/>
+        </w:rPr>
+        <w:t>GestorCasos</w:t>
+      </w:r>
+      <w:proofErr w:type="spellEnd"/>
+      <w:r>
+        <w:rPr>
+          <w:rFonts w:ascii="Arial" w:hAnsi="Arial" w:cs="Arial"/>
+          <w:sz w:val="24"/>
+          <w:szCs w:val="24"/>
+          <w:lang w:eastAsia="es-EC"/>
+        </w:rPr>
+        <w:t xml:space="preserve"> llenaría su código de condicionales if/</w:t>
+      </w:r>
+      <w:proofErr w:type="spellStart"/>
+      <w:r>
+        <w:rPr>
+          <w:rFonts w:ascii="Arial" w:hAnsi="Arial" w:cs="Arial"/>
+          <w:sz w:val="24"/>
+          <w:szCs w:val="24"/>
+          <w:lang w:eastAsia="es-EC"/>
+        </w:rPr>
+        <w:t>else</w:t>
+      </w:r>
+      <w:proofErr w:type="spellEnd"/>
+      <w:r>
+        <w:rPr>
+          <w:rFonts w:ascii="Arial" w:hAnsi="Arial" w:cs="Arial"/>
+          <w:sz w:val="24"/>
+          <w:szCs w:val="24"/>
+          <w:lang w:eastAsia="es-EC"/>
+        </w:rPr>
+        <w:t xml:space="preserve"> por especie y habría que modificarlo cada vez que se agregue una nueva. Con Factory Method, cada fábrica concreta crea su expediente y el gestor solo conoce la clase abstracta.</w:t>
       </w:r>
     </w:p>
     <w:p>
@@ -4786,7 +5687,31 @@
           <w:szCs w:val="24"/>
           <w:lang w:eastAsia="es-EC"/>
         </w:rPr>
-        <w:t>MVC (Model-View-Controller)</w:t>
+        <w:t>MVC (Model-View-</w:t>
+      </w:r>
+      <w:proofErr w:type="spellStart"/>
+      <w:r>
+        <w:rPr>
+          <w:rFonts w:ascii="Arial" w:hAnsi="Arial" w:cs="Arial"/>
+          <w:b/>
+          <w:bCs/>
+          <w:sz w:val="24"/>
+          <w:szCs w:val="24"/>
+          <w:lang w:eastAsia="es-EC"/>
+        </w:rPr>
+        <w:t>Controller</w:t>
+      </w:r>
+      <w:proofErr w:type="spellEnd"/>
+      <w:r>
+        <w:rPr>
+          <w:rFonts w:ascii="Arial" w:hAnsi="Arial" w:cs="Arial"/>
+          <w:b/>
+          <w:bCs/>
+          <w:sz w:val="24"/>
+          <w:szCs w:val="24"/>
+          <w:lang w:eastAsia="es-EC"/>
+        </w:rPr>
+        <w:t>)</w:t>
       </w:r>
     </w:p>
     <w:p>
@@ -4852,7 +5777,67 @@
           <w:szCs w:val="24"/>
           <w:lang w:eastAsia="es-EC"/>
         </w:rPr>
-        <w:t>evita mezclar la interfaz con las reglas del refugio. El ciudadano, el voluntario y el administrador pueden tener vistas distintas (web o móvil) que reutilizan el mismo modelo, lo que mejora la mantenibilidad y la escalabilidad. CasoController recibe la acción, invoca a GestorCasos (modelo) y actualiza VistaCaso.</w:t>
+        <w:t xml:space="preserve">evita mezclar la interfaz con las reglas del refugio. El ciudadano, el voluntario y el administrador pueden tener vistas distintas (web o móvil) que reutilizan el mismo modelo, lo que mejora la mantenibilidad y la escalabilidad. </w:t>
+      </w:r>
+      <w:proofErr w:type="spellStart"/>
+      <w:r>
+        <w:rPr>
+          <w:rFonts w:ascii="Arial" w:hAnsi="Arial" w:cs="Arial"/>
+          <w:sz w:val="24"/>
+          <w:szCs w:val="24"/>
+          <w:lang w:eastAsia="es-EC"/>
+        </w:rPr>
+        <w:t>CasoController</w:t>
+      </w:r>
+      <w:proofErr w:type="spellEnd"/>
+      <w:r>
+        <w:rPr>
+          <w:rFonts w:ascii="Arial" w:hAnsi="Arial" w:cs="Arial"/>
+          <w:sz w:val="24"/>
+          <w:szCs w:val="24"/>
+          <w:lang w:eastAsia="es-EC"/>
+        </w:rPr>
+        <w:t xml:space="preserve"> recibe la acción, invoca a </w:t>
+      </w:r>
+      <w:proofErr w:type="spellStart"/>
+      <w:r>
+        <w:rPr>
+          <w:rFonts w:ascii="Arial" w:hAnsi="Arial" w:cs="Arial"/>
+          <w:sz w:val="24"/>
+          <w:szCs w:val="24"/>
+          <w:lang w:eastAsia="es-EC"/>
+        </w:rPr>
+        <w:t>GestorCasos</w:t>
+      </w:r>
+      <w:proofErr w:type="spellEnd"/>
+      <w:r>
+        <w:rPr>
+          <w:rFonts w:ascii="Arial" w:hAnsi="Arial" w:cs="Arial"/>
+          <w:sz w:val="24"/>
+          <w:szCs w:val="24"/>
+          <w:lang w:eastAsia="es-EC"/>
+        </w:rPr>
+        <w:t xml:space="preserve"> (modelo) y actualiza </w:t>
+      </w:r>
+      <w:proofErr w:type="spellStart"/>
+      <w:r>
+        <w:rPr>
+          <w:rFonts w:ascii="Arial" w:hAnsi="Arial" w:cs="Arial"/>
+          <w:sz w:val="24"/>
+          <w:szCs w:val="24"/>
+          <w:lang w:eastAsia="es-EC"/>
+        </w:rPr>
+        <w:t>VistaCaso</w:t>
+      </w:r>
+      <w:proofErr w:type="spellEnd"/>
+      <w:r>
+        <w:rPr>
+          <w:rFonts w:ascii="Arial" w:hAnsi="Arial" w:cs="Arial"/>
+          <w:sz w:val="24"/>
+          <w:szCs w:val="24"/>
+          <w:lang w:eastAsia="es-EC"/>
+        </w:rPr>
+        <w:t>.</w:t>
       </w:r>
     </w:p>
     <w:p>
@@ -4913,6 +5898,10 @@
         <w:tc>
           <w:tcPr>
             <w:tcW w:w="2263" w:type="dxa"/>
+            <w:tcBorders>
+              <w:left w:val="single" w:sz="4" w:space="0" w:color="FFFFFF" w:themeColor="background1"/>
+              <w:right w:val="single" w:sz="4" w:space="0" w:color="FFFFFF" w:themeColor="background1"/>
+            </w:tcBorders>
           </w:tcPr>
           <w:p>
             <w:pPr>
@@ -4943,6 +5932,10 @@
         <w:tc>
           <w:tcPr>
             <w:tcW w:w="3686" w:type="dxa"/>
+            <w:tcBorders>
+              <w:left w:val="single" w:sz="4" w:space="0" w:color="FFFFFF" w:themeColor="background1"/>
+              <w:right w:val="single" w:sz="4" w:space="0" w:color="FFFFFF" w:themeColor="background1"/>
+            </w:tcBorders>
           </w:tcPr>
           <w:p>
             <w:pPr>
@@ -4972,6 +5965,10 @@
         <w:tc>
           <w:tcPr>
             <w:tcW w:w="3067" w:type="dxa"/>
+            <w:tcBorders>
+              <w:left w:val="single" w:sz="4" w:space="0" w:color="FFFFFF" w:themeColor="background1"/>
+              <w:right w:val="single" w:sz="4" w:space="0" w:color="FFFFFF" w:themeColor="background1"/>
+            </w:tcBorders>
           </w:tcPr>
           <w:p>
             <w:pPr>
@@ -5003,6 +6000,11 @@
         <w:tc>
           <w:tcPr>
             <w:tcW w:w="2263" w:type="dxa"/>
+            <w:tcBorders>
+              <w:left w:val="single" w:sz="4" w:space="0" w:color="FFFFFF" w:themeColor="background1"/>
+              <w:bottom w:val="single" w:sz="4" w:space="0" w:color="FFFFFF" w:themeColor="background1"/>
+              <w:right w:val="single" w:sz="4" w:space="0" w:color="FFFFFF" w:themeColor="background1"/>
+            </w:tcBorders>
           </w:tcPr>
           <w:p>
             <w:pPr>
@@ -5014,6 +6016,7 @@
                 <w:szCs w:val="24"/>
               </w:rPr>
             </w:pPr>
+            <w:proofErr w:type="spellStart"/>
             <w:r>
               <w:rPr>
                 <w:rFonts w:ascii="Arial" w:hAnsi="Arial" w:cs="Arial"/>
@@ -5022,11 +6025,17 @@
               </w:rPr>
               <w:t>Singleton</w:t>
             </w:r>
+            <w:proofErr w:type="spellEnd"/>
           </w:p>
         </w:tc>
         <w:tc>
           <w:tcPr>
             <w:tcW w:w="3686" w:type="dxa"/>
+            <w:tcBorders>
+              <w:left w:val="single" w:sz="4" w:space="0" w:color="FFFFFF" w:themeColor="background1"/>
+              <w:bottom w:val="single" w:sz="4" w:space="0" w:color="FFFFFF" w:themeColor="background1"/>
+              <w:right w:val="single" w:sz="4" w:space="0" w:color="FFFFFF" w:themeColor="background1"/>
+            </w:tcBorders>
           </w:tcPr>
           <w:p>
             <w:pPr>
@@ -5038,6 +6047,7 @@
                 <w:szCs w:val="24"/>
               </w:rPr>
             </w:pPr>
+            <w:proofErr w:type="spellStart"/>
             <w:r>
               <w:rPr>
                 <w:rFonts w:ascii="Arial" w:hAnsi="Arial" w:cs="Arial"/>
@@ -5046,11 +6056,17 @@
               </w:rPr>
               <w:t>GestorCasos</w:t>
             </w:r>
+            <w:proofErr w:type="spellEnd"/>
           </w:p>
         </w:tc>
         <w:tc>
           <w:tcPr>
             <w:tcW w:w="3067" w:type="dxa"/>
+            <w:tcBorders>
+              <w:left w:val="single" w:sz="4" w:space="0" w:color="FFFFFF" w:themeColor="background1"/>
+              <w:bottom w:val="single" w:sz="4" w:space="0" w:color="FFFFFF" w:themeColor="background1"/>
+              <w:right w:val="single" w:sz="4" w:space="0" w:color="FFFFFF" w:themeColor="background1"/>
+            </w:tcBorders>
           </w:tcPr>
           <w:p>
             <w:pPr>
@@ -5077,6 +6093,12 @@
         <w:tc>
           <w:tcPr>
             <w:tcW w:w="2263" w:type="dxa"/>
+            <w:tcBorders>
+              <w:top w:val="single" w:sz="4" w:space="0" w:color="FFFFFF" w:themeColor="background1"/>
+              <w:left w:val="single" w:sz="4" w:space="0" w:color="FFFFFF" w:themeColor="background1"/>
+              <w:bottom w:val="single" w:sz="4" w:space="0" w:color="FFFFFF" w:themeColor="background1"/>
+              <w:right w:val="single" w:sz="4" w:space="0" w:color="FFFFFF" w:themeColor="background1"/>
+            </w:tcBorders>
           </w:tcPr>
           <w:p>
             <w:pPr>
@@ -5088,6 +6110,7 @@
                 <w:szCs w:val="24"/>
               </w:rPr>
             </w:pPr>
+            <w:proofErr w:type="spellStart"/>
             <w:r>
               <w:rPr>
                 <w:rFonts w:ascii="Arial" w:hAnsi="Arial" w:cs="Arial"/>
@@ -5096,11 +6119,18 @@
               </w:rPr>
               <w:t>Observer</w:t>
             </w:r>
+            <w:proofErr w:type="spellEnd"/>
           </w:p>
         </w:tc>
         <w:tc>
           <w:tcPr>
             <w:tcW w:w="3686" w:type="dxa"/>
+            <w:tcBorders>
+              <w:top w:val="single" w:sz="4" w:space="0" w:color="FFFFFF" w:themeColor="background1"/>
+              <w:left w:val="single" w:sz="4" w:space="0" w:color="FFFFFF" w:themeColor="background1"/>
+              <w:bottom w:val="single" w:sz="4" w:space="0" w:color="FFFFFF" w:themeColor="background1"/>
+              <w:right w:val="single" w:sz="4" w:space="0" w:color="FFFFFF" w:themeColor="background1"/>
+            </w:tcBorders>
           </w:tcPr>
           <w:p>
             <w:pPr>
@@ -5118,13 +6148,37 @@
                 <w:sz w:val="24"/>
                 <w:szCs w:val="24"/>
               </w:rPr>
-              <w:t>Sujeto, Observador, GestorCasos, Voluntario, Veterinario</w:t>
+              <w:t xml:space="preserve">Sujeto, Observador, </w:t>
+            </w:r>
+            <w:proofErr w:type="spellStart"/>
+            <w:r>
+              <w:rPr>
+                <w:rFonts w:ascii="Arial" w:hAnsi="Arial" w:cs="Arial"/>
+                <w:sz w:val="24"/>
+                <w:szCs w:val="24"/>
+              </w:rPr>
+              <w:t>GestorCasos</w:t>
+            </w:r>
+            <w:proofErr w:type="spellEnd"/>
+            <w:r>
+              <w:rPr>
+                <w:rFonts w:ascii="Arial" w:hAnsi="Arial" w:cs="Arial"/>
+                <w:sz w:val="24"/>
+                <w:szCs w:val="24"/>
+              </w:rPr>
+              <w:t>, Voluntario, Veterinario</w:t>
             </w:r>
           </w:p>
         </w:tc>
         <w:tc>
           <w:tcPr>
             <w:tcW w:w="3067" w:type="dxa"/>
+            <w:tcBorders>
+              <w:top w:val="single" w:sz="4" w:space="0" w:color="FFFFFF" w:themeColor="background1"/>
+              <w:left w:val="single" w:sz="4" w:space="0" w:color="FFFFFF" w:themeColor="background1"/>
+              <w:bottom w:val="single" w:sz="4" w:space="0" w:color="FFFFFF" w:themeColor="background1"/>
+              <w:right w:val="single" w:sz="4" w:space="0" w:color="FFFFFF" w:themeColor="background1"/>
+            </w:tcBorders>
           </w:tcPr>
           <w:p>
             <w:pPr>
@@ -5151,6 +6205,12 @@
         <w:tc>
           <w:tcPr>
             <w:tcW w:w="2263" w:type="dxa"/>
+            <w:tcBorders>
+              <w:top w:val="single" w:sz="4" w:space="0" w:color="FFFFFF" w:themeColor="background1"/>
+              <w:left w:val="single" w:sz="4" w:space="0" w:color="FFFFFF" w:themeColor="background1"/>
+              <w:bottom w:val="single" w:sz="4" w:space="0" w:color="FFFFFF" w:themeColor="background1"/>
+              <w:right w:val="single" w:sz="4" w:space="0" w:color="FFFFFF" w:themeColor="background1"/>
+            </w:tcBorders>
           </w:tcPr>
           <w:p>
             <w:pPr>
@@ -5191,6 +6251,12 @@
         <w:tc>
           <w:tcPr>
             <w:tcW w:w="3686" w:type="dxa"/>
+            <w:tcBorders>
+              <w:top w:val="single" w:sz="4" w:space="0" w:color="FFFFFF" w:themeColor="background1"/>
+              <w:left w:val="single" w:sz="4" w:space="0" w:color="FFFFFF" w:themeColor="background1"/>
+              <w:bottom w:val="single" w:sz="4" w:space="0" w:color="FFFFFF" w:themeColor="background1"/>
+              <w:right w:val="single" w:sz="4" w:space="0" w:color="FFFFFF" w:themeColor="background1"/>
+            </w:tcBorders>
           </w:tcPr>
           <w:p>
             <w:pPr>
@@ -5202,19 +6268,35 @@
                 <w:szCs w:val="24"/>
               </w:rPr>
             </w:pPr>
-            <w:r>
-              <w:rPr>
-                <w:rFonts w:ascii="Arial" w:hAnsi="Arial" w:cs="Arial"/>
-                <w:sz w:val="24"/>
-                <w:szCs w:val="24"/>
-              </w:rPr>
-              <w:t>FabricaExpediente, fábricas concretas, Expediente y subclases</w:t>
+            <w:proofErr w:type="spellStart"/>
+            <w:r>
+              <w:rPr>
+                <w:rFonts w:ascii="Arial" w:hAnsi="Arial" w:cs="Arial"/>
+                <w:sz w:val="24"/>
+                <w:szCs w:val="24"/>
+              </w:rPr>
+              <w:t>FabricaExpediente</w:t>
+            </w:r>
+            <w:proofErr w:type="spellEnd"/>
+            <w:r>
+              <w:rPr>
+                <w:rFonts w:ascii="Arial" w:hAnsi="Arial" w:cs="Arial"/>
+                <w:sz w:val="24"/>
+                <w:szCs w:val="24"/>
+              </w:rPr>
+              <w:t>, fábricas concretas, Expediente y subclases</w:t>
             </w:r>
           </w:p>
         </w:tc>
         <w:tc>
           <w:tcPr>
             <w:tcW w:w="3067" w:type="dxa"/>
+            <w:tcBorders>
+              <w:top w:val="single" w:sz="4" w:space="0" w:color="FFFFFF" w:themeColor="background1"/>
+              <w:left w:val="single" w:sz="4" w:space="0" w:color="FFFFFF" w:themeColor="background1"/>
+              <w:bottom w:val="single" w:sz="4" w:space="0" w:color="FFFFFF" w:themeColor="background1"/>
+              <w:right w:val="single" w:sz="4" w:space="0" w:color="FFFFFF" w:themeColor="background1"/>
+            </w:tcBorders>
           </w:tcPr>
           <w:p>
             <w:pPr>
@@ -5241,6 +6323,11 @@
         <w:tc>
           <w:tcPr>
             <w:tcW w:w="2263" w:type="dxa"/>
+            <w:tcBorders>
+              <w:top w:val="single" w:sz="4" w:space="0" w:color="FFFFFF" w:themeColor="background1"/>
+              <w:left w:val="single" w:sz="4" w:space="0" w:color="FFFFFF" w:themeColor="background1"/>
+              <w:right w:val="single" w:sz="4" w:space="0" w:color="FFFFFF" w:themeColor="background1"/>
+            </w:tcBorders>
           </w:tcPr>
           <w:p>
             <w:pPr>
@@ -5265,6 +6352,11 @@
         <w:tc>
           <w:tcPr>
             <w:tcW w:w="3686" w:type="dxa"/>
+            <w:tcBorders>
+              <w:top w:val="single" w:sz="4" w:space="0" w:color="FFFFFF" w:themeColor="background1"/>
+              <w:left w:val="single" w:sz="4" w:space="0" w:color="FFFFFF" w:themeColor="background1"/>
+              <w:right w:val="single" w:sz="4" w:space="0" w:color="FFFFFF" w:themeColor="background1"/>
+            </w:tcBorders>
           </w:tcPr>
           <w:p>
             <w:pPr>
@@ -5276,19 +6368,70 @@
                 <w:szCs w:val="24"/>
               </w:rPr>
             </w:pPr>
-            <w:r>
-              <w:rPr>
-                <w:rFonts w:ascii="Arial" w:hAnsi="Arial" w:cs="Arial"/>
-                <w:sz w:val="24"/>
-                <w:szCs w:val="24"/>
-              </w:rPr>
-              <w:t>VistaCaso, CasoController, GestorCasos, Expediente</w:t>
+            <w:proofErr w:type="spellStart"/>
+            <w:r>
+              <w:rPr>
+                <w:rFonts w:ascii="Arial" w:hAnsi="Arial" w:cs="Arial"/>
+                <w:sz w:val="24"/>
+                <w:szCs w:val="24"/>
+              </w:rPr>
+              <w:t>VistaCaso</w:t>
+            </w:r>
+            <w:proofErr w:type="spellEnd"/>
+            <w:r>
+              <w:rPr>
+                <w:rFonts w:ascii="Arial" w:hAnsi="Arial" w:cs="Arial"/>
+                <w:sz w:val="24"/>
+                <w:szCs w:val="24"/>
+              </w:rPr>
+              <w:t xml:space="preserve">, </w:t>
+            </w:r>
+            <w:proofErr w:type="spellStart"/>
+            <w:r>
+              <w:rPr>
+                <w:rFonts w:ascii="Arial" w:hAnsi="Arial" w:cs="Arial"/>
+                <w:sz w:val="24"/>
+                <w:szCs w:val="24"/>
+              </w:rPr>
+              <w:t>CasoController</w:t>
+            </w:r>
+            <w:proofErr w:type="spellEnd"/>
+            <w:r>
+              <w:rPr>
+                <w:rFonts w:ascii="Arial" w:hAnsi="Arial" w:cs="Arial"/>
+                <w:sz w:val="24"/>
+                <w:szCs w:val="24"/>
+              </w:rPr>
+              <w:t xml:space="preserve">, </w:t>
+            </w:r>
+            <w:proofErr w:type="spellStart"/>
+            <w:r>
+              <w:rPr>
+                <w:rFonts w:ascii="Arial" w:hAnsi="Arial" w:cs="Arial"/>
+                <w:sz w:val="24"/>
+                <w:szCs w:val="24"/>
+              </w:rPr>
+              <w:t>GestorCasos</w:t>
+            </w:r>
+            <w:proofErr w:type="spellEnd"/>
+            <w:r>
+              <w:rPr>
+                <w:rFonts w:ascii="Arial" w:hAnsi="Arial" w:cs="Arial"/>
+                <w:sz w:val="24"/>
+                <w:szCs w:val="24"/>
+              </w:rPr>
+              <w:t>, Expediente</w:t>
             </w:r>
           </w:p>
         </w:tc>
         <w:tc>
           <w:tcPr>
             <w:tcW w:w="3067" w:type="dxa"/>
+            <w:tcBorders>
+              <w:top w:val="single" w:sz="4" w:space="0" w:color="FFFFFF" w:themeColor="background1"/>
+              <w:left w:val="single" w:sz="4" w:space="0" w:color="FFFFFF" w:themeColor="background1"/>
+              <w:right w:val="single" w:sz="4" w:space="0" w:color="FFFFFF" w:themeColor="background1"/>
+            </w:tcBorders>
           </w:tcPr>
           <w:p>
             <w:pPr>
@@ -5418,7 +6561,27 @@
           <w:szCs w:val="24"/>
           <w:lang w:eastAsia="es-EC"/>
         </w:rPr>
-        <w:t xml:space="preserve">Repositorio Gitflow:   </w:t>
+        <w:t xml:space="preserve">Repositorio </w:t>
+      </w:r>
+      <w:proofErr w:type="spellStart"/>
+      <w:r>
+        <w:rPr>
+          <w:rFonts w:ascii="Arial" w:hAnsi="Arial" w:cs="Arial"/>
+          <w:sz w:val="24"/>
+          <w:szCs w:val="24"/>
+          <w:lang w:eastAsia="es-EC"/>
+        </w:rPr>
+        <w:t>Gitflow</w:t>
+      </w:r>
+      <w:proofErr w:type="spellEnd"/>
+      <w:r>
+        <w:rPr>
+          <w:rFonts w:ascii="Arial" w:hAnsi="Arial" w:cs="Arial"/>
+          <w:sz w:val="24"/>
+          <w:szCs w:val="24"/>
+          <w:lang w:eastAsia="es-EC"/>
+        </w:rPr>
+        <w:t xml:space="preserve">:   </w:t>
       </w:r>
     </w:p>
     <w:p>
@@ -5443,7 +6606,7 @@
             <w:szCs w:val="24"/>
             <w:lang w:eastAsia="es-EC"/>
           </w:rPr>
-          <w:t>https://github.com/kcarlosama2687/Carlosama_Daniela_actividad1/commits?author=kcarlosama2687</w:t>
+          <w:t>https://github.com/kcarlosama2687/Carlosama_Daniela_actividad1</w:t>
         </w:r>
       </w:hyperlink>
     </w:p>
@@ -5467,7 +6630,27 @@
           <w:szCs w:val="24"/>
           <w:lang w:eastAsia="es-EC"/>
         </w:rPr>
-        <w:t>Repositorio Lucidchart:</w:t>
+        <w:t xml:space="preserve">Repositorio </w:t>
+      </w:r>
+      <w:proofErr w:type="spellStart"/>
+      <w:r>
+        <w:rPr>
+          <w:rFonts w:ascii="Arial" w:hAnsi="Arial" w:cs="Arial"/>
+          <w:sz w:val="24"/>
+          <w:szCs w:val="24"/>
+          <w:lang w:eastAsia="es-EC"/>
+        </w:rPr>
+        <w:t>Lucidchart</w:t>
+      </w:r>
+      <w:proofErr w:type="spellEnd"/>
+      <w:r>
+        <w:rPr>
+          <w:rFonts w:ascii="Arial" w:hAnsi="Arial" w:cs="Arial"/>
+          <w:sz w:val="24"/>
+          <w:szCs w:val="24"/>
+          <w:lang w:eastAsia="es-EC"/>
+        </w:rPr>
+        <w:t>:</w:t>
       </w:r>
       <w:r>
         <w:rPr>
@@ -5501,7 +6684,7 @@
             <w:szCs w:val="24"/>
             <w:lang w:eastAsia="es-EC"/>
           </w:rPr>
-          <w:t>https://lucid.app/lucidchart/a5145e66-8b38-4236-8b97-27203eff7fcf/edit?viewport_loc=181%2C-211%2C2834%2C1486%2CHWEp-vi-RSFO&amp;invitationId=inv_238da3fc-1d2b-446e-96ce-19013efc0b9d</w:t>
+          <w:t>https://lucid.app/lucidchart/a5145e66-8b38-4236-8b97-27203eff7fcf/edit?viewport_loc=-894%2C-901%2C4606%2C2415%2CHWEp-vi-RSFO&amp;invitationId=inv_238da3fc-1d2b-446e-96ce-19013efc0b9d</w:t>
         </w:r>
       </w:hyperlink>
     </w:p>
@@ -5546,8 +6729,21 @@
           <w:szCs w:val="24"/>
           <w:lang w:eastAsia="es-EC"/>
         </w:rPr>
-        <w:t>Justificación del uso de Gitflow</w:t>
-      </w:r>
+        <w:t xml:space="preserve">Justificación del uso de </w:t>
+      </w:r>
+      <w:proofErr w:type="spellStart"/>
+      <w:r>
+        <w:rPr>
+          <w:rFonts w:ascii="Arial" w:hAnsi="Arial" w:cs="Arial"/>
+          <w:b/>
+          <w:bCs/>
+          <w:sz w:val="24"/>
+          <w:szCs w:val="24"/>
+          <w:lang w:eastAsia="es-EC"/>
+        </w:rPr>
+        <w:t>Gitflow</w:t>
+      </w:r>
+      <w:proofErr w:type="spellEnd"/>
     </w:p>
     <w:p>
       <w:pPr>
@@ -5561,14 +6757,25 @@
           <w:lang w:eastAsia="es-EC"/>
         </w:rPr>
       </w:pPr>
-      <w:r>
-        <w:rPr>
-          <w:rFonts w:ascii="Arial" w:hAnsi="Arial" w:cs="Arial"/>
-          <w:sz w:val="24"/>
-          <w:szCs w:val="24"/>
-          <w:lang w:eastAsia="es-EC"/>
-        </w:rPr>
-        <w:t>Gitflow define un modelo de ramas con roles claros, lo que lo hace adecuado para este proyecto por las siguientes razones:</w:t>
+      <w:proofErr w:type="spellStart"/>
+      <w:r>
+        <w:rPr>
+          <w:rFonts w:ascii="Arial" w:hAnsi="Arial" w:cs="Arial"/>
+          <w:sz w:val="24"/>
+          <w:szCs w:val="24"/>
+          <w:lang w:eastAsia="es-EC"/>
+        </w:rPr>
+        <w:t>Gitflow</w:t>
+      </w:r>
+      <w:proofErr w:type="spellEnd"/>
+      <w:r>
+        <w:rPr>
+          <w:rFonts w:ascii="Arial" w:hAnsi="Arial" w:cs="Arial"/>
+          <w:sz w:val="24"/>
+          <w:szCs w:val="24"/>
+          <w:lang w:eastAsia="es-EC"/>
+        </w:rPr>
+        <w:t xml:space="preserve"> define un modelo de ramas con roles claros, lo que lo hace adecuado para este proyecto por las siguientes razones:</w:t>
       </w:r>
     </w:p>
     <w:p>
@@ -5594,7 +6801,27 @@
           <w:szCs w:val="24"/>
           <w:lang w:eastAsia="es-EC"/>
         </w:rPr>
-        <w:t>Aislamiento del trabajo: cada patrón o módulo se desarrolla en su propia rama feature/, sin afectar el código estable.</w:t>
+        <w:t xml:space="preserve">Aislamiento del trabajo: cada patrón o módulo se desarrolla en su propia rama </w:t>
+      </w:r>
+      <w:proofErr w:type="spellStart"/>
+      <w:r>
+        <w:rPr>
+          <w:rFonts w:ascii="Arial" w:hAnsi="Arial" w:cs="Arial"/>
+          <w:sz w:val="24"/>
+          <w:szCs w:val="24"/>
+          <w:lang w:eastAsia="es-EC"/>
+        </w:rPr>
+        <w:t>feature</w:t>
+      </w:r>
+      <w:proofErr w:type="spellEnd"/>
+      <w:r>
+        <w:rPr>
+          <w:rFonts w:ascii="Arial" w:hAnsi="Arial" w:cs="Arial"/>
+          <w:sz w:val="24"/>
+          <w:szCs w:val="24"/>
+          <w:lang w:eastAsia="es-EC"/>
+        </w:rPr>
+        <w:t>/, sin afectar el código estable.</w:t>
       </w:r>
     </w:p>
     <w:p>
@@ -5620,7 +6847,27 @@
           <w:szCs w:val="24"/>
           <w:lang w:eastAsia="es-EC"/>
         </w:rPr>
-        <w:t>Trazabilidad: el historial de ramas y commits muestra qué se desarrolló, cuándo y con qué propósito.</w:t>
+        <w:t xml:space="preserve">Trazabilidad: el historial de ramas y </w:t>
+      </w:r>
+      <w:proofErr w:type="spellStart"/>
+      <w:r>
+        <w:rPr>
+          <w:rFonts w:ascii="Arial" w:hAnsi="Arial" w:cs="Arial"/>
+          <w:sz w:val="24"/>
+          <w:szCs w:val="24"/>
+          <w:lang w:eastAsia="es-EC"/>
+        </w:rPr>
+        <w:t>commits</w:t>
+      </w:r>
+      <w:proofErr w:type="spellEnd"/>
+      <w:r>
+        <w:rPr>
+          <w:rFonts w:ascii="Arial" w:hAnsi="Arial" w:cs="Arial"/>
+          <w:sz w:val="24"/>
+          <w:szCs w:val="24"/>
+          <w:lang w:eastAsia="es-EC"/>
+        </w:rPr>
+        <w:t xml:space="preserve"> muestra qué se desarrolló, cuándo y con qué propósito.</w:t>
       </w:r>
     </w:p>
     <w:p>
@@ -5646,8 +6893,36 @@
           <w:szCs w:val="24"/>
           <w:lang w:eastAsia="es-EC"/>
         </w:rPr>
-        <w:lastRenderedPageBreak/>
-        <w:t>Versiones estables: master contiene únicamente versiones probadas y etiquetadas.</w:t>
+        <w:t xml:space="preserve">Versiones estables: </w:t>
+      </w:r>
+      <w:proofErr w:type="spellStart"/>
+      <w:r>
+        <w:rPr>
+          <w:rFonts w:ascii="Arial" w:hAnsi="Arial" w:cs="Arial"/>
+          <w:sz w:val="24"/>
+          <w:szCs w:val="24"/>
+          <w:lang w:eastAsia="es-EC"/>
+        </w:rPr>
+        <w:t>ma</w:t>
+      </w:r>
+      <w:r>
+        <w:rPr>
+          <w:rFonts w:ascii="Arial" w:hAnsi="Arial" w:cs="Arial"/>
+          <w:sz w:val="24"/>
+          <w:szCs w:val="24"/>
+          <w:lang w:eastAsia="es-EC"/>
+        </w:rPr>
+        <w:t>in</w:t>
+      </w:r>
+      <w:proofErr w:type="spellEnd"/>
+      <w:r>
+        <w:rPr>
+          <w:rFonts w:ascii="Arial" w:hAnsi="Arial" w:cs="Arial"/>
+          <w:sz w:val="24"/>
+          <w:szCs w:val="24"/>
+          <w:lang w:eastAsia="es-EC"/>
+        </w:rPr>
+        <w:t xml:space="preserve"> contiene únicamente versiones probadas y etiquetadas.</w:t>
       </w:r>
     </w:p>
     <w:p>
@@ -5673,7 +6948,68 @@
           <w:szCs w:val="24"/>
           <w:lang w:eastAsia="es-EC"/>
         </w:rPr>
-        <w:t>Integración controlada: develop concentra el trabajo terminado mediante Pull Request antes de pasar a una versión.</w:t>
+        <w:lastRenderedPageBreak/>
+        <w:t xml:space="preserve">Integración controlada: </w:t>
+      </w:r>
+      <w:proofErr w:type="spellStart"/>
+      <w:r>
+        <w:rPr>
+          <w:rFonts w:ascii="Arial" w:hAnsi="Arial" w:cs="Arial"/>
+          <w:sz w:val="24"/>
+          <w:szCs w:val="24"/>
+          <w:lang w:eastAsia="es-EC"/>
+        </w:rPr>
+        <w:t>develop</w:t>
+      </w:r>
+      <w:proofErr w:type="spellEnd"/>
+      <w:r>
+        <w:rPr>
+          <w:rFonts w:ascii="Arial" w:hAnsi="Arial" w:cs="Arial"/>
+          <w:sz w:val="24"/>
+          <w:szCs w:val="24"/>
+          <w:lang w:eastAsia="es-EC"/>
+        </w:rPr>
+        <w:t xml:space="preserve"> concentra el trabajo terminado mediante </w:t>
+      </w:r>
+      <w:proofErr w:type="spellStart"/>
+      <w:r>
+        <w:rPr>
+          <w:rFonts w:ascii="Arial" w:hAnsi="Arial" w:cs="Arial"/>
+          <w:sz w:val="24"/>
+          <w:szCs w:val="24"/>
+          <w:lang w:eastAsia="es-EC"/>
+        </w:rPr>
+        <w:t>Pull</w:t>
+      </w:r>
+      <w:proofErr w:type="spellEnd"/>
+      <w:r>
+        <w:rPr>
+          <w:rFonts w:ascii="Arial" w:hAnsi="Arial" w:cs="Arial"/>
+          <w:sz w:val="24"/>
+          <w:szCs w:val="24"/>
+          <w:lang w:eastAsia="es-EC"/>
+        </w:rPr>
+        <w:t xml:space="preserve"> </w:t>
+      </w:r>
+      <w:proofErr w:type="spellStart"/>
+      <w:r>
+        <w:rPr>
+          <w:rFonts w:ascii="Arial" w:hAnsi="Arial" w:cs="Arial"/>
+          <w:sz w:val="24"/>
+          <w:szCs w:val="24"/>
+          <w:lang w:eastAsia="es-EC"/>
+        </w:rPr>
+        <w:t>Request</w:t>
+      </w:r>
+      <w:proofErr w:type="spellEnd"/>
+      <w:r>
+        <w:rPr>
+          <w:rFonts w:ascii="Arial" w:hAnsi="Arial" w:cs="Arial"/>
+          <w:sz w:val="24"/>
+          <w:szCs w:val="24"/>
+          <w:lang w:eastAsia="es-EC"/>
+        </w:rPr>
+        <w:t xml:space="preserve"> antes de pasar a una versión.</w:t>
       </w:r>
     </w:p>
     <w:p>
@@ -5760,6 +7096,10 @@
         <w:tc>
           <w:tcPr>
             <w:tcW w:w="2900" w:type="dxa"/>
+            <w:tcBorders>
+              <w:left w:val="single" w:sz="4" w:space="0" w:color="FFFFFF" w:themeColor="background1"/>
+              <w:right w:val="single" w:sz="4" w:space="0" w:color="FFFFFF" w:themeColor="background1"/>
+            </w:tcBorders>
           </w:tcPr>
           <w:p>
             <w:pPr>
@@ -5788,6 +7128,10 @@
         <w:tc>
           <w:tcPr>
             <w:tcW w:w="6126" w:type="dxa"/>
+            <w:tcBorders>
+              <w:left w:val="single" w:sz="4" w:space="0" w:color="FFFFFF" w:themeColor="background1"/>
+              <w:right w:val="single" w:sz="4" w:space="0" w:color="FFFFFF" w:themeColor="background1"/>
+            </w:tcBorders>
           </w:tcPr>
           <w:p>
             <w:pPr>
@@ -5818,6 +7162,11 @@
         <w:tc>
           <w:tcPr>
             <w:tcW w:w="2900" w:type="dxa"/>
+            <w:tcBorders>
+              <w:left w:val="single" w:sz="4" w:space="0" w:color="FFFFFF" w:themeColor="background1"/>
+              <w:bottom w:val="single" w:sz="4" w:space="0" w:color="FFFFFF" w:themeColor="background1"/>
+              <w:right w:val="single" w:sz="4" w:space="0" w:color="FFFFFF" w:themeColor="background1"/>
+            </w:tcBorders>
           </w:tcPr>
           <w:p>
             <w:pPr>
@@ -5828,6 +7177,7 @@
                 <w:szCs w:val="24"/>
               </w:rPr>
             </w:pPr>
+            <w:proofErr w:type="spellStart"/>
             <w:r>
               <w:rPr>
                 <w:rFonts w:ascii="Arial" w:eastAsia="Arial" w:hAnsi="Arial" w:cs="Arial"/>
@@ -5835,13 +7185,28 @@
                 <w:sz w:val="24"/>
                 <w:szCs w:val="24"/>
               </w:rPr>
-              <w:t>master</w:t>
-            </w:r>
+              <w:t>ma</w:t>
+            </w:r>
+            <w:r>
+              <w:rPr>
+                <w:rFonts w:ascii="Arial" w:eastAsia="Arial" w:hAnsi="Arial" w:cs="Arial"/>
+                <w:color w:val="000000"/>
+                <w:sz w:val="24"/>
+                <w:szCs w:val="24"/>
+              </w:rPr>
+              <w:t>in</w:t>
+            </w:r>
+            <w:proofErr w:type="spellEnd"/>
           </w:p>
         </w:tc>
         <w:tc>
           <w:tcPr>
             <w:tcW w:w="6126" w:type="dxa"/>
+            <w:tcBorders>
+              <w:left w:val="single" w:sz="4" w:space="0" w:color="FFFFFF" w:themeColor="background1"/>
+              <w:bottom w:val="single" w:sz="4" w:space="0" w:color="FFFFFF" w:themeColor="background1"/>
+              <w:right w:val="single" w:sz="4" w:space="0" w:color="FFFFFF" w:themeColor="background1"/>
+            </w:tcBorders>
           </w:tcPr>
           <w:p>
             <w:pPr>
@@ -5859,7 +7224,27 @@
                 <w:sz w:val="24"/>
                 <w:szCs w:val="24"/>
               </w:rPr>
-              <w:t>Versión estable y publicada del sistema. Cada merge se etiqueta (v0.1.0, v1.0.0).</w:t>
+              <w:t xml:space="preserve">Versión estable y publicada del sistema. Cada </w:t>
+            </w:r>
+            <w:proofErr w:type="spellStart"/>
+            <w:r>
+              <w:rPr>
+                <w:rFonts w:ascii="Arial" w:eastAsia="Arial" w:hAnsi="Arial" w:cs="Arial"/>
+                <w:color w:val="000000"/>
+                <w:sz w:val="24"/>
+                <w:szCs w:val="24"/>
+              </w:rPr>
+              <w:t>merge</w:t>
+            </w:r>
+            <w:proofErr w:type="spellEnd"/>
+            <w:r>
+              <w:rPr>
+                <w:rFonts w:ascii="Arial" w:eastAsia="Arial" w:hAnsi="Arial" w:cs="Arial"/>
+                <w:color w:val="000000"/>
+                <w:sz w:val="24"/>
+                <w:szCs w:val="24"/>
+              </w:rPr>
+              <w:t xml:space="preserve"> se etiqueta (v0.1.0, v1.0.0).</w:t>
             </w:r>
           </w:p>
         </w:tc>
@@ -5868,6 +7253,12 @@
         <w:tc>
           <w:tcPr>
             <w:tcW w:w="2900" w:type="dxa"/>
+            <w:tcBorders>
+              <w:top w:val="single" w:sz="4" w:space="0" w:color="FFFFFF" w:themeColor="background1"/>
+              <w:left w:val="single" w:sz="4" w:space="0" w:color="FFFFFF" w:themeColor="background1"/>
+              <w:bottom w:val="single" w:sz="4" w:space="0" w:color="FFFFFF" w:themeColor="background1"/>
+              <w:right w:val="single" w:sz="4" w:space="0" w:color="FFFFFF" w:themeColor="background1"/>
+            </w:tcBorders>
           </w:tcPr>
           <w:p>
             <w:pPr>
@@ -5878,6 +7269,7 @@
                 <w:szCs w:val="24"/>
               </w:rPr>
             </w:pPr>
+            <w:proofErr w:type="spellStart"/>
             <w:r>
               <w:rPr>
                 <w:rFonts w:ascii="Arial" w:eastAsia="Arial" w:hAnsi="Arial" w:cs="Arial"/>
@@ -5887,11 +7279,18 @@
               </w:rPr>
               <w:t>develop</w:t>
             </w:r>
+            <w:proofErr w:type="spellEnd"/>
           </w:p>
         </w:tc>
         <w:tc>
           <w:tcPr>
             <w:tcW w:w="6126" w:type="dxa"/>
+            <w:tcBorders>
+              <w:top w:val="single" w:sz="4" w:space="0" w:color="FFFFFF" w:themeColor="background1"/>
+              <w:left w:val="single" w:sz="4" w:space="0" w:color="FFFFFF" w:themeColor="background1"/>
+              <w:bottom w:val="single" w:sz="4" w:space="0" w:color="FFFFFF" w:themeColor="background1"/>
+              <w:right w:val="single" w:sz="4" w:space="0" w:color="FFFFFF" w:themeColor="background1"/>
+            </w:tcBorders>
           </w:tcPr>
           <w:p>
             <w:pPr>
@@ -5918,6 +7317,12 @@
         <w:tc>
           <w:tcPr>
             <w:tcW w:w="2900" w:type="dxa"/>
+            <w:tcBorders>
+              <w:top w:val="single" w:sz="4" w:space="0" w:color="FFFFFF" w:themeColor="background1"/>
+              <w:left w:val="single" w:sz="4" w:space="0" w:color="FFFFFF" w:themeColor="background1"/>
+              <w:bottom w:val="single" w:sz="4" w:space="0" w:color="FFFFFF" w:themeColor="background1"/>
+              <w:right w:val="single" w:sz="4" w:space="0" w:color="FFFFFF" w:themeColor="background1"/>
+            </w:tcBorders>
           </w:tcPr>
           <w:p>
             <w:pPr>
@@ -5928,6 +7333,7 @@
                 <w:szCs w:val="24"/>
               </w:rPr>
             </w:pPr>
+            <w:proofErr w:type="spellStart"/>
             <w:r>
               <w:rPr>
                 <w:rFonts w:ascii="Arial" w:eastAsia="Arial" w:hAnsi="Arial" w:cs="Arial"/>
@@ -5935,13 +7341,49 @@
                 <w:sz w:val="24"/>
                 <w:szCs w:val="24"/>
               </w:rPr>
-              <w:t>feature/singleton-gestor</w:t>
+              <w:t>feature</w:t>
+            </w:r>
+            <w:proofErr w:type="spellEnd"/>
+            <w:r>
+              <w:rPr>
+                <w:rFonts w:ascii="Arial" w:eastAsia="Arial" w:hAnsi="Arial" w:cs="Arial"/>
+                <w:color w:val="000000"/>
+                <w:sz w:val="24"/>
+                <w:szCs w:val="24"/>
+              </w:rPr>
+              <w:t>/</w:t>
+            </w:r>
+            <w:proofErr w:type="spellStart"/>
+            <w:r>
+              <w:rPr>
+                <w:rFonts w:ascii="Arial" w:eastAsia="Arial" w:hAnsi="Arial" w:cs="Arial"/>
+                <w:color w:val="000000"/>
+                <w:sz w:val="24"/>
+                <w:szCs w:val="24"/>
+              </w:rPr>
+              <w:t>singleton</w:t>
+            </w:r>
+            <w:proofErr w:type="spellEnd"/>
+            <w:r>
+              <w:rPr>
+                <w:rFonts w:ascii="Arial" w:eastAsia="Arial" w:hAnsi="Arial" w:cs="Arial"/>
+                <w:color w:val="000000"/>
+                <w:sz w:val="24"/>
+                <w:szCs w:val="24"/>
+              </w:rPr>
+              <w:t>-gestor</w:t>
             </w:r>
           </w:p>
         </w:tc>
         <w:tc>
           <w:tcPr>
             <w:tcW w:w="6126" w:type="dxa"/>
+            <w:tcBorders>
+              <w:top w:val="single" w:sz="4" w:space="0" w:color="FFFFFF" w:themeColor="background1"/>
+              <w:left w:val="single" w:sz="4" w:space="0" w:color="FFFFFF" w:themeColor="background1"/>
+              <w:bottom w:val="single" w:sz="4" w:space="0" w:color="FFFFFF" w:themeColor="background1"/>
+              <w:right w:val="single" w:sz="4" w:space="0" w:color="FFFFFF" w:themeColor="background1"/>
+            </w:tcBorders>
           </w:tcPr>
           <w:p>
             <w:pPr>
@@ -5959,7 +7401,47 @@
                 <w:sz w:val="24"/>
                 <w:szCs w:val="24"/>
               </w:rPr>
-              <w:t>Implementación de GestorCasos como Singleton.</w:t>
+              <w:t xml:space="preserve">Implementación de </w:t>
+            </w:r>
+            <w:proofErr w:type="spellStart"/>
+            <w:r>
+              <w:rPr>
+                <w:rFonts w:ascii="Arial" w:eastAsia="Arial" w:hAnsi="Arial" w:cs="Arial"/>
+                <w:color w:val="000000"/>
+                <w:sz w:val="24"/>
+                <w:szCs w:val="24"/>
+              </w:rPr>
+              <w:t>GestorCasos</w:t>
+            </w:r>
+            <w:proofErr w:type="spellEnd"/>
+            <w:r>
+              <w:rPr>
+                <w:rFonts w:ascii="Arial" w:eastAsia="Arial" w:hAnsi="Arial" w:cs="Arial"/>
+                <w:color w:val="000000"/>
+                <w:sz w:val="24"/>
+                <w:szCs w:val="24"/>
+              </w:rPr>
+              <w:t xml:space="preserve"> como </w:t>
+            </w:r>
+            <w:proofErr w:type="spellStart"/>
+            <w:r>
+              <w:rPr>
+                <w:rFonts w:ascii="Arial" w:eastAsia="Arial" w:hAnsi="Arial" w:cs="Arial"/>
+                <w:color w:val="000000"/>
+                <w:sz w:val="24"/>
+                <w:szCs w:val="24"/>
+              </w:rPr>
+              <w:t>Singleton</w:t>
+            </w:r>
+            <w:proofErr w:type="spellEnd"/>
+            <w:r>
+              <w:rPr>
+                <w:rFonts w:ascii="Arial" w:eastAsia="Arial" w:hAnsi="Arial" w:cs="Arial"/>
+                <w:color w:val="000000"/>
+                <w:sz w:val="24"/>
+                <w:szCs w:val="24"/>
+              </w:rPr>
+              <w:t>.</w:t>
             </w:r>
           </w:p>
         </w:tc>
@@ -5968,6 +7450,12 @@
         <w:tc>
           <w:tcPr>
             <w:tcW w:w="2900" w:type="dxa"/>
+            <w:tcBorders>
+              <w:top w:val="single" w:sz="4" w:space="0" w:color="FFFFFF" w:themeColor="background1"/>
+              <w:left w:val="single" w:sz="4" w:space="0" w:color="FFFFFF" w:themeColor="background1"/>
+              <w:bottom w:val="single" w:sz="4" w:space="0" w:color="FFFFFF" w:themeColor="background1"/>
+              <w:right w:val="single" w:sz="4" w:space="0" w:color="FFFFFF" w:themeColor="background1"/>
+            </w:tcBorders>
           </w:tcPr>
           <w:p>
             <w:pPr>
@@ -5978,6 +7466,7 @@
                 <w:szCs w:val="24"/>
               </w:rPr>
             </w:pPr>
+            <w:proofErr w:type="spellStart"/>
             <w:r>
               <w:rPr>
                 <w:rFonts w:ascii="Arial" w:eastAsia="Arial" w:hAnsi="Arial" w:cs="Arial"/>
@@ -5985,13 +7474,49 @@
                 <w:sz w:val="24"/>
                 <w:szCs w:val="24"/>
               </w:rPr>
-              <w:t>feature/factory-expedientes</w:t>
+              <w:t>feature</w:t>
+            </w:r>
+            <w:proofErr w:type="spellEnd"/>
+            <w:r>
+              <w:rPr>
+                <w:rFonts w:ascii="Arial" w:eastAsia="Arial" w:hAnsi="Arial" w:cs="Arial"/>
+                <w:color w:val="000000"/>
+                <w:sz w:val="24"/>
+                <w:szCs w:val="24"/>
+              </w:rPr>
+              <w:t>/</w:t>
+            </w:r>
+            <w:proofErr w:type="spellStart"/>
+            <w:r>
+              <w:rPr>
+                <w:rFonts w:ascii="Arial" w:eastAsia="Arial" w:hAnsi="Arial" w:cs="Arial"/>
+                <w:color w:val="000000"/>
+                <w:sz w:val="24"/>
+                <w:szCs w:val="24"/>
+              </w:rPr>
+              <w:t>factory</w:t>
+            </w:r>
+            <w:proofErr w:type="spellEnd"/>
+            <w:r>
+              <w:rPr>
+                <w:rFonts w:ascii="Arial" w:eastAsia="Arial" w:hAnsi="Arial" w:cs="Arial"/>
+                <w:color w:val="000000"/>
+                <w:sz w:val="24"/>
+                <w:szCs w:val="24"/>
+              </w:rPr>
+              <w:t>-expedientes</w:t>
             </w:r>
           </w:p>
         </w:tc>
         <w:tc>
           <w:tcPr>
             <w:tcW w:w="6126" w:type="dxa"/>
+            <w:tcBorders>
+              <w:top w:val="single" w:sz="4" w:space="0" w:color="FFFFFF" w:themeColor="background1"/>
+              <w:left w:val="single" w:sz="4" w:space="0" w:color="FFFFFF" w:themeColor="background1"/>
+              <w:bottom w:val="single" w:sz="4" w:space="0" w:color="FFFFFF" w:themeColor="background1"/>
+              <w:right w:val="single" w:sz="4" w:space="0" w:color="FFFFFF" w:themeColor="background1"/>
+            </w:tcBorders>
           </w:tcPr>
           <w:p>
             <w:pPr>
@@ -6018,6 +7543,12 @@
         <w:tc>
           <w:tcPr>
             <w:tcW w:w="2900" w:type="dxa"/>
+            <w:tcBorders>
+              <w:top w:val="single" w:sz="4" w:space="0" w:color="FFFFFF" w:themeColor="background1"/>
+              <w:left w:val="single" w:sz="4" w:space="0" w:color="FFFFFF" w:themeColor="background1"/>
+              <w:bottom w:val="single" w:sz="4" w:space="0" w:color="FFFFFF" w:themeColor="background1"/>
+              <w:right w:val="single" w:sz="4" w:space="0" w:color="FFFFFF" w:themeColor="background1"/>
+            </w:tcBorders>
           </w:tcPr>
           <w:p>
             <w:pPr>
@@ -6028,6 +7559,7 @@
                 <w:szCs w:val="24"/>
               </w:rPr>
             </w:pPr>
+            <w:proofErr w:type="spellStart"/>
             <w:r>
               <w:rPr>
                 <w:rFonts w:ascii="Arial" w:eastAsia="Arial" w:hAnsi="Arial" w:cs="Arial"/>
@@ -6035,13 +7567,49 @@
                 <w:sz w:val="24"/>
                 <w:szCs w:val="24"/>
               </w:rPr>
-              <w:t>feature/observer-notificaciones</w:t>
+              <w:t>feature</w:t>
+            </w:r>
+            <w:proofErr w:type="spellEnd"/>
+            <w:r>
+              <w:rPr>
+                <w:rFonts w:ascii="Arial" w:eastAsia="Arial" w:hAnsi="Arial" w:cs="Arial"/>
+                <w:color w:val="000000"/>
+                <w:sz w:val="24"/>
+                <w:szCs w:val="24"/>
+              </w:rPr>
+              <w:t>/</w:t>
+            </w:r>
+            <w:proofErr w:type="spellStart"/>
+            <w:r>
+              <w:rPr>
+                <w:rFonts w:ascii="Arial" w:eastAsia="Arial" w:hAnsi="Arial" w:cs="Arial"/>
+                <w:color w:val="000000"/>
+                <w:sz w:val="24"/>
+                <w:szCs w:val="24"/>
+              </w:rPr>
+              <w:t>observer</w:t>
+            </w:r>
+            <w:proofErr w:type="spellEnd"/>
+            <w:r>
+              <w:rPr>
+                <w:rFonts w:ascii="Arial" w:eastAsia="Arial" w:hAnsi="Arial" w:cs="Arial"/>
+                <w:color w:val="000000"/>
+                <w:sz w:val="24"/>
+                <w:szCs w:val="24"/>
+              </w:rPr>
+              <w:t>-notificaciones</w:t>
             </w:r>
           </w:p>
         </w:tc>
         <w:tc>
           <w:tcPr>
             <w:tcW w:w="6126" w:type="dxa"/>
+            <w:tcBorders>
+              <w:top w:val="single" w:sz="4" w:space="0" w:color="FFFFFF" w:themeColor="background1"/>
+              <w:left w:val="single" w:sz="4" w:space="0" w:color="FFFFFF" w:themeColor="background1"/>
+              <w:bottom w:val="single" w:sz="4" w:space="0" w:color="FFFFFF" w:themeColor="background1"/>
+              <w:right w:val="single" w:sz="4" w:space="0" w:color="FFFFFF" w:themeColor="background1"/>
+            </w:tcBorders>
           </w:tcPr>
           <w:p>
             <w:pPr>
@@ -6068,6 +7636,12 @@
         <w:tc>
           <w:tcPr>
             <w:tcW w:w="2900" w:type="dxa"/>
+            <w:tcBorders>
+              <w:top w:val="single" w:sz="4" w:space="0" w:color="FFFFFF" w:themeColor="background1"/>
+              <w:left w:val="single" w:sz="4" w:space="0" w:color="FFFFFF" w:themeColor="background1"/>
+              <w:bottom w:val="single" w:sz="4" w:space="0" w:color="FFFFFF" w:themeColor="background1"/>
+              <w:right w:val="single" w:sz="4" w:space="0" w:color="FFFFFF" w:themeColor="background1"/>
+            </w:tcBorders>
           </w:tcPr>
           <w:p>
             <w:pPr>
@@ -6078,6 +7652,7 @@
                 <w:szCs w:val="24"/>
               </w:rPr>
             </w:pPr>
+            <w:proofErr w:type="spellStart"/>
             <w:r>
               <w:rPr>
                 <w:rFonts w:ascii="Arial" w:eastAsia="Arial" w:hAnsi="Arial" w:cs="Arial"/>
@@ -6085,13 +7660,49 @@
                 <w:sz w:val="24"/>
                 <w:szCs w:val="24"/>
               </w:rPr>
-              <w:t>feature/mvc-controlador</w:t>
+              <w:t>feature</w:t>
+            </w:r>
+            <w:proofErr w:type="spellEnd"/>
+            <w:r>
+              <w:rPr>
+                <w:rFonts w:ascii="Arial" w:eastAsia="Arial" w:hAnsi="Arial" w:cs="Arial"/>
+                <w:color w:val="000000"/>
+                <w:sz w:val="24"/>
+                <w:szCs w:val="24"/>
+              </w:rPr>
+              <w:t>/</w:t>
+            </w:r>
+            <w:proofErr w:type="spellStart"/>
+            <w:r>
+              <w:rPr>
+                <w:rFonts w:ascii="Arial" w:eastAsia="Arial" w:hAnsi="Arial" w:cs="Arial"/>
+                <w:color w:val="000000"/>
+                <w:sz w:val="24"/>
+                <w:szCs w:val="24"/>
+              </w:rPr>
+              <w:t>mvc</w:t>
+            </w:r>
+            <w:proofErr w:type="spellEnd"/>
+            <w:r>
+              <w:rPr>
+                <w:rFonts w:ascii="Arial" w:eastAsia="Arial" w:hAnsi="Arial" w:cs="Arial"/>
+                <w:color w:val="000000"/>
+                <w:sz w:val="24"/>
+                <w:szCs w:val="24"/>
+              </w:rPr>
+              <w:t>-controlador</w:t>
             </w:r>
           </w:p>
         </w:tc>
         <w:tc>
           <w:tcPr>
             <w:tcW w:w="6126" w:type="dxa"/>
+            <w:tcBorders>
+              <w:top w:val="single" w:sz="4" w:space="0" w:color="FFFFFF" w:themeColor="background1"/>
+              <w:left w:val="single" w:sz="4" w:space="0" w:color="FFFFFF" w:themeColor="background1"/>
+              <w:bottom w:val="single" w:sz="4" w:space="0" w:color="FFFFFF" w:themeColor="background1"/>
+              <w:right w:val="single" w:sz="4" w:space="0" w:color="FFFFFF" w:themeColor="background1"/>
+            </w:tcBorders>
           </w:tcPr>
           <w:p>
             <w:pPr>
@@ -6118,6 +7729,11 @@
         <w:tc>
           <w:tcPr>
             <w:tcW w:w="2900" w:type="dxa"/>
+            <w:tcBorders>
+              <w:top w:val="single" w:sz="4" w:space="0" w:color="FFFFFF" w:themeColor="background1"/>
+              <w:left w:val="single" w:sz="4" w:space="0" w:color="FFFFFF" w:themeColor="background1"/>
+              <w:right w:val="single" w:sz="4" w:space="0" w:color="FFFFFF" w:themeColor="background1"/>
+            </w:tcBorders>
           </w:tcPr>
           <w:p>
             <w:pPr>
@@ -6128,6 +7744,7 @@
                 <w:szCs w:val="24"/>
               </w:rPr>
             </w:pPr>
+            <w:proofErr w:type="spellStart"/>
             <w:r>
               <w:rPr>
                 <w:rFonts w:ascii="Arial" w:eastAsia="Arial" w:hAnsi="Arial" w:cs="Arial"/>
@@ -6135,13 +7752,28 @@
                 <w:sz w:val="24"/>
                 <w:szCs w:val="24"/>
               </w:rPr>
-              <w:t>release/1.0.0</w:t>
+              <w:t>release</w:t>
+            </w:r>
+            <w:proofErr w:type="spellEnd"/>
+            <w:r>
+              <w:rPr>
+                <w:rFonts w:ascii="Arial" w:eastAsia="Arial" w:hAnsi="Arial" w:cs="Arial"/>
+                <w:color w:val="000000"/>
+                <w:sz w:val="24"/>
+                <w:szCs w:val="24"/>
+              </w:rPr>
+              <w:t>/1.0.0</w:t>
             </w:r>
           </w:p>
         </w:tc>
         <w:tc>
           <w:tcPr>
             <w:tcW w:w="6126" w:type="dxa"/>
+            <w:tcBorders>
+              <w:top w:val="single" w:sz="4" w:space="0" w:color="FFFFFF" w:themeColor="background1"/>
+              <w:left w:val="single" w:sz="4" w:space="0" w:color="FFFFFF" w:themeColor="background1"/>
+              <w:right w:val="single" w:sz="4" w:space="0" w:color="FFFFFF" w:themeColor="background1"/>
+            </w:tcBorders>
           </w:tcPr>
           <w:p>
             <w:pPr>
@@ -6190,14 +7822,18 @@
         <w:jc w:val="both"/>
         <w:rPr>
           <w:rFonts w:ascii="Arial" w:hAnsi="Arial" w:cs="Arial"/>
-          <w:sz w:val="24"/>
-          <w:szCs w:val="24"/>
-          <w:lang w:eastAsia="es-EC"/>
-        </w:rPr>
-      </w:pPr>
-      <w:r>
-        <w:rPr>
-          <w:rFonts w:ascii="Arial" w:hAnsi="Arial" w:cs="Arial"/>
+          <w:b/>
+          <w:bCs/>
+          <w:sz w:val="24"/>
+          <w:szCs w:val="24"/>
+          <w:lang w:eastAsia="es-EC"/>
+        </w:rPr>
+      </w:pPr>
+      <w:r>
+        <w:rPr>
+          <w:rFonts w:ascii="Arial" w:hAnsi="Arial" w:cs="Arial"/>
+          <w:b/>
+          <w:bCs/>
           <w:sz w:val="24"/>
           <w:szCs w:val="24"/>
           <w:lang w:eastAsia="es-EC"/>
@@ -6247,14 +7883,45 @@
           <w:lang w:eastAsia="es-EC"/>
         </w:rPr>
       </w:pPr>
-      <w:r>
-        <w:rPr>
-          <w:rFonts w:ascii="Arial" w:hAnsi="Arial" w:cs="Arial"/>
-          <w:sz w:val="24"/>
-          <w:szCs w:val="24"/>
-          <w:lang w:eastAsia="es-EC"/>
-        </w:rPr>
-        <w:t>Singleton asegura un único gestor de casos; Observer automatiza la notificación a voluntarios; Factory Method simplifica la creación de expedientes por especie y MVC separa la interfaz de la lógica.</w:t>
+      <w:proofErr w:type="spellStart"/>
+      <w:r>
+        <w:rPr>
+          <w:rFonts w:ascii="Arial" w:hAnsi="Arial" w:cs="Arial"/>
+          <w:sz w:val="24"/>
+          <w:szCs w:val="24"/>
+          <w:lang w:eastAsia="es-EC"/>
+        </w:rPr>
+        <w:t>Singleton</w:t>
+      </w:r>
+      <w:proofErr w:type="spellEnd"/>
+      <w:r>
+        <w:rPr>
+          <w:rFonts w:ascii="Arial" w:hAnsi="Arial" w:cs="Arial"/>
+          <w:sz w:val="24"/>
+          <w:szCs w:val="24"/>
+          <w:lang w:eastAsia="es-EC"/>
+        </w:rPr>
+        <w:t xml:space="preserve"> asegura un único gestor de casos; </w:t>
+      </w:r>
+      <w:proofErr w:type="spellStart"/>
+      <w:r>
+        <w:rPr>
+          <w:rFonts w:ascii="Arial" w:hAnsi="Arial" w:cs="Arial"/>
+          <w:sz w:val="24"/>
+          <w:szCs w:val="24"/>
+          <w:lang w:eastAsia="es-EC"/>
+        </w:rPr>
+        <w:t>Observer</w:t>
+      </w:r>
+      <w:proofErr w:type="spellEnd"/>
+      <w:r>
+        <w:rPr>
+          <w:rFonts w:ascii="Arial" w:hAnsi="Arial" w:cs="Arial"/>
+          <w:sz w:val="24"/>
+          <w:szCs w:val="24"/>
+          <w:lang w:eastAsia="es-EC"/>
+        </w:rPr>
+        <w:t xml:space="preserve"> automatiza la notificación a voluntarios; Factory Method simplifica la creación de expedientes por especie y MVC separa la interfaz de la lógica.</w:t>
       </w:r>
     </w:p>
     <w:p>
@@ -6299,14 +7966,25 @@
           <w:lang w:eastAsia="es-EC"/>
         </w:rPr>
       </w:pPr>
-      <w:r>
-        <w:rPr>
-          <w:rFonts w:ascii="Arial" w:hAnsi="Arial" w:cs="Arial"/>
-          <w:sz w:val="24"/>
-          <w:szCs w:val="24"/>
-          <w:lang w:eastAsia="es-EC"/>
-        </w:rPr>
-        <w:t>Gitflow aporta orden y trazabilidad al desarrollo, y deja evidencia verificable del trabajo realizado en el repositorio.</w:t>
+      <w:proofErr w:type="spellStart"/>
+      <w:r>
+        <w:rPr>
+          <w:rFonts w:ascii="Arial" w:hAnsi="Arial" w:cs="Arial"/>
+          <w:sz w:val="24"/>
+          <w:szCs w:val="24"/>
+          <w:lang w:eastAsia="es-EC"/>
+        </w:rPr>
+        <w:t>Gitflow</w:t>
+      </w:r>
+      <w:proofErr w:type="spellEnd"/>
+      <w:r>
+        <w:rPr>
+          <w:rFonts w:ascii="Arial" w:hAnsi="Arial" w:cs="Arial"/>
+          <w:sz w:val="24"/>
+          <w:szCs w:val="24"/>
+          <w:lang w:eastAsia="es-EC"/>
+        </w:rPr>
+        <w:t xml:space="preserve"> aporta orden y trazabilidad al desarrollo, y deja evidencia verificable del trabajo realizado en el repositorio.</w:t>
       </w:r>
     </w:p>
     <w:p>
@@ -6332,7 +8010,6 @@
           <w:szCs w:val="24"/>
           <w:lang w:eastAsia="es-EC"/>
         </w:rPr>
-        <w:lastRenderedPageBreak/>
         <w:t>Evidencias</w:t>
       </w:r>
     </w:p>
@@ -6355,15 +8032,17 @@
           <w:rFonts w:ascii="Arial" w:hAnsi="Arial" w:cs="Arial"/>
           <w:b/>
           <w:bCs/>
-          <w:sz w:val="24"/>
-          <w:szCs w:val="24"/>
-          <w:lang w:eastAsia="es-EC"/>
-        </w:rPr>
+          <w:noProof/>
+          <w:sz w:val="24"/>
+          <w:szCs w:val="24"/>
+          <w:lang w:eastAsia="es-EC"/>
+        </w:rPr>
+        <w:lastRenderedPageBreak/>
         <w:drawing>
-          <wp:inline distT="0" distB="0" distL="0" distR="0" wp14:anchorId="00691407" wp14:editId="36A596C2">
-            <wp:extent cx="5731510" cy="4670425"/>
+          <wp:inline distT="0" distB="0" distL="0" distR="0" wp14:anchorId="634AAE67" wp14:editId="483E871D">
+            <wp:extent cx="5731510" cy="3797300"/>
             <wp:effectExtent l="0" t="0" r="2540" b="0"/>
-            <wp:docPr id="10" name="Imagen 10" descr="Texto&#10;&#10;Descripción generada automáticamente"/>
+            <wp:docPr id="2" name="Imagen 2" descr="Texto&#10;&#10;Descripción generada automáticamente"/>
             <wp:cNvGraphicFramePr>
               <a:graphicFrameLocks xmlns:a="http://schemas.openxmlformats.org/drawingml/2006/main" noChangeAspect="1"/>
             </wp:cNvGraphicFramePr>
@@ -6371,7 +8050,7 @@
               <a:graphicData uri="http://schemas.openxmlformats.org/drawingml/2006/picture">
                 <pic:pic xmlns:pic="http://schemas.openxmlformats.org/drawingml/2006/picture">
                   <pic:nvPicPr>
-                    <pic:cNvPr id="10" name="Imagen 10" descr="Texto&#10;&#10;Descripción generada automáticamente"/>
+                    <pic:cNvPr id="2" name="Imagen 2" descr="Texto&#10;&#10;Descripción generada automáticamente"/>
                     <pic:cNvPicPr/>
                   </pic:nvPicPr>
                   <pic:blipFill>
@@ -6383,7 +8062,7 @@
                   <pic:spPr>
                     <a:xfrm>
                       <a:off x="0" y="0"/>
-                      <a:ext cx="5731510" cy="4670425"/>
+                      <a:ext cx="5731510" cy="3797300"/>
                     </a:xfrm>
                     <a:prstGeom prst="rect">
                       <a:avLst/>
@@ -6398,6 +8077,63 @@
     </w:p>
     <w:p>
       <w:pPr>
+        <w:pStyle w:val="Descripcin"/>
+      </w:pPr>
+      <w:r>
+        <w:t xml:space="preserve">Figura </w:t>
+      </w:r>
+      <w:r>
+        <w:fldChar w:fldCharType="begin"/>
+      </w:r>
+      <w:r>
+        <w:instrText xml:space="preserve"> SEQ Figura \* ARABIC </w:instrText>
+      </w:r>
+      <w:r>
+        <w:fldChar w:fldCharType="separate"/>
+      </w:r>
+      <w:r>
+        <w:rPr>
+          <w:noProof/>
+        </w:rPr>
+        <w:t>4</w:t>
+      </w:r>
+      <w:r>
+        <w:rPr>
+          <w:noProof/>
+        </w:rPr>
+        <w:fldChar w:fldCharType="end"/>
+      </w:r>
+      <w:r>
+        <w:t xml:space="preserve">: </w:t>
+      </w:r>
+      <w:r>
+        <w:t xml:space="preserve">Historial de </w:t>
+      </w:r>
+      <w:proofErr w:type="spellStart"/>
+      <w:r>
+        <w:t>commits</w:t>
+      </w:r>
+      <w:proofErr w:type="spellEnd"/>
+      <w:r>
+        <w:t xml:space="preserve"> y </w:t>
+      </w:r>
+      <w:proofErr w:type="spellStart"/>
+      <w:r>
+        <w:t>merges</w:t>
+      </w:r>
+      <w:proofErr w:type="spellEnd"/>
+      <w:r>
+        <w:t xml:space="preserve"> en Git </w:t>
+      </w:r>
+      <w:proofErr w:type="spellStart"/>
+      <w:r>
+        <w:t>Bash</w:t>
+      </w:r>
+      <w:proofErr w:type="spellEnd"/>
+    </w:p>
+    <w:p/>
+    <w:p>
+      <w:pPr>
         <w:pStyle w:val="Sinespaciado"/>
         <w:spacing w:line="360" w:lineRule="auto"/>
         <w:jc w:val="both"/>
@@ -6415,15 +8151,16 @@
           <w:rFonts w:ascii="Arial" w:hAnsi="Arial" w:cs="Arial"/>
           <w:b/>
           <w:bCs/>
+          <w:noProof/>
           <w:sz w:val="24"/>
           <w:szCs w:val="24"/>
           <w:lang w:eastAsia="es-EC"/>
         </w:rPr>
         <w:drawing>
-          <wp:inline distT="0" distB="0" distL="0" distR="0" wp14:anchorId="56B30C19" wp14:editId="44734316">
-            <wp:extent cx="5731510" cy="2576195"/>
-            <wp:effectExtent l="0" t="0" r="2540" b="0"/>
-            <wp:docPr id="11" name="Imagen 11" descr="Interfaz de usuario gráfica, Texto, Aplicación, Correo electrónico&#10;&#10;Descripción generada automáticamente"/>
+          <wp:inline distT="0" distB="0" distL="0" distR="0" wp14:anchorId="1BEC08A4" wp14:editId="289BCF59">
+            <wp:extent cx="5731510" cy="2738120"/>
+            <wp:effectExtent l="0" t="0" r="2540" b="5080"/>
+            <wp:docPr id="4" name="Imagen 4" descr="Una captura de pantalla de una red social&#10;&#10;Descripción generada automáticamente"/>
             <wp:cNvGraphicFramePr>
               <a:graphicFrameLocks xmlns:a="http://schemas.openxmlformats.org/drawingml/2006/main" noChangeAspect="1"/>
             </wp:cNvGraphicFramePr>
@@ -6431,7 +8168,7 @@
               <a:graphicData uri="http://schemas.openxmlformats.org/drawingml/2006/picture">
                 <pic:pic xmlns:pic="http://schemas.openxmlformats.org/drawingml/2006/picture">
                   <pic:nvPicPr>
-                    <pic:cNvPr id="11" name="Imagen 11" descr="Interfaz de usuario gráfica, Texto, Aplicación, Correo electrónico&#10;&#10;Descripción generada automáticamente"/>
+                    <pic:cNvPr id="4" name="Imagen 4" descr="Una captura de pantalla de una red social&#10;&#10;Descripción generada automáticamente"/>
                     <pic:cNvPicPr/>
                   </pic:nvPicPr>
                   <pic:blipFill>
@@ -6443,7 +8180,7 @@
                   <pic:spPr>
                     <a:xfrm>
                       <a:off x="0" y="0"/>
-                      <a:ext cx="5731510" cy="2576195"/>
+                      <a:ext cx="5731510" cy="2738120"/>
                     </a:xfrm>
                     <a:prstGeom prst="rect">
                       <a:avLst/>
@@ -6458,33 +8195,82 @@
     </w:p>
     <w:p>
       <w:pPr>
-        <w:pStyle w:val="Sinespaciado"/>
-        <w:spacing w:line="360" w:lineRule="auto"/>
-        <w:jc w:val="both"/>
-        <w:rPr>
-          <w:rFonts w:ascii="Arial" w:hAnsi="Arial" w:cs="Arial"/>
-          <w:b/>
-          <w:bCs/>
-          <w:sz w:val="24"/>
-          <w:szCs w:val="24"/>
-          <w:lang w:eastAsia="es-EC"/>
-        </w:rPr>
-      </w:pPr>
-      <w:r>
-        <w:rPr>
-          <w:rFonts w:ascii="Arial" w:hAnsi="Arial" w:cs="Arial"/>
-          <w:b/>
-          <w:bCs/>
-          <w:sz w:val="24"/>
-          <w:szCs w:val="24"/>
-          <w:lang w:eastAsia="es-EC"/>
+        <w:pStyle w:val="Descripcin"/>
+      </w:pPr>
+      <w:r>
+        <w:t xml:space="preserve">Figura </w:t>
+      </w:r>
+      <w:r>
+        <w:fldChar w:fldCharType="begin"/>
+      </w:r>
+      <w:r>
+        <w:instrText xml:space="preserve"> SEQ Figura \* ARABIC </w:instrText>
+      </w:r>
+      <w:r>
+        <w:fldChar w:fldCharType="separate"/>
+      </w:r>
+      <w:r>
+        <w:rPr>
+          <w:noProof/>
+        </w:rPr>
+        <w:t>5</w:t>
+      </w:r>
+      <w:r>
+        <w:rPr>
+          <w:noProof/>
+        </w:rPr>
+        <w:fldChar w:fldCharType="end"/>
+      </w:r>
+      <w:r>
+        <w:t xml:space="preserve">: </w:t>
+      </w:r>
+      <w:r>
+        <w:t>Ramas del repositorio (</w:t>
+      </w:r>
+      <w:proofErr w:type="spellStart"/>
+      <w:r>
+        <w:t>main</w:t>
+      </w:r>
+      <w:proofErr w:type="spellEnd"/>
+      <w:r>
+        <w:t xml:space="preserve">, </w:t>
+      </w:r>
+      <w:proofErr w:type="spellStart"/>
+      <w:r>
+        <w:t>develop</w:t>
+      </w:r>
+      <w:proofErr w:type="spellEnd"/>
+      <w:r>
+        <w:t xml:space="preserve">, </w:t>
+      </w:r>
+      <w:proofErr w:type="spellStart"/>
+      <w:r>
+        <w:t>feature</w:t>
+      </w:r>
+      <w:proofErr w:type="spellEnd"/>
+      <w:r>
+        <w:t xml:space="preserve">, </w:t>
+      </w:r>
+      <w:proofErr w:type="spellStart"/>
+      <w:r>
+        <w:t>release</w:t>
+      </w:r>
+      <w:proofErr w:type="spellEnd"/>
+      <w:r>
+        <w:t>)</w:t>
+      </w:r>
+    </w:p>
+    <w:p>
+      <w:r>
+        <w:rPr>
+          <w:noProof/>
         </w:rPr>
         <w:lastRenderedPageBreak/>
         <w:drawing>
-          <wp:inline distT="0" distB="0" distL="0" distR="0" wp14:anchorId="7CC8F332" wp14:editId="59BD1F42">
-            <wp:extent cx="5731510" cy="2744470"/>
-            <wp:effectExtent l="0" t="0" r="2540" b="0"/>
-            <wp:docPr id="12" name="Imagen 12" descr="Diagrama, Dibujo de ingeniería&#10;&#10;Descripción generada automáticamente"/>
+          <wp:inline distT="0" distB="0" distL="0" distR="0" wp14:anchorId="45FF2E67" wp14:editId="23592371">
+            <wp:extent cx="5731510" cy="2735580"/>
+            <wp:effectExtent l="0" t="0" r="2540" b="7620"/>
+            <wp:docPr id="10" name="Imagen 10" descr="Interfaz de usuario gráfica, Texto, Aplicación, Correo electrónico  Descripción generada automáticamente"/>
             <wp:cNvGraphicFramePr>
               <a:graphicFrameLocks xmlns:a="http://schemas.openxmlformats.org/drawingml/2006/main" noChangeAspect="1"/>
             </wp:cNvGraphicFramePr>
@@ -6492,7 +8278,7 @@
               <a:graphicData uri="http://schemas.openxmlformats.org/drawingml/2006/picture">
                 <pic:pic xmlns:pic="http://schemas.openxmlformats.org/drawingml/2006/picture">
                   <pic:nvPicPr>
-                    <pic:cNvPr id="12" name="Imagen 12" descr="Diagrama, Dibujo de ingeniería&#10;&#10;Descripción generada automáticamente"/>
+                    <pic:cNvPr id="5" name="Imagen 5" descr="Interfaz de usuario gráfica, Texto, Aplicación, Correo electrónico  Descripción generada automáticamente"/>
                     <pic:cNvPicPr/>
                   </pic:nvPicPr>
                   <pic:blipFill>
@@ -6504,7 +8290,7 @@
                   <pic:spPr>
                     <a:xfrm>
                       <a:off x="0" y="0"/>
-                      <a:ext cx="5731510" cy="2744470"/>
+                      <a:ext cx="5731510" cy="2735580"/>
                     </a:xfrm>
                     <a:prstGeom prst="rect">
                       <a:avLst/>
@@ -6519,6 +8305,198 @@
     </w:p>
     <w:p>
       <w:pPr>
+        <w:pStyle w:val="Descripcin"/>
+      </w:pPr>
+      <w:r>
+        <w:t xml:space="preserve">Figura </w:t>
+      </w:r>
+      <w:r>
+        <w:fldChar w:fldCharType="begin"/>
+      </w:r>
+      <w:r>
+        <w:instrText xml:space="preserve"> SEQ Figura \* ARABIC </w:instrText>
+      </w:r>
+      <w:r>
+        <w:fldChar w:fldCharType="separate"/>
+      </w:r>
+      <w:r>
+        <w:rPr>
+          <w:noProof/>
+        </w:rPr>
+        <w:t>6</w:t>
+      </w:r>
+      <w:r>
+        <w:rPr>
+          <w:noProof/>
+        </w:rPr>
+        <w:fldChar w:fldCharType="end"/>
+      </w:r>
+      <w:r>
+        <w:t xml:space="preserve">: </w:t>
+      </w:r>
+      <w:r>
+        <w:t>Versión etiquetada v1.0.0</w:t>
+      </w:r>
+    </w:p>
+    <w:p/>
+    <w:p>
+      <w:r>
+        <w:drawing>
+          <wp:inline distT="0" distB="0" distL="0" distR="0" wp14:anchorId="482F472F" wp14:editId="4A5949E7">
+            <wp:extent cx="5731510" cy="2529840"/>
+            <wp:effectExtent l="0" t="0" r="2540" b="3810"/>
+            <wp:docPr id="11" name="Imagen 11" descr="Diagrama, Dibujo de ingeniería&#10;&#10;Descripción generada automáticamente"/>
+            <wp:cNvGraphicFramePr>
+              <a:graphicFrameLocks xmlns:a="http://schemas.openxmlformats.org/drawingml/2006/main" noChangeAspect="1"/>
+            </wp:cNvGraphicFramePr>
+            <a:graphic xmlns:a="http://schemas.openxmlformats.org/drawingml/2006/main">
+              <a:graphicData uri="http://schemas.openxmlformats.org/drawingml/2006/picture">
+                <pic:pic xmlns:pic="http://schemas.openxmlformats.org/drawingml/2006/picture">
+                  <pic:nvPicPr>
+                    <pic:cNvPr id="11" name="Imagen 11" descr="Diagrama, Dibujo de ingeniería&#10;&#10;Descripción generada automáticamente"/>
+                    <pic:cNvPicPr/>
+                  </pic:nvPicPr>
+                  <pic:blipFill>
+                    <a:blip r:embed="rId23"/>
+                    <a:stretch>
+                      <a:fillRect/>
+                    </a:stretch>
+                  </pic:blipFill>
+                  <pic:spPr>
+                    <a:xfrm>
+                      <a:off x="0" y="0"/>
+                      <a:ext cx="5731510" cy="2529840"/>
+                    </a:xfrm>
+                    <a:prstGeom prst="rect">
+                      <a:avLst/>
+                    </a:prstGeom>
+                  </pic:spPr>
+                </pic:pic>
+              </a:graphicData>
+            </a:graphic>
+          </wp:inline>
+        </w:drawing>
+      </w:r>
+    </w:p>
+    <w:p>
+      <w:pPr>
+        <w:pStyle w:val="Descripcin"/>
+        <w:rPr>
+          <w:lang w:val="en-US"/>
+        </w:rPr>
+      </w:pPr>
+      <w:proofErr w:type="spellStart"/>
+      <w:r>
+        <w:rPr>
+          <w:lang w:val="en-US"/>
+        </w:rPr>
+        <w:t>Figura</w:t>
+      </w:r>
+      <w:proofErr w:type="spellEnd"/>
+      <w:r>
+        <w:rPr>
+          <w:lang w:val="en-US"/>
+        </w:rPr>
+        <w:t xml:space="preserve"> </w:t>
+      </w:r>
+      <w:r>
+        <w:fldChar w:fldCharType="begin"/>
+      </w:r>
+      <w:r>
+        <w:rPr>
+          <w:lang w:val="en-US"/>
+        </w:rPr>
+        <w:instrText xml:space="preserve"> SEQ Figura \* ARABIC </w:instrText>
+      </w:r>
+      <w:r>
+        <w:fldChar w:fldCharType="separate"/>
+      </w:r>
+      <w:r>
+        <w:rPr>
+          <w:noProof/>
+          <w:lang w:val="en-US"/>
+        </w:rPr>
+        <w:t>7</w:t>
+      </w:r>
+      <w:r>
+        <w:rPr>
+          <w:noProof/>
+        </w:rPr>
+        <w:fldChar w:fldCharType="end"/>
+      </w:r>
+      <w:r>
+        <w:rPr>
+          <w:lang w:val="en-US"/>
+        </w:rPr>
+        <w:t xml:space="preserve">: </w:t>
+      </w:r>
+      <w:proofErr w:type="spellStart"/>
+      <w:r>
+        <w:rPr>
+          <w:lang w:val="en-US"/>
+        </w:rPr>
+        <w:t>Lucidchart</w:t>
+      </w:r>
+      <w:proofErr w:type="spellEnd"/>
+    </w:p>
+    <w:p>
+      <w:pPr>
+        <w:rPr>
+          <w:lang w:val="en-US"/>
+        </w:rPr>
+      </w:pPr>
+    </w:p>
+    <w:p>
+      <w:pPr>
+        <w:rPr>
+          <w:lang w:val="en-US"/>
+        </w:rPr>
+      </w:pPr>
+    </w:p>
+    <w:p>
+      <w:pPr>
+        <w:rPr>
+          <w:lang w:val="en-US"/>
+        </w:rPr>
+      </w:pPr>
+    </w:p>
+    <w:p>
+      <w:pPr>
+        <w:rPr>
+          <w:lang w:val="en-US"/>
+        </w:rPr>
+      </w:pPr>
+    </w:p>
+    <w:p>
+      <w:pPr>
+        <w:rPr>
+          <w:lang w:val="en-US"/>
+        </w:rPr>
+      </w:pPr>
+    </w:p>
+    <w:p>
+      <w:pPr>
+        <w:rPr>
+          <w:lang w:val="en-US"/>
+        </w:rPr>
+      </w:pPr>
+    </w:p>
+    <w:p>
+      <w:pPr>
+        <w:rPr>
+          <w:lang w:val="en-US"/>
+        </w:rPr>
+      </w:pPr>
+    </w:p>
+    <w:p>
+      <w:pPr>
+        <w:rPr>
+          <w:lang w:val="en-US"/>
+        </w:rPr>
+      </w:pPr>
+    </w:p>
+    <w:p>
+      <w:pPr>
         <w:pStyle w:val="Sinespaciado"/>
         <w:spacing w:line="360" w:lineRule="auto"/>
         <w:jc w:val="both"/>
@@ -6528,15 +8506,11 @@
           <w:bCs/>
           <w:sz w:val="24"/>
           <w:szCs w:val="24"/>
-          <w:lang w:eastAsia="es-EC"/>
-        </w:rPr>
-      </w:pPr>
-    </w:p>
-    <w:p>
-      <w:pPr>
-        <w:pStyle w:val="Sinespaciado"/>
-        <w:spacing w:line="360" w:lineRule="auto"/>
-        <w:jc w:val="both"/>
+          <w:lang w:val="en-US" w:eastAsia="es-EC"/>
+        </w:rPr>
+      </w:pPr>
+      <w:proofErr w:type="spellStart"/>
+      <w:r>
         <w:rPr>
           <w:rFonts w:ascii="Arial" w:hAnsi="Arial" w:cs="Arial"/>
           <w:b/>
@@ -6545,18 +8519,10 @@
           <w:szCs w:val="24"/>
           <w:lang w:val="en-US" w:eastAsia="es-EC"/>
         </w:rPr>
-      </w:pPr>
-      <w:r>
-        <w:rPr>
-          <w:rFonts w:ascii="Arial" w:hAnsi="Arial" w:cs="Arial"/>
-          <w:b/>
-          <w:bCs/>
-          <w:sz w:val="24"/>
-          <w:szCs w:val="24"/>
-          <w:lang w:val="en-US" w:eastAsia="es-EC"/>
-        </w:rPr>
+        <w:lastRenderedPageBreak/>
         <w:t>Bibliografía</w:t>
       </w:r>
+      <w:proofErr w:type="spellEnd"/>
     </w:p>
     <w:p>
       <w:pPr>
@@ -6571,7 +8537,23 @@
           <w:rFonts w:ascii="Arial" w:eastAsia="Arial" w:hAnsi="Arial" w:cs="Arial"/>
           <w:lang w:val="en-US"/>
         </w:rPr>
-        <w:t>Gamma, E., Helm, R., Johnson, R., &amp; Vlissides, J. (1994). Design Patterns: Elements of Reusable Object-Oriented Software. Addison-Wesley.</w:t>
+        <w:t xml:space="preserve">Gamma, E., Helm, R., Johnson, R., &amp; </w:t>
+      </w:r>
+      <w:proofErr w:type="spellStart"/>
+      <w:r>
+        <w:rPr>
+          <w:rFonts w:ascii="Arial" w:eastAsia="Arial" w:hAnsi="Arial" w:cs="Arial"/>
+          <w:lang w:val="en-US"/>
+        </w:rPr>
+        <w:t>Vlissides</w:t>
+      </w:r>
+      <w:proofErr w:type="spellEnd"/>
+      <w:r>
+        <w:rPr>
+          <w:rFonts w:ascii="Arial" w:eastAsia="Arial" w:hAnsi="Arial" w:cs="Arial"/>
+          <w:lang w:val="en-US"/>
+        </w:rPr>
+        <w:t>, J. (1994). Design Patterns: Elements of Reusable Object-Oriented Software. Addison-Wesley.</w:t>
       </w:r>
     </w:p>
     <w:p>
@@ -6618,11 +8600,19 @@
         </w:rPr>
         <w:t xml:space="preserve">Chacon, S., &amp; Straub, B. (2014). Pro Git (2.ª ed.). </w:t>
       </w:r>
+      <w:proofErr w:type="spellStart"/>
       <w:r>
         <w:rPr>
           <w:rFonts w:ascii="Arial" w:eastAsia="Arial" w:hAnsi="Arial" w:cs="Arial"/>
         </w:rPr>
-        <w:t>Apress.</w:t>
+        <w:t>Apress</w:t>
+      </w:r>
+      <w:proofErr w:type="spellEnd"/>
+      <w:r>
+        <w:rPr>
+          <w:rFonts w:ascii="Arial" w:eastAsia="Arial" w:hAnsi="Arial" w:cs="Arial"/>
+        </w:rPr>
+        <w:t>.</w:t>
       </w:r>
     </w:p>
     <w:p>
@@ -7589,7 +9579,7 @@
         <v:path o:extrusionok="f" gradientshapeok="t" o:connecttype="rect"/>
         <o:lock v:ext="edit" aspectratio="t"/>
       </v:shapetype>
-      <v:shape id="_x0000_i1297" type="#_x0000_t75" style="width:11.35pt;height:11.35pt" o:bullet="t">
+      <v:shape id="_x0000_i1057" type="#_x0000_t75" style="width:11.3pt;height:11.3pt" o:bullet="t">
         <v:imagedata r:id="rId1" o:title="mso3E28"/>
       </v:shape>
     </w:pict>
@@ -11062,6 +13052,7 @@
     <w:lsdException w:name="HTML Sample" w:semiHidden="1" w:unhideWhenUsed="1"/>
     <w:lsdException w:name="HTML Typewriter" w:semiHidden="1" w:unhideWhenUsed="1"/>
     <w:lsdException w:name="HTML Variable" w:semiHidden="1" w:unhideWhenUsed="1"/>
+    <w:lsdException w:name="Normal Table" w:semiHidden="1" w:unhideWhenUsed="1"/>
     <w:lsdException w:name="annotation subject" w:semiHidden="1" w:unhideWhenUsed="1"/>
     <w:lsdException w:name="No List" w:semiHidden="1" w:unhideWhenUsed="1"/>
     <w:lsdException w:name="Outline List 1" w:semiHidden="1" w:unhideWhenUsed="1"/>
@@ -11108,8 +13099,10 @@
     <w:lsdException w:name="Table Subtle 2" w:semiHidden="1" w:unhideWhenUsed="1"/>
     <w:lsdException w:name="Table Web 1" w:semiHidden="1" w:unhideWhenUsed="1"/>
     <w:lsdException w:name="Table Web 2" w:semiHidden="1" w:unhideWhenUsed="1"/>
+    <w:lsdException w:name="Table Web 3" w:semiHidden="1" w:unhideWhenUsed="1"/>
     <w:lsdException w:name="Balloon Text" w:semiHidden="1" w:unhideWhenUsed="1"/>
     <w:lsdException w:name="Table Grid" w:uiPriority="39"/>
+    <w:lsdException w:name="Table Theme" w:semiHidden="1" w:unhideWhenUsed="1"/>
     <w:lsdException w:name="Placeholder Text" w:semiHidden="1"/>
     <w:lsdException w:name="No Spacing" w:uiPriority="1" w:qFormat="1"/>
     <w:lsdException w:name="Light Shading" w:uiPriority="60"/>

</xml_diff>